<commit_message>
Verify Quad PCM placement and expand mapper validation
</commit_message>
<xml_diff>
--- a/artifacts/x2-spec-20261004/x2-technical-specification.docx
+++ b/artifacts/x2-spec-20261004/x2-technical-specification.docx
@@ -20,7 +20,7 @@
     </w:p>
     <w:p>
       <w:r>
-        <w:t>Draft 0.2   •   Independent firmware reconstruction   •   4 October 2026</w:t>
+        <w:t>Draft 0.3   •   Independent firmware reconstruction   •   4 October 2026</w:t>
       </w:r>
     </w:p>
     <w:p>
@@ -38,7 +38,7 @@
     </w:p>
     <w:p>
       <w:r>
-        <w:t>The client retains executable x2 setup and DSP code. The server capability exchange and sample transforms have been reconstructed. New component work identifies six mapping positions, a two-bit choice for each position and the expansion of two candidate codeword sets into six working banks. The physical placement of the Quad mapper overlay still requires validation, so those new results are provisional.</w:t>
+        <w:t>The client retains executable x2 setup and DSP code. The server capability exchange and sample transforms have been reconstructed. The later Quad reconstruction now connects a received parameter record to six mapping positions and the expansion of candidate codeword sets into six working banks. The stock controller validates the overlay source placement. Startup construction and its consumers also execute together in bounded test contexts. Payload mapping and complete peer negotiation remain open.</w:t>
       </w:r>
     </w:p>
     <w:p>
@@ -1090,7 +1090,7 @@
                 <w:b w:val="0"/>
                 <w:sz w:val="20"/>
               </w:rPr>
-              <w:t>Select two candidate level sets and distribute choices across six mapping positions.</w:t>
+              <w:t>Decode received choices, select candidate level sets and expand six position banks.</w:t>
             </w:r>
           </w:p>
         </w:tc>
@@ -1120,7 +1120,7 @@
                 <w:b w:val="0"/>
                 <w:sz w:val="20"/>
               </w:rPr>
-              <w:t>Provisional</w:t>
+              <w:t>Components verified</w:t>
             </w:r>
           </w:p>
         </w:tc>
@@ -4018,7 +4018,7 @@
         <w:pStyle w:val="Heading1"/>
       </w:pPr>
       <w:r>
-        <w:t>7 Downstream mapping organization</w:t>
+        <w:t>7 Negotiated downstream parameters</w:t>
       </w:r>
     </w:p>
     <w:p>
@@ -4026,12 +4026,12 @@
         <w:pStyle w:val="Heading2"/>
       </w:pPr>
       <w:r>
-        <w:t>7 1 Six positions and two candidate sets</w:t>
+        <w:t>7 1 Transfer of the received record</w:t>
       </w:r>
     </w:p>
     <w:p>
       <w:r>
-        <w:t>The new Quad component reconstruction exposes six two-bit position fields packed into twelve bits. One routine counts positions whose field is nonzero. A second assigns one of two candidate set sizes to each position: field zero chooses the high-byte size and fields 1, 2 or 3 choose the low-byte size. All 4,096 combinations of the position fields have been compared against the original instructions under the provisional overlay placement.</w:t>
+        <w:t>In the inspected PCM receive branch, four buffered words become the working negotiation record. The first two words supply directional parameters; the last two supply the position choices and an additional parameter. This transfer and the subsequent unpacking match the original instructions. The branch condition is part of the verified entry context; the check does not include frame reception, CRC acceptance or acknowledgement.</w:t>
       </w:r>
     </w:p>
     <w:p>
@@ -4039,7 +4039,1158 @@
         <w:pStyle w:val="Caption"/>
       </w:pPr>
       <w:r>
-        <w:t>Table 8 — Position control behavior</w:t>
+        <w:t>Table 8 — Recovered working parameters</w:t>
+      </w:r>
+    </w:p>
+    <w:tbl>
+      <w:tblPr>
+        <w:tblW w:type="auto" w:w="0"/>
+        <w:jc w:val="center"/>
+        <w:tblLayout w:type="fixed"/>
+        <w:tblLook w:firstColumn="1" w:firstRow="1" w:lastColumn="0" w:lastRow="0" w:noHBand="0" w:noVBand="1" w:val="04A0"/>
+      </w:tblPr>
+      <w:tblGrid>
+        <w:gridCol w:w="2098"/>
+        <w:gridCol w:w="4025"/>
+        <w:gridCol w:w="3288"/>
+      </w:tblGrid>
+      <w:tr>
+        <w:trPr>
+          <w:tblHeader/>
+          <w:cantSplit/>
+        </w:trPr>
+        <w:tc>
+          <w:tcPr>
+            <w:tcW w:type="dxa" w:w="2098"/>
+            <w:vAlign w:val="center"/>
+            <w:tcBorders>
+              <w:top w:val="single" w:sz="4" w:color="D9D9D9"/>
+              <w:left w:val="single" w:sz="4" w:color="D9D9D9"/>
+              <w:bottom w:val="single" w:sz="4" w:color="D9D9D9"/>
+              <w:right w:val="single" w:sz="4" w:color="D9D9D9"/>
+            </w:tcBorders>
+            <w:shd w:fill="E7E7E7"/>
+            <w:tcMar>
+              <w:top w:w="85" w:type="dxa"/>
+              <w:left w:w="85" w:type="dxa"/>
+              <w:bottom w:w="85" w:type="dxa"/>
+              <w:right w:w="85" w:type="dxa"/>
+            </w:tcMar>
+          </w:tcPr>
+          <w:p>
+            <w:pPr>
+              <w:spacing w:after="20" w:line="240" w:lineRule="auto"/>
+            </w:pPr>
+            <w:r>
+              <w:rPr>
+                <w:b/>
+                <w:sz w:val="20"/>
+              </w:rPr>
+              <w:t>Parameter</w:t>
+            </w:r>
+          </w:p>
+        </w:tc>
+        <w:tc>
+          <w:tcPr>
+            <w:tcW w:type="dxa" w:w="4025"/>
+            <w:vAlign w:val="center"/>
+            <w:tcBorders>
+              <w:top w:val="single" w:sz="4" w:color="D9D9D9"/>
+              <w:left w:val="single" w:sz="4" w:color="D9D9D9"/>
+              <w:bottom w:val="single" w:sz="4" w:color="D9D9D9"/>
+              <w:right w:val="single" w:sz="4" w:color="D9D9D9"/>
+            </w:tcBorders>
+            <w:shd w:fill="E7E7E7"/>
+            <w:tcMar>
+              <w:top w:w="85" w:type="dxa"/>
+              <w:left w:w="85" w:type="dxa"/>
+              <w:bottom w:w="85" w:type="dxa"/>
+              <w:right w:w="85" w:type="dxa"/>
+            </w:tcMar>
+          </w:tcPr>
+          <w:p>
+            <w:pPr>
+              <w:spacing w:after="20" w:line="240" w:lineRule="auto"/>
+            </w:pPr>
+            <w:r>
+              <w:rPr>
+                <w:b/>
+                <w:sz w:val="20"/>
+              </w:rPr>
+              <w:t>Recovered representation</w:t>
+            </w:r>
+          </w:p>
+        </w:tc>
+        <w:tc>
+          <w:tcPr>
+            <w:tcW w:type="dxa" w:w="3288"/>
+            <w:vAlign w:val="center"/>
+            <w:tcBorders>
+              <w:top w:val="single" w:sz="4" w:color="D9D9D9"/>
+              <w:left w:val="single" w:sz="4" w:color="D9D9D9"/>
+              <w:bottom w:val="single" w:sz="4" w:color="D9D9D9"/>
+              <w:right w:val="single" w:sz="4" w:color="D9D9D9"/>
+            </w:tcBorders>
+            <w:shd w:fill="E7E7E7"/>
+            <w:tcMar>
+              <w:top w:w="85" w:type="dxa"/>
+              <w:left w:w="85" w:type="dxa"/>
+              <w:bottom w:w="85" w:type="dxa"/>
+              <w:right w:w="85" w:type="dxa"/>
+            </w:tcMar>
+          </w:tcPr>
+          <w:p>
+            <w:pPr>
+              <w:spacing w:after="20" w:line="240" w:lineRule="auto"/>
+            </w:pPr>
+            <w:r>
+              <w:rPr>
+                <w:b/>
+                <w:sz w:val="20"/>
+              </w:rPr>
+              <w:t>Qualification</w:t>
+            </w:r>
+          </w:p>
+        </w:tc>
+      </w:tr>
+      <w:tr>
+        <w:trPr>
+          <w:cantSplit/>
+        </w:trPr>
+        <w:tc>
+          <w:tcPr>
+            <w:tcW w:type="dxa" w:w="2098"/>
+            <w:vAlign w:val="center"/>
+            <w:tcBorders>
+              <w:top w:val="single" w:sz="4" w:color="D9D9D9"/>
+              <w:left w:val="single" w:sz="4" w:color="D9D9D9"/>
+              <w:bottom w:val="single" w:sz="4" w:color="D9D9D9"/>
+              <w:right w:val="single" w:sz="4" w:color="D9D9D9"/>
+            </w:tcBorders>
+            <w:tcMar>
+              <w:top w:w="85" w:type="dxa"/>
+              <w:left w:w="85" w:type="dxa"/>
+              <w:bottom w:w="85" w:type="dxa"/>
+              <w:right w:w="85" w:type="dxa"/>
+            </w:tcMar>
+          </w:tcPr>
+          <w:p>
+            <w:pPr>
+              <w:spacing w:after="20" w:line="240" w:lineRule="auto"/>
+            </w:pPr>
+            <w:r>
+              <w:rPr>
+                <w:b w:val="0"/>
+                <w:sz w:val="20"/>
+              </w:rPr>
+              <w:t>Original mode</w:t>
+            </w:r>
+          </w:p>
+        </w:tc>
+        <w:tc>
+          <w:tcPr>
+            <w:tcW w:type="dxa" w:w="4025"/>
+            <w:vAlign w:val="center"/>
+            <w:tcBorders>
+              <w:top w:val="single" w:sz="4" w:color="D9D9D9"/>
+              <w:left w:val="single" w:sz="4" w:color="D9D9D9"/>
+              <w:bottom w:val="single" w:sz="4" w:color="D9D9D9"/>
+              <w:right w:val="single" w:sz="4" w:color="D9D9D9"/>
+            </w:tcBorders>
+            <w:tcMar>
+              <w:top w:w="85" w:type="dxa"/>
+              <w:left w:w="85" w:type="dxa"/>
+              <w:bottom w:w="85" w:type="dxa"/>
+              <w:right w:w="85" w:type="dxa"/>
+            </w:tcMar>
+          </w:tcPr>
+          <w:p>
+            <w:pPr>
+              <w:spacing w:after="20" w:line="240" w:lineRule="auto"/>
+            </w:pPr>
+            <w:r>
+              <w:rPr>
+                <w:b w:val="0"/>
+                <w:sz w:val="20"/>
+              </w:rPr>
+              <w:t>Four bits from the first working word</w:t>
+            </w:r>
+          </w:p>
+        </w:tc>
+        <w:tc>
+          <w:tcPr>
+            <w:tcW w:type="dxa" w:w="3288"/>
+            <w:vAlign w:val="center"/>
+            <w:tcBorders>
+              <w:top w:val="single" w:sz="4" w:color="D9D9D9"/>
+              <w:left w:val="single" w:sz="4" w:color="D9D9D9"/>
+              <w:bottom w:val="single" w:sz="4" w:color="D9D9D9"/>
+              <w:right w:val="single" w:sz="4" w:color="D9D9D9"/>
+            </w:tcBorders>
+            <w:tcMar>
+              <w:top w:w="85" w:type="dxa"/>
+              <w:left w:w="85" w:type="dxa"/>
+              <w:bottom w:w="85" w:type="dxa"/>
+              <w:right w:w="85" w:type="dxa"/>
+            </w:tcMar>
+          </w:tcPr>
+          <w:p>
+            <w:pPr>
+              <w:spacing w:after="20" w:line="240" w:lineRule="auto"/>
+            </w:pPr>
+            <w:r>
+              <w:rPr>
+                <w:b w:val="0"/>
+                <w:sz w:val="20"/>
+              </w:rPr>
+              <w:t>Used to select a scale table</w:t>
+            </w:r>
+          </w:p>
+        </w:tc>
+      </w:tr>
+      <w:tr>
+        <w:trPr>
+          <w:cantSplit/>
+        </w:trPr>
+        <w:tc>
+          <w:tcPr>
+            <w:tcW w:type="dxa" w:w="2098"/>
+            <w:vAlign w:val="center"/>
+            <w:tcBorders>
+              <w:top w:val="single" w:sz="4" w:color="D9D9D9"/>
+              <w:left w:val="single" w:sz="4" w:color="D9D9D9"/>
+              <w:bottom w:val="single" w:sz="4" w:color="D9D9D9"/>
+              <w:right w:val="single" w:sz="4" w:color="D9D9D9"/>
+            </w:tcBorders>
+            <w:tcMar>
+              <w:top w:w="85" w:type="dxa"/>
+              <w:left w:w="85" w:type="dxa"/>
+              <w:bottom w:w="85" w:type="dxa"/>
+              <w:right w:w="85" w:type="dxa"/>
+            </w:tcMar>
+          </w:tcPr>
+          <w:p>
+            <w:pPr>
+              <w:spacing w:after="20" w:line="240" w:lineRule="auto"/>
+            </w:pPr>
+            <w:r>
+              <w:rPr>
+                <w:b w:val="0"/>
+                <w:sz w:val="20"/>
+              </w:rPr>
+              <w:t>Effective mode</w:t>
+            </w:r>
+          </w:p>
+        </w:tc>
+        <w:tc>
+          <w:tcPr>
+            <w:tcW w:type="dxa" w:w="4025"/>
+            <w:vAlign w:val="center"/>
+            <w:tcBorders>
+              <w:top w:val="single" w:sz="4" w:color="D9D9D9"/>
+              <w:left w:val="single" w:sz="4" w:color="D9D9D9"/>
+              <w:bottom w:val="single" w:sz="4" w:color="D9D9D9"/>
+              <w:right w:val="single" w:sz="4" w:color="D9D9D9"/>
+            </w:tcBorders>
+            <w:tcMar>
+              <w:top w:w="85" w:type="dxa"/>
+              <w:left w:w="85" w:type="dxa"/>
+              <w:bottom w:w="85" w:type="dxa"/>
+              <w:right w:w="85" w:type="dxa"/>
+            </w:tcMar>
+          </w:tcPr>
+          <w:p>
+            <w:pPr>
+              <w:spacing w:after="20" w:line="240" w:lineRule="auto"/>
+            </w:pPr>
+            <w:r>
+              <w:rPr>
+                <w:b w:val="0"/>
+                <w:sz w:val="20"/>
+              </w:rPr>
+              <w:t>Original mode, or zero when a local override is set</w:t>
+            </w:r>
+          </w:p>
+        </w:tc>
+        <w:tc>
+          <w:tcPr>
+            <w:tcW w:type="dxa" w:w="3288"/>
+            <w:vAlign w:val="center"/>
+            <w:tcBorders>
+              <w:top w:val="single" w:sz="4" w:color="D9D9D9"/>
+              <w:left w:val="single" w:sz="4" w:color="D9D9D9"/>
+              <w:bottom w:val="single" w:sz="4" w:color="D9D9D9"/>
+              <w:right w:val="single" w:sz="4" w:color="D9D9D9"/>
+            </w:tcBorders>
+            <w:tcMar>
+              <w:top w:w="85" w:type="dxa"/>
+              <w:left w:w="85" w:type="dxa"/>
+              <w:bottom w:w="85" w:type="dxa"/>
+              <w:right w:w="85" w:type="dxa"/>
+            </w:tcMar>
+          </w:tcPr>
+          <w:p>
+            <w:pPr>
+              <w:spacing w:after="20" w:line="240" w:lineRule="auto"/>
+            </w:pPr>
+            <w:r>
+              <w:rPr>
+                <w:b w:val="0"/>
+                <w:sz w:val="20"/>
+              </w:rPr>
+              <w:t>Used by a second parameter table</w:t>
+            </w:r>
+          </w:p>
+        </w:tc>
+      </w:tr>
+      <w:tr>
+        <w:trPr>
+          <w:cantSplit/>
+        </w:trPr>
+        <w:tc>
+          <w:tcPr>
+            <w:tcW w:type="dxa" w:w="2098"/>
+            <w:vAlign w:val="center"/>
+            <w:tcBorders>
+              <w:top w:val="single" w:sz="4" w:color="D9D9D9"/>
+              <w:left w:val="single" w:sz="4" w:color="D9D9D9"/>
+              <w:bottom w:val="single" w:sz="4" w:color="D9D9D9"/>
+              <w:right w:val="single" w:sz="4" w:color="D9D9D9"/>
+            </w:tcBorders>
+            <w:tcMar>
+              <w:top w:w="85" w:type="dxa"/>
+              <w:left w:w="85" w:type="dxa"/>
+              <w:bottom w:w="85" w:type="dxa"/>
+              <w:right w:w="85" w:type="dxa"/>
+            </w:tcMar>
+          </w:tcPr>
+          <w:p>
+            <w:pPr>
+              <w:spacing w:after="20" w:line="240" w:lineRule="auto"/>
+            </w:pPr>
+            <w:r>
+              <w:rPr>
+                <w:b w:val="0"/>
+                <w:sz w:val="20"/>
+              </w:rPr>
+              <w:t>Additional parameter</w:t>
+            </w:r>
+          </w:p>
+        </w:tc>
+        <w:tc>
+          <w:tcPr>
+            <w:tcW w:type="dxa" w:w="4025"/>
+            <w:vAlign w:val="center"/>
+            <w:tcBorders>
+              <w:top w:val="single" w:sz="4" w:color="D9D9D9"/>
+              <w:left w:val="single" w:sz="4" w:color="D9D9D9"/>
+              <w:bottom w:val="single" w:sz="4" w:color="D9D9D9"/>
+              <w:right w:val="single" w:sz="4" w:color="D9D9D9"/>
+            </w:tcBorders>
+            <w:tcMar>
+              <w:top w:w="85" w:type="dxa"/>
+              <w:left w:w="85" w:type="dxa"/>
+              <w:bottom w:w="85" w:type="dxa"/>
+              <w:right w:w="85" w:type="dxa"/>
+            </w:tcMar>
+          </w:tcPr>
+          <w:p>
+            <w:pPr>
+              <w:spacing w:after="20" w:line="240" w:lineRule="auto"/>
+            </w:pPr>
+            <w:r>
+              <w:rPr>
+                <w:b w:val="0"/>
+                <w:sz w:val="20"/>
+              </w:rPr>
+              <w:t>Three bits above the position record</w:t>
+            </w:r>
+          </w:p>
+        </w:tc>
+        <w:tc>
+          <w:tcPr>
+            <w:tcW w:type="dxa" w:w="3288"/>
+            <w:vAlign w:val="center"/>
+            <w:tcBorders>
+              <w:top w:val="single" w:sz="4" w:color="D9D9D9"/>
+              <w:left w:val="single" w:sz="4" w:color="D9D9D9"/>
+              <w:bottom w:val="single" w:sz="4" w:color="D9D9D9"/>
+              <w:right w:val="single" w:sz="4" w:color="D9D9D9"/>
+            </w:tcBorders>
+            <w:tcMar>
+              <w:top w:w="85" w:type="dxa"/>
+              <w:left w:w="85" w:type="dxa"/>
+              <w:bottom w:w="85" w:type="dxa"/>
+              <w:right w:w="85" w:type="dxa"/>
+            </w:tcMar>
+          </w:tcPr>
+          <w:p>
+            <w:pPr>
+              <w:spacing w:after="20" w:line="240" w:lineRule="auto"/>
+            </w:pPr>
+            <w:r>
+              <w:rPr>
+                <w:b w:val="0"/>
+                <w:sz w:val="20"/>
+              </w:rPr>
+              <w:t>Physical meaning remains open</w:t>
+            </w:r>
+          </w:p>
+        </w:tc>
+      </w:tr>
+      <w:tr>
+        <w:trPr>
+          <w:cantSplit/>
+        </w:trPr>
+        <w:tc>
+          <w:tcPr>
+            <w:tcW w:type="dxa" w:w="2098"/>
+            <w:vAlign w:val="center"/>
+            <w:tcBorders>
+              <w:top w:val="single" w:sz="4" w:color="D9D9D9"/>
+              <w:left w:val="single" w:sz="4" w:color="D9D9D9"/>
+              <w:bottom w:val="single" w:sz="4" w:color="D9D9D9"/>
+              <w:right w:val="single" w:sz="4" w:color="D9D9D9"/>
+            </w:tcBorders>
+            <w:tcMar>
+              <w:top w:w="85" w:type="dxa"/>
+              <w:left w:w="85" w:type="dxa"/>
+              <w:bottom w:w="85" w:type="dxa"/>
+              <w:right w:w="85" w:type="dxa"/>
+            </w:tcMar>
+          </w:tcPr>
+          <w:p>
+            <w:pPr>
+              <w:spacing w:after="20" w:line="240" w:lineRule="auto"/>
+            </w:pPr>
+            <w:r>
+              <w:rPr>
+                <w:b w:val="0"/>
+                <w:sz w:val="20"/>
+              </w:rPr>
+              <w:t>Position record</w:t>
+            </w:r>
+          </w:p>
+        </w:tc>
+        <w:tc>
+          <w:tcPr>
+            <w:tcW w:type="dxa" w:w="4025"/>
+            <w:vAlign w:val="center"/>
+            <w:tcBorders>
+              <w:top w:val="single" w:sz="4" w:color="D9D9D9"/>
+              <w:left w:val="single" w:sz="4" w:color="D9D9D9"/>
+              <w:bottom w:val="single" w:sz="4" w:color="D9D9D9"/>
+              <w:right w:val="single" w:sz="4" w:color="D9D9D9"/>
+            </w:tcBorders>
+            <w:tcMar>
+              <w:top w:w="85" w:type="dxa"/>
+              <w:left w:w="85" w:type="dxa"/>
+              <w:bottom w:w="85" w:type="dxa"/>
+              <w:right w:w="85" w:type="dxa"/>
+            </w:tcMar>
+          </w:tcPr>
+          <w:p>
+            <w:pPr>
+              <w:spacing w:after="20" w:line="240" w:lineRule="auto"/>
+            </w:pPr>
+            <w:r>
+              <w:rPr>
+                <w:b w:val="0"/>
+                <w:sz w:val="20"/>
+              </w:rPr>
+              <w:t>Twenty-four bits organized as six four-bit cells</w:t>
+            </w:r>
+          </w:p>
+        </w:tc>
+        <w:tc>
+          <w:tcPr>
+            <w:tcW w:type="dxa" w:w="3288"/>
+            <w:vAlign w:val="center"/>
+            <w:tcBorders>
+              <w:top w:val="single" w:sz="4" w:color="D9D9D9"/>
+              <w:left w:val="single" w:sz="4" w:color="D9D9D9"/>
+              <w:bottom w:val="single" w:sz="4" w:color="D9D9D9"/>
+              <w:right w:val="single" w:sz="4" w:color="D9D9D9"/>
+            </w:tcBorders>
+            <w:tcMar>
+              <w:top w:w="85" w:type="dxa"/>
+              <w:left w:w="85" w:type="dxa"/>
+              <w:bottom w:w="85" w:type="dxa"/>
+              <w:right w:w="85" w:type="dxa"/>
+            </w:tcMar>
+          </w:tcPr>
+          <w:p>
+            <w:pPr>
+              <w:spacing w:after="20" w:line="240" w:lineRule="auto"/>
+            </w:pPr>
+            <w:r>
+              <w:rPr>
+                <w:b w:val="0"/>
+                <w:sz w:val="20"/>
+              </w:rPr>
+              <w:t>Three bits of each cell select a control value</w:t>
+            </w:r>
+          </w:p>
+        </w:tc>
+      </w:tr>
+    </w:tbl>
+    <w:p/>
+    <w:p>
+      <w:r>
+        <w:t>The distinction between original and effective mode is observable: a local override changes the stored mode to zero, while one scale-table lookup retains the original mode. The draft therefore keeps both parameters distinct. Their exact rate names and the physical units of the scale values have not been established.</w:t>
+      </w:r>
+    </w:p>
+    <w:p>
+      <w:pPr>
+        <w:pStyle w:val="Heading2"/>
+      </w:pPr>
+      <w:r>
+        <w:t>7 2 Conversion of position choices</w:t>
+      </w:r>
+    </w:p>
+    <w:p>
+      <w:r>
+        <w:t>The firmware consumes the six cells from the most significant end of its working record. It ignores the upper bit of each cell and converts the lower three bits according to Table 9. Each result occupies two bits in the position-control word. Bank expansion then consumes that word from its least significant end, so its first bank corresponds to the last cell processed during unpacking. This describes working-record order; wire order remains to be established.</w:t>
+      </w:r>
+    </w:p>
+    <w:p>
+      <w:pPr>
+        <w:pStyle w:val="Caption"/>
+      </w:pPr>
+      <w:r>
+        <w:t>Table 9 — Cell value to position control</w:t>
+      </w:r>
+    </w:p>
+    <w:tbl>
+      <w:tblPr>
+        <w:tblW w:type="auto" w:w="0"/>
+        <w:jc w:val="center"/>
+        <w:tblLayout w:type="fixed"/>
+        <w:tblLook w:firstColumn="1" w:firstRow="1" w:lastColumn="0" w:lastRow="0" w:noHBand="0" w:noVBand="1" w:val="04A0"/>
+      </w:tblPr>
+      <w:tblGrid>
+        <w:gridCol w:w="2154"/>
+        <w:gridCol w:w="907"/>
+        <w:gridCol w:w="907"/>
+        <w:gridCol w:w="907"/>
+        <w:gridCol w:w="907"/>
+        <w:gridCol w:w="907"/>
+        <w:gridCol w:w="907"/>
+        <w:gridCol w:w="907"/>
+        <w:gridCol w:w="907"/>
+      </w:tblGrid>
+      <w:tr>
+        <w:trPr>
+          <w:tblHeader/>
+          <w:cantSplit/>
+        </w:trPr>
+        <w:tc>
+          <w:tcPr>
+            <w:tcW w:type="dxa" w:w="2154"/>
+            <w:vAlign w:val="center"/>
+            <w:tcBorders>
+              <w:top w:val="single" w:sz="4" w:color="D9D9D9"/>
+              <w:left w:val="single" w:sz="4" w:color="D9D9D9"/>
+              <w:bottom w:val="single" w:sz="4" w:color="D9D9D9"/>
+              <w:right w:val="single" w:sz="4" w:color="D9D9D9"/>
+            </w:tcBorders>
+            <w:shd w:fill="E7E7E7"/>
+            <w:tcMar>
+              <w:top w:w="85" w:type="dxa"/>
+              <w:left w:w="85" w:type="dxa"/>
+              <w:bottom w:w="85" w:type="dxa"/>
+              <w:right w:w="85" w:type="dxa"/>
+            </w:tcMar>
+          </w:tcPr>
+          <w:p>
+            <w:pPr>
+              <w:spacing w:after="20" w:line="240" w:lineRule="auto"/>
+            </w:pPr>
+            <w:r>
+              <w:rPr>
+                <w:b/>
+                <w:sz w:val="20"/>
+              </w:rPr>
+              <w:t>Cell value</w:t>
+            </w:r>
+          </w:p>
+        </w:tc>
+        <w:tc>
+          <w:tcPr>
+            <w:tcW w:type="dxa" w:w="907"/>
+            <w:vAlign w:val="center"/>
+            <w:tcBorders>
+              <w:top w:val="single" w:sz="4" w:color="D9D9D9"/>
+              <w:left w:val="single" w:sz="4" w:color="D9D9D9"/>
+              <w:bottom w:val="single" w:sz="4" w:color="D9D9D9"/>
+              <w:right w:val="single" w:sz="4" w:color="D9D9D9"/>
+            </w:tcBorders>
+            <w:shd w:fill="E7E7E7"/>
+            <w:tcMar>
+              <w:top w:w="85" w:type="dxa"/>
+              <w:left w:w="85" w:type="dxa"/>
+              <w:bottom w:w="85" w:type="dxa"/>
+              <w:right w:w="85" w:type="dxa"/>
+            </w:tcMar>
+          </w:tcPr>
+          <w:p>
+            <w:pPr>
+              <w:spacing w:after="20" w:line="240" w:lineRule="auto"/>
+            </w:pPr>
+            <w:r>
+              <w:rPr>
+                <w:b/>
+                <w:sz w:val="20"/>
+              </w:rPr>
+              <w:t>0</w:t>
+            </w:r>
+          </w:p>
+        </w:tc>
+        <w:tc>
+          <w:tcPr>
+            <w:tcW w:type="dxa" w:w="907"/>
+            <w:vAlign w:val="center"/>
+            <w:tcBorders>
+              <w:top w:val="single" w:sz="4" w:color="D9D9D9"/>
+              <w:left w:val="single" w:sz="4" w:color="D9D9D9"/>
+              <w:bottom w:val="single" w:sz="4" w:color="D9D9D9"/>
+              <w:right w:val="single" w:sz="4" w:color="D9D9D9"/>
+            </w:tcBorders>
+            <w:shd w:fill="E7E7E7"/>
+            <w:tcMar>
+              <w:top w:w="85" w:type="dxa"/>
+              <w:left w:w="85" w:type="dxa"/>
+              <w:bottom w:w="85" w:type="dxa"/>
+              <w:right w:w="85" w:type="dxa"/>
+            </w:tcMar>
+          </w:tcPr>
+          <w:p>
+            <w:pPr>
+              <w:spacing w:after="20" w:line="240" w:lineRule="auto"/>
+            </w:pPr>
+            <w:r>
+              <w:rPr>
+                <w:b/>
+                <w:sz w:val="20"/>
+              </w:rPr>
+              <w:t>1</w:t>
+            </w:r>
+          </w:p>
+        </w:tc>
+        <w:tc>
+          <w:tcPr>
+            <w:tcW w:type="dxa" w:w="907"/>
+            <w:vAlign w:val="center"/>
+            <w:tcBorders>
+              <w:top w:val="single" w:sz="4" w:color="D9D9D9"/>
+              <w:left w:val="single" w:sz="4" w:color="D9D9D9"/>
+              <w:bottom w:val="single" w:sz="4" w:color="D9D9D9"/>
+              <w:right w:val="single" w:sz="4" w:color="D9D9D9"/>
+            </w:tcBorders>
+            <w:shd w:fill="E7E7E7"/>
+            <w:tcMar>
+              <w:top w:w="85" w:type="dxa"/>
+              <w:left w:w="85" w:type="dxa"/>
+              <w:bottom w:w="85" w:type="dxa"/>
+              <w:right w:w="85" w:type="dxa"/>
+            </w:tcMar>
+          </w:tcPr>
+          <w:p>
+            <w:pPr>
+              <w:spacing w:after="20" w:line="240" w:lineRule="auto"/>
+            </w:pPr>
+            <w:r>
+              <w:rPr>
+                <w:b/>
+                <w:sz w:val="20"/>
+              </w:rPr>
+              <w:t>2</w:t>
+            </w:r>
+          </w:p>
+        </w:tc>
+        <w:tc>
+          <w:tcPr>
+            <w:tcW w:type="dxa" w:w="907"/>
+            <w:vAlign w:val="center"/>
+            <w:tcBorders>
+              <w:top w:val="single" w:sz="4" w:color="D9D9D9"/>
+              <w:left w:val="single" w:sz="4" w:color="D9D9D9"/>
+              <w:bottom w:val="single" w:sz="4" w:color="D9D9D9"/>
+              <w:right w:val="single" w:sz="4" w:color="D9D9D9"/>
+            </w:tcBorders>
+            <w:shd w:fill="E7E7E7"/>
+            <w:tcMar>
+              <w:top w:w="85" w:type="dxa"/>
+              <w:left w:w="85" w:type="dxa"/>
+              <w:bottom w:w="85" w:type="dxa"/>
+              <w:right w:w="85" w:type="dxa"/>
+            </w:tcMar>
+          </w:tcPr>
+          <w:p>
+            <w:pPr>
+              <w:spacing w:after="20" w:line="240" w:lineRule="auto"/>
+            </w:pPr>
+            <w:r>
+              <w:rPr>
+                <w:b/>
+                <w:sz w:val="20"/>
+              </w:rPr>
+              <w:t>3</w:t>
+            </w:r>
+          </w:p>
+        </w:tc>
+        <w:tc>
+          <w:tcPr>
+            <w:tcW w:type="dxa" w:w="907"/>
+            <w:vAlign w:val="center"/>
+            <w:tcBorders>
+              <w:top w:val="single" w:sz="4" w:color="D9D9D9"/>
+              <w:left w:val="single" w:sz="4" w:color="D9D9D9"/>
+              <w:bottom w:val="single" w:sz="4" w:color="D9D9D9"/>
+              <w:right w:val="single" w:sz="4" w:color="D9D9D9"/>
+            </w:tcBorders>
+            <w:shd w:fill="E7E7E7"/>
+            <w:tcMar>
+              <w:top w:w="85" w:type="dxa"/>
+              <w:left w:w="85" w:type="dxa"/>
+              <w:bottom w:w="85" w:type="dxa"/>
+              <w:right w:w="85" w:type="dxa"/>
+            </w:tcMar>
+          </w:tcPr>
+          <w:p>
+            <w:pPr>
+              <w:spacing w:after="20" w:line="240" w:lineRule="auto"/>
+            </w:pPr>
+            <w:r>
+              <w:rPr>
+                <w:b/>
+                <w:sz w:val="20"/>
+              </w:rPr>
+              <w:t>4</w:t>
+            </w:r>
+          </w:p>
+        </w:tc>
+        <w:tc>
+          <w:tcPr>
+            <w:tcW w:type="dxa" w:w="907"/>
+            <w:vAlign w:val="center"/>
+            <w:tcBorders>
+              <w:top w:val="single" w:sz="4" w:color="D9D9D9"/>
+              <w:left w:val="single" w:sz="4" w:color="D9D9D9"/>
+              <w:bottom w:val="single" w:sz="4" w:color="D9D9D9"/>
+              <w:right w:val="single" w:sz="4" w:color="D9D9D9"/>
+            </w:tcBorders>
+            <w:shd w:fill="E7E7E7"/>
+            <w:tcMar>
+              <w:top w:w="85" w:type="dxa"/>
+              <w:left w:w="85" w:type="dxa"/>
+              <w:bottom w:w="85" w:type="dxa"/>
+              <w:right w:w="85" w:type="dxa"/>
+            </w:tcMar>
+          </w:tcPr>
+          <w:p>
+            <w:pPr>
+              <w:spacing w:after="20" w:line="240" w:lineRule="auto"/>
+            </w:pPr>
+            <w:r>
+              <w:rPr>
+                <w:b/>
+                <w:sz w:val="20"/>
+              </w:rPr>
+              <w:t>5</w:t>
+            </w:r>
+          </w:p>
+        </w:tc>
+        <w:tc>
+          <w:tcPr>
+            <w:tcW w:type="dxa" w:w="907"/>
+            <w:vAlign w:val="center"/>
+            <w:tcBorders>
+              <w:top w:val="single" w:sz="4" w:color="D9D9D9"/>
+              <w:left w:val="single" w:sz="4" w:color="D9D9D9"/>
+              <w:bottom w:val="single" w:sz="4" w:color="D9D9D9"/>
+              <w:right w:val="single" w:sz="4" w:color="D9D9D9"/>
+            </w:tcBorders>
+            <w:shd w:fill="E7E7E7"/>
+            <w:tcMar>
+              <w:top w:w="85" w:type="dxa"/>
+              <w:left w:w="85" w:type="dxa"/>
+              <w:bottom w:w="85" w:type="dxa"/>
+              <w:right w:w="85" w:type="dxa"/>
+            </w:tcMar>
+          </w:tcPr>
+          <w:p>
+            <w:pPr>
+              <w:spacing w:after="20" w:line="240" w:lineRule="auto"/>
+            </w:pPr>
+            <w:r>
+              <w:rPr>
+                <w:b/>
+                <w:sz w:val="20"/>
+              </w:rPr>
+              <w:t>6</w:t>
+            </w:r>
+          </w:p>
+        </w:tc>
+        <w:tc>
+          <w:tcPr>
+            <w:tcW w:type="dxa" w:w="907"/>
+            <w:vAlign w:val="center"/>
+            <w:tcBorders>
+              <w:top w:val="single" w:sz="4" w:color="D9D9D9"/>
+              <w:left w:val="single" w:sz="4" w:color="D9D9D9"/>
+              <w:bottom w:val="single" w:sz="4" w:color="D9D9D9"/>
+              <w:right w:val="single" w:sz="4" w:color="D9D9D9"/>
+            </w:tcBorders>
+            <w:shd w:fill="E7E7E7"/>
+            <w:tcMar>
+              <w:top w:w="85" w:type="dxa"/>
+              <w:left w:w="85" w:type="dxa"/>
+              <w:bottom w:w="85" w:type="dxa"/>
+              <w:right w:w="85" w:type="dxa"/>
+            </w:tcMar>
+          </w:tcPr>
+          <w:p>
+            <w:pPr>
+              <w:spacing w:after="20" w:line="240" w:lineRule="auto"/>
+            </w:pPr>
+            <w:r>
+              <w:rPr>
+                <w:b/>
+                <w:sz w:val="20"/>
+              </w:rPr>
+              <w:t>7</w:t>
+            </w:r>
+          </w:p>
+        </w:tc>
+      </w:tr>
+      <w:tr>
+        <w:trPr>
+          <w:cantSplit/>
+        </w:trPr>
+        <w:tc>
+          <w:tcPr>
+            <w:tcW w:type="dxa" w:w="2154"/>
+            <w:vAlign w:val="center"/>
+            <w:tcBorders>
+              <w:top w:val="single" w:sz="4" w:color="D9D9D9"/>
+              <w:left w:val="single" w:sz="4" w:color="D9D9D9"/>
+              <w:bottom w:val="single" w:sz="4" w:color="D9D9D9"/>
+              <w:right w:val="single" w:sz="4" w:color="D9D9D9"/>
+            </w:tcBorders>
+            <w:tcMar>
+              <w:top w:w="85" w:type="dxa"/>
+              <w:left w:w="85" w:type="dxa"/>
+              <w:bottom w:w="85" w:type="dxa"/>
+              <w:right w:w="85" w:type="dxa"/>
+            </w:tcMar>
+          </w:tcPr>
+          <w:p>
+            <w:pPr>
+              <w:spacing w:after="20" w:line="240" w:lineRule="auto"/>
+            </w:pPr>
+            <w:r>
+              <w:rPr>
+                <w:b w:val="0"/>
+                <w:sz w:val="20"/>
+              </w:rPr>
+              <w:t>Control</w:t>
+            </w:r>
+          </w:p>
+        </w:tc>
+        <w:tc>
+          <w:tcPr>
+            <w:tcW w:type="dxa" w:w="907"/>
+            <w:vAlign w:val="center"/>
+            <w:tcBorders>
+              <w:top w:val="single" w:sz="4" w:color="D9D9D9"/>
+              <w:left w:val="single" w:sz="4" w:color="D9D9D9"/>
+              <w:bottom w:val="single" w:sz="4" w:color="D9D9D9"/>
+              <w:right w:val="single" w:sz="4" w:color="D9D9D9"/>
+            </w:tcBorders>
+            <w:tcMar>
+              <w:top w:w="85" w:type="dxa"/>
+              <w:left w:w="85" w:type="dxa"/>
+              <w:bottom w:w="85" w:type="dxa"/>
+              <w:right w:w="85" w:type="dxa"/>
+            </w:tcMar>
+          </w:tcPr>
+          <w:p>
+            <w:pPr>
+              <w:spacing w:after="20" w:line="240" w:lineRule="auto"/>
+            </w:pPr>
+            <w:r>
+              <w:rPr>
+                <w:b w:val="0"/>
+                <w:sz w:val="20"/>
+              </w:rPr>
+              <w:t>0</w:t>
+            </w:r>
+          </w:p>
+        </w:tc>
+        <w:tc>
+          <w:tcPr>
+            <w:tcW w:type="dxa" w:w="907"/>
+            <w:vAlign w:val="center"/>
+            <w:tcBorders>
+              <w:top w:val="single" w:sz="4" w:color="D9D9D9"/>
+              <w:left w:val="single" w:sz="4" w:color="D9D9D9"/>
+              <w:bottom w:val="single" w:sz="4" w:color="D9D9D9"/>
+              <w:right w:val="single" w:sz="4" w:color="D9D9D9"/>
+            </w:tcBorders>
+            <w:tcMar>
+              <w:top w:w="85" w:type="dxa"/>
+              <w:left w:w="85" w:type="dxa"/>
+              <w:bottom w:w="85" w:type="dxa"/>
+              <w:right w:w="85" w:type="dxa"/>
+            </w:tcMar>
+          </w:tcPr>
+          <w:p>
+            <w:pPr>
+              <w:spacing w:after="20" w:line="240" w:lineRule="auto"/>
+            </w:pPr>
+            <w:r>
+              <w:rPr>
+                <w:b w:val="0"/>
+                <w:sz w:val="20"/>
+              </w:rPr>
+              <w:t>1</w:t>
+            </w:r>
+          </w:p>
+        </w:tc>
+        <w:tc>
+          <w:tcPr>
+            <w:tcW w:type="dxa" w:w="907"/>
+            <w:vAlign w:val="center"/>
+            <w:tcBorders>
+              <w:top w:val="single" w:sz="4" w:color="D9D9D9"/>
+              <w:left w:val="single" w:sz="4" w:color="D9D9D9"/>
+              <w:bottom w:val="single" w:sz="4" w:color="D9D9D9"/>
+              <w:right w:val="single" w:sz="4" w:color="D9D9D9"/>
+            </w:tcBorders>
+            <w:tcMar>
+              <w:top w:w="85" w:type="dxa"/>
+              <w:left w:w="85" w:type="dxa"/>
+              <w:bottom w:w="85" w:type="dxa"/>
+              <w:right w:w="85" w:type="dxa"/>
+            </w:tcMar>
+          </w:tcPr>
+          <w:p>
+            <w:pPr>
+              <w:spacing w:after="20" w:line="240" w:lineRule="auto"/>
+            </w:pPr>
+            <w:r>
+              <w:rPr>
+                <w:b w:val="0"/>
+                <w:sz w:val="20"/>
+              </w:rPr>
+              <w:t>2</w:t>
+            </w:r>
+          </w:p>
+        </w:tc>
+        <w:tc>
+          <w:tcPr>
+            <w:tcW w:type="dxa" w:w="907"/>
+            <w:vAlign w:val="center"/>
+            <w:tcBorders>
+              <w:top w:val="single" w:sz="4" w:color="D9D9D9"/>
+              <w:left w:val="single" w:sz="4" w:color="D9D9D9"/>
+              <w:bottom w:val="single" w:sz="4" w:color="D9D9D9"/>
+              <w:right w:val="single" w:sz="4" w:color="D9D9D9"/>
+            </w:tcBorders>
+            <w:tcMar>
+              <w:top w:w="85" w:type="dxa"/>
+              <w:left w:w="85" w:type="dxa"/>
+              <w:bottom w:w="85" w:type="dxa"/>
+              <w:right w:w="85" w:type="dxa"/>
+            </w:tcMar>
+          </w:tcPr>
+          <w:p>
+            <w:pPr>
+              <w:spacing w:after="20" w:line="240" w:lineRule="auto"/>
+            </w:pPr>
+            <w:r>
+              <w:rPr>
+                <w:b w:val="0"/>
+                <w:sz w:val="20"/>
+              </w:rPr>
+              <w:t>1</w:t>
+            </w:r>
+          </w:p>
+        </w:tc>
+        <w:tc>
+          <w:tcPr>
+            <w:tcW w:type="dxa" w:w="907"/>
+            <w:vAlign w:val="center"/>
+            <w:tcBorders>
+              <w:top w:val="single" w:sz="4" w:color="D9D9D9"/>
+              <w:left w:val="single" w:sz="4" w:color="D9D9D9"/>
+              <w:bottom w:val="single" w:sz="4" w:color="D9D9D9"/>
+              <w:right w:val="single" w:sz="4" w:color="D9D9D9"/>
+            </w:tcBorders>
+            <w:tcMar>
+              <w:top w:w="85" w:type="dxa"/>
+              <w:left w:w="85" w:type="dxa"/>
+              <w:bottom w:w="85" w:type="dxa"/>
+              <w:right w:w="85" w:type="dxa"/>
+            </w:tcMar>
+          </w:tcPr>
+          <w:p>
+            <w:pPr>
+              <w:spacing w:after="20" w:line="240" w:lineRule="auto"/>
+            </w:pPr>
+            <w:r>
+              <w:rPr>
+                <w:b w:val="0"/>
+                <w:sz w:val="20"/>
+              </w:rPr>
+              <w:t>0</w:t>
+            </w:r>
+          </w:p>
+        </w:tc>
+        <w:tc>
+          <w:tcPr>
+            <w:tcW w:type="dxa" w:w="907"/>
+            <w:vAlign w:val="center"/>
+            <w:tcBorders>
+              <w:top w:val="single" w:sz="4" w:color="D9D9D9"/>
+              <w:left w:val="single" w:sz="4" w:color="D9D9D9"/>
+              <w:bottom w:val="single" w:sz="4" w:color="D9D9D9"/>
+              <w:right w:val="single" w:sz="4" w:color="D9D9D9"/>
+            </w:tcBorders>
+            <w:tcMar>
+              <w:top w:w="85" w:type="dxa"/>
+              <w:left w:w="85" w:type="dxa"/>
+              <w:bottom w:w="85" w:type="dxa"/>
+              <w:right w:w="85" w:type="dxa"/>
+            </w:tcMar>
+          </w:tcPr>
+          <w:p>
+            <w:pPr>
+              <w:spacing w:after="20" w:line="240" w:lineRule="auto"/>
+            </w:pPr>
+            <w:r>
+              <w:rPr>
+                <w:b w:val="0"/>
+                <w:sz w:val="20"/>
+              </w:rPr>
+              <w:t>3</w:t>
+            </w:r>
+          </w:p>
+        </w:tc>
+        <w:tc>
+          <w:tcPr>
+            <w:tcW w:type="dxa" w:w="907"/>
+            <w:vAlign w:val="center"/>
+            <w:tcBorders>
+              <w:top w:val="single" w:sz="4" w:color="D9D9D9"/>
+              <w:left w:val="single" w:sz="4" w:color="D9D9D9"/>
+              <w:bottom w:val="single" w:sz="4" w:color="D9D9D9"/>
+              <w:right w:val="single" w:sz="4" w:color="D9D9D9"/>
+            </w:tcBorders>
+            <w:tcMar>
+              <w:top w:w="85" w:type="dxa"/>
+              <w:left w:w="85" w:type="dxa"/>
+              <w:bottom w:w="85" w:type="dxa"/>
+              <w:right w:w="85" w:type="dxa"/>
+            </w:tcMar>
+          </w:tcPr>
+          <w:p>
+            <w:pPr>
+              <w:spacing w:after="20" w:line="240" w:lineRule="auto"/>
+            </w:pPr>
+            <w:r>
+              <w:rPr>
+                <w:b w:val="0"/>
+                <w:sz w:val="20"/>
+              </w:rPr>
+              <w:t>0</w:t>
+            </w:r>
+          </w:p>
+        </w:tc>
+        <w:tc>
+          <w:tcPr>
+            <w:tcW w:type="dxa" w:w="907"/>
+            <w:vAlign w:val="center"/>
+            <w:tcBorders>
+              <w:top w:val="single" w:sz="4" w:color="D9D9D9"/>
+              <w:left w:val="single" w:sz="4" w:color="D9D9D9"/>
+              <w:bottom w:val="single" w:sz="4" w:color="D9D9D9"/>
+              <w:right w:val="single" w:sz="4" w:color="D9D9D9"/>
+            </w:tcBorders>
+            <w:tcMar>
+              <w:top w:w="85" w:type="dxa"/>
+              <w:left w:w="85" w:type="dxa"/>
+              <w:bottom w:w="85" w:type="dxa"/>
+              <w:right w:w="85" w:type="dxa"/>
+            </w:tcMar>
+          </w:tcPr>
+          <w:p>
+            <w:pPr>
+              <w:spacing w:after="20" w:line="240" w:lineRule="auto"/>
+            </w:pPr>
+            <w:r>
+              <w:rPr>
+                <w:b w:val="0"/>
+                <w:sz w:val="20"/>
+              </w:rPr>
+              <w:t>3</w:t>
+            </w:r>
+          </w:p>
+        </w:tc>
+      </w:tr>
+    </w:tbl>
+    <w:p/>
+    <w:p>
+      <w:r>
+        <w:t>The firmware also counts the nonzero controls. If all six controls are zero, it substitutes a control word with the lowest position set to value 2, while retaining an active-position count of zero. This is a distinct default state. It must not be described as six ordinary zero choices or silently recounted as one active position.</w:t>
+      </w:r>
+    </w:p>
+    <w:p>
+      <w:pPr>
+        <w:pStyle w:val="Heading2"/>
+      </w:pPr>
+      <w:r>
+        <w:t>7 3 Extent of the verified negotiation path</w:t>
+      </w:r>
+    </w:p>
+    <w:p>
+      <w:r>
+        <w:t>Tests cover received-record transfer, parameter unpacking and expansion into six banks for all 4,096 possible control combinations, with both values of the ignored cell bit represented. Candidate sets are supplied before expansion in these tests. Their construction between unpacking and expansion has not yet been execution compared as one negotiated call. The relation to the received training bitmap, agreed bit rate and transmitted parameter frame remains open.</w:t>
+      </w:r>
+    </w:p>
+    <w:p>
+      <w:r>
+        <w:br w:type="page"/>
+      </w:r>
+    </w:p>
+    <w:p>
+      <w:pPr>
+        <w:pStyle w:val="Heading1"/>
+      </w:pPr>
+      <w:r>
+        <w:t>8 Downstream mapping organization</w:t>
+      </w:r>
+    </w:p>
+    <w:p>
+      <w:pPr>
+        <w:pStyle w:val="Heading2"/>
+      </w:pPr>
+      <w:r>
+        <w:t>8 1 Six positions and two candidate sets</w:t>
+      </w:r>
+    </w:p>
+    <w:p>
+      <w:r>
+        <w:t>Six two-bit controls select the candidate sets for the six positions. A size-distribution routine assigns one of two set sizes to each position: control zero chooses the high-byte size and controls 1, 2 or 3 choose the low-byte size. The count and size routines match the original instructions for all 4,096 combinations.</w:t>
+      </w:r>
+    </w:p>
+    <w:p>
+      <w:pPr>
+        <w:pStyle w:val="Caption"/>
+      </w:pPr>
+      <w:r>
+        <w:t>Table 10 — Position control behavior</w:t>
       </w:r>
     </w:p>
     <w:tbl>
@@ -4086,7 +5237,7 @@
                 <w:b/>
                 <w:sz w:val="20"/>
               </w:rPr>
-              <w:t>Field</w:t>
+              <w:t>Control</w:t>
             </w:r>
           </w:p>
         </w:tc>
@@ -4537,7 +5688,7 @@
     <w:p/>
     <w:p>
       <w:r>
-        <w:t>The expansion flag is a separate stored attribute. Its interpretation as sign, orientation or another signal property is not yet established. It must not be called a sign bit merely because it distinguishes two variants.</w:t>
+        <w:t>The expansion flag is a separate stored attribute. Its interpretation as sign, orientation or another signal property is not yet established. The firmware preserves it as part of each working entry.</w:t>
       </w:r>
     </w:p>
     <w:p>
@@ -4545,22 +5696,17 @@
         <w:pStyle w:val="Heading2"/>
       </w:pPr>
       <w:r>
-        <w:t>7 2 Expansion into working banks</w:t>
+        <w:t>8 2 Expansion into working banks</w:t>
       </w:r>
     </w:p>
     <w:p>
       <w:r>
-        <w:t>A following component constructs six working banks from the two candidate tables. It consumes one position field per bank, chooses the corresponding source set and copies its configured length. An odd position field sets an additional flag in each copied entry. Successive destination banks begin 128 words apart.</w:t>
+        <w:t>The expansion component constructs six working banks from the two candidate tables. It consumes one control per bank, chooses the corresponding source set and copies its configured length. An odd control sets the additional flag in each copied entry. Successive banks begin 128 words apart; that spacing is a storage stride, not a requirement to use 128 levels.</w:t>
       </w:r>
     </w:p>
     <w:p>
       <w:r>
-        <w:t>The copy instruction treats the stored length as a last index: a configured value of three copies four entries. This convention is included in the reconstruction and prevents the table size from being understated by one. The candidate sizes distributed by the earlier routine and the configured copy lengths still require a full caller-context trace.</w:t>
-      </w:r>
-    </w:p>
-    <w:p>
-      <w:r>
-        <w:t>The expansion was compared in 192 generated contexts containing both zero and nonzero position fields and varying source entries. Together with the count and size-distribution checks, this adds 8,384 component comparisons. These checks verify the stated six-position operations under the placement assumption; they do not verify a full mapper call.</w:t>
+        <w:t>The expansion uses a last-index convention: a configured value of three copies four entries. The startup caller supplies the value nine, so expansion copies ten entries, whereas the constructor and level-conversion loop each prepare nine. Tests seed the additional entry explicitly. Its initialization and purpose in the complete connection still require a caller trace.</w:t>
       </w:r>
     </w:p>
     <w:p>
@@ -4568,17 +5714,30 @@
         <w:pStyle w:val="Heading2"/>
       </w:pPr>
       <w:r>
-        <w:t>7 3 Overlay placement qualification</w:t>
+        <w:t>8 3 Constructor and consumer execution</w:t>
       </w:r>
     </w:p>
     <w:p>
       <w:r>
-        <w:t>The earlier Quad placement leaves internal calls and table references one word before their intended targets. Omitting the leading erased word produces coherent internal targets and the paired tables in clause 8. The six-position components also execute consistently under that placement.</w:t>
+        <w:t>The original startup caller has now been executed through candidate construction, level conversion and six-bank expansion in 128 seeded contexts. It sets all six size slots to nine, preserves the selected constructor codewords in the low octets, and copies the transformed candidate entries into the banks selected by the controls. These checks cover the unmodified caller and its callees together.</w:t>
       </w:r>
     </w:p>
     <w:p>
       <w:r>
-        <w:t>This is strong evidence for correcting the alignment, but the stock downloader has not yet demonstrated the omission. The provisional placement is kept separate from the existing program map. The earlier raw selector value that decoded as a return instruction, and the earlier nine-word tables with an extra leading value, shall not be used as established mapping parameters.</w:t>
+        <w:t>The second candidate table and additional entries are seeded in those contexts. The result verifies their consumption and the constructor relationship; it does not establish how both candidates are populated in an actual negotiated connection. The intermediate level converter has been executed, but its amplitude and companding interpretation has not been independently reconstructed.</w:t>
+      </w:r>
+    </w:p>
+    <w:p>
+      <w:pPr>
+        <w:pStyle w:val="Heading2"/>
+      </w:pPr>
+      <w:r>
+        <w:t>8 4 Verified source placement</w:t>
+      </w:r>
+    </w:p>
+    <w:p>
+      <w:r>
+        <w:t>A fresh stock controller run copied all seven overlay sources into each of the four modem RAM banks. All 28 byte comparisons matched the corrected source offsets over the complete overlay lengths. The earlier one-word discrepancy was a flat-file extraction error. The downloader does not discard a leading word. This removes the placement qualification from the component results in clauses 7 to 9.</w:t>
       </w:r>
     </w:p>
     <w:p>
@@ -4591,7 +5750,7 @@
         <w:pStyle w:val="Heading1"/>
       </w:pPr>
       <w:r>
-        <w:t>8 Codeword sets and signal realization</w:t>
+        <w:t>9 Codeword sets and signal realization</w:t>
       </w:r>
     </w:p>
     <w:p>
@@ -4599,12 +5758,12 @@
         <w:pStyle w:val="Heading2"/>
       </w:pPr>
       <w:r>
-        <w:t>8 1 Paired candidate tables</w:t>
+        <w:t>9 1 Paired constructor tables</w:t>
       </w:r>
     </w:p>
     <w:p>
       <w:r>
-        <w:t>Under the provisional placement, the constructor copies the two nine-entry tables in Table 9. Every value in the second table is sixteen lower than the corresponding value in the first. This resolves the shifted outputs in the earlier draft at the component level, while leaving download alignment to be verified.</w:t>
+        <w:t>The constructor selects one of the two nine-entry tables in Table 11 according to a local mode flag. Every value in the second table is sixteen lower than the corresponding value in the first. These are alternative constructor tables; they must not be equated automatically with the two candidates consumed by bank expansion. The corrected source placement and original startup caller both support the table contents.</w:t>
       </w:r>
     </w:p>
     <w:p>
@@ -4612,7 +5771,7 @@
         <w:pStyle w:val="Caption"/>
       </w:pPr>
       <w:r>
-        <w:t>Table 9 — Paired candidate values</w:t>
+        <w:t>Table 11 — Paired constructor values</w:t>
       </w:r>
     </w:p>
     <w:tbl>
@@ -5593,7 +6752,7 @@
         <w:pStyle w:val="Heading2"/>
       </w:pPr>
       <w:r>
-        <w:t>8 2 From constellation choice to a transmitted sample</w:t>
+        <w:t>9 2 From constellation choice to a transmitted sample</w:t>
       </w:r>
     </w:p>
     <w:p>
@@ -5611,12 +6770,12 @@
         <w:pStyle w:val="Heading2"/>
       </w:pPr>
       <w:r>
-        <w:t>8 3 Remaining negotiation and mapping requirements</w:t>
+        <w:t>9 3 Remaining negotiation and mapping requirements</w:t>
       </w:r>
     </w:p>
     <w:p>
       <w:r>
-        <w:t>The next required checks are to validate the stock overlay transfer, run the constructor and consumers as one chain, trace the received bitmap into the six position fields, and connect the agreed rate to the input-bit grouping. A full call trace must establish the alignment signal and show that the client accepts the selected constellations.</w:t>
+        <w:t>The next required checks are to trace the received training bitmap into the parameter record, execute the negotiated candidate builder with its consumers, establish the additional bank entry, and connect the agreed rate to the input-bit grouping. A full call trace must establish the alignment signal and show that the client accepts the selected constellations.</w:t>
       </w:r>
     </w:p>
     <w:p>
@@ -6041,7 +7200,7 @@
                 <w:b w:val="0"/>
                 <w:sz w:val="20"/>
               </w:rPr>
-              <w:t>Shared PCM helpers and provisional six-position mapper</w:t>
+              <w:t>Shared PCM helpers and six-position parameter decoding</w:t>
             </w:r>
           </w:p>
         </w:tc>
@@ -6050,7 +7209,7 @@
     <w:p/>
     <w:p>
       <w:r>
-        <w:t>Client evidence is in artifacts/3453c-x2-decomp-20261004. Server evidence is in artifacts/x2-server-decomp-20261004. New conditional mapper evidence is in artifacts/x2-mapper-negotiation-20261004, including mapper_lift.c, mapper-alignment.asm and verification.json.</w:t>
+        <w:t>Client evidence is in artifacts/3453c-x2-decomp-20261004. Server evidence is in artifacts/x2-server-decomp-20261004. Mapper and placement evidence is in artifacts/x2-mapper-negotiation-20261004, including mapper_lift.c, mapper-alignment.asm and verification.json.</w:t>
       </w:r>
     </w:p>
     <w:p>
@@ -6392,7 +7551,7 @@
                 <w:b w:val="0"/>
                 <w:sz w:val="20"/>
               </w:rPr>
-              <w:t>Earlier Quad helpers</w:t>
+              <w:t>Quad helpers</w:t>
             </w:r>
           </w:p>
         </w:tc>
@@ -6452,7 +7611,7 @@
                 <w:b w:val="0"/>
                 <w:sz w:val="20"/>
               </w:rPr>
-              <w:t>Raw placement; isolated checks do not validate the whole overlay</w:t>
+              <w:t>Corrected stock-verified source placement</w:t>
             </w:r>
           </w:p>
         </w:tc>
@@ -6487,7 +7646,7 @@
                 <w:b w:val="0"/>
                 <w:sz w:val="20"/>
               </w:rPr>
-              <w:t>New mapper components</w:t>
+              <w:t>Mapper C comparisons</w:t>
             </w:r>
           </w:p>
         </w:tc>
@@ -6517,7 +7676,7 @@
                 <w:b w:val="0"/>
                 <w:sz w:val="20"/>
               </w:rPr>
-              <w:t>8,384</w:t>
+              <w:t>13,504</w:t>
             </w:r>
           </w:p>
         </w:tc>
@@ -6547,7 +7706,197 @@
                 <w:b w:val="0"/>
                 <w:sz w:val="20"/>
               </w:rPr>
-              <w:t>Conditional alignment; separate from confirmed placement</w:t>
+              <w:t>Transfer, unpacking, count, sizes and bank expansion</w:t>
+            </w:r>
+          </w:p>
+        </w:tc>
+      </w:tr>
+      <w:tr>
+        <w:trPr>
+          <w:cantSplit/>
+        </w:trPr>
+        <w:tc>
+          <w:tcPr>
+            <w:tcW w:type="dxa" w:w="2778"/>
+            <w:vAlign w:val="center"/>
+            <w:tcBorders>
+              <w:top w:val="single" w:sz="4" w:color="D9D9D9"/>
+              <w:left w:val="single" w:sz="4" w:color="D9D9D9"/>
+              <w:bottom w:val="single" w:sz="4" w:color="D9D9D9"/>
+              <w:right w:val="single" w:sz="4" w:color="D9D9D9"/>
+            </w:tcBorders>
+            <w:tcMar>
+              <w:top w:w="85" w:type="dxa"/>
+              <w:left w:w="85" w:type="dxa"/>
+              <w:bottom w:w="85" w:type="dxa"/>
+              <w:right w:w="85" w:type="dxa"/>
+            </w:tcMar>
+          </w:tcPr>
+          <w:p>
+            <w:pPr>
+              <w:spacing w:after="20" w:line="240" w:lineRule="auto"/>
+            </w:pPr>
+            <w:r>
+              <w:rPr>
+                <w:b w:val="0"/>
+                <w:sz w:val="20"/>
+              </w:rPr>
+              <w:t>Startup caller contexts</w:t>
+            </w:r>
+          </w:p>
+        </w:tc>
+        <w:tc>
+          <w:tcPr>
+            <w:tcW w:type="dxa" w:w="1304"/>
+            <w:vAlign w:val="center"/>
+            <w:tcBorders>
+              <w:top w:val="single" w:sz="4" w:color="D9D9D9"/>
+              <w:left w:val="single" w:sz="4" w:color="D9D9D9"/>
+              <w:bottom w:val="single" w:sz="4" w:color="D9D9D9"/>
+              <w:right w:val="single" w:sz="4" w:color="D9D9D9"/>
+            </w:tcBorders>
+            <w:tcMar>
+              <w:top w:w="85" w:type="dxa"/>
+              <w:left w:w="85" w:type="dxa"/>
+              <w:bottom w:w="85" w:type="dxa"/>
+              <w:right w:w="85" w:type="dxa"/>
+            </w:tcMar>
+          </w:tcPr>
+          <w:p>
+            <w:pPr>
+              <w:spacing w:after="20" w:line="240" w:lineRule="auto"/>
+            </w:pPr>
+            <w:r>
+              <w:rPr>
+                <w:b w:val="0"/>
+                <w:sz w:val="20"/>
+              </w:rPr>
+              <w:t>128</w:t>
+            </w:r>
+          </w:p>
+        </w:tc>
+        <w:tc>
+          <w:tcPr>
+            <w:tcW w:type="dxa" w:w="5329"/>
+            <w:vAlign w:val="center"/>
+            <w:tcBorders>
+              <w:top w:val="single" w:sz="4" w:color="D9D9D9"/>
+              <w:left w:val="single" w:sz="4" w:color="D9D9D9"/>
+              <w:bottom w:val="single" w:sz="4" w:color="D9D9D9"/>
+              <w:right w:val="single" w:sz="4" w:color="D9D9D9"/>
+            </w:tcBorders>
+            <w:tcMar>
+              <w:top w:w="85" w:type="dxa"/>
+              <w:left w:w="85" w:type="dxa"/>
+              <w:bottom w:w="85" w:type="dxa"/>
+              <w:right w:w="85" w:type="dxa"/>
+            </w:tcMar>
+          </w:tcPr>
+          <w:p>
+            <w:pPr>
+              <w:spacing w:after="20" w:line="240" w:lineRule="auto"/>
+            </w:pPr>
+            <w:r>
+              <w:rPr>
+                <w:b w:val="0"/>
+                <w:sz w:val="20"/>
+              </w:rPr>
+              <w:t>Unmodified constructor and consumers; seeded candidates</w:t>
+            </w:r>
+          </w:p>
+        </w:tc>
+      </w:tr>
+      <w:tr>
+        <w:trPr>
+          <w:cantSplit/>
+        </w:trPr>
+        <w:tc>
+          <w:tcPr>
+            <w:tcW w:type="dxa" w:w="2778"/>
+            <w:vAlign w:val="center"/>
+            <w:tcBorders>
+              <w:top w:val="single" w:sz="4" w:color="D9D9D9"/>
+              <w:left w:val="single" w:sz="4" w:color="D9D9D9"/>
+              <w:bottom w:val="single" w:sz="4" w:color="D9D9D9"/>
+              <w:right w:val="single" w:sz="4" w:color="D9D9D9"/>
+            </w:tcBorders>
+            <w:tcMar>
+              <w:top w:w="85" w:type="dxa"/>
+              <w:left w:w="85" w:type="dxa"/>
+              <w:bottom w:w="85" w:type="dxa"/>
+              <w:right w:w="85" w:type="dxa"/>
+            </w:tcMar>
+          </w:tcPr>
+          <w:p>
+            <w:pPr>
+              <w:spacing w:after="20" w:line="240" w:lineRule="auto"/>
+            </w:pPr>
+            <w:r>
+              <w:rPr>
+                <w:b w:val="0"/>
+                <w:sz w:val="20"/>
+              </w:rPr>
+              <w:t>Overlay source copies</w:t>
+            </w:r>
+          </w:p>
+        </w:tc>
+        <w:tc>
+          <w:tcPr>
+            <w:tcW w:type="dxa" w:w="1304"/>
+            <w:vAlign w:val="center"/>
+            <w:tcBorders>
+              <w:top w:val="single" w:sz="4" w:color="D9D9D9"/>
+              <w:left w:val="single" w:sz="4" w:color="D9D9D9"/>
+              <w:bottom w:val="single" w:sz="4" w:color="D9D9D9"/>
+              <w:right w:val="single" w:sz="4" w:color="D9D9D9"/>
+            </w:tcBorders>
+            <w:tcMar>
+              <w:top w:w="85" w:type="dxa"/>
+              <w:left w:w="85" w:type="dxa"/>
+              <w:bottom w:w="85" w:type="dxa"/>
+              <w:right w:w="85" w:type="dxa"/>
+            </w:tcMar>
+          </w:tcPr>
+          <w:p>
+            <w:pPr>
+              <w:spacing w:after="20" w:line="240" w:lineRule="auto"/>
+            </w:pPr>
+            <w:r>
+              <w:rPr>
+                <w:b w:val="0"/>
+                <w:sz w:val="20"/>
+              </w:rPr>
+              <w:t>28</w:t>
+            </w:r>
+          </w:p>
+        </w:tc>
+        <w:tc>
+          <w:tcPr>
+            <w:tcW w:type="dxa" w:w="5329"/>
+            <w:vAlign w:val="center"/>
+            <w:tcBorders>
+              <w:top w:val="single" w:sz="4" w:color="D9D9D9"/>
+              <w:left w:val="single" w:sz="4" w:color="D9D9D9"/>
+              <w:bottom w:val="single" w:sz="4" w:color="D9D9D9"/>
+              <w:right w:val="single" w:sz="4" w:color="D9D9D9"/>
+            </w:tcBorders>
+            <w:tcMar>
+              <w:top w:w="85" w:type="dxa"/>
+              <w:left w:w="85" w:type="dxa"/>
+              <w:bottom w:w="85" w:type="dxa"/>
+              <w:right w:w="85" w:type="dxa"/>
+            </w:tcMar>
+          </w:tcPr>
+          <w:p>
+            <w:pPr>
+              <w:spacing w:after="20" w:line="240" w:lineRule="auto"/>
+            </w:pPr>
+            <w:r>
+              <w:rPr>
+                <w:b w:val="0"/>
+                <w:sz w:val="20"/>
+              </w:rPr>
+              <w:t>Seven overlays across four stock controller RAM banks</w:t>
             </w:r>
           </w:p>
         </w:tc>
@@ -6556,12 +7905,12 @@
     <w:p/>
     <w:p>
       <w:r>
-        <w:t>The new mapper entries are C6E5 for the six-position count, C6F4 for size distribution and C92A for descriptor expansion under the conditional placement. The first candidate source is 0A60 and the second is 0880; expanded banks begin at E8F4 with a stride of 0080. The codeword constructor is C9BF under that placement.</w:t>
+        <w:t>Mapper entries are AB06 for received-record transfer, C870 for unpacking, C6E5 for the six-position count, C6F4 for size distribution and C92A for descriptor expansion. The first candidate source is 0A60 and the second is 0880; expanded banks begin at E8F4 with a stride of 0080. The codeword constructor is C9BF; the integrated startup caller begins at C840.</w:t>
       </w:r>
     </w:p>
     <w:p>
       <w:r>
-        <w:t>Reproduce with tools/recover_3453c_x2.py, tools/recover_x2_server.py and tools/recover_x2_mapper.py using the repository virtual environment. The last script explicitly marks its placement assumption and does not alter the production overlay map. It compiles the manual C lifts and compares their data effects with original instructions in the native emulator.</w:t>
+        <w:t>Reproduce with tools/recover_3453c_x2.py, tools/recover_x2_server.py and tools/recover_x2_mapper.py using the repository virtual environment. The mapper script compiles the manual C lift and compares its data effects with original instructions in the native emulator. It also executes the original startup chain and checks its resulting banks. Run tools/verify_quad_pcm_placement.py for the independent stock controller source-copy check; its report records the corrected offsets and complete copy lengths.</w:t>
       </w:r>
     </w:p>
     <w:p>
@@ -6571,7 +7920,7 @@
     </w:p>
     <w:p>
       <w:r>
-        <w:t>Draft 0.2 replaces address-led explanations with operating procedures and adds provisional six-position mapper behavior, announcement framing and an explicit receiver-recognition gap. Complete call negotiation and downstream payload mapping remain open.</w:t>
+        <w:t>Draft 0.3 adds verified source placement, received-parameter decoding, exhaustive position-control coverage and integrated startup constructor checks. It distinguishes alternative constructor tables from the two expansion candidates. Complete call negotiation and downstream payload mapping remain open.</w:t>
       </w:r>
     </w:p>
     <w:sectPr>
@@ -6614,7 +7963,7 @@
       <w:rPr>
         <w:sz w:val="18"/>
       </w:rPr>
-      <w:t>COURIER EMU     x2 firmware reconstruction     Draft 0.2</w:t>
+      <w:t>COURIER EMU     x2 firmware reconstruction     Draft 0.3</w:t>
     </w:r>
   </w:p>
 </w:hdr>

</xml_diff>

<commit_message>
Find the server receiver for the x2 7-bit marker
QF060003 arms its INFO receiver for a 7-bit body at 9791 (IM020104 at
948a); the parse at 97b5 reads carrier plus two indices and keeps x2 only
when the role-selected index is 6. Retracts the 'no receiver' claims.
Spec draft 0.12.

Co-Authored-By: Claude Sonnet 5.5 <noreply@anthropic.com>
</commit_message>
<xml_diff>
--- a/artifacts/x2-spec-20261004/x2-technical-specification.docx
+++ b/artifacts/x2-spec-20261004/x2-technical-specification.docx
@@ -20,7 +20,7 @@
     </w:p>
     <w:p>
       <w:r>
-        <w:t>Draft 0.11   •   Independent firmware reconstruction   •   4 October 2026</w:t>
+        <w:t>Draft 0.12   •   Independent firmware reconstruction   •   4 October 2026</w:t>
       </w:r>
     </w:p>
     <w:p>
@@ -3390,7 +3390,7 @@
         <w:pStyle w:val="Heading2"/>
       </w:pPr>
       <w:r>
-        <w:t>5 2 Receiver recognition remains open</w:t>
+        <w:t>5 2 Receiver recognition</w:t>
       </w:r>
     </w:p>
     <w:p>
@@ -3400,7 +3400,17 @@
     </w:p>
     <w:p>
       <w:r>
-        <w:t>No receiver for the proprietary seven-bit body has been conclusively identified. The framing script proves construction of an announcement; it does not prove how a server accepts it. The document therefore does not assign an acknowledgement, timeout or retry procedure to this message.</w:t>
+        <w:t>The receiver is the ordinary framed INFO receiver, armed for a seven-bit body. The Quad server arms it after its capability gate, which requires the x2 capability word to be selected, a set peer bit and a differing eleventh word bit between the peer and local capability words. The body is accepted as a frame by the standard synchronization and CRC test; the receiver does not search the raw bit stream.</w:t>
+      </w:r>
+    </w:p>
+    <w:p>
+      <w:r>
+        <w:t>The parse reads the carrier bit first, then two three-bit indices in transmission order. The role flag selects which index belongs to the receiver. If that index is six the server keeps the x2 state and records the carrier choice for the other index; otherwise it clears the x2 selection and continues as ordinary V.34. The originator announcement 4D hexadecimal is therefore accepted by a server holding the answering role flag, and the answerer announcement 69 hexadecimal by the opposite flag. The symmetric values 48 and 49 hexadecimal contain no six and are not accepted as x2 markers.</w:t>
+      </w:r>
+    </w:p>
+    <w:p>
+      <w:r>
+        <w:t>Executing the original parse for every body value and both role flag values reproduces this layout, with thirty-two accepted combinations. The CRC and synchronization check was read but was not run on a transmitted frame, and the acknowledgement, timeout or retry that follows acceptance is not assigned here.</w:t>
       </w:r>
     </w:p>
     <w:p>
@@ -17043,6 +17053,18 @@
         <w:rPr>
           <w:sz w:val="20"/>
         </w:rPr>
+        <w:t>The marker receiver is documented at the end of docs/x2-v90-protocol-selection.md; tools/verify_x2_marker_receiver.py runs the original QF060003 parse from 97B5 and writes artifacts/x2-marker-receiver-20261004/verification.json. The arming site is 9791; the IM020104 counterpart is 948A.</w:t>
+      </w:r>
+    </w:p>
+    <w:p>
+      <w:pPr>
+        <w:keepLines/>
+        <w:spacing w:after="80"/>
+      </w:pPr>
+      <w:r>
+        <w:rPr>
+          <w:sz w:val="20"/>
+        </w:rPr>
         <w:t>The payload entries are B2BA for source append, C5DF for amplitude selection, C642 for signs and C544 for frame output. Builder entry C862 receives a preselected rate index. The tested branch has 039F bit 7 and FFD9 bit 12 clear. Profiles use default position choices, flags zero and one, mode zero for rate indices 1 through 15, and SPM 1. Continuous streams cover indices 10 and 15. tools/probe_x2_57333_profile.py additionally checks the rate-15 bank variants; x2-57333-profile-20261004 preserves the candidate scan and bank snapshots. verification.json and example.json preserve the results. The payload aggregate counts component cases, sample steps and streams; it does not represent independent connection trials.</w:t>
       </w:r>
     </w:p>
@@ -17068,7 +17090,7 @@
         <w:rPr>
           <w:sz w:val="20"/>
         </w:rPr>
-        <w:t>Draft 0.11 resolves the 3453C capability route: the transmitted INFO0 word is the plain tag 51 word and the tag 70 word is never read. Draft 0.10 adds pre-V.90 and later client rate selection, position grouping, variable-length body construction and original serialization. It distinguishes the host diagnostic report from peer records and records the XC timing correction and successful symmetric regression. Draft 0.9 executes the four-word PCM record receiver through CRC acceptance, rate-mask selection, bank construction, mapped output and later payload-source activation. The client measurement-to-record producer and complete call-state selection remain open. Draft 0.8 verified 57333 profiles and corrected builder product scaling to SPM 1. Draft 0.7 confirmed active GPC scrambling and pre-data resets in the symmetric 64000 pair. Analogue client decoding, alternate companding output and complete peer negotiation remain open.</w:t>
+        <w:t>Draft 0.12 identifies the server receiver for the seven-bit marker and verifies its field parse. Draft 0.11 resolves the 3453C capability route: the transmitted INFO0 word is the plain tag 51 word and the tag 70 word is never read. Draft 0.10 adds pre-V.90 and later client rate selection, position grouping, variable-length body construction and original serialization. It distinguishes the host diagnostic report from peer records and records the XC timing correction and successful symmetric regression. Draft 0.9 executes the four-word PCM record receiver through CRC acceptance, rate-mask selection, bank construction, mapped output and later payload-source activation. The client measurement-to-record producer and complete call-state selection remain open. Draft 0.8 verified 57333 profiles and corrected builder product scaling to SPM 1. Draft 0.7 confirmed active GPC scrambling and pre-data resets in the symmetric 64000 pair. Analogue client decoding, alternate companding output and complete peer negotiation remain open.</w:t>
       </w:r>
     </w:p>
     <w:p>
@@ -17207,7 +17229,7 @@
       <w:rPr>
         <w:sz w:val="18"/>
       </w:rPr>
-      <w:t>COURIER EMU     x2 firmware reconstruction     Draft 0.11</w:t>
+      <w:t>COURIER EMU     x2 firmware reconstruction     Draft 0.12</w:t>
     </w:r>
   </w:p>
 </w:hdr>

</xml_diff>

<commit_message>
Trace the server after x2 marker acceptance
Accept branch clears role bits, marks x2, resets receive state, retunes
symbol rate and carrier from the announced index, swaps timing hooks and
reports index to the host (0034). Records that the analog 53333 call fails
with the uncommitted native changes. Spec draft 0.13.

Co-Authored-By: Claude Sonnet 5.5 <noreply@anthropic.com>
</commit_message>
<xml_diff>
--- a/artifacts/x2-spec-20261004/x2-technical-specification.docx
+++ b/artifacts/x2-spec-20261004/x2-technical-specification.docx
@@ -20,7 +20,7 @@
     </w:p>
     <w:p>
       <w:r>
-        <w:t>Draft 0.12   •   Independent firmware reconstruction   •   4 October 2026</w:t>
+        <w:t>Draft 0.13   •   Independent firmware reconstruction   •   4 October 2026</w:t>
       </w:r>
     </w:p>
     <w:p>
@@ -3410,7 +3410,12 @@
     </w:p>
     <w:p>
       <w:r>
-        <w:t>Executing the original parse for every body value and both role flag values reproduces this layout, with thirty-two accepted combinations. The CRC and synchronization check was read but was not run on a transmitted frame, and the acknowledgement, timeout or retry that follows acceptance is not assigned here.</w:t>
+        <w:t>Executing the original parse for every body value and both role flag values reproduces this layout, with thirty-two accepted combinations. In a recorded analogue client to I-modem call the server buffer holds the originator announcement 4D hexadecimal at the position the parse reads, and the accept branch executes.</w:t>
+      </w:r>
+    </w:p>
+    <w:p>
+      <w:r>
+        <w:t>Acceptance is not answered on the line. The server clears the role flag bits, sets an x2 mark, resets its receive state, retunes its receive symbol rate and carrier from the announced index and carrier bit, installs a different pair of timing callbacks and waits a fixed count of symbol periods. It then reports the index to the host. The index is the ordinary V.34 symbol rate index, with 4 meaning 3200 symbols per second. Acknowledgement, timeout and retry behavior beyond this are not established.</w:t>
       </w:r>
     </w:p>
     <w:p>
@@ -17090,7 +17095,7 @@
         <w:rPr>
           <w:sz w:val="20"/>
         </w:rPr>
-        <w:t>Draft 0.12 identifies the server receiver for the seven-bit marker and verifies its field parse. Draft 0.11 resolves the 3453C capability route: the transmitted INFO0 word is the plain tag 51 word and the tag 70 word is never read. Draft 0.10 adds pre-V.90 and later client rate selection, position grouping, variable-length body construction and original serialization. It distinguishes the host diagnostic report from peer records and records the XC timing correction and successful symmetric regression. Draft 0.9 executes the four-word PCM record receiver through CRC acceptance, rate-mask selection, bank construction, mapped output and later payload-source activation. The client measurement-to-record producer and complete call-state selection remain open. Draft 0.8 verified 57333 profiles and corrected builder product scaling to SPM 1. Draft 0.7 confirmed active GPC scrambling and pre-data resets in the symmetric 64000 pair. Analogue client decoding, alternate companding output and complete peer negotiation remain open.</w:t>
+        <w:t>Draft 0.13 traces the server after marker acceptance. Draft 0.12 identifies the server receiver for the seven-bit marker and verifies its field parse. Draft 0.11 resolves the 3453C capability route: the transmitted INFO0 word is the plain tag 51 word and the tag 70 word is never read. Draft 0.10 adds pre-V.90 and later client rate selection, position grouping, variable-length body construction and original serialization. It distinguishes the host diagnostic report from peer records and records the XC timing correction and successful symmetric regression. Draft 0.9 executes the four-word PCM record receiver through CRC acceptance, rate-mask selection, bank construction, mapped output and later payload-source activation. The client measurement-to-record producer and complete call-state selection remain open. Draft 0.8 verified 57333 profiles and corrected builder product scaling to SPM 1. Draft 0.7 confirmed active GPC scrambling and pre-data resets in the symmetric 64000 pair. Analogue client decoding, alternate companding output and complete peer negotiation remain open.</w:t>
       </w:r>
     </w:p>
     <w:p>
@@ -17229,7 +17234,7 @@
       <w:rPr>
         <w:sz w:val="18"/>
       </w:rPr>
-      <w:t>COURIER EMU     x2 firmware reconstruction     Draft 0.12</w:t>
+      <w:t>COURIER EMU     x2 firmware reconstruction     Draft 0.13</w:t>
     </w:r>
   </w:p>
 </w:hdr>

</xml_diff>

<commit_message>
Specify the server peer-role gate on the exchanged INFO0 words
Co-Authored-By: Claude Sonnet 5.5 <noreply@anthropic.com>
</commit_message>
<xml_diff>
--- a/artifacts/x2-spec-20261004/x2-technical-specification.docx
+++ b/artifacts/x2-spec-20261004/x2-technical-specification.docx
@@ -20,7 +20,7 @@
     </w:p>
     <w:p>
       <w:r>
-        <w:t>Draft 0.13   •   Independent firmware reconstruction   •   4 October 2026</w:t>
+        <w:t>Draft 0.14   •   Independent firmware reconstruction   •   4 October 2026</w:t>
       </w:r>
     </w:p>
     <w:p>
@@ -8168,6 +8168,11 @@
     </w:p>
     <w:p>
       <w:r>
+        <w:t>The server decides how to treat the peer from the two exchanged capability words before it arms the marker receiver in clause 5.2. In INFO0 bit numbers it requires the peer to advertise high-carrier 3200 symbol operation, bit 18. It then compares the asymmetry most significant bit, bit 23, and the CME bit, bit 24. If both words have bit 23 set, it leaves the marker path and takes a separate startup path that sets a state flag and installs different handlers; this agrees with the symmetric role in which both endpoints set that bit, but the path itself was not traced. Otherwise the two words must differ in bit 24, which separates a server from a client, and the peer is treated as a client. If the words are equal in bit 24 the x2 selection is dropped. Both server images contain this test.</w:t>
+      </w:r>
+    </w:p>
+    <w:p>
+      <w:r>
         <w:t>Capability advertisement, enabled-rate mask and datapump mode are separate parameters. The actual engine mode comes from call descriptors, through a different command path. A capability bit does not by itself identify the active engine branch. The fixed digital-call controls in S67 also operate separately from S58 symmetric capability. Annex A records the corrected command identities and source references.</w:t>
       </w:r>
     </w:p>
@@ -8625,7 +8630,7 @@
     </w:p>
     <w:p>
       <w:r>
-        <w:t>Peer role selection from INFO0, startup ordering, rate acknowledgement, alignment, complete queue semantics and retrain or fallback behavior remain open. The component lift uses IM020104; the live trace uses Ie030002. Their instructions have not been shown identical.</w:t>
+        <w:t>The server side of peer role selection from INFO0 is described in clause 12 2. The client side, startup ordering after marker acceptance, rate acknowledgement, alignment, complete queue semantics and retrain or fallback behavior remain open. The component lift uses IM020104; the live trace uses Ie030002. Their instructions have not been shown identical.</w:t>
       </w:r>
     </w:p>
     <w:p>
@@ -17095,7 +17100,7 @@
         <w:rPr>
           <w:sz w:val="20"/>
         </w:rPr>
-        <w:t>Draft 0.13 traces the server after marker acceptance. Draft 0.12 identifies the server receiver for the seven-bit marker and verifies its field parse. Draft 0.11 resolves the 3453C capability route: the transmitted INFO0 word is the plain tag 51 word and the tag 70 word is never read. Draft 0.10 adds pre-V.90 and later client rate selection, position grouping, variable-length body construction and original serialization. It distinguishes the host diagnostic report from peer records and records the XC timing correction and successful symmetric regression. Draft 0.9 executes the four-word PCM record receiver through CRC acceptance, rate-mask selection, bank construction, mapped output and later payload-source activation. The client measurement-to-record producer and complete call-state selection remain open. Draft 0.8 verified 57333 profiles and corrected builder product scaling to SPM 1. Draft 0.7 confirmed active GPC scrambling and pre-data resets in the symmetric 64000 pair. Analogue client decoding, alternate companding output and complete peer negotiation remain open.</w:t>
+        <w:t>Draft 0.14 specifies the server peer-role test on the exchanged INFO0 words. Draft 0.13 traces the server after marker acceptance. Draft 0.12 identifies the server receiver for the seven-bit marker and verifies its field parse. Draft 0.11 resolves the 3453C capability route: the transmitted INFO0 word is the plain tag 51 word and the tag 70 word is never read. Draft 0.10 adds pre-V.90 and later client rate selection, position grouping, variable-length body construction and original serialization. It distinguishes the host diagnostic report from peer records and records the XC timing correction and successful symmetric regression. Draft 0.9 executes the four-word PCM record receiver through CRC acceptance, rate-mask selection, bank construction, mapped output and later payload-source activation. The client measurement-to-record producer and complete call-state selection remain open. Draft 0.8 verified 57333 profiles and corrected builder product scaling to SPM 1. Draft 0.7 confirmed active GPC scrambling and pre-data resets in the symmetric 64000 pair. Analogue client decoding, alternate companding output and complete peer negotiation remain open.</w:t>
       </w:r>
     </w:p>
     <w:p>
@@ -17234,7 +17239,7 @@
       <w:rPr>
         <w:sz w:val="18"/>
       </w:rPr>
-      <w:t>COURIER EMU     x2 firmware reconstruction     Draft 0.13</w:t>
+      <w:t>COURIER EMU     x2 firmware reconstruction     Draft 0.14</w:t>
     </w:r>
   </w:p>
 </w:hdr>

</xml_diff>

<commit_message>
Trace the symmetric x2 startup branch on both server images
Co-Authored-By: Claude Sonnet 5.5 <noreply@anthropic.com>
</commit_message>
<xml_diff>
--- a/artifacts/x2-spec-20261004/x2-technical-specification.docx
+++ b/artifacts/x2-spec-20261004/x2-technical-specification.docx
@@ -20,7 +20,7 @@
     </w:p>
     <w:p>
       <w:r>
-        <w:t>Draft 0.14   •   Independent firmware reconstruction   •   4 October 2026</w:t>
+        <w:t>Draft 0.15   •   Independent firmware reconstruction   •   4 October 2026</w:t>
       </w:r>
     </w:p>
     <w:p>
@@ -8168,7 +8168,7 @@
     </w:p>
     <w:p>
       <w:r>
-        <w:t>The server decides how to treat the peer from the two exchanged capability words before it arms the marker receiver in clause 5.2. In INFO0 bit numbers it requires the peer to advertise high-carrier 3200 symbol operation, bit 18. It then compares the asymmetry most significant bit, bit 23, and the CME bit, bit 24. If both words have bit 23 set, it leaves the marker path and takes a separate startup path that sets a state flag and installs different handlers; this agrees with the symmetric role in which both endpoints set that bit, but the path itself was not traced. Otherwise the two words must differ in bit 24, which separates a server from a client, and the peer is treated as a client. If the words are equal in bit 24 the x2 selection is dropped. Both server images contain this test.</w:t>
+        <w:t>The server decides how to treat the peer from the two exchanged capability words before it arms the marker receiver in clause 5.2. In INFO0 bit numbers it requires the peer to advertise high-carrier 3200 symbol operation, bit 18. It then compares the asymmetry most significant bit, bit 23, and the CME bit, bit 24. If both words have bit 23 set, it leaves the marker path and enters the common mode initializer with a locally written mode word, using the role flag to split the two ends. The initializer installs the digital startup source, a repeated sequence of 1,747 constant words, seven zero words and 128 ascending and descending pairs. The answering end then runs that source, whereas the originating end installs a short stub whose output was not decoded. A trace of both servers in the recorded symmetric call executes this branch and not the marker path. Otherwise the two words must differ in bit 24, which separates a server from a client, and the peer is treated as a client. If the words are equal in bit 24 the x2 selection is dropped. Both server images contain this test.</w:t>
       </w:r>
     </w:p>
     <w:p>
@@ -17100,7 +17100,7 @@
         <w:rPr>
           <w:sz w:val="20"/>
         </w:rPr>
-        <w:t>Draft 0.14 specifies the server peer-role test on the exchanged INFO0 words. Draft 0.13 traces the server after marker acceptance. Draft 0.12 identifies the server receiver for the seven-bit marker and verifies its field parse. Draft 0.11 resolves the 3453C capability route: the transmitted INFO0 word is the plain tag 51 word and the tag 70 word is never read. Draft 0.10 adds pre-V.90 and later client rate selection, position grouping, variable-length body construction and original serialization. It distinguishes the host diagnostic report from peer records and records the XC timing correction and successful symmetric regression. Draft 0.9 executes the four-word PCM record receiver through CRC acceptance, rate-mask selection, bank construction, mapped output and later payload-source activation. The client measurement-to-record producer and complete call-state selection remain open. Draft 0.8 verified 57333 profiles and corrected builder product scaling to SPM 1. Draft 0.7 confirmed active GPC scrambling and pre-data resets in the symmetric 64000 pair. Analogue client decoding, alternate companding output and complete peer negotiation remain open.</w:t>
+        <w:t>Draft 0.15 traces the symmetric startup branch. Draft 0.14 specifies the server peer-role test on the exchanged INFO0 words. Draft 0.13 traces the server after marker acceptance. Draft 0.12 identifies the server receiver for the seven-bit marker and verifies its field parse. Draft 0.11 resolves the 3453C capability route: the transmitted INFO0 word is the plain tag 51 word and the tag 70 word is never read. Draft 0.10 adds pre-V.90 and later client rate selection, position grouping, variable-length body construction and original serialization. It distinguishes the host diagnostic report from peer records and records the XC timing correction and successful symmetric regression. Draft 0.9 executes the four-word PCM record receiver through CRC acceptance, rate-mask selection, bank construction, mapped output and later payload-source activation. The client measurement-to-record producer and complete call-state selection remain open. Draft 0.8 verified 57333 profiles and corrected builder product scaling to SPM 1. Draft 0.7 confirmed active GPC scrambling and pre-data resets in the symmetric 64000 pair. Analogue client decoding, alternate companding output and complete peer negotiation remain open.</w:t>
       </w:r>
     </w:p>
     <w:p>
@@ -17239,7 +17239,7 @@
       <w:rPr>
         <w:sz w:val="18"/>
       </w:rPr>
-      <w:t>COURIER EMU     x2 firmware reconstruction     Draft 0.14</w:t>
+      <w:t>COURIER EMU     x2 firmware reconstruction     Draft 0.15</w:t>
     </w:r>
   </w:p>
 </w:hdr>

</xml_diff>

<commit_message>
Decode the originating-end idle stub and the wait that ends it
Co-Authored-By: Claude Sonnet 5.5 <noreply@anthropic.com>
</commit_message>
<xml_diff>
--- a/artifacts/x2-spec-20261004/x2-technical-specification.docx
+++ b/artifacts/x2-spec-20261004/x2-technical-specification.docx
@@ -20,7 +20,7 @@
     </w:p>
     <w:p>
       <w:r>
-        <w:t>Draft 0.15   •   Independent firmware reconstruction   •   4 October 2026</w:t>
+        <w:t>Draft 0.16   •   Independent firmware reconstruction   •   4 October 2026</w:t>
       </w:r>
     </w:p>
     <w:p>
@@ -8168,7 +8168,7 @@
     </w:p>
     <w:p>
       <w:r>
-        <w:t>The server decides how to treat the peer from the two exchanged capability words before it arms the marker receiver in clause 5.2. In INFO0 bit numbers it requires the peer to advertise high-carrier 3200 symbol operation, bit 18. It then compares the asymmetry most significant bit, bit 23, and the CME bit, bit 24. If both words have bit 23 set, it leaves the marker path and enters the common mode initializer with a locally written mode word, using the role flag to split the two ends. The initializer installs the digital startup source, a repeated sequence of 1,747 constant words, seven zero words and 128 ascending and descending pairs. The answering end then runs that source, whereas the originating end installs a short stub whose output was not decoded. A trace of both servers in the recorded symmetric call executes this branch and not the marker path. Otherwise the two words must differ in bit 24, which separates a server from a client, and the peer is treated as a client. If the words are equal in bit 24 the x2 selection is dropped. Both server images contain this test.</w:t>
+        <w:t>The server decides how to treat the peer from the two exchanged capability words before it arms the marker receiver in clause 5.2. In INFO0 bit numbers it requires the peer to advertise high-carrier 3200 symbol operation, bit 18. It then compares the asymmetry most significant bit, bit 23, and the CME bit, bit 24. If both words have bit 23 set, it leaves the marker path and enters the common mode initializer with a locally written mode word, using the role flag to split the two ends. The initializer installs the digital startup source, a repeated sequence of 1,747 constant words, seven zero words and 128 ascending and descending pairs. The answering end runs that source at once. The originating end keeps its idle transmit hook, which writes one constant idle word per call, and starts the source only after its receive state machine has seen a run of source words from the answering end, in the recorded call about ten million DSP instructions later. A trace of both servers in the recorded symmetric call executes this branch and not the marker path. Otherwise the two words must differ in bit 24, which separates a server from a client, and the peer is treated as a client. If the words are equal in bit 24 the x2 selection is dropped. Both server images contain this test.</w:t>
       </w:r>
     </w:p>
     <w:p>
@@ -17100,7 +17100,7 @@
         <w:rPr>
           <w:sz w:val="20"/>
         </w:rPr>
-        <w:t>Draft 0.15 traces the symmetric startup branch. Draft 0.14 specifies the server peer-role test on the exchanged INFO0 words. Draft 0.13 traces the server after marker acceptance. Draft 0.12 identifies the server receiver for the seven-bit marker and verifies its field parse. Draft 0.11 resolves the 3453C capability route: the transmitted INFO0 word is the plain tag 51 word and the tag 70 word is never read. Draft 0.10 adds pre-V.90 and later client rate selection, position grouping, variable-length body construction and original serialization. It distinguishes the host diagnostic report from peer records and records the XC timing correction and successful symmetric regression. Draft 0.9 executes the four-word PCM record receiver through CRC acceptance, rate-mask selection, bank construction, mapped output and later payload-source activation. The client measurement-to-record producer and complete call-state selection remain open. Draft 0.8 verified 57333 profiles and corrected builder product scaling to SPM 1. Draft 0.7 confirmed active GPC scrambling and pre-data resets in the symmetric 64000 pair. Analogue client decoding, alternate companding output and complete peer negotiation remain open.</w:t>
+        <w:t>Draft 0.16 decodes the originating-end idle stub and the wait that ends it. Draft 0.15 traces the symmetric startup branch. Draft 0.14 specifies the server peer-role test on the exchanged INFO0 words. Draft 0.13 traces the server after marker acceptance. Draft 0.12 identifies the server receiver for the seven-bit marker and verifies its field parse. Draft 0.11 resolves the 3453C capability route: the transmitted INFO0 word is the plain tag 51 word and the tag 70 word is never read. Draft 0.10 adds pre-V.90 and later client rate selection, position grouping, variable-length body construction and original serialization. It distinguishes the host diagnostic report from peer records and records the XC timing correction and successful symmetric regression. Draft 0.9 executes the four-word PCM record receiver through CRC acceptance, rate-mask selection, bank construction, mapped output and later payload-source activation. The client measurement-to-record producer and complete call-state selection remain open. Draft 0.8 verified 57333 profiles and corrected builder product scaling to SPM 1. Draft 0.7 confirmed active GPC scrambling and pre-data resets in the symmetric 64000 pair. Analogue client decoding, alternate companding output and complete peer negotiation remain open.</w:t>
       </w:r>
     </w:p>
     <w:p>
@@ -17239,7 +17239,7 @@
       <w:rPr>
         <w:sz w:val="18"/>
       </w:rPr>
-      <w:t>COURIER EMU     x2 firmware reconstruction     Draft 0.15</w:t>
+      <w:t>COURIER EMU     x2 firmware reconstruction     Draft 0.16</w:t>
     </w:r>
   </w:p>
 </w:hdr>

</xml_diff>

<commit_message>
Trace the symmetric startup-source receiver that ends the originator's wait
Co-Authored-By: Claude Sonnet 5.5 <noreply@anthropic.com>
</commit_message>
<xml_diff>
--- a/artifacts/x2-spec-20261004/x2-technical-specification.docx
+++ b/artifacts/x2-spec-20261004/x2-technical-specification.docx
@@ -20,7 +20,7 @@
     </w:p>
     <w:p>
       <w:r>
-        <w:t>Draft 0.16   •   Independent firmware reconstruction   •   4 October 2026</w:t>
+        <w:t>Draft 0.17   •   Independent firmware reconstruction   •   4 October 2026</w:t>
       </w:r>
     </w:p>
     <w:p>
@@ -8168,7 +8168,7 @@
     </w:p>
     <w:p>
       <w:r>
-        <w:t>The server decides how to treat the peer from the two exchanged capability words before it arms the marker receiver in clause 5.2. In INFO0 bit numbers it requires the peer to advertise high-carrier 3200 symbol operation, bit 18. It then compares the asymmetry most significant bit, bit 23, and the CME bit, bit 24. If both words have bit 23 set, it leaves the marker path and enters the common mode initializer with a locally written mode word, using the role flag to split the two ends. The initializer installs the digital startup source, a repeated sequence of 1,747 constant words, seven zero words and 128 ascending and descending pairs. The answering end runs that source at once. The originating end keeps its idle transmit hook, which writes one constant idle word per call, and starts the source only after its receive state machine has seen a run of source words from the answering end, in the recorded call about ten million DSP instructions later. A trace of both servers in the recorded symmetric call executes this branch and not the marker path. Otherwise the two words must differ in bit 24, which separates a server from a client, and the peer is treated as a client. If the words are equal in bit 24 the x2 selection is dropped. Both server images contain this test.</w:t>
+        <w:t>The server decides how to treat the peer from the two exchanged capability words before it arms the marker receiver in clause 5.2. In INFO0 bit numbers it requires the peer to advertise high-carrier 3200 symbol operation, bit 18. It then compares the asymmetry most significant bit, bit 23, and the CME bit, bit 24. If both words have bit 23 set, it leaves the marker path and enters the common mode initializer with a locally written mode word, using the role flag to split the two ends. The initializer installs the digital startup source, a repeated sequence of 1,747 constant words, seven zero words and 128 ascending and descending pairs. The answering end runs that source at once. The originating end keeps its idle transmit hook, which writes one constant idle word per call, and starts the source only after its receive state machine has acquired the answering end source cycle. That machine is a word receiver: it needs seven consecutive run words, then seven low-valued zero words, then verifies the 128 ramp pairs one word at a time, the first of each pair against a running count and the second against its complement from 255. Both ends run the same receiver on the peer source. In the recorded call the originating end completed it about ten million DSP instructions after starting to listen. A trace of both servers in the recorded symmetric call executes this branch and not the marker path. Otherwise the two words must differ in bit 24, which separates a server from a client, and the peer is treated as a client. If the words are equal in bit 24 the x2 selection is dropped. Both server images contain this test.</w:t>
       </w:r>
     </w:p>
     <w:p>
@@ -17100,7 +17100,7 @@
         <w:rPr>
           <w:sz w:val="20"/>
         </w:rPr>
-        <w:t>Draft 0.16 decodes the originating-end idle stub and the wait that ends it. Draft 0.15 traces the symmetric startup branch. Draft 0.14 specifies the server peer-role test on the exchanged INFO0 words. Draft 0.13 traces the server after marker acceptance. Draft 0.12 identifies the server receiver for the seven-bit marker and verifies its field parse. Draft 0.11 resolves the 3453C capability route: the transmitted INFO0 word is the plain tag 51 word and the tag 70 word is never read. Draft 0.10 adds pre-V.90 and later client rate selection, position grouping, variable-length body construction and original serialization. It distinguishes the host diagnostic report from peer records and records the XC timing correction and successful symmetric regression. Draft 0.9 executes the four-word PCM record receiver through CRC acceptance, rate-mask selection, bank construction, mapped output and later payload-source activation. The client measurement-to-record producer and complete call-state selection remain open. Draft 0.8 verified 57333 profiles and corrected builder product scaling to SPM 1. Draft 0.7 confirmed active GPC scrambling and pre-data resets in the symmetric 64000 pair. Analogue client decoding, alternate companding output and complete peer negotiation remain open.</w:t>
+        <w:t>Draft 0.17 decodes the startup source receiver that ends the wait. Draft 0.16 decodes the originating-end idle stub and the wait that ends it. Draft 0.15 traces the symmetric startup branch. Draft 0.14 specifies the server peer-role test on the exchanged INFO0 words. Draft 0.13 traces the server after marker acceptance. Draft 0.12 identifies the server receiver for the seven-bit marker and verifies its field parse. Draft 0.11 resolves the 3453C capability route: the transmitted INFO0 word is the plain tag 51 word and the tag 70 word is never read. Draft 0.10 adds pre-V.90 and later client rate selection, position grouping, variable-length body construction and original serialization. It distinguishes the host diagnostic report from peer records and records the XC timing correction and successful symmetric regression. Draft 0.9 executes the four-word PCM record receiver through CRC acceptance, rate-mask selection, bank construction, mapped output and later payload-source activation. The client measurement-to-record producer and complete call-state selection remain open. Draft 0.8 verified 57333 profiles and corrected builder product scaling to SPM 1. Draft 0.7 confirmed active GPC scrambling and pre-data resets in the symmetric 64000 pair. Analogue client decoding, alternate companding output and complete peer negotiation remain open.</w:t>
       </w:r>
     </w:p>
     <w:p>
@@ -17239,7 +17239,7 @@
       <w:rPr>
         <w:sz w:val="18"/>
       </w:rPr>
-      <w:t>COURIER EMU     x2 firmware reconstruction     Draft 0.16</w:t>
+      <w:t>COURIER EMU     x2 firmware reconstruction     Draft 0.17</w:t>
     </w:r>
   </w:p>
 </w:hdr>

</xml_diff>

<commit_message>
Decode the startup-source receiver mismatch handling
Co-Authored-By: Claude Sonnet 5.5 <noreply@anthropic.com>
</commit_message>
<xml_diff>
--- a/artifacts/x2-spec-20261004/x2-technical-specification.docx
+++ b/artifacts/x2-spec-20261004/x2-technical-specification.docx
@@ -20,7 +20,7 @@
     </w:p>
     <w:p>
       <w:r>
-        <w:t>Draft 0.17   •   Independent firmware reconstruction   •   4 October 2026</w:t>
+        <w:t>Draft 0.18   •   Independent firmware reconstruction   •   4 October 2026</w:t>
       </w:r>
     </w:p>
     <w:p>
@@ -8168,7 +8168,7 @@
     </w:p>
     <w:p>
       <w:r>
-        <w:t>The server decides how to treat the peer from the two exchanged capability words before it arms the marker receiver in clause 5.2. In INFO0 bit numbers it requires the peer to advertise high-carrier 3200 symbol operation, bit 18. It then compares the asymmetry most significant bit, bit 23, and the CME bit, bit 24. If both words have bit 23 set, it leaves the marker path and enters the common mode initializer with a locally written mode word, using the role flag to split the two ends. The initializer installs the digital startup source, a repeated sequence of 1,747 constant words, seven zero words and 128 ascending and descending pairs. The answering end runs that source at once. The originating end keeps its idle transmit hook, which writes one constant idle word per call, and starts the source only after its receive state machine has acquired the answering end source cycle. That machine is a word receiver: it needs seven consecutive run words, then seven low-valued zero words, then verifies the 128 ramp pairs one word at a time, the first of each pair against a running count and the second against its complement from 255. Both ends run the same receiver on the peer source. In the recorded call the originating end completed it about ten million DSP instructions after starting to listen. A trace of both servers in the recorded symmetric call executes this branch and not the marker path. Otherwise the two words must differ in bit 24, which separates a server from a client, and the peer is treated as a client. If the words are equal in bit 24 the x2 selection is dropped. Both server images contain this test.</w:t>
+        <w:t>The server decides how to treat the peer from the two exchanged capability words before it arms the marker receiver in clause 5.2. In INFO0 bit numbers it requires the peer to advertise high-carrier 3200 symbol operation, bit 18. It then compares the asymmetry most significant bit, bit 23, and the CME bit, bit 24. If both words have bit 23 set, it leaves the marker path and enters the common mode initializer with a locally written mode word, using the role flag to split the two ends. The initializer installs the digital startup source, a repeated sequence of 1,747 constant words, seven zero words and 128 ascending and descending pairs. The answering end runs that source at once. The originating end keeps its idle transmit hook, which writes one constant idle word per call, and starts the source only after its receive state machine has acquired the answering end source cycle. That machine is a word receiver: it needs seven consecutive run words, then seven low-valued zero words, then verifies the 128 ramp pairs one word at a time, the first of each pair against a running count and the second against its complement from 255. Both ends run the same receiver on the peer source. It tolerates a received word that differs from the expected word only in the lowest bit, counts such words per symbol phase in a six-bit map, and logs unexpected words for the host; any larger difference in the pair phase restarts acquisition from the run words. The receiver has no timeout of its own. In the recorded call the originating end completed it about ten million DSP instructions after starting to listen. A trace of both servers in the recorded symmetric call executes this branch and not the marker path. Otherwise the two words must differ in bit 24, which separates a server from a client, and the peer is treated as a client. If the words are equal in bit 24 the x2 selection is dropped. Both server images contain this test.</w:t>
       </w:r>
     </w:p>
     <w:p>
@@ -17100,7 +17100,7 @@
         <w:rPr>
           <w:sz w:val="20"/>
         </w:rPr>
-        <w:t>Draft 0.17 decodes the startup source receiver that ends the wait. Draft 0.16 decodes the originating-end idle stub and the wait that ends it. Draft 0.15 traces the symmetric startup branch. Draft 0.14 specifies the server peer-role test on the exchanged INFO0 words. Draft 0.13 traces the server after marker acceptance. Draft 0.12 identifies the server receiver for the seven-bit marker and verifies its field parse. Draft 0.11 resolves the 3453C capability route: the transmitted INFO0 word is the plain tag 51 word and the tag 70 word is never read. Draft 0.10 adds pre-V.90 and later client rate selection, position grouping, variable-length body construction and original serialization. It distinguishes the host diagnostic report from peer records and records the XC timing correction and successful symmetric regression. Draft 0.9 executes the four-word PCM record receiver through CRC acceptance, rate-mask selection, bank construction, mapped output and later payload-source activation. The client measurement-to-record producer and complete call-state selection remain open. Draft 0.8 verified 57333 profiles and corrected builder product scaling to SPM 1. Draft 0.7 confirmed active GPC scrambling and pre-data resets in the symmetric 64000 pair. Analogue client decoding, alternate companding output and complete peer negotiation remain open.</w:t>
+        <w:t>Draft 0.18 decodes the receiver mismatch handling. Draft 0.17 decodes the startup source receiver that ends the wait. Draft 0.16 decodes the originating-end idle stub and the wait that ends it. Draft 0.15 traces the symmetric startup branch. Draft 0.14 specifies the server peer-role test on the exchanged INFO0 words. Draft 0.13 traces the server after marker acceptance. Draft 0.12 identifies the server receiver for the seven-bit marker and verifies its field parse. Draft 0.11 resolves the 3453C capability route: the transmitted INFO0 word is the plain tag 51 word and the tag 70 word is never read. Draft 0.10 adds pre-V.90 and later client rate selection, position grouping, variable-length body construction and original serialization. It distinguishes the host diagnostic report from peer records and records the XC timing correction and successful symmetric regression. Draft 0.9 executes the four-word PCM record receiver through CRC acceptance, rate-mask selection, bank construction, mapped output and later payload-source activation. The client measurement-to-record producer and complete call-state selection remain open. Draft 0.8 verified 57333 profiles and corrected builder product scaling to SPM 1. Draft 0.7 confirmed active GPC scrambling and pre-data resets in the symmetric 64000 pair. Analogue client decoding, alternate companding output and complete peer negotiation remain open.</w:t>
       </w:r>
     </w:p>
     <w:p>
@@ -17239,7 +17239,7 @@
       <w:rPr>
         <w:sz w:val="18"/>
       </w:rPr>
-      <w:t>COURIER EMU     x2 firmware reconstruction     Draft 0.17</w:t>
+      <w:t>COURIER EMU     x2 firmware reconstruction     Draft 0.18</w:t>
     </w:r>
   </w:p>
 </w:hdr>

</xml_diff>

<commit_message>
Decode the in-band symmetric capability frame
Co-Authored-By: Claude Sonnet 5.5 <noreply@anthropic.com>
</commit_message>
<xml_diff>
--- a/artifacts/x2-spec-20261004/x2-technical-specification.docx
+++ b/artifacts/x2-spec-20261004/x2-technical-specification.docx
@@ -20,7 +20,7 @@
     </w:p>
     <w:p>
       <w:r>
-        <w:t>Draft 0.18   •   Independent firmware reconstruction   •   4 October 2026</w:t>
+        <w:t>Draft 0.19   •   Independent firmware reconstruction   •   4 October 2026</w:t>
       </w:r>
     </w:p>
     <w:p>
@@ -8173,6 +8173,11 @@
     </w:p>
     <w:p>
       <w:r>
+        <w:t>When acquisition completes, each end sends a short repeated frame in the same word stream and receives the peer frame. Words carry six data bits and have the lowest bit set; two start words precede a body of five words and four words carrying the inverted CRC-16, which the receiver checks against the standard residue. The body carries a six-bit map of symbol phases with errors seen by the sender, a flag word and a six-bit mask. The receiver forms the union of the two error maps and the intersection of the two masks, then both ends switch to the data-mode handlers and notify the host. In the recorded symmetric call both frames carry an empty map and the same mask. The six symbol phases suggest a per-position impairment test, but that purpose is inferred.</w:t>
+      </w:r>
+    </w:p>
+    <w:p>
+      <w:r>
         <w:t>Capability advertisement, enabled-rate mask and datapump mode are separate parameters. The actual engine mode comes from call descriptors, through a different command path. A capability bit does not by itself identify the active engine branch. The fixed digital-call controls in S67 also operate separately from S58 symmetric capability. Annex A records the corrected command identities and source references.</w:t>
       </w:r>
     </w:p>
@@ -17100,7 +17105,7 @@
         <w:rPr>
           <w:sz w:val="20"/>
         </w:rPr>
-        <w:t>Draft 0.18 decodes the receiver mismatch handling. Draft 0.17 decodes the startup source receiver that ends the wait. Draft 0.16 decodes the originating-end idle stub and the wait that ends it. Draft 0.15 traces the symmetric startup branch. Draft 0.14 specifies the server peer-role test on the exchanged INFO0 words. Draft 0.13 traces the server after marker acceptance. Draft 0.12 identifies the server receiver for the seven-bit marker and verifies its field parse. Draft 0.11 resolves the 3453C capability route: the transmitted INFO0 word is the plain tag 51 word and the tag 70 word is never read. Draft 0.10 adds pre-V.90 and later client rate selection, position grouping, variable-length body construction and original serialization. It distinguishes the host diagnostic report from peer records and records the XC timing correction and successful symmetric regression. Draft 0.9 executes the four-word PCM record receiver through CRC acceptance, rate-mask selection, bank construction, mapped output and later payload-source activation. The client measurement-to-record producer and complete call-state selection remain open. Draft 0.8 verified 57333 profiles and corrected builder product scaling to SPM 1. Draft 0.7 confirmed active GPC scrambling and pre-data resets in the symmetric 64000 pair. Analogue client decoding, alternate companding output and complete peer negotiation remain open.</w:t>
+        <w:t>Draft 0.19 decodes the in-band capability frame. Draft 0.18 decodes the receiver mismatch handling. Draft 0.17 decodes the startup source receiver that ends the wait. Draft 0.16 decodes the originating-end idle stub and the wait that ends it. Draft 0.15 traces the symmetric startup branch. Draft 0.14 specifies the server peer-role test on the exchanged INFO0 words. Draft 0.13 traces the server after marker acceptance. Draft 0.12 identifies the server receiver for the seven-bit marker and verifies its field parse. Draft 0.11 resolves the 3453C capability route: the transmitted INFO0 word is the plain tag 51 word and the tag 70 word is never read. Draft 0.10 adds pre-V.90 and later client rate selection, position grouping, variable-length body construction and original serialization. It distinguishes the host diagnostic report from peer records and records the XC timing correction and successful symmetric regression. Draft 0.9 executes the four-word PCM record receiver through CRC acceptance, rate-mask selection, bank construction, mapped output and later payload-source activation. The client measurement-to-record producer and complete call-state selection remain open. Draft 0.8 verified 57333 profiles and corrected builder product scaling to SPM 1. Draft 0.7 confirmed active GPC scrambling and pre-data resets in the symmetric 64000 pair. Analogue client decoding, alternate companding output and complete peer negotiation remain open.</w:t>
       </w:r>
     </w:p>
     <w:p>
@@ -17239,7 +17244,7 @@
       <w:rPr>
         <w:sz w:val="18"/>
       </w:rPr>
-      <w:t>COURIER EMU     x2 firmware reconstruction     Draft 0.18</w:t>
+      <w:t>COURIER EMU     x2 firmware reconstruction     Draft 0.19</w:t>
     </w:r>
   </w:p>
 </w:hdr>

</xml_diff>

<commit_message>
Decode the symmetric data-mode hook families and the post-exchange rate decision
Co-Authored-By: Claude Sonnet 5.5 <noreply@anthropic.com>
</commit_message>
<xml_diff>
--- a/artifacts/x2-spec-20261004/x2-technical-specification.docx
+++ b/artifacts/x2-spec-20261004/x2-technical-specification.docx
@@ -20,7 +20,7 @@
     </w:p>
     <w:p>
       <w:r>
-        <w:t>Draft 0.19   •   Independent firmware reconstruction   •   4 October 2026</w:t>
+        <w:t>Draft 0.20   •   Independent firmware reconstruction   •   4 October 2026</w:t>
       </w:r>
     </w:p>
     <w:p>
@@ -8178,6 +8178,11 @@
     </w:p>
     <w:p>
       <w:r>
+        <w:t>After the merge each end derives its rate from the intersected mask. If the 64000 bit survived, which requires that the peer reported an empty error map, it reports 64000 to the host; otherwise, if the lower bit survived, it reports 56000, using the same report with equal values of sixteen and fourteen in units of 4000 bit/s. The recorded call reports 64000. The 56000 outcome was derived from the code and not reproduced, because the bearer impairments tried did not give a controlled test.</w:t>
+      </w:r>
+    </w:p>
+    <w:p>
+      <w:r>
         <w:t>Capability advertisement, enabled-rate mask and datapump mode are separate parameters. The actual engine mode comes from call descriptors, through a different command path. A capability bit does not by itself identify the active engine branch. The fixed digital-call controls in S67 also operate separately from S58 symmetric capability. Annex A records the corrected command identities and source references.</w:t>
       </w:r>
     </w:p>
@@ -17105,7 +17110,7 @@
         <w:rPr>
           <w:sz w:val="20"/>
         </w:rPr>
-        <w:t>Draft 0.19 decodes the in-band capability frame. Draft 0.18 decodes the receiver mismatch handling. Draft 0.17 decodes the startup source receiver that ends the wait. Draft 0.16 decodes the originating-end idle stub and the wait that ends it. Draft 0.15 traces the symmetric startup branch. Draft 0.14 specifies the server peer-role test on the exchanged INFO0 words. Draft 0.13 traces the server after marker acceptance. Draft 0.12 identifies the server receiver for the seven-bit marker and verifies its field parse. Draft 0.11 resolves the 3453C capability route: the transmitted INFO0 word is the plain tag 51 word and the tag 70 word is never read. Draft 0.10 adds pre-V.90 and later client rate selection, position grouping, variable-length body construction and original serialization. It distinguishes the host diagnostic report from peer records and records the XC timing correction and successful symmetric regression. Draft 0.9 executes the four-word PCM record receiver through CRC acceptance, rate-mask selection, bank construction, mapped output and later payload-source activation. The client measurement-to-record producer and complete call-state selection remain open. Draft 0.8 verified 57333 profiles and corrected builder product scaling to SPM 1. Draft 0.7 confirmed active GPC scrambling and pre-data resets in the symmetric 64000 pair. Analogue client decoding, alternate companding output and complete peer negotiation remain open.</w:t>
+        <w:t>Draft 0.20 decodes the data-mode hook families and the rate decision after the capability exchange. Draft 0.19 decodes the in-band capability frame. Draft 0.18 decodes the receiver mismatch handling. Draft 0.17 decodes the startup source receiver that ends the wait. Draft 0.16 decodes the originating-end idle stub and the wait that ends it. Draft 0.15 traces the symmetric startup branch. Draft 0.14 specifies the server peer-role test on the exchanged INFO0 words. Draft 0.13 traces the server after marker acceptance. Draft 0.12 identifies the server receiver for the seven-bit marker and verifies its field parse. Draft 0.11 resolves the 3453C capability route: the transmitted INFO0 word is the plain tag 51 word and the tag 70 word is never read. Draft 0.10 adds pre-V.90 and later client rate selection, position grouping, variable-length body construction and original serialization. It distinguishes the host diagnostic report from peer records and records the XC timing correction and successful symmetric regression. Draft 0.9 executes the four-word PCM record receiver through CRC acceptance, rate-mask selection, bank construction, mapped output and later payload-source activation. The client measurement-to-record producer and complete call-state selection remain open. Draft 0.8 verified 57333 profiles and corrected builder product scaling to SPM 1. Draft 0.7 confirmed active GPC scrambling and pre-data resets in the symmetric 64000 pair. Analogue client decoding, alternate companding output and complete peer negotiation remain open.</w:t>
       </w:r>
     </w:p>
     <w:p>
@@ -17244,7 +17249,7 @@
       <w:rPr>
         <w:sz w:val="18"/>
       </w:rPr>
-      <w:t>COURIER EMU     x2 firmware reconstruction     Draft 0.19</w:t>
+      <w:t>COURIER EMU     x2 firmware reconstruction     Draft 0.20</w:t>
     </w:r>
   </w:p>
 </w:hdr>

</xml_diff>

<commit_message>
Reproduce the symmetric 56000 decision with a controlled low-bit impairment
Flipping the LSB of one phase of the startup source on the bearer gives
56000/x2 (host 6a:0e0e); flipping bit 1 loses x2. Adds the impairment filter
and a hook in the pair harness. Spec draft 0.21.

Co-Authored-By: Claude Sonnet 5.5 <noreply@anthropic.com>
</commit_message>
<xml_diff>
--- a/artifacts/x2-spec-20261004/x2-technical-specification.docx
+++ b/artifacts/x2-spec-20261004/x2-technical-specification.docx
@@ -20,7 +20,7 @@
     </w:p>
     <w:p>
       <w:r>
-        <w:t>Draft 0.20   •   Independent firmware reconstruction   •   4 October 2026</w:t>
+        <w:t>Draft 0.21   •   Independent firmware reconstruction   •   4 October 2026</w:t>
       </w:r>
     </w:p>
     <w:p>
@@ -8173,12 +8173,12 @@
     </w:p>
     <w:p>
       <w:r>
-        <w:t>When acquisition completes, each end sends a short repeated frame in the same word stream and receives the peer frame. Words carry six data bits and have the lowest bit set; two start words precede a body of five words and four words carrying the inverted CRC-16, which the receiver checks against the standard residue. The body carries a six-bit map of symbol phases with errors seen by the sender, a flag word and a six-bit mask. The receiver forms the union of the two error maps and the intersection of the two masks, then both ends switch to the data-mode handlers and notify the host. In the recorded symmetric call both frames carry an empty map and the same mask. The six symbol phases suggest a per-position impairment test, but that purpose is inferred.</w:t>
+        <w:t>When acquisition completes, each end sends a short repeated frame in the same word stream and receives the peer frame. Words carry six data bits and have the lowest bit set; two start words precede a body of five words and four words carrying the inverted CRC-16, which the receiver checks against the standard residue. The body carries a six-bit map of symbol phases with errors seen by the sender, a flag word and a six-bit mask. The receiver forms the union of the two error maps and the intersection of the two masks, then both ends switch to the data-mode handlers and notify the host. In the recorded symmetric call both frames carry an empty map and the same mask. The six symbol phases give a per-position test of the lowest bit of the source words; the natural cause is robbed-bit signalling, which the firmware does not state.</w:t>
       </w:r>
     </w:p>
     <w:p>
       <w:r>
-        <w:t>After the merge each end derives its rate from the intersected mask. If the 64000 bit survived, which requires that the peer reported an empty error map, it reports 64000 to the host; otherwise, if the lower bit survived, it reports 56000, using the same report with equal values of sixteen and fourteen in units of 4000 bit/s. The recorded call reports 64000. The 56000 outcome was derived from the code and not reproduced, because the bearer impairments tried did not give a controlled test.</w:t>
+        <w:t>After the merge each end derives its rate from the intersected mask. If the 64000 bit survived, which requires that the peer reported an empty error map, it reports 64000 to the host; otherwise, if the lower bit survived, it reports 56000, using the same report with equal values of sixteen and fourteen in units of 4000 bit/s. The recorded call reports 64000. In a controlled test that flipped the lowest bit of every sixth octet of the startup source on the bearer, on either of two phases, both ends reported 56000 and connected at 56000 with the payloads delivered; flipping the next bit instead abandoned x2 and fell back to V.34. A low-bit error on a single symbol phase is therefore tolerated, recorded, reported to the peer and lowers the rate to 56000.</w:t>
       </w:r>
     </w:p>
     <w:p>
@@ -17073,7 +17073,7 @@
         <w:rPr>
           <w:sz w:val="20"/>
         </w:rPr>
-        <w:t>The marker receiver is documented at the end of docs/x2-v90-protocol-selection.md; tools/verify_x2_marker_receiver.py runs the original QF060003 parse from 97B5 and writes artifacts/x2-marker-receiver-20261004/verification.json. The arming site is 9791; the IM020104 counterpart is 948A.</w:t>
+        <w:t>The impairment test is tools/x2_source_impairment.py with artifacts/x2-source-impairment-20261004/verification.json. The marker receiver is documented at the end of docs/x2-v90-protocol-selection.md; tools/verify_x2_marker_receiver.py runs the original QF060003 parse from 97B5 and writes artifacts/x2-marker-receiver-20261004/verification.json. The arming site is 9791; the IM020104 counterpart is 948A.</w:t>
       </w:r>
     </w:p>
     <w:p>
@@ -17110,7 +17110,7 @@
         <w:rPr>
           <w:sz w:val="20"/>
         </w:rPr>
-        <w:t>Draft 0.20 decodes the data-mode hook families and the rate decision after the capability exchange. Draft 0.19 decodes the in-band capability frame. Draft 0.18 decodes the receiver mismatch handling. Draft 0.17 decodes the startup source receiver that ends the wait. Draft 0.16 decodes the originating-end idle stub and the wait that ends it. Draft 0.15 traces the symmetric startup branch. Draft 0.14 specifies the server peer-role test on the exchanged INFO0 words. Draft 0.13 traces the server after marker acceptance. Draft 0.12 identifies the server receiver for the seven-bit marker and verifies its field parse. Draft 0.11 resolves the 3453C capability route: the transmitted INFO0 word is the plain tag 51 word and the tag 70 word is never read. Draft 0.10 adds pre-V.90 and later client rate selection, position grouping, variable-length body construction and original serialization. It distinguishes the host diagnostic report from peer records and records the XC timing correction and successful symmetric regression. Draft 0.9 executes the four-word PCM record receiver through CRC acceptance, rate-mask selection, bank construction, mapped output and later payload-source activation. The client measurement-to-record producer and complete call-state selection remain open. Draft 0.8 verified 57333 profiles and corrected builder product scaling to SPM 1. Draft 0.7 confirmed active GPC scrambling and pre-data resets in the symmetric 64000 pair. Analogue client decoding, alternate companding output and complete peer negotiation remain open.</w:t>
+        <w:t>Draft 0.21 reproduces the 56000 decision with a controlled low-bit impairment of the startup source. Draft 0.20 decodes the data-mode hook families and the rate decision after the capability exchange. Draft 0.19 decodes the in-band capability frame. Draft 0.18 decodes the receiver mismatch handling. Draft 0.17 decodes the startup source receiver that ends the wait. Draft 0.16 decodes the originating-end idle stub and the wait that ends it. Draft 0.15 traces the symmetric startup branch. Draft 0.14 specifies the server peer-role test on the exchanged INFO0 words. Draft 0.13 traces the server after marker acceptance. Draft 0.12 identifies the server receiver for the seven-bit marker and verifies its field parse. Draft 0.11 resolves the 3453C capability route: the transmitted INFO0 word is the plain tag 51 word and the tag 70 word is never read. Draft 0.10 adds pre-V.90 and later client rate selection, position grouping, variable-length body construction and original serialization. It distinguishes the host diagnostic report from peer records and records the XC timing correction and successful symmetric regression. Draft 0.9 executes the four-word PCM record receiver through CRC acceptance, rate-mask selection, bank construction, mapped output and later payload-source activation. The client measurement-to-record producer and complete call-state selection remain open. Draft 0.8 verified 57333 profiles and corrected builder product scaling to SPM 1. Draft 0.7 confirmed active GPC scrambling and pre-data resets in the symmetric 64000 pair. Analogue client decoding, alternate companding output and complete peer negotiation remain open.</w:t>
       </w:r>
     </w:p>
     <w:p>
@@ -17249,7 +17249,7 @@
       <w:rPr>
         <w:sz w:val="18"/>
       </w:rPr>
-      <w:t>COURIER EMU     x2 firmware reconstruction     Draft 0.20</w:t>
+      <w:t>COURIER EMU     x2 firmware reconstruction     Draft 0.21</w:t>
     </w:r>
   </w:p>
 </w:hdr>

</xml_diff>

<commit_message>
Sweep all six phases of the startup-source impairment test
Co-Authored-By: Claude Sonnet 5.5 <noreply@anthropic.com>
</commit_message>
<xml_diff>
--- a/artifacts/x2-spec-20261004/x2-technical-specification.docx
+++ b/artifacts/x2-spec-20261004/x2-technical-specification.docx
@@ -20,7 +20,7 @@
     </w:p>
     <w:p>
       <w:r>
-        <w:t>Draft 0.21   •   Independent firmware reconstruction   •   4 October 2026</w:t>
+        <w:t>Draft 0.22   •   Independent firmware reconstruction   •   4 October 2026</w:t>
       </w:r>
     </w:p>
     <w:p>
@@ -8178,7 +8178,7 @@
     </w:p>
     <w:p>
       <w:r>
-        <w:t>After the merge each end derives its rate from the intersected mask. If the 64000 bit survived, which requires that the peer reported an empty error map, it reports 64000 to the host; otherwise, if the lower bit survived, it reports 56000, using the same report with equal values of sixteen and fourteen in units of 4000 bit/s. The recorded call reports 64000. In a controlled test that flipped the lowest bit of every sixth octet of the startup source on the bearer, on either of two phases, both ends reported 56000 and connected at 56000 with the payloads delivered; flipping the next bit instead abandoned x2 and fell back to V.34. A low-bit error on a single symbol phase is therefore tolerated, recorded, reported to the peer and lowers the rate to 56000.</w:t>
+        <w:t>After the merge each end derives its rate from the intersected mask. If the 64000 bit survived, which requires that the peer reported an empty error map, it reports 64000 to the host; otherwise, if the lower bit survived, it reports 56000, using the same report with equal values of sixteen and fourteen in units of 4000 bit/s. The recorded call reports 64000. In a controlled test that flipped the lowest bit of every sixth octet of the startup source on the bearer, on either of two phases, both ends reported 56000 and connected at 56000 with the payloads delivered; flipping the next bit instead abandoned x2 and fell back to V.34. A low-bit error on a single symbol phase is therefore tolerated, recorded, reported to the peer and lowers the rate to 56000. The test was repeated on each of the six phases: every phase gave 56000, and each set exactly one distinct bit of the error map sent in the frame, identical at both ends, so the map is per symbol phase.</w:t>
       </w:r>
     </w:p>
     <w:p>
@@ -17110,7 +17110,7 @@
         <w:rPr>
           <w:sz w:val="20"/>
         </w:rPr>
-        <w:t>Draft 0.21 reproduces the 56000 decision with a controlled low-bit impairment of the startup source. Draft 0.20 decodes the data-mode hook families and the rate decision after the capability exchange. Draft 0.19 decodes the in-band capability frame. Draft 0.18 decodes the receiver mismatch handling. Draft 0.17 decodes the startup source receiver that ends the wait. Draft 0.16 decodes the originating-end idle stub and the wait that ends it. Draft 0.15 traces the symmetric startup branch. Draft 0.14 specifies the server peer-role test on the exchanged INFO0 words. Draft 0.13 traces the server after marker acceptance. Draft 0.12 identifies the server receiver for the seven-bit marker and verifies its field parse. Draft 0.11 resolves the 3453C capability route: the transmitted INFO0 word is the plain tag 51 word and the tag 70 word is never read. Draft 0.10 adds pre-V.90 and later client rate selection, position grouping, variable-length body construction and original serialization. It distinguishes the host diagnostic report from peer records and records the XC timing correction and successful symmetric regression. Draft 0.9 executes the four-word PCM record receiver through CRC acceptance, rate-mask selection, bank construction, mapped output and later payload-source activation. The client measurement-to-record producer and complete call-state selection remain open. Draft 0.8 verified 57333 profiles and corrected builder product scaling to SPM 1. Draft 0.7 confirmed active GPC scrambling and pre-data resets in the symmetric 64000 pair. Analogue client decoding, alternate companding output and complete peer negotiation remain open.</w:t>
+        <w:t>Draft 0.22 sweeps all six phases of the impairment test. Draft 0.21 reproduces the 56000 decision with a controlled low-bit impairment of the startup source. Draft 0.20 decodes the data-mode hook families and the rate decision after the capability exchange. Draft 0.19 decodes the in-band capability frame. Draft 0.18 decodes the receiver mismatch handling. Draft 0.17 decodes the startup source receiver that ends the wait. Draft 0.16 decodes the originating-end idle stub and the wait that ends it. Draft 0.15 traces the symmetric startup branch. Draft 0.14 specifies the server peer-role test on the exchanged INFO0 words. Draft 0.13 traces the server after marker acceptance. Draft 0.12 identifies the server receiver for the seven-bit marker and verifies its field parse. Draft 0.11 resolves the 3453C capability route: the transmitted INFO0 word is the plain tag 51 word and the tag 70 word is never read. Draft 0.10 adds pre-V.90 and later client rate selection, position grouping, variable-length body construction and original serialization. It distinguishes the host diagnostic report from peer records and records the XC timing correction and successful symmetric regression. Draft 0.9 executes the four-word PCM record receiver through CRC acceptance, rate-mask selection, bank construction, mapped output and later payload-source activation. The client measurement-to-record producer and complete call-state selection remain open. Draft 0.8 verified 57333 profiles and corrected builder product scaling to SPM 1. Draft 0.7 confirmed active GPC scrambling and pre-data resets in the symmetric 64000 pair. Analogue client decoding, alternate companding output and complete peer negotiation remain open.</w:t>
       </w:r>
     </w:p>
     <w:p>
@@ -17249,7 +17249,7 @@
       <w:rPr>
         <w:sz w:val="18"/>
       </w:rPr>
-      <w:t>COURIER EMU     x2 firmware reconstruction     Draft 0.21</w:t>
+      <w:t>COURIER EMU     x2 firmware reconstruction     Draft 0.22</w:t>
     </w:r>
   </w:p>
 </w:hdr>

</xml_diff>

<commit_message>
Test multi-phase source impairments: the map is a bitwise union, 56000 holds
Co-Authored-By: Claude Sonnet 5.5 <noreply@anthropic.com>
</commit_message>
<xml_diff>
--- a/artifacts/x2-spec-20261004/x2-technical-specification.docx
+++ b/artifacts/x2-spec-20261004/x2-technical-specification.docx
@@ -20,7 +20,7 @@
     </w:p>
     <w:p>
       <w:r>
-        <w:t>Draft 0.22   •   Independent firmware reconstruction   •   4 October 2026</w:t>
+        <w:t>Draft 0.23   •   Independent firmware reconstruction   •   4 October 2026</w:t>
       </w:r>
     </w:p>
     <w:p>
@@ -8178,7 +8178,7 @@
     </w:p>
     <w:p>
       <w:r>
-        <w:t>After the merge each end derives its rate from the intersected mask. If the 64000 bit survived, which requires that the peer reported an empty error map, it reports 64000 to the host; otherwise, if the lower bit survived, it reports 56000, using the same report with equal values of sixteen and fourteen in units of 4000 bit/s. The recorded call reports 64000. In a controlled test that flipped the lowest bit of every sixth octet of the startup source on the bearer, on either of two phases, both ends reported 56000 and connected at 56000 with the payloads delivered; flipping the next bit instead abandoned x2 and fell back to V.34. A low-bit error on a single symbol phase is therefore tolerated, recorded, reported to the peer and lowers the rate to 56000. The test was repeated on each of the six phases: every phase gave 56000, and each set exactly one distinct bit of the error map sent in the frame, identical at both ends, so the map is per symbol phase.</w:t>
+        <w:t>After the merge each end derives its rate from the intersected mask. If the 64000 bit survived, which requires that the peer reported an empty error map, it reports 64000 to the host; otherwise, if the lower bit survived, it reports 56000, using the same report with equal values of sixteen and fourteen in units of 4000 bit/s. The recorded call reports 64000. In a controlled test that flipped the lowest bit of every sixth octet of the startup source on the bearer, on either of two phases, both ends reported 56000 and connected at 56000 with the payloads delivered; flipping the next bit instead abandoned x2 and fell back to V.34. A low-bit error on a single symbol phase is therefore tolerated, recorded, reported to the peer and lowers the rate to 56000. The test was repeated on each of the six phases: every phase gave 56000, and each set exactly one distinct bit of the error map sent in the frame, identical at both ends, so the map is per symbol phase. With several phases corrupted at once, including all six, the map is the bitwise union of the single-phase words, the same at both ends, and the call still connects at 56000; the lower rate does not depend on the lowest bit.</w:t>
       </w:r>
     </w:p>
     <w:p>
@@ -17110,7 +17110,7 @@
         <w:rPr>
           <w:sz w:val="20"/>
         </w:rPr>
-        <w:t>Draft 0.22 sweeps all six phases of the impairment test. Draft 0.21 reproduces the 56000 decision with a controlled low-bit impairment of the startup source. Draft 0.20 decodes the data-mode hook families and the rate decision after the capability exchange. Draft 0.19 decodes the in-band capability frame. Draft 0.18 decodes the receiver mismatch handling. Draft 0.17 decodes the startup source receiver that ends the wait. Draft 0.16 decodes the originating-end idle stub and the wait that ends it. Draft 0.15 traces the symmetric startup branch. Draft 0.14 specifies the server peer-role test on the exchanged INFO0 words. Draft 0.13 traces the server after marker acceptance. Draft 0.12 identifies the server receiver for the seven-bit marker and verifies its field parse. Draft 0.11 resolves the 3453C capability route: the transmitted INFO0 word is the plain tag 51 word and the tag 70 word is never read. Draft 0.10 adds pre-V.90 and later client rate selection, position grouping, variable-length body construction and original serialization. It distinguishes the host diagnostic report from peer records and records the XC timing correction and successful symmetric regression. Draft 0.9 executes the four-word PCM record receiver through CRC acceptance, rate-mask selection, bank construction, mapped output and later payload-source activation. The client measurement-to-record producer and complete call-state selection remain open. Draft 0.8 verified 57333 profiles and corrected builder product scaling to SPM 1. Draft 0.7 confirmed active GPC scrambling and pre-data resets in the symmetric 64000 pair. Analogue client decoding, alternate companding output and complete peer negotiation remain open.</w:t>
+        <w:t>Draft 0.23 tests multi-phase errors. Draft 0.22 sweeps all six phases of the impairment test. Draft 0.21 reproduces the 56000 decision with a controlled low-bit impairment of the startup source. Draft 0.20 decodes the data-mode hook families and the rate decision after the capability exchange. Draft 0.19 decodes the in-band capability frame. Draft 0.18 decodes the receiver mismatch handling. Draft 0.17 decodes the startup source receiver that ends the wait. Draft 0.16 decodes the originating-end idle stub and the wait that ends it. Draft 0.15 traces the symmetric startup branch. Draft 0.14 specifies the server peer-role test on the exchanged INFO0 words. Draft 0.13 traces the server after marker acceptance. Draft 0.12 identifies the server receiver for the seven-bit marker and verifies its field parse. Draft 0.11 resolves the 3453C capability route: the transmitted INFO0 word is the plain tag 51 word and the tag 70 word is never read. Draft 0.10 adds pre-V.90 and later client rate selection, position grouping, variable-length body construction and original serialization. It distinguishes the host diagnostic report from peer records and records the XC timing correction and successful symmetric regression. Draft 0.9 executes the four-word PCM record receiver through CRC acceptance, rate-mask selection, bank construction, mapped output and later payload-source activation. The client measurement-to-record producer and complete call-state selection remain open. Draft 0.8 verified 57333 profiles and corrected builder product scaling to SPM 1. Draft 0.7 confirmed active GPC scrambling and pre-data resets in the symmetric 64000 pair. Analogue client decoding, alternate companding output and complete peer negotiation remain open.</w:t>
       </w:r>
     </w:p>
     <w:p>
@@ -17249,7 +17249,7 @@
       <w:rPr>
         <w:sz w:val="18"/>
       </w:rPr>
-      <w:t>COURIER EMU     x2 firmware reconstruction     Draft 0.22</w:t>
+      <w:t>COURIER EMU     x2 firmware reconstruction     Draft 0.23</w:t>
     </w:r>
   </w:p>
 </w:hdr>

</xml_diff>

<commit_message>
Decode the bearer sequence before the INFO0 gate in the symmetric call
V.8 (CI, ANSam, CM, JM, CJ), INFO0 in both directions with passing CRC,
tones A and B, then the startup source. Adds a wire-log hook and an analysis
tool. Spec draft 0.24.

Co-Authored-By: Claude Sonnet 5.5 <noreply@anthropic.com>
</commit_message>
<xml_diff>
--- a/artifacts/x2-spec-20261004/x2-technical-specification.docx
+++ b/artifacts/x2-spec-20261004/x2-technical-specification.docx
@@ -20,7 +20,7 @@
     </w:p>
     <w:p>
       <w:r>
-        <w:t>Draft 0.23   •   Independent firmware reconstruction   •   4 October 2026</w:t>
+        <w:t>Draft 0.24   •   Independent firmware reconstruction   •   4 October 2026</w:t>
       </w:r>
     </w:p>
     <w:p>
@@ -1250,6 +1250,995 @@
         <w:t>The 3453C supervisor builds two capability words from the same base: the plain word, sent as mailbox tag 51, and the x2-edited word, sent as tag 70. The DSP stores them at separate locations. The negotiation-start routine at 0A64 reads only the plain location, forces the clock-source field to the value one and queues the result as a sixteen-bit field of the INFO0 work buffer. Nothing in the four images reads the tag 70 location. The x2 asymmetry and CME edits therefore do not reach the INFO0 field in this build, whereas the pre-V.90 server selects between its two words with a state bit. A component test varies both words and shows the queued field follows the plain word alone. Whether a deployed client announced x2 asymmetry through another route, or relied on the later V.90 exchange, is not established by this firmware.</w:t>
       </w:r>
     </w:p>
+    <w:p>
+      <w:pPr>
+        <w:pStyle w:val="Heading2"/>
+      </w:pPr>
+      <w:r>
+        <w:t>3 3 Observed symmetric call on the bearer</w:t>
+      </w:r>
+    </w:p>
+    <w:p>
+      <w:r>
+        <w:t>In the recorded symmetric call both ends exchange the V.8 messages, an INFO0 frame each, and the two phase 2 tones before any digital signal appears. The table gives the order and the times observed on the bearer from the start of the capture. The call side message and the answer side message carry the same five octets after the synchronization octet. Both INFO0 frames pass their CRC and carry the same body: all six symbol rates, high-carrier 3200 symbol operation, the asymmetry field equal to six with its most significant bit set, the CME bit set, internal clock and no acknowledgement. Setting the asymmetry most significant bit at both ends is what selects the symmetric branch of clause 12. The meanings of the V.8 octets were not decoded.</w:t>
+      </w:r>
+    </w:p>
+    <w:p>
+      <w:pPr>
+        <w:pStyle w:val="Caption"/>
+      </w:pPr>
+      <w:r>
+        <w:t>Table 3A — Observed bearer sequence before data</w:t>
+      </w:r>
+    </w:p>
+    <w:tbl>
+      <w:tblPr>
+        <w:tblW w:type="auto" w:w="0"/>
+        <w:jc w:val="center"/>
+        <w:tblLayout w:type="fixed"/>
+        <w:tblLook w:firstColumn="1" w:firstRow="1" w:lastColumn="0" w:lastRow="0" w:noHBand="0" w:noVBand="1" w:val="04A0"/>
+      </w:tblPr>
+      <w:tblGrid>
+        <w:gridCol w:w="1701"/>
+        <w:gridCol w:w="1474"/>
+        <w:gridCol w:w="6236"/>
+      </w:tblGrid>
+      <w:tr>
+        <w:trPr>
+          <w:tblHeader/>
+          <w:cantSplit/>
+        </w:trPr>
+        <w:tc>
+          <w:tcPr>
+            <w:tcW w:type="dxa" w:w="1701"/>
+            <w:vAlign w:val="center"/>
+            <w:tcBorders>
+              <w:top w:val="single" w:sz="4" w:color="D9D9D9"/>
+              <w:left w:val="single" w:sz="4" w:color="D9D9D9"/>
+              <w:bottom w:val="single" w:sz="4" w:color="D9D9D9"/>
+              <w:right w:val="single" w:sz="4" w:color="D9D9D9"/>
+            </w:tcBorders>
+            <w:shd w:fill="E7E7E7"/>
+            <w:tcMar>
+              <w:top w:w="85" w:type="dxa"/>
+              <w:left w:w="85" w:type="dxa"/>
+              <w:bottom w:w="85" w:type="dxa"/>
+              <w:right w:w="85" w:type="dxa"/>
+            </w:tcMar>
+          </w:tcPr>
+          <w:p>
+            <w:pPr>
+              <w:spacing w:after="20" w:line="240" w:lineRule="auto"/>
+            </w:pPr>
+            <w:r>
+              <w:rPr>
+                <w:b/>
+                <w:sz w:val="20"/>
+              </w:rPr>
+              <w:t>Time</w:t>
+            </w:r>
+          </w:p>
+        </w:tc>
+        <w:tc>
+          <w:tcPr>
+            <w:tcW w:type="dxa" w:w="1474"/>
+            <w:vAlign w:val="center"/>
+            <w:tcBorders>
+              <w:top w:val="single" w:sz="4" w:color="D9D9D9"/>
+              <w:left w:val="single" w:sz="4" w:color="D9D9D9"/>
+              <w:bottom w:val="single" w:sz="4" w:color="D9D9D9"/>
+              <w:right w:val="single" w:sz="4" w:color="D9D9D9"/>
+            </w:tcBorders>
+            <w:shd w:fill="E7E7E7"/>
+            <w:tcMar>
+              <w:top w:w="85" w:type="dxa"/>
+              <w:left w:w="85" w:type="dxa"/>
+              <w:bottom w:w="85" w:type="dxa"/>
+              <w:right w:w="85" w:type="dxa"/>
+            </w:tcMar>
+          </w:tcPr>
+          <w:p>
+            <w:pPr>
+              <w:spacing w:after="20" w:line="240" w:lineRule="auto"/>
+            </w:pPr>
+            <w:r>
+              <w:rPr>
+                <w:b/>
+                <w:sz w:val="20"/>
+              </w:rPr>
+              <w:t>Sender</w:t>
+            </w:r>
+          </w:p>
+        </w:tc>
+        <w:tc>
+          <w:tcPr>
+            <w:tcW w:type="dxa" w:w="6236"/>
+            <w:vAlign w:val="center"/>
+            <w:tcBorders>
+              <w:top w:val="single" w:sz="4" w:color="D9D9D9"/>
+              <w:left w:val="single" w:sz="4" w:color="D9D9D9"/>
+              <w:bottom w:val="single" w:sz="4" w:color="D9D9D9"/>
+              <w:right w:val="single" w:sz="4" w:color="D9D9D9"/>
+            </w:tcBorders>
+            <w:shd w:fill="E7E7E7"/>
+            <w:tcMar>
+              <w:top w:w="85" w:type="dxa"/>
+              <w:left w:w="85" w:type="dxa"/>
+              <w:bottom w:w="85" w:type="dxa"/>
+              <w:right w:w="85" w:type="dxa"/>
+            </w:tcMar>
+          </w:tcPr>
+          <w:p>
+            <w:pPr>
+              <w:spacing w:after="20" w:line="240" w:lineRule="auto"/>
+            </w:pPr>
+            <w:r>
+              <w:rPr>
+                <w:b/>
+                <w:sz w:val="20"/>
+              </w:rPr>
+              <w:t>Signal</w:t>
+            </w:r>
+          </w:p>
+        </w:tc>
+      </w:tr>
+      <w:tr>
+        <w:trPr>
+          <w:cantSplit/>
+        </w:trPr>
+        <w:tc>
+          <w:tcPr>
+            <w:tcW w:type="dxa" w:w="1701"/>
+            <w:vAlign w:val="center"/>
+            <w:tcBorders>
+              <w:top w:val="single" w:sz="4" w:color="D9D9D9"/>
+              <w:left w:val="single" w:sz="4" w:color="D9D9D9"/>
+              <w:bottom w:val="single" w:sz="4" w:color="D9D9D9"/>
+              <w:right w:val="single" w:sz="4" w:color="D9D9D9"/>
+            </w:tcBorders>
+            <w:tcMar>
+              <w:top w:w="85" w:type="dxa"/>
+              <w:left w:w="85" w:type="dxa"/>
+              <w:bottom w:w="85" w:type="dxa"/>
+              <w:right w:w="85" w:type="dxa"/>
+            </w:tcMar>
+          </w:tcPr>
+          <w:p>
+            <w:pPr>
+              <w:spacing w:after="20" w:line="240" w:lineRule="auto"/>
+            </w:pPr>
+            <w:r>
+              <w:rPr>
+                <w:b w:val="0"/>
+                <w:sz w:val="20"/>
+              </w:rPr>
+              <w:t>0.1 to 1.7 s</w:t>
+            </w:r>
+          </w:p>
+        </w:tc>
+        <w:tc>
+          <w:tcPr>
+            <w:tcW w:type="dxa" w:w="1474"/>
+            <w:vAlign w:val="center"/>
+            <w:tcBorders>
+              <w:top w:val="single" w:sz="4" w:color="D9D9D9"/>
+              <w:left w:val="single" w:sz="4" w:color="D9D9D9"/>
+              <w:bottom w:val="single" w:sz="4" w:color="D9D9D9"/>
+              <w:right w:val="single" w:sz="4" w:color="D9D9D9"/>
+            </w:tcBorders>
+            <w:tcMar>
+              <w:top w:w="85" w:type="dxa"/>
+              <w:left w:w="85" w:type="dxa"/>
+              <w:bottom w:w="85" w:type="dxa"/>
+              <w:right w:w="85" w:type="dxa"/>
+            </w:tcMar>
+          </w:tcPr>
+          <w:p>
+            <w:pPr>
+              <w:spacing w:after="20" w:line="240" w:lineRule="auto"/>
+            </w:pPr>
+            <w:r>
+              <w:rPr>
+                <w:b w:val="0"/>
+                <w:sz w:val="20"/>
+              </w:rPr>
+              <w:t>Originator</w:t>
+            </w:r>
+          </w:p>
+        </w:tc>
+        <w:tc>
+          <w:tcPr>
+            <w:tcW w:type="dxa" w:w="6236"/>
+            <w:vAlign w:val="center"/>
+            <w:tcBorders>
+              <w:top w:val="single" w:sz="4" w:color="D9D9D9"/>
+              <w:left w:val="single" w:sz="4" w:color="D9D9D9"/>
+              <w:bottom w:val="single" w:sz="4" w:color="D9D9D9"/>
+              <w:right w:val="single" w:sz="4" w:color="D9D9D9"/>
+            </w:tcBorders>
+            <w:tcMar>
+              <w:top w:w="85" w:type="dxa"/>
+              <w:left w:w="85" w:type="dxa"/>
+              <w:bottom w:w="85" w:type="dxa"/>
+              <w:right w:w="85" w:type="dxa"/>
+            </w:tcMar>
+          </w:tcPr>
+          <w:p>
+            <w:pPr>
+              <w:spacing w:after="20" w:line="240" w:lineRule="auto"/>
+            </w:pPr>
+            <w:r>
+              <w:rPr>
+                <w:b w:val="0"/>
+                <w:sz w:val="20"/>
+              </w:rPr>
+              <w:t>V.8 call indicate, FSK at 300 baud</w:t>
+            </w:r>
+          </w:p>
+        </w:tc>
+      </w:tr>
+      <w:tr>
+        <w:trPr>
+          <w:cantSplit/>
+        </w:trPr>
+        <w:tc>
+          <w:tcPr>
+            <w:tcW w:type="dxa" w:w="1701"/>
+            <w:vAlign w:val="center"/>
+            <w:tcBorders>
+              <w:top w:val="single" w:sz="4" w:color="D9D9D9"/>
+              <w:left w:val="single" w:sz="4" w:color="D9D9D9"/>
+              <w:bottom w:val="single" w:sz="4" w:color="D9D9D9"/>
+              <w:right w:val="single" w:sz="4" w:color="D9D9D9"/>
+            </w:tcBorders>
+            <w:tcMar>
+              <w:top w:w="85" w:type="dxa"/>
+              <w:left w:w="85" w:type="dxa"/>
+              <w:bottom w:w="85" w:type="dxa"/>
+              <w:right w:w="85" w:type="dxa"/>
+            </w:tcMar>
+          </w:tcPr>
+          <w:p>
+            <w:pPr>
+              <w:spacing w:after="20" w:line="240" w:lineRule="auto"/>
+            </w:pPr>
+            <w:r>
+              <w:rPr>
+                <w:b w:val="0"/>
+                <w:sz w:val="20"/>
+              </w:rPr>
+              <w:t>2.0 to 3.8 s</w:t>
+            </w:r>
+          </w:p>
+        </w:tc>
+        <w:tc>
+          <w:tcPr>
+            <w:tcW w:type="dxa" w:w="1474"/>
+            <w:vAlign w:val="center"/>
+            <w:tcBorders>
+              <w:top w:val="single" w:sz="4" w:color="D9D9D9"/>
+              <w:left w:val="single" w:sz="4" w:color="D9D9D9"/>
+              <w:bottom w:val="single" w:sz="4" w:color="D9D9D9"/>
+              <w:right w:val="single" w:sz="4" w:color="D9D9D9"/>
+            </w:tcBorders>
+            <w:tcMar>
+              <w:top w:w="85" w:type="dxa"/>
+              <w:left w:w="85" w:type="dxa"/>
+              <w:bottom w:w="85" w:type="dxa"/>
+              <w:right w:w="85" w:type="dxa"/>
+            </w:tcMar>
+          </w:tcPr>
+          <w:p>
+            <w:pPr>
+              <w:spacing w:after="20" w:line="240" w:lineRule="auto"/>
+            </w:pPr>
+            <w:r>
+              <w:rPr>
+                <w:b w:val="0"/>
+                <w:sz w:val="20"/>
+              </w:rPr>
+              <w:t>Answerer</w:t>
+            </w:r>
+          </w:p>
+        </w:tc>
+        <w:tc>
+          <w:tcPr>
+            <w:tcW w:type="dxa" w:w="6236"/>
+            <w:vAlign w:val="center"/>
+            <w:tcBorders>
+              <w:top w:val="single" w:sz="4" w:color="D9D9D9"/>
+              <w:left w:val="single" w:sz="4" w:color="D9D9D9"/>
+              <w:bottom w:val="single" w:sz="4" w:color="D9D9D9"/>
+              <w:right w:val="single" w:sz="4" w:color="D9D9D9"/>
+            </w:tcBorders>
+            <w:tcMar>
+              <w:top w:w="85" w:type="dxa"/>
+              <w:left w:w="85" w:type="dxa"/>
+              <w:bottom w:w="85" w:type="dxa"/>
+              <w:right w:w="85" w:type="dxa"/>
+            </w:tcMar>
+          </w:tcPr>
+          <w:p>
+            <w:pPr>
+              <w:spacing w:after="20" w:line="240" w:lineRule="auto"/>
+            </w:pPr>
+            <w:r>
+              <w:rPr>
+                <w:b w:val="0"/>
+                <w:sz w:val="20"/>
+              </w:rPr>
+              <w:t>2100 Hz answer tone</w:t>
+            </w:r>
+          </w:p>
+        </w:tc>
+      </w:tr>
+      <w:tr>
+        <w:trPr>
+          <w:cantSplit/>
+        </w:trPr>
+        <w:tc>
+          <w:tcPr>
+            <w:tcW w:type="dxa" w:w="1701"/>
+            <w:vAlign w:val="center"/>
+            <w:tcBorders>
+              <w:top w:val="single" w:sz="4" w:color="D9D9D9"/>
+              <w:left w:val="single" w:sz="4" w:color="D9D9D9"/>
+              <w:bottom w:val="single" w:sz="4" w:color="D9D9D9"/>
+              <w:right w:val="single" w:sz="4" w:color="D9D9D9"/>
+            </w:tcBorders>
+            <w:tcMar>
+              <w:top w:w="85" w:type="dxa"/>
+              <w:left w:w="85" w:type="dxa"/>
+              <w:bottom w:w="85" w:type="dxa"/>
+              <w:right w:w="85" w:type="dxa"/>
+            </w:tcMar>
+          </w:tcPr>
+          <w:p>
+            <w:pPr>
+              <w:spacing w:after="20" w:line="240" w:lineRule="auto"/>
+            </w:pPr>
+            <w:r>
+              <w:rPr>
+                <w:b w:val="0"/>
+                <w:sz w:val="20"/>
+              </w:rPr>
+              <w:t>3.2 to 4.7 s</w:t>
+            </w:r>
+          </w:p>
+        </w:tc>
+        <w:tc>
+          <w:tcPr>
+            <w:tcW w:type="dxa" w:w="1474"/>
+            <w:vAlign w:val="center"/>
+            <w:tcBorders>
+              <w:top w:val="single" w:sz="4" w:color="D9D9D9"/>
+              <w:left w:val="single" w:sz="4" w:color="D9D9D9"/>
+              <w:bottom w:val="single" w:sz="4" w:color="D9D9D9"/>
+              <w:right w:val="single" w:sz="4" w:color="D9D9D9"/>
+            </w:tcBorders>
+            <w:tcMar>
+              <w:top w:w="85" w:type="dxa"/>
+              <w:left w:w="85" w:type="dxa"/>
+              <w:bottom w:w="85" w:type="dxa"/>
+              <w:right w:w="85" w:type="dxa"/>
+            </w:tcMar>
+          </w:tcPr>
+          <w:p>
+            <w:pPr>
+              <w:spacing w:after="20" w:line="240" w:lineRule="auto"/>
+            </w:pPr>
+            <w:r>
+              <w:rPr>
+                <w:b w:val="0"/>
+                <w:sz w:val="20"/>
+              </w:rPr>
+              <w:t>Originator</w:t>
+            </w:r>
+          </w:p>
+        </w:tc>
+        <w:tc>
+          <w:tcPr>
+            <w:tcW w:type="dxa" w:w="6236"/>
+            <w:vAlign w:val="center"/>
+            <w:tcBorders>
+              <w:top w:val="single" w:sz="4" w:color="D9D9D9"/>
+              <w:left w:val="single" w:sz="4" w:color="D9D9D9"/>
+              <w:bottom w:val="single" w:sz="4" w:color="D9D9D9"/>
+              <w:right w:val="single" w:sz="4" w:color="D9D9D9"/>
+            </w:tcBorders>
+            <w:tcMar>
+              <w:top w:w="85" w:type="dxa"/>
+              <w:left w:w="85" w:type="dxa"/>
+              <w:bottom w:w="85" w:type="dxa"/>
+              <w:right w:w="85" w:type="dxa"/>
+            </w:tcMar>
+          </w:tcPr>
+          <w:p>
+            <w:pPr>
+              <w:spacing w:after="20" w:line="240" w:lineRule="auto"/>
+            </w:pPr>
+            <w:r>
+              <w:rPr>
+                <w:b w:val="0"/>
+                <w:sz w:val="20"/>
+              </w:rPr>
+              <w:t>V.8 capability message, then the three-octet completion</w:t>
+            </w:r>
+          </w:p>
+        </w:tc>
+      </w:tr>
+      <w:tr>
+        <w:trPr>
+          <w:cantSplit/>
+        </w:trPr>
+        <w:tc>
+          <w:tcPr>
+            <w:tcW w:type="dxa" w:w="1701"/>
+            <w:vAlign w:val="center"/>
+            <w:tcBorders>
+              <w:top w:val="single" w:sz="4" w:color="D9D9D9"/>
+              <w:left w:val="single" w:sz="4" w:color="D9D9D9"/>
+              <w:bottom w:val="single" w:sz="4" w:color="D9D9D9"/>
+              <w:right w:val="single" w:sz="4" w:color="D9D9D9"/>
+            </w:tcBorders>
+            <w:tcMar>
+              <w:top w:w="85" w:type="dxa"/>
+              <w:left w:w="85" w:type="dxa"/>
+              <w:bottom w:w="85" w:type="dxa"/>
+              <w:right w:w="85" w:type="dxa"/>
+            </w:tcMar>
+          </w:tcPr>
+          <w:p>
+            <w:pPr>
+              <w:spacing w:after="20" w:line="240" w:lineRule="auto"/>
+            </w:pPr>
+            <w:r>
+              <w:rPr>
+                <w:b w:val="0"/>
+                <w:sz w:val="20"/>
+              </w:rPr>
+              <w:t>3.8 to 4.8 s</w:t>
+            </w:r>
+          </w:p>
+        </w:tc>
+        <w:tc>
+          <w:tcPr>
+            <w:tcW w:type="dxa" w:w="1474"/>
+            <w:vAlign w:val="center"/>
+            <w:tcBorders>
+              <w:top w:val="single" w:sz="4" w:color="D9D9D9"/>
+              <w:left w:val="single" w:sz="4" w:color="D9D9D9"/>
+              <w:bottom w:val="single" w:sz="4" w:color="D9D9D9"/>
+              <w:right w:val="single" w:sz="4" w:color="D9D9D9"/>
+            </w:tcBorders>
+            <w:tcMar>
+              <w:top w:w="85" w:type="dxa"/>
+              <w:left w:w="85" w:type="dxa"/>
+              <w:bottom w:w="85" w:type="dxa"/>
+              <w:right w:w="85" w:type="dxa"/>
+            </w:tcMar>
+          </w:tcPr>
+          <w:p>
+            <w:pPr>
+              <w:spacing w:after="20" w:line="240" w:lineRule="auto"/>
+            </w:pPr>
+            <w:r>
+              <w:rPr>
+                <w:b w:val="0"/>
+                <w:sz w:val="20"/>
+              </w:rPr>
+              <w:t>Answerer</w:t>
+            </w:r>
+          </w:p>
+        </w:tc>
+        <w:tc>
+          <w:tcPr>
+            <w:tcW w:type="dxa" w:w="6236"/>
+            <w:vAlign w:val="center"/>
+            <w:tcBorders>
+              <w:top w:val="single" w:sz="4" w:color="D9D9D9"/>
+              <w:left w:val="single" w:sz="4" w:color="D9D9D9"/>
+              <w:bottom w:val="single" w:sz="4" w:color="D9D9D9"/>
+              <w:right w:val="single" w:sz="4" w:color="D9D9D9"/>
+            </w:tcBorders>
+            <w:tcMar>
+              <w:top w:w="85" w:type="dxa"/>
+              <w:left w:w="85" w:type="dxa"/>
+              <w:bottom w:w="85" w:type="dxa"/>
+              <w:right w:w="85" w:type="dxa"/>
+            </w:tcMar>
+          </w:tcPr>
+          <w:p>
+            <w:pPr>
+              <w:spacing w:after="20" w:line="240" w:lineRule="auto"/>
+            </w:pPr>
+            <w:r>
+              <w:rPr>
+                <w:b w:val="0"/>
+                <w:sz w:val="20"/>
+              </w:rPr>
+              <w:t>V.8 joint message, identical in content</w:t>
+            </w:r>
+          </w:p>
+        </w:tc>
+      </w:tr>
+      <w:tr>
+        <w:trPr>
+          <w:cantSplit/>
+        </w:trPr>
+        <w:tc>
+          <w:tcPr>
+            <w:tcW w:type="dxa" w:w="1701"/>
+            <w:vAlign w:val="center"/>
+            <w:tcBorders>
+              <w:top w:val="single" w:sz="4" w:color="D9D9D9"/>
+              <w:left w:val="single" w:sz="4" w:color="D9D9D9"/>
+              <w:bottom w:val="single" w:sz="4" w:color="D9D9D9"/>
+              <w:right w:val="single" w:sz="4" w:color="D9D9D9"/>
+            </w:tcBorders>
+            <w:tcMar>
+              <w:top w:w="85" w:type="dxa"/>
+              <w:left w:w="85" w:type="dxa"/>
+              <w:bottom w:w="85" w:type="dxa"/>
+              <w:right w:w="85" w:type="dxa"/>
+            </w:tcMar>
+          </w:tcPr>
+          <w:p>
+            <w:pPr>
+              <w:spacing w:after="20" w:line="240" w:lineRule="auto"/>
+            </w:pPr>
+            <w:r>
+              <w:rPr>
+                <w:b w:val="0"/>
+                <w:sz w:val="20"/>
+              </w:rPr>
+              <w:t>4.75 to 4.95 s</w:t>
+            </w:r>
+          </w:p>
+        </w:tc>
+        <w:tc>
+          <w:tcPr>
+            <w:tcW w:type="dxa" w:w="1474"/>
+            <w:vAlign w:val="center"/>
+            <w:tcBorders>
+              <w:top w:val="single" w:sz="4" w:color="D9D9D9"/>
+              <w:left w:val="single" w:sz="4" w:color="D9D9D9"/>
+              <w:bottom w:val="single" w:sz="4" w:color="D9D9D9"/>
+              <w:right w:val="single" w:sz="4" w:color="D9D9D9"/>
+            </w:tcBorders>
+            <w:tcMar>
+              <w:top w:w="85" w:type="dxa"/>
+              <w:left w:w="85" w:type="dxa"/>
+              <w:bottom w:w="85" w:type="dxa"/>
+              <w:right w:w="85" w:type="dxa"/>
+            </w:tcMar>
+          </w:tcPr>
+          <w:p>
+            <w:pPr>
+              <w:spacing w:after="20" w:line="240" w:lineRule="auto"/>
+            </w:pPr>
+            <w:r>
+              <w:rPr>
+                <w:b w:val="0"/>
+                <w:sz w:val="20"/>
+              </w:rPr>
+              <w:t>Both</w:t>
+            </w:r>
+          </w:p>
+        </w:tc>
+        <w:tc>
+          <w:tcPr>
+            <w:tcW w:type="dxa" w:w="6236"/>
+            <w:vAlign w:val="center"/>
+            <w:tcBorders>
+              <w:top w:val="single" w:sz="4" w:color="D9D9D9"/>
+              <w:left w:val="single" w:sz="4" w:color="D9D9D9"/>
+              <w:bottom w:val="single" w:sz="4" w:color="D9D9D9"/>
+              <w:right w:val="single" w:sz="4" w:color="D9D9D9"/>
+            </w:tcBorders>
+            <w:tcMar>
+              <w:top w:w="85" w:type="dxa"/>
+              <w:left w:w="85" w:type="dxa"/>
+              <w:bottom w:w="85" w:type="dxa"/>
+              <w:right w:w="85" w:type="dxa"/>
+            </w:tcMar>
+          </w:tcPr>
+          <w:p>
+            <w:pPr>
+              <w:spacing w:after="20" w:line="240" w:lineRule="auto"/>
+            </w:pPr>
+            <w:r>
+              <w:rPr>
+                <w:b w:val="0"/>
+                <w:sz w:val="20"/>
+              </w:rPr>
+              <w:t>INFO0 frames: 600 baud DPSK, 1200 Hz carrier from the call side, 2400 Hz from the answer side</w:t>
+            </w:r>
+          </w:p>
+        </w:tc>
+      </w:tr>
+      <w:tr>
+        <w:trPr>
+          <w:cantSplit/>
+        </w:trPr>
+        <w:tc>
+          <w:tcPr>
+            <w:tcW w:type="dxa" w:w="1701"/>
+            <w:vAlign w:val="center"/>
+            <w:tcBorders>
+              <w:top w:val="single" w:sz="4" w:color="D9D9D9"/>
+              <w:left w:val="single" w:sz="4" w:color="D9D9D9"/>
+              <w:bottom w:val="single" w:sz="4" w:color="D9D9D9"/>
+              <w:right w:val="single" w:sz="4" w:color="D9D9D9"/>
+            </w:tcBorders>
+            <w:tcMar>
+              <w:top w:w="85" w:type="dxa"/>
+              <w:left w:w="85" w:type="dxa"/>
+              <w:bottom w:w="85" w:type="dxa"/>
+              <w:right w:w="85" w:type="dxa"/>
+            </w:tcMar>
+          </w:tcPr>
+          <w:p>
+            <w:pPr>
+              <w:spacing w:after="20" w:line="240" w:lineRule="auto"/>
+            </w:pPr>
+            <w:r>
+              <w:rPr>
+                <w:b w:val="0"/>
+                <w:sz w:val="20"/>
+              </w:rPr>
+              <w:t>4.9 to 5.35 s</w:t>
+            </w:r>
+          </w:p>
+        </w:tc>
+        <w:tc>
+          <w:tcPr>
+            <w:tcW w:type="dxa" w:w="1474"/>
+            <w:vAlign w:val="center"/>
+            <w:tcBorders>
+              <w:top w:val="single" w:sz="4" w:color="D9D9D9"/>
+              <w:left w:val="single" w:sz="4" w:color="D9D9D9"/>
+              <w:bottom w:val="single" w:sz="4" w:color="D9D9D9"/>
+              <w:right w:val="single" w:sz="4" w:color="D9D9D9"/>
+            </w:tcBorders>
+            <w:tcMar>
+              <w:top w:w="85" w:type="dxa"/>
+              <w:left w:w="85" w:type="dxa"/>
+              <w:bottom w:w="85" w:type="dxa"/>
+              <w:right w:w="85" w:type="dxa"/>
+            </w:tcMar>
+          </w:tcPr>
+          <w:p>
+            <w:pPr>
+              <w:spacing w:after="20" w:line="240" w:lineRule="auto"/>
+            </w:pPr>
+            <w:r>
+              <w:rPr>
+                <w:b w:val="0"/>
+                <w:sz w:val="20"/>
+              </w:rPr>
+              <w:t>Both</w:t>
+            </w:r>
+          </w:p>
+        </w:tc>
+        <w:tc>
+          <w:tcPr>
+            <w:tcW w:type="dxa" w:w="6236"/>
+            <w:vAlign w:val="center"/>
+            <w:tcBorders>
+              <w:top w:val="single" w:sz="4" w:color="D9D9D9"/>
+              <w:left w:val="single" w:sz="4" w:color="D9D9D9"/>
+              <w:bottom w:val="single" w:sz="4" w:color="D9D9D9"/>
+              <w:right w:val="single" w:sz="4" w:color="D9D9D9"/>
+            </w:tcBorders>
+            <w:tcMar>
+              <w:top w:w="85" w:type="dxa"/>
+              <w:left w:w="85" w:type="dxa"/>
+              <w:bottom w:w="85" w:type="dxa"/>
+              <w:right w:w="85" w:type="dxa"/>
+            </w:tcMar>
+          </w:tcPr>
+          <w:p>
+            <w:pPr>
+              <w:spacing w:after="20" w:line="240" w:lineRule="auto"/>
+            </w:pPr>
+            <w:r>
+              <w:rPr>
+                <w:b w:val="0"/>
+                <w:sz w:val="20"/>
+              </w:rPr>
+              <w:t>Tone B from the call side, tone A from the answer side</w:t>
+            </w:r>
+          </w:p>
+        </w:tc>
+      </w:tr>
+      <w:tr>
+        <w:trPr>
+          <w:cantSplit/>
+        </w:trPr>
+        <w:tc>
+          <w:tcPr>
+            <w:tcW w:type="dxa" w:w="1701"/>
+            <w:vAlign w:val="center"/>
+            <w:tcBorders>
+              <w:top w:val="single" w:sz="4" w:color="D9D9D9"/>
+              <w:left w:val="single" w:sz="4" w:color="D9D9D9"/>
+              <w:bottom w:val="single" w:sz="4" w:color="D9D9D9"/>
+              <w:right w:val="single" w:sz="4" w:color="D9D9D9"/>
+            </w:tcBorders>
+            <w:tcMar>
+              <w:top w:w="85" w:type="dxa"/>
+              <w:left w:w="85" w:type="dxa"/>
+              <w:bottom w:w="85" w:type="dxa"/>
+              <w:right w:w="85" w:type="dxa"/>
+            </w:tcMar>
+          </w:tcPr>
+          <w:p>
+            <w:pPr>
+              <w:spacing w:after="20" w:line="240" w:lineRule="auto"/>
+            </w:pPr>
+            <w:r>
+              <w:rPr>
+                <w:b w:val="0"/>
+                <w:sz w:val="20"/>
+              </w:rPr>
+              <w:t>5.35 to 5.60 s</w:t>
+            </w:r>
+          </w:p>
+        </w:tc>
+        <w:tc>
+          <w:tcPr>
+            <w:tcW w:type="dxa" w:w="1474"/>
+            <w:vAlign w:val="center"/>
+            <w:tcBorders>
+              <w:top w:val="single" w:sz="4" w:color="D9D9D9"/>
+              <w:left w:val="single" w:sz="4" w:color="D9D9D9"/>
+              <w:bottom w:val="single" w:sz="4" w:color="D9D9D9"/>
+              <w:right w:val="single" w:sz="4" w:color="D9D9D9"/>
+            </w:tcBorders>
+            <w:tcMar>
+              <w:top w:w="85" w:type="dxa"/>
+              <w:left w:w="85" w:type="dxa"/>
+              <w:bottom w:w="85" w:type="dxa"/>
+              <w:right w:w="85" w:type="dxa"/>
+            </w:tcMar>
+          </w:tcPr>
+          <w:p>
+            <w:pPr>
+              <w:spacing w:after="20" w:line="240" w:lineRule="auto"/>
+            </w:pPr>
+            <w:r>
+              <w:rPr>
+                <w:b w:val="0"/>
+                <w:sz w:val="20"/>
+              </w:rPr>
+              <w:t>Answerer</w:t>
+            </w:r>
+          </w:p>
+        </w:tc>
+        <w:tc>
+          <w:tcPr>
+            <w:tcW w:type="dxa" w:w="6236"/>
+            <w:vAlign w:val="center"/>
+            <w:tcBorders>
+              <w:top w:val="single" w:sz="4" w:color="D9D9D9"/>
+              <w:left w:val="single" w:sz="4" w:color="D9D9D9"/>
+              <w:bottom w:val="single" w:sz="4" w:color="D9D9D9"/>
+              <w:right w:val="single" w:sz="4" w:color="D9D9D9"/>
+            </w:tcBorders>
+            <w:tcMar>
+              <w:top w:w="85" w:type="dxa"/>
+              <w:left w:w="85" w:type="dxa"/>
+              <w:bottom w:w="85" w:type="dxa"/>
+              <w:right w:w="85" w:type="dxa"/>
+            </w:tcMar>
+          </w:tcPr>
+          <w:p>
+            <w:pPr>
+              <w:spacing w:after="20" w:line="240" w:lineRule="auto"/>
+            </w:pPr>
+            <w:r>
+              <w:rPr>
+                <w:b w:val="0"/>
+                <w:sz w:val="20"/>
+              </w:rPr>
+              <w:t>Startup source</w:t>
+            </w:r>
+          </w:p>
+        </w:tc>
+      </w:tr>
+      <w:tr>
+        <w:trPr>
+          <w:cantSplit/>
+        </w:trPr>
+        <w:tc>
+          <w:tcPr>
+            <w:tcW w:type="dxa" w:w="1701"/>
+            <w:vAlign w:val="center"/>
+            <w:tcBorders>
+              <w:top w:val="single" w:sz="4" w:color="D9D9D9"/>
+              <w:left w:val="single" w:sz="4" w:color="D9D9D9"/>
+              <w:bottom w:val="single" w:sz="4" w:color="D9D9D9"/>
+              <w:right w:val="single" w:sz="4" w:color="D9D9D9"/>
+            </w:tcBorders>
+            <w:tcMar>
+              <w:top w:w="85" w:type="dxa"/>
+              <w:left w:w="85" w:type="dxa"/>
+              <w:bottom w:w="85" w:type="dxa"/>
+              <w:right w:w="85" w:type="dxa"/>
+            </w:tcMar>
+          </w:tcPr>
+          <w:p>
+            <w:pPr>
+              <w:spacing w:after="20" w:line="240" w:lineRule="auto"/>
+            </w:pPr>
+            <w:r>
+              <w:rPr>
+                <w:b w:val="0"/>
+                <w:sz w:val="20"/>
+              </w:rPr>
+              <w:t>5.70 to 5.96 s</w:t>
+            </w:r>
+          </w:p>
+        </w:tc>
+        <w:tc>
+          <w:tcPr>
+            <w:tcW w:type="dxa" w:w="1474"/>
+            <w:vAlign w:val="center"/>
+            <w:tcBorders>
+              <w:top w:val="single" w:sz="4" w:color="D9D9D9"/>
+              <w:left w:val="single" w:sz="4" w:color="D9D9D9"/>
+              <w:bottom w:val="single" w:sz="4" w:color="D9D9D9"/>
+              <w:right w:val="single" w:sz="4" w:color="D9D9D9"/>
+            </w:tcBorders>
+            <w:tcMar>
+              <w:top w:w="85" w:type="dxa"/>
+              <w:left w:w="85" w:type="dxa"/>
+              <w:bottom w:w="85" w:type="dxa"/>
+              <w:right w:w="85" w:type="dxa"/>
+            </w:tcMar>
+          </w:tcPr>
+          <w:p>
+            <w:pPr>
+              <w:spacing w:after="20" w:line="240" w:lineRule="auto"/>
+            </w:pPr>
+            <w:r>
+              <w:rPr>
+                <w:b w:val="0"/>
+                <w:sz w:val="20"/>
+              </w:rPr>
+              <w:t>Originator</w:t>
+            </w:r>
+          </w:p>
+        </w:tc>
+        <w:tc>
+          <w:tcPr>
+            <w:tcW w:type="dxa" w:w="6236"/>
+            <w:vAlign w:val="center"/>
+            <w:tcBorders>
+              <w:top w:val="single" w:sz="4" w:color="D9D9D9"/>
+              <w:left w:val="single" w:sz="4" w:color="D9D9D9"/>
+              <w:bottom w:val="single" w:sz="4" w:color="D9D9D9"/>
+              <w:right w:val="single" w:sz="4" w:color="D9D9D9"/>
+            </w:tcBorders>
+            <w:tcMar>
+              <w:top w:w="85" w:type="dxa"/>
+              <w:left w:w="85" w:type="dxa"/>
+              <w:bottom w:w="85" w:type="dxa"/>
+              <w:right w:w="85" w:type="dxa"/>
+            </w:tcMar>
+          </w:tcPr>
+          <w:p>
+            <w:pPr>
+              <w:spacing w:after="20" w:line="240" w:lineRule="auto"/>
+            </w:pPr>
+            <w:r>
+              <w:rPr>
+                <w:b w:val="0"/>
+                <w:sz w:val="20"/>
+              </w:rPr>
+              <w:t>Startup source, after the answerer source was acquired</w:t>
+            </w:r>
+          </w:p>
+        </w:tc>
+      </w:tr>
+      <w:tr>
+        <w:trPr>
+          <w:cantSplit/>
+        </w:trPr>
+        <w:tc>
+          <w:tcPr>
+            <w:tcW w:type="dxa" w:w="1701"/>
+            <w:vAlign w:val="center"/>
+            <w:tcBorders>
+              <w:top w:val="single" w:sz="4" w:color="D9D9D9"/>
+              <w:left w:val="single" w:sz="4" w:color="D9D9D9"/>
+              <w:bottom w:val="single" w:sz="4" w:color="D9D9D9"/>
+              <w:right w:val="single" w:sz="4" w:color="D9D9D9"/>
+            </w:tcBorders>
+            <w:tcMar>
+              <w:top w:w="85" w:type="dxa"/>
+              <w:left w:w="85" w:type="dxa"/>
+              <w:bottom w:w="85" w:type="dxa"/>
+              <w:right w:w="85" w:type="dxa"/>
+            </w:tcMar>
+          </w:tcPr>
+          <w:p>
+            <w:pPr>
+              <w:spacing w:after="20" w:line="240" w:lineRule="auto"/>
+            </w:pPr>
+            <w:r>
+              <w:rPr>
+                <w:b w:val="0"/>
+                <w:sz w:val="20"/>
+              </w:rPr>
+              <w:t>6.05 s on</w:t>
+            </w:r>
+          </w:p>
+        </w:tc>
+        <w:tc>
+          <w:tcPr>
+            <w:tcW w:type="dxa" w:w="1474"/>
+            <w:vAlign w:val="center"/>
+            <w:tcBorders>
+              <w:top w:val="single" w:sz="4" w:color="D9D9D9"/>
+              <w:left w:val="single" w:sz="4" w:color="D9D9D9"/>
+              <w:bottom w:val="single" w:sz="4" w:color="D9D9D9"/>
+              <w:right w:val="single" w:sz="4" w:color="D9D9D9"/>
+            </w:tcBorders>
+            <w:tcMar>
+              <w:top w:w="85" w:type="dxa"/>
+              <w:left w:w="85" w:type="dxa"/>
+              <w:bottom w:w="85" w:type="dxa"/>
+              <w:right w:w="85" w:type="dxa"/>
+            </w:tcMar>
+          </w:tcPr>
+          <w:p>
+            <w:pPr>
+              <w:spacing w:after="20" w:line="240" w:lineRule="auto"/>
+            </w:pPr>
+            <w:r>
+              <w:rPr>
+                <w:b w:val="0"/>
+                <w:sz w:val="20"/>
+              </w:rPr>
+              <w:t>Both</w:t>
+            </w:r>
+          </w:p>
+        </w:tc>
+        <w:tc>
+          <w:tcPr>
+            <w:tcW w:type="dxa" w:w="6236"/>
+            <w:vAlign w:val="center"/>
+            <w:tcBorders>
+              <w:top w:val="single" w:sz="4" w:color="D9D9D9"/>
+              <w:left w:val="single" w:sz="4" w:color="D9D9D9"/>
+              <w:bottom w:val="single" w:sz="4" w:color="D9D9D9"/>
+              <w:right w:val="single" w:sz="4" w:color="D9D9D9"/>
+            </w:tcBorders>
+            <w:tcMar>
+              <w:top w:w="85" w:type="dxa"/>
+              <w:left w:w="85" w:type="dxa"/>
+              <w:bottom w:w="85" w:type="dxa"/>
+              <w:right w:w="85" w:type="dxa"/>
+            </w:tcMar>
+          </w:tcPr>
+          <w:p>
+            <w:pPr>
+              <w:spacing w:after="20" w:line="240" w:lineRule="auto"/>
+            </w:pPr>
+            <w:r>
+              <w:rPr>
+                <w:b w:val="0"/>
+                <w:sz w:val="20"/>
+              </w:rPr>
+              <w:t>Scrambled data</w:t>
+            </w:r>
+          </w:p>
+        </w:tc>
+      </w:tr>
+    </w:tbl>
+    <w:p/>
     <w:p>
       <w:pPr>
         <w:pStyle w:val="Heading1"/>
@@ -17073,7 +18062,7 @@
         <w:rPr>
           <w:sz w:val="20"/>
         </w:rPr>
-        <w:t>The impairment test is tools/x2_source_impairment.py with artifacts/x2-source-impairment-20261004/verification.json. The marker receiver is documented at the end of docs/x2-v90-protocol-selection.md; tools/verify_x2_marker_receiver.py runs the original QF060003 parse from 97B5 and writes artifacts/x2-marker-receiver-20261004/verification.json. The arming site is 9791; the IM020104 counterpart is 948A.</w:t>
+        <w:t>The pre-gate bearer sequence is analysed by tools/analyze_bearer_handshake.py with artifacts/x2-pre-gate-20261004/analysis.json. The impairment test is tools/x2_source_impairment.py with artifacts/x2-source-impairment-20261004/verification.json. The marker receiver is documented at the end of docs/x2-v90-protocol-selection.md; tools/verify_x2_marker_receiver.py runs the original QF060003 parse from 97B5 and writes artifacts/x2-marker-receiver-20261004/verification.json. The arming site is 9791; the IM020104 counterpart is 948A.</w:t>
       </w:r>
     </w:p>
     <w:p>
@@ -17110,7 +18099,7 @@
         <w:rPr>
           <w:sz w:val="20"/>
         </w:rPr>
-        <w:t>Draft 0.23 tests multi-phase errors. Draft 0.22 sweeps all six phases of the impairment test. Draft 0.21 reproduces the 56000 decision with a controlled low-bit impairment of the startup source. Draft 0.20 decodes the data-mode hook families and the rate decision after the capability exchange. Draft 0.19 decodes the in-band capability frame. Draft 0.18 decodes the receiver mismatch handling. Draft 0.17 decodes the startup source receiver that ends the wait. Draft 0.16 decodes the originating-end idle stub and the wait that ends it. Draft 0.15 traces the symmetric startup branch. Draft 0.14 specifies the server peer-role test on the exchanged INFO0 words. Draft 0.13 traces the server after marker acceptance. Draft 0.12 identifies the server receiver for the seven-bit marker and verifies its field parse. Draft 0.11 resolves the 3453C capability route: the transmitted INFO0 word is the plain tag 51 word and the tag 70 word is never read. Draft 0.10 adds pre-V.90 and later client rate selection, position grouping, variable-length body construction and original serialization. It distinguishes the host diagnostic report from peer records and records the XC timing correction and successful symmetric regression. Draft 0.9 executes the four-word PCM record receiver through CRC acceptance, rate-mask selection, bank construction, mapped output and later payload-source activation. The client measurement-to-record producer and complete call-state selection remain open. Draft 0.8 verified 57333 profiles and corrected builder product scaling to SPM 1. Draft 0.7 confirmed active GPC scrambling and pre-data resets in the symmetric 64000 pair. Analogue client decoding, alternate companding output and complete peer negotiation remain open.</w:t>
+        <w:t>Draft 0.24 decodes the bearer sequence before the INFO0 gate. Draft 0.23 tests multi-phase errors. Draft 0.22 sweeps all six phases of the impairment test. Draft 0.21 reproduces the 56000 decision with a controlled low-bit impairment of the startup source. Draft 0.20 decodes the data-mode hook families and the rate decision after the capability exchange. Draft 0.19 decodes the in-band capability frame. Draft 0.18 decodes the receiver mismatch handling. Draft 0.17 decodes the startup source receiver that ends the wait. Draft 0.16 decodes the originating-end idle stub and the wait that ends it. Draft 0.15 traces the symmetric startup branch. Draft 0.14 specifies the server peer-role test on the exchanged INFO0 words. Draft 0.13 traces the server after marker acceptance. Draft 0.12 identifies the server receiver for the seven-bit marker and verifies its field parse. Draft 0.11 resolves the 3453C capability route: the transmitted INFO0 word is the plain tag 51 word and the tag 70 word is never read. Draft 0.10 adds pre-V.90 and later client rate selection, position grouping, variable-length body construction and original serialization. It distinguishes the host diagnostic report from peer records and records the XC timing correction and successful symmetric regression. Draft 0.9 executes the four-word PCM record receiver through CRC acceptance, rate-mask selection, bank construction, mapped output and later payload-source activation. The client measurement-to-record producer and complete call-state selection remain open. Draft 0.8 verified 57333 profiles and corrected builder product scaling to SPM 1. Draft 0.7 confirmed active GPC scrambling and pre-data resets in the symmetric 64000 pair. Analogue client decoding, alternate companding output and complete peer negotiation remain open.</w:t>
       </w:r>
     </w:p>
     <w:p>
@@ -17249,7 +18238,7 @@
       <w:rPr>
         <w:sz w:val="18"/>
       </w:rPr>
-      <w:t>COURIER EMU     x2 firmware reconstruction     Draft 0.23</w:t>
+      <w:t>COURIER EMU     x2 firmware reconstruction     Draft 0.24</w:t>
     </w:r>
   </w:p>
 </w:hdr>

</xml_diff>

<commit_message>
Map the asymmetric call's bearer sequence and decode the marker frame from the line
Analyzer now bridges tone glitches and decodes 7-bit INFO-format frames.
Courier INFO0 clears bits 23/24; marker 4d decodes with a good CRC; 0034
and the server's digital zero follow within about 70 ms. Spec draft 0.25.

Co-Authored-By: Claude Sonnet 5.5 <noreply@anthropic.com>
</commit_message>
<xml_diff>
--- a/artifacts/x2-spec-20261004/x2-technical-specification.docx
+++ b/artifacts/x2-spec-20261004/x2-technical-specification.docx
@@ -20,7 +20,7 @@
     </w:p>
     <w:p>
       <w:r>
-        <w:t>Draft 0.24   •   Independent firmware reconstruction   •   4 October 2026</w:t>
+        <w:t>Draft 0.25   •   Independent firmware reconstruction   •   4 October 2026</w:t>
       </w:r>
     </w:p>
     <w:p>
@@ -2233,6 +2233,1177 @@
                 <w:sz w:val="20"/>
               </w:rPr>
               <w:t>Scrambled data</w:t>
+            </w:r>
+          </w:p>
+        </w:tc>
+      </w:tr>
+    </w:tbl>
+    <w:p/>
+    <w:p>
+      <w:r>
+        <w:t>The asymmetric call between an analogue Courier and the I-modem runs the same V.8 and INFO0 steps with different contents. The Courier INFO0 word clears bits 23 and 24 where the server word sets both, so the symmetric condition of clause 12 is false and the two words differ in the CME bit: the marker path. The Courier then transmits the seven-bit marker frame about 0.3 s after the end of the tones; it decodes from the bearer, with a passing CRC, to the originator announcement 4D hexadecimal. About 60 ms later the server reports the retune message with index 4, and 70 ms after the frame it begins sending digital zero for about 2.2 s while the Courier sends a wideband signal. The V.8 messages differ from the symmetric call in one octet and in one bit of the last octet; their meaning was not decoded.</w:t>
+      </w:r>
+    </w:p>
+    <w:p>
+      <w:pPr>
+        <w:pStyle w:val="Caption"/>
+      </w:pPr>
+      <w:r>
+        <w:t>Table 3B — Observed bearer sequence, analogue Courier to I-modem</w:t>
+      </w:r>
+    </w:p>
+    <w:tbl>
+      <w:tblPr>
+        <w:tblW w:type="auto" w:w="0"/>
+        <w:jc w:val="center"/>
+        <w:tblLayout w:type="fixed"/>
+        <w:tblLook w:firstColumn="1" w:firstRow="1" w:lastColumn="0" w:lastRow="0" w:noHBand="0" w:noVBand="1" w:val="04A0"/>
+      </w:tblPr>
+      <w:tblGrid>
+        <w:gridCol w:w="1701"/>
+        <w:gridCol w:w="1474"/>
+        <w:gridCol w:w="6236"/>
+      </w:tblGrid>
+      <w:tr>
+        <w:trPr>
+          <w:tblHeader/>
+          <w:cantSplit/>
+        </w:trPr>
+        <w:tc>
+          <w:tcPr>
+            <w:tcW w:type="dxa" w:w="1701"/>
+            <w:vAlign w:val="center"/>
+            <w:tcBorders>
+              <w:top w:val="single" w:sz="4" w:color="D9D9D9"/>
+              <w:left w:val="single" w:sz="4" w:color="D9D9D9"/>
+              <w:bottom w:val="single" w:sz="4" w:color="D9D9D9"/>
+              <w:right w:val="single" w:sz="4" w:color="D9D9D9"/>
+            </w:tcBorders>
+            <w:shd w:fill="E7E7E7"/>
+            <w:tcMar>
+              <w:top w:w="85" w:type="dxa"/>
+              <w:left w:w="85" w:type="dxa"/>
+              <w:bottom w:w="85" w:type="dxa"/>
+              <w:right w:w="85" w:type="dxa"/>
+            </w:tcMar>
+          </w:tcPr>
+          <w:p>
+            <w:pPr>
+              <w:spacing w:after="20" w:line="240" w:lineRule="auto"/>
+            </w:pPr>
+            <w:r>
+              <w:rPr>
+                <w:b/>
+                <w:sz w:val="20"/>
+              </w:rPr>
+              <w:t>Time</w:t>
+            </w:r>
+          </w:p>
+        </w:tc>
+        <w:tc>
+          <w:tcPr>
+            <w:tcW w:type="dxa" w:w="1474"/>
+            <w:vAlign w:val="center"/>
+            <w:tcBorders>
+              <w:top w:val="single" w:sz="4" w:color="D9D9D9"/>
+              <w:left w:val="single" w:sz="4" w:color="D9D9D9"/>
+              <w:bottom w:val="single" w:sz="4" w:color="D9D9D9"/>
+              <w:right w:val="single" w:sz="4" w:color="D9D9D9"/>
+            </w:tcBorders>
+            <w:shd w:fill="E7E7E7"/>
+            <w:tcMar>
+              <w:top w:w="85" w:type="dxa"/>
+              <w:left w:w="85" w:type="dxa"/>
+              <w:bottom w:w="85" w:type="dxa"/>
+              <w:right w:w="85" w:type="dxa"/>
+            </w:tcMar>
+          </w:tcPr>
+          <w:p>
+            <w:pPr>
+              <w:spacing w:after="20" w:line="240" w:lineRule="auto"/>
+            </w:pPr>
+            <w:r>
+              <w:rPr>
+                <w:b/>
+                <w:sz w:val="20"/>
+              </w:rPr>
+              <w:t>Sender</w:t>
+            </w:r>
+          </w:p>
+        </w:tc>
+        <w:tc>
+          <w:tcPr>
+            <w:tcW w:type="dxa" w:w="6236"/>
+            <w:vAlign w:val="center"/>
+            <w:tcBorders>
+              <w:top w:val="single" w:sz="4" w:color="D9D9D9"/>
+              <w:left w:val="single" w:sz="4" w:color="D9D9D9"/>
+              <w:bottom w:val="single" w:sz="4" w:color="D9D9D9"/>
+              <w:right w:val="single" w:sz="4" w:color="D9D9D9"/>
+            </w:tcBorders>
+            <w:shd w:fill="E7E7E7"/>
+            <w:tcMar>
+              <w:top w:w="85" w:type="dxa"/>
+              <w:left w:w="85" w:type="dxa"/>
+              <w:bottom w:w="85" w:type="dxa"/>
+              <w:right w:w="85" w:type="dxa"/>
+            </w:tcMar>
+          </w:tcPr>
+          <w:p>
+            <w:pPr>
+              <w:spacing w:after="20" w:line="240" w:lineRule="auto"/>
+            </w:pPr>
+            <w:r>
+              <w:rPr>
+                <w:b/>
+                <w:sz w:val="20"/>
+              </w:rPr>
+              <w:t>Signal</w:t>
+            </w:r>
+          </w:p>
+        </w:tc>
+      </w:tr>
+      <w:tr>
+        <w:trPr>
+          <w:cantSplit/>
+        </w:trPr>
+        <w:tc>
+          <w:tcPr>
+            <w:tcW w:type="dxa" w:w="1701"/>
+            <w:vAlign w:val="center"/>
+            <w:tcBorders>
+              <w:top w:val="single" w:sz="4" w:color="D9D9D9"/>
+              <w:left w:val="single" w:sz="4" w:color="D9D9D9"/>
+              <w:bottom w:val="single" w:sz="4" w:color="D9D9D9"/>
+              <w:right w:val="single" w:sz="4" w:color="D9D9D9"/>
+            </w:tcBorders>
+            <w:tcMar>
+              <w:top w:w="85" w:type="dxa"/>
+              <w:left w:w="85" w:type="dxa"/>
+              <w:bottom w:w="85" w:type="dxa"/>
+              <w:right w:w="85" w:type="dxa"/>
+            </w:tcMar>
+          </w:tcPr>
+          <w:p>
+            <w:pPr>
+              <w:spacing w:after="20" w:line="240" w:lineRule="auto"/>
+            </w:pPr>
+            <w:r>
+              <w:rPr>
+                <w:b w:val="0"/>
+                <w:sz w:val="20"/>
+              </w:rPr>
+              <w:t>0.7 to 2.1 s</w:t>
+            </w:r>
+          </w:p>
+        </w:tc>
+        <w:tc>
+          <w:tcPr>
+            <w:tcW w:type="dxa" w:w="1474"/>
+            <w:vAlign w:val="center"/>
+            <w:tcBorders>
+              <w:top w:val="single" w:sz="4" w:color="D9D9D9"/>
+              <w:left w:val="single" w:sz="4" w:color="D9D9D9"/>
+              <w:bottom w:val="single" w:sz="4" w:color="D9D9D9"/>
+              <w:right w:val="single" w:sz="4" w:color="D9D9D9"/>
+            </w:tcBorders>
+            <w:tcMar>
+              <w:top w:w="85" w:type="dxa"/>
+              <w:left w:w="85" w:type="dxa"/>
+              <w:bottom w:w="85" w:type="dxa"/>
+              <w:right w:w="85" w:type="dxa"/>
+            </w:tcMar>
+          </w:tcPr>
+          <w:p>
+            <w:pPr>
+              <w:spacing w:after="20" w:line="240" w:lineRule="auto"/>
+            </w:pPr>
+            <w:r>
+              <w:rPr>
+                <w:b w:val="0"/>
+                <w:sz w:val="20"/>
+              </w:rPr>
+              <w:t>Courier</w:t>
+            </w:r>
+          </w:p>
+        </w:tc>
+        <w:tc>
+          <w:tcPr>
+            <w:tcW w:type="dxa" w:w="6236"/>
+            <w:vAlign w:val="center"/>
+            <w:tcBorders>
+              <w:top w:val="single" w:sz="4" w:color="D9D9D9"/>
+              <w:left w:val="single" w:sz="4" w:color="D9D9D9"/>
+              <w:bottom w:val="single" w:sz="4" w:color="D9D9D9"/>
+              <w:right w:val="single" w:sz="4" w:color="D9D9D9"/>
+            </w:tcBorders>
+            <w:tcMar>
+              <w:top w:w="85" w:type="dxa"/>
+              <w:left w:w="85" w:type="dxa"/>
+              <w:bottom w:w="85" w:type="dxa"/>
+              <w:right w:w="85" w:type="dxa"/>
+            </w:tcMar>
+          </w:tcPr>
+          <w:p>
+            <w:pPr>
+              <w:spacing w:after="20" w:line="240" w:lineRule="auto"/>
+            </w:pPr>
+            <w:r>
+              <w:rPr>
+                <w:b w:val="0"/>
+                <w:sz w:val="20"/>
+              </w:rPr>
+              <w:t>V.8 call indicate</w:t>
+            </w:r>
+          </w:p>
+        </w:tc>
+      </w:tr>
+      <w:tr>
+        <w:trPr>
+          <w:cantSplit/>
+        </w:trPr>
+        <w:tc>
+          <w:tcPr>
+            <w:tcW w:type="dxa" w:w="1701"/>
+            <w:vAlign w:val="center"/>
+            <w:tcBorders>
+              <w:top w:val="single" w:sz="4" w:color="D9D9D9"/>
+              <w:left w:val="single" w:sz="4" w:color="D9D9D9"/>
+              <w:bottom w:val="single" w:sz="4" w:color="D9D9D9"/>
+              <w:right w:val="single" w:sz="4" w:color="D9D9D9"/>
+            </w:tcBorders>
+            <w:tcMar>
+              <w:top w:w="85" w:type="dxa"/>
+              <w:left w:w="85" w:type="dxa"/>
+              <w:bottom w:w="85" w:type="dxa"/>
+              <w:right w:w="85" w:type="dxa"/>
+            </w:tcMar>
+          </w:tcPr>
+          <w:p>
+            <w:pPr>
+              <w:spacing w:after="20" w:line="240" w:lineRule="auto"/>
+            </w:pPr>
+            <w:r>
+              <w:rPr>
+                <w:b w:val="0"/>
+                <w:sz w:val="20"/>
+              </w:rPr>
+              <w:t>1.9 to 3.8 s</w:t>
+            </w:r>
+          </w:p>
+        </w:tc>
+        <w:tc>
+          <w:tcPr>
+            <w:tcW w:type="dxa" w:w="1474"/>
+            <w:vAlign w:val="center"/>
+            <w:tcBorders>
+              <w:top w:val="single" w:sz="4" w:color="D9D9D9"/>
+              <w:left w:val="single" w:sz="4" w:color="D9D9D9"/>
+              <w:bottom w:val="single" w:sz="4" w:color="D9D9D9"/>
+              <w:right w:val="single" w:sz="4" w:color="D9D9D9"/>
+            </w:tcBorders>
+            <w:tcMar>
+              <w:top w:w="85" w:type="dxa"/>
+              <w:left w:w="85" w:type="dxa"/>
+              <w:bottom w:w="85" w:type="dxa"/>
+              <w:right w:w="85" w:type="dxa"/>
+            </w:tcMar>
+          </w:tcPr>
+          <w:p>
+            <w:pPr>
+              <w:spacing w:after="20" w:line="240" w:lineRule="auto"/>
+            </w:pPr>
+            <w:r>
+              <w:rPr>
+                <w:b w:val="0"/>
+                <w:sz w:val="20"/>
+              </w:rPr>
+              <w:t>I-modem</w:t>
+            </w:r>
+          </w:p>
+        </w:tc>
+        <w:tc>
+          <w:tcPr>
+            <w:tcW w:type="dxa" w:w="6236"/>
+            <w:vAlign w:val="center"/>
+            <w:tcBorders>
+              <w:top w:val="single" w:sz="4" w:color="D9D9D9"/>
+              <w:left w:val="single" w:sz="4" w:color="D9D9D9"/>
+              <w:bottom w:val="single" w:sz="4" w:color="D9D9D9"/>
+              <w:right w:val="single" w:sz="4" w:color="D9D9D9"/>
+            </w:tcBorders>
+            <w:tcMar>
+              <w:top w:w="85" w:type="dxa"/>
+              <w:left w:w="85" w:type="dxa"/>
+              <w:bottom w:w="85" w:type="dxa"/>
+              <w:right w:w="85" w:type="dxa"/>
+            </w:tcMar>
+          </w:tcPr>
+          <w:p>
+            <w:pPr>
+              <w:spacing w:after="20" w:line="240" w:lineRule="auto"/>
+            </w:pPr>
+            <w:r>
+              <w:rPr>
+                <w:b w:val="0"/>
+                <w:sz w:val="20"/>
+              </w:rPr>
+              <w:t>2100 Hz answer tone</w:t>
+            </w:r>
+          </w:p>
+        </w:tc>
+      </w:tr>
+      <w:tr>
+        <w:trPr>
+          <w:cantSplit/>
+        </w:trPr>
+        <w:tc>
+          <w:tcPr>
+            <w:tcW w:type="dxa" w:w="1701"/>
+            <w:vAlign w:val="center"/>
+            <w:tcBorders>
+              <w:top w:val="single" w:sz="4" w:color="D9D9D9"/>
+              <w:left w:val="single" w:sz="4" w:color="D9D9D9"/>
+              <w:bottom w:val="single" w:sz="4" w:color="D9D9D9"/>
+              <w:right w:val="single" w:sz="4" w:color="D9D9D9"/>
+            </w:tcBorders>
+            <w:tcMar>
+              <w:top w:w="85" w:type="dxa"/>
+              <w:left w:w="85" w:type="dxa"/>
+              <w:bottom w:w="85" w:type="dxa"/>
+              <w:right w:w="85" w:type="dxa"/>
+            </w:tcMar>
+          </w:tcPr>
+          <w:p>
+            <w:pPr>
+              <w:spacing w:after="20" w:line="240" w:lineRule="auto"/>
+            </w:pPr>
+            <w:r>
+              <w:rPr>
+                <w:b w:val="0"/>
+                <w:sz w:val="20"/>
+              </w:rPr>
+              <w:t>3.3 to 4.6 s</w:t>
+            </w:r>
+          </w:p>
+        </w:tc>
+        <w:tc>
+          <w:tcPr>
+            <w:tcW w:type="dxa" w:w="1474"/>
+            <w:vAlign w:val="center"/>
+            <w:tcBorders>
+              <w:top w:val="single" w:sz="4" w:color="D9D9D9"/>
+              <w:left w:val="single" w:sz="4" w:color="D9D9D9"/>
+              <w:bottom w:val="single" w:sz="4" w:color="D9D9D9"/>
+              <w:right w:val="single" w:sz="4" w:color="D9D9D9"/>
+            </w:tcBorders>
+            <w:tcMar>
+              <w:top w:w="85" w:type="dxa"/>
+              <w:left w:w="85" w:type="dxa"/>
+              <w:bottom w:w="85" w:type="dxa"/>
+              <w:right w:w="85" w:type="dxa"/>
+            </w:tcMar>
+          </w:tcPr>
+          <w:p>
+            <w:pPr>
+              <w:spacing w:after="20" w:line="240" w:lineRule="auto"/>
+            </w:pPr>
+            <w:r>
+              <w:rPr>
+                <w:b w:val="0"/>
+                <w:sz w:val="20"/>
+              </w:rPr>
+              <w:t>Courier</w:t>
+            </w:r>
+          </w:p>
+        </w:tc>
+        <w:tc>
+          <w:tcPr>
+            <w:tcW w:type="dxa" w:w="6236"/>
+            <w:vAlign w:val="center"/>
+            <w:tcBorders>
+              <w:top w:val="single" w:sz="4" w:color="D9D9D9"/>
+              <w:left w:val="single" w:sz="4" w:color="D9D9D9"/>
+              <w:bottom w:val="single" w:sz="4" w:color="D9D9D9"/>
+              <w:right w:val="single" w:sz="4" w:color="D9D9D9"/>
+            </w:tcBorders>
+            <w:tcMar>
+              <w:top w:w="85" w:type="dxa"/>
+              <w:left w:w="85" w:type="dxa"/>
+              <w:bottom w:w="85" w:type="dxa"/>
+              <w:right w:w="85" w:type="dxa"/>
+            </w:tcMar>
+          </w:tcPr>
+          <w:p>
+            <w:pPr>
+              <w:spacing w:after="20" w:line="240" w:lineRule="auto"/>
+            </w:pPr>
+            <w:r>
+              <w:rPr>
+                <w:b w:val="0"/>
+                <w:sz w:val="20"/>
+              </w:rPr>
+              <w:t>V.8 capability message</w:t>
+            </w:r>
+          </w:p>
+        </w:tc>
+      </w:tr>
+      <w:tr>
+        <w:trPr>
+          <w:cantSplit/>
+        </w:trPr>
+        <w:tc>
+          <w:tcPr>
+            <w:tcW w:type="dxa" w:w="1701"/>
+            <w:vAlign w:val="center"/>
+            <w:tcBorders>
+              <w:top w:val="single" w:sz="4" w:color="D9D9D9"/>
+              <w:left w:val="single" w:sz="4" w:color="D9D9D9"/>
+              <w:bottom w:val="single" w:sz="4" w:color="D9D9D9"/>
+              <w:right w:val="single" w:sz="4" w:color="D9D9D9"/>
+            </w:tcBorders>
+            <w:tcMar>
+              <w:top w:w="85" w:type="dxa"/>
+              <w:left w:w="85" w:type="dxa"/>
+              <w:bottom w:w="85" w:type="dxa"/>
+              <w:right w:w="85" w:type="dxa"/>
+            </w:tcMar>
+          </w:tcPr>
+          <w:p>
+            <w:pPr>
+              <w:spacing w:after="20" w:line="240" w:lineRule="auto"/>
+            </w:pPr>
+            <w:r>
+              <w:rPr>
+                <w:b w:val="0"/>
+                <w:sz w:val="20"/>
+              </w:rPr>
+              <w:t>3.8 to 4.6 s</w:t>
+            </w:r>
+          </w:p>
+        </w:tc>
+        <w:tc>
+          <w:tcPr>
+            <w:tcW w:type="dxa" w:w="1474"/>
+            <w:vAlign w:val="center"/>
+            <w:tcBorders>
+              <w:top w:val="single" w:sz="4" w:color="D9D9D9"/>
+              <w:left w:val="single" w:sz="4" w:color="D9D9D9"/>
+              <w:bottom w:val="single" w:sz="4" w:color="D9D9D9"/>
+              <w:right w:val="single" w:sz="4" w:color="D9D9D9"/>
+            </w:tcBorders>
+            <w:tcMar>
+              <w:top w:w="85" w:type="dxa"/>
+              <w:left w:w="85" w:type="dxa"/>
+              <w:bottom w:w="85" w:type="dxa"/>
+              <w:right w:w="85" w:type="dxa"/>
+            </w:tcMar>
+          </w:tcPr>
+          <w:p>
+            <w:pPr>
+              <w:spacing w:after="20" w:line="240" w:lineRule="auto"/>
+            </w:pPr>
+            <w:r>
+              <w:rPr>
+                <w:b w:val="0"/>
+                <w:sz w:val="20"/>
+              </w:rPr>
+              <w:t>I-modem</w:t>
+            </w:r>
+          </w:p>
+        </w:tc>
+        <w:tc>
+          <w:tcPr>
+            <w:tcW w:type="dxa" w:w="6236"/>
+            <w:vAlign w:val="center"/>
+            <w:tcBorders>
+              <w:top w:val="single" w:sz="4" w:color="D9D9D9"/>
+              <w:left w:val="single" w:sz="4" w:color="D9D9D9"/>
+              <w:bottom w:val="single" w:sz="4" w:color="D9D9D9"/>
+              <w:right w:val="single" w:sz="4" w:color="D9D9D9"/>
+            </w:tcBorders>
+            <w:tcMar>
+              <w:top w:w="85" w:type="dxa"/>
+              <w:left w:w="85" w:type="dxa"/>
+              <w:bottom w:w="85" w:type="dxa"/>
+              <w:right w:w="85" w:type="dxa"/>
+            </w:tcMar>
+          </w:tcPr>
+          <w:p>
+            <w:pPr>
+              <w:spacing w:after="20" w:line="240" w:lineRule="auto"/>
+            </w:pPr>
+            <w:r>
+              <w:rPr>
+                <w:b w:val="0"/>
+                <w:sz w:val="20"/>
+              </w:rPr>
+              <w:t>V.8 joint message</w:t>
+            </w:r>
+          </w:p>
+        </w:tc>
+      </w:tr>
+      <w:tr>
+        <w:trPr>
+          <w:cantSplit/>
+        </w:trPr>
+        <w:tc>
+          <w:tcPr>
+            <w:tcW w:type="dxa" w:w="1701"/>
+            <w:vAlign w:val="center"/>
+            <w:tcBorders>
+              <w:top w:val="single" w:sz="4" w:color="D9D9D9"/>
+              <w:left w:val="single" w:sz="4" w:color="D9D9D9"/>
+              <w:bottom w:val="single" w:sz="4" w:color="D9D9D9"/>
+              <w:right w:val="single" w:sz="4" w:color="D9D9D9"/>
+            </w:tcBorders>
+            <w:tcMar>
+              <w:top w:w="85" w:type="dxa"/>
+              <w:left w:w="85" w:type="dxa"/>
+              <w:bottom w:w="85" w:type="dxa"/>
+              <w:right w:w="85" w:type="dxa"/>
+            </w:tcMar>
+          </w:tcPr>
+          <w:p>
+            <w:pPr>
+              <w:spacing w:after="20" w:line="240" w:lineRule="auto"/>
+            </w:pPr>
+            <w:r>
+              <w:rPr>
+                <w:b w:val="0"/>
+                <w:sz w:val="20"/>
+              </w:rPr>
+              <w:t>4.65 to 4.75 s</w:t>
+            </w:r>
+          </w:p>
+        </w:tc>
+        <w:tc>
+          <w:tcPr>
+            <w:tcW w:type="dxa" w:w="1474"/>
+            <w:vAlign w:val="center"/>
+            <w:tcBorders>
+              <w:top w:val="single" w:sz="4" w:color="D9D9D9"/>
+              <w:left w:val="single" w:sz="4" w:color="D9D9D9"/>
+              <w:bottom w:val="single" w:sz="4" w:color="D9D9D9"/>
+              <w:right w:val="single" w:sz="4" w:color="D9D9D9"/>
+            </w:tcBorders>
+            <w:tcMar>
+              <w:top w:w="85" w:type="dxa"/>
+              <w:left w:w="85" w:type="dxa"/>
+              <w:bottom w:w="85" w:type="dxa"/>
+              <w:right w:w="85" w:type="dxa"/>
+            </w:tcMar>
+          </w:tcPr>
+          <w:p>
+            <w:pPr>
+              <w:spacing w:after="20" w:line="240" w:lineRule="auto"/>
+            </w:pPr>
+            <w:r>
+              <w:rPr>
+                <w:b w:val="0"/>
+                <w:sz w:val="20"/>
+              </w:rPr>
+              <w:t>Both</w:t>
+            </w:r>
+          </w:p>
+        </w:tc>
+        <w:tc>
+          <w:tcPr>
+            <w:tcW w:type="dxa" w:w="6236"/>
+            <w:vAlign w:val="center"/>
+            <w:tcBorders>
+              <w:top w:val="single" w:sz="4" w:color="D9D9D9"/>
+              <w:left w:val="single" w:sz="4" w:color="D9D9D9"/>
+              <w:bottom w:val="single" w:sz="4" w:color="D9D9D9"/>
+              <w:right w:val="single" w:sz="4" w:color="D9D9D9"/>
+            </w:tcBorders>
+            <w:tcMar>
+              <w:top w:w="85" w:type="dxa"/>
+              <w:left w:w="85" w:type="dxa"/>
+              <w:bottom w:w="85" w:type="dxa"/>
+              <w:right w:w="85" w:type="dxa"/>
+            </w:tcMar>
+          </w:tcPr>
+          <w:p>
+            <w:pPr>
+              <w:spacing w:after="20" w:line="240" w:lineRule="auto"/>
+            </w:pPr>
+            <w:r>
+              <w:rPr>
+                <w:b w:val="0"/>
+                <w:sz w:val="20"/>
+              </w:rPr>
+              <w:t>INFO0 frames; the Courier word has bits 23 and 24 clear, the server word has both set</w:t>
+            </w:r>
+          </w:p>
+        </w:tc>
+      </w:tr>
+      <w:tr>
+        <w:trPr>
+          <w:cantSplit/>
+        </w:trPr>
+        <w:tc>
+          <w:tcPr>
+            <w:tcW w:type="dxa" w:w="1701"/>
+            <w:vAlign w:val="center"/>
+            <w:tcBorders>
+              <w:top w:val="single" w:sz="4" w:color="D9D9D9"/>
+              <w:left w:val="single" w:sz="4" w:color="D9D9D9"/>
+              <w:bottom w:val="single" w:sz="4" w:color="D9D9D9"/>
+              <w:right w:val="single" w:sz="4" w:color="D9D9D9"/>
+            </w:tcBorders>
+            <w:tcMar>
+              <w:top w:w="85" w:type="dxa"/>
+              <w:left w:w="85" w:type="dxa"/>
+              <w:bottom w:w="85" w:type="dxa"/>
+              <w:right w:w="85" w:type="dxa"/>
+            </w:tcMar>
+          </w:tcPr>
+          <w:p>
+            <w:pPr>
+              <w:spacing w:after="20" w:line="240" w:lineRule="auto"/>
+            </w:pPr>
+            <w:r>
+              <w:rPr>
+                <w:b w:val="0"/>
+                <w:sz w:val="20"/>
+              </w:rPr>
+              <w:t>4.7 to 5.0 s</w:t>
+            </w:r>
+          </w:p>
+        </w:tc>
+        <w:tc>
+          <w:tcPr>
+            <w:tcW w:type="dxa" w:w="1474"/>
+            <w:vAlign w:val="center"/>
+            <w:tcBorders>
+              <w:top w:val="single" w:sz="4" w:color="D9D9D9"/>
+              <w:left w:val="single" w:sz="4" w:color="D9D9D9"/>
+              <w:bottom w:val="single" w:sz="4" w:color="D9D9D9"/>
+              <w:right w:val="single" w:sz="4" w:color="D9D9D9"/>
+            </w:tcBorders>
+            <w:tcMar>
+              <w:top w:w="85" w:type="dxa"/>
+              <w:left w:w="85" w:type="dxa"/>
+              <w:bottom w:w="85" w:type="dxa"/>
+              <w:right w:w="85" w:type="dxa"/>
+            </w:tcMar>
+          </w:tcPr>
+          <w:p>
+            <w:pPr>
+              <w:spacing w:after="20" w:line="240" w:lineRule="auto"/>
+            </w:pPr>
+            <w:r>
+              <w:rPr>
+                <w:b w:val="0"/>
+                <w:sz w:val="20"/>
+              </w:rPr>
+              <w:t>Both</w:t>
+            </w:r>
+          </w:p>
+        </w:tc>
+        <w:tc>
+          <w:tcPr>
+            <w:tcW w:type="dxa" w:w="6236"/>
+            <w:vAlign w:val="center"/>
+            <w:tcBorders>
+              <w:top w:val="single" w:sz="4" w:color="D9D9D9"/>
+              <w:left w:val="single" w:sz="4" w:color="D9D9D9"/>
+              <w:bottom w:val="single" w:sz="4" w:color="D9D9D9"/>
+              <w:right w:val="single" w:sz="4" w:color="D9D9D9"/>
+            </w:tcBorders>
+            <w:tcMar>
+              <w:top w:w="85" w:type="dxa"/>
+              <w:left w:w="85" w:type="dxa"/>
+              <w:bottom w:w="85" w:type="dxa"/>
+              <w:right w:w="85" w:type="dxa"/>
+            </w:tcMar>
+          </w:tcPr>
+          <w:p>
+            <w:pPr>
+              <w:spacing w:after="20" w:line="240" w:lineRule="auto"/>
+            </w:pPr>
+            <w:r>
+              <w:rPr>
+                <w:b w:val="0"/>
+                <w:sz w:val="20"/>
+              </w:rPr>
+              <w:t>Tone B from the Courier, tone A from the I-modem</w:t>
+            </w:r>
+          </w:p>
+        </w:tc>
+      </w:tr>
+      <w:tr>
+        <w:trPr>
+          <w:cantSplit/>
+        </w:trPr>
+        <w:tc>
+          <w:tcPr>
+            <w:tcW w:type="dxa" w:w="1701"/>
+            <w:vAlign w:val="center"/>
+            <w:tcBorders>
+              <w:top w:val="single" w:sz="4" w:color="D9D9D9"/>
+              <w:left w:val="single" w:sz="4" w:color="D9D9D9"/>
+              <w:bottom w:val="single" w:sz="4" w:color="D9D9D9"/>
+              <w:right w:val="single" w:sz="4" w:color="D9D9D9"/>
+            </w:tcBorders>
+            <w:tcMar>
+              <w:top w:w="85" w:type="dxa"/>
+              <w:left w:w="85" w:type="dxa"/>
+              <w:bottom w:w="85" w:type="dxa"/>
+              <w:right w:w="85" w:type="dxa"/>
+            </w:tcMar>
+          </w:tcPr>
+          <w:p>
+            <w:pPr>
+              <w:spacing w:after="20" w:line="240" w:lineRule="auto"/>
+            </w:pPr>
+            <w:r>
+              <w:rPr>
+                <w:b w:val="0"/>
+                <w:sz w:val="20"/>
+              </w:rPr>
+              <w:t>5.0 s</w:t>
+            </w:r>
+          </w:p>
+        </w:tc>
+        <w:tc>
+          <w:tcPr>
+            <w:tcW w:type="dxa" w:w="1474"/>
+            <w:vAlign w:val="center"/>
+            <w:tcBorders>
+              <w:top w:val="single" w:sz="4" w:color="D9D9D9"/>
+              <w:left w:val="single" w:sz="4" w:color="D9D9D9"/>
+              <w:bottom w:val="single" w:sz="4" w:color="D9D9D9"/>
+              <w:right w:val="single" w:sz="4" w:color="D9D9D9"/>
+            </w:tcBorders>
+            <w:tcMar>
+              <w:top w:w="85" w:type="dxa"/>
+              <w:left w:w="85" w:type="dxa"/>
+              <w:bottom w:w="85" w:type="dxa"/>
+              <w:right w:w="85" w:type="dxa"/>
+            </w:tcMar>
+          </w:tcPr>
+          <w:p>
+            <w:pPr>
+              <w:spacing w:after="20" w:line="240" w:lineRule="auto"/>
+            </w:pPr>
+            <w:r>
+              <w:rPr>
+                <w:b w:val="0"/>
+                <w:sz w:val="20"/>
+              </w:rPr>
+              <w:t>DSP to host</w:t>
+            </w:r>
+          </w:p>
+        </w:tc>
+        <w:tc>
+          <w:tcPr>
+            <w:tcW w:type="dxa" w:w="6236"/>
+            <w:vAlign w:val="center"/>
+            <w:tcBorders>
+              <w:top w:val="single" w:sz="4" w:color="D9D9D9"/>
+              <w:left w:val="single" w:sz="4" w:color="D9D9D9"/>
+              <w:bottom w:val="single" w:sz="4" w:color="D9D9D9"/>
+              <w:right w:val="single" w:sz="4" w:color="D9D9D9"/>
+            </w:tcBorders>
+            <w:tcMar>
+              <w:top w:w="85" w:type="dxa"/>
+              <w:left w:w="85" w:type="dxa"/>
+              <w:bottom w:w="85" w:type="dxa"/>
+              <w:right w:w="85" w:type="dxa"/>
+            </w:tcMar>
+          </w:tcPr>
+          <w:p>
+            <w:pPr>
+              <w:spacing w:after="20" w:line="240" w:lineRule="auto"/>
+            </w:pPr>
+            <w:r>
+              <w:rPr>
+                <w:b w:val="0"/>
+                <w:sz w:val="20"/>
+              </w:rPr>
+              <w:t>Gate message, as tone A ends</w:t>
+            </w:r>
+          </w:p>
+        </w:tc>
+      </w:tr>
+      <w:tr>
+        <w:trPr>
+          <w:cantSplit/>
+        </w:trPr>
+        <w:tc>
+          <w:tcPr>
+            <w:tcW w:type="dxa" w:w="1701"/>
+            <w:vAlign w:val="center"/>
+            <w:tcBorders>
+              <w:top w:val="single" w:sz="4" w:color="D9D9D9"/>
+              <w:left w:val="single" w:sz="4" w:color="D9D9D9"/>
+              <w:bottom w:val="single" w:sz="4" w:color="D9D9D9"/>
+              <w:right w:val="single" w:sz="4" w:color="D9D9D9"/>
+            </w:tcBorders>
+            <w:tcMar>
+              <w:top w:w="85" w:type="dxa"/>
+              <w:left w:w="85" w:type="dxa"/>
+              <w:bottom w:w="85" w:type="dxa"/>
+              <w:right w:w="85" w:type="dxa"/>
+            </w:tcMar>
+          </w:tcPr>
+          <w:p>
+            <w:pPr>
+              <w:spacing w:after="20" w:line="240" w:lineRule="auto"/>
+            </w:pPr>
+            <w:r>
+              <w:rPr>
+                <w:b w:val="0"/>
+                <w:sz w:val="20"/>
+              </w:rPr>
+              <w:t>5.27 to 5.35 s</w:t>
+            </w:r>
+          </w:p>
+        </w:tc>
+        <w:tc>
+          <w:tcPr>
+            <w:tcW w:type="dxa" w:w="1474"/>
+            <w:vAlign w:val="center"/>
+            <w:tcBorders>
+              <w:top w:val="single" w:sz="4" w:color="D9D9D9"/>
+              <w:left w:val="single" w:sz="4" w:color="D9D9D9"/>
+              <w:bottom w:val="single" w:sz="4" w:color="D9D9D9"/>
+              <w:right w:val="single" w:sz="4" w:color="D9D9D9"/>
+            </w:tcBorders>
+            <w:tcMar>
+              <w:top w:w="85" w:type="dxa"/>
+              <w:left w:w="85" w:type="dxa"/>
+              <w:bottom w:w="85" w:type="dxa"/>
+              <w:right w:w="85" w:type="dxa"/>
+            </w:tcMar>
+          </w:tcPr>
+          <w:p>
+            <w:pPr>
+              <w:spacing w:after="20" w:line="240" w:lineRule="auto"/>
+            </w:pPr>
+            <w:r>
+              <w:rPr>
+                <w:b w:val="0"/>
+                <w:sz w:val="20"/>
+              </w:rPr>
+              <w:t>Courier</w:t>
+            </w:r>
+          </w:p>
+        </w:tc>
+        <w:tc>
+          <w:tcPr>
+            <w:tcW w:type="dxa" w:w="6236"/>
+            <w:vAlign w:val="center"/>
+            <w:tcBorders>
+              <w:top w:val="single" w:sz="4" w:color="D9D9D9"/>
+              <w:left w:val="single" w:sz="4" w:color="D9D9D9"/>
+              <w:bottom w:val="single" w:sz="4" w:color="D9D9D9"/>
+              <w:right w:val="single" w:sz="4" w:color="D9D9D9"/>
+            </w:tcBorders>
+            <w:tcMar>
+              <w:top w:w="85" w:type="dxa"/>
+              <w:left w:w="85" w:type="dxa"/>
+              <w:bottom w:w="85" w:type="dxa"/>
+              <w:right w:w="85" w:type="dxa"/>
+            </w:tcMar>
+          </w:tcPr>
+          <w:p>
+            <w:pPr>
+              <w:spacing w:after="20" w:line="240" w:lineRule="auto"/>
+            </w:pPr>
+            <w:r>
+              <w:rPr>
+                <w:b w:val="0"/>
+                <w:sz w:val="20"/>
+              </w:rPr>
+              <w:t>The seven-bit marker frame, value 4D hexadecimal</w:t>
+            </w:r>
+          </w:p>
+        </w:tc>
+      </w:tr>
+      <w:tr>
+        <w:trPr>
+          <w:cantSplit/>
+        </w:trPr>
+        <w:tc>
+          <w:tcPr>
+            <w:tcW w:type="dxa" w:w="1701"/>
+            <w:vAlign w:val="center"/>
+            <w:tcBorders>
+              <w:top w:val="single" w:sz="4" w:color="D9D9D9"/>
+              <w:left w:val="single" w:sz="4" w:color="D9D9D9"/>
+              <w:bottom w:val="single" w:sz="4" w:color="D9D9D9"/>
+              <w:right w:val="single" w:sz="4" w:color="D9D9D9"/>
+            </w:tcBorders>
+            <w:tcMar>
+              <w:top w:w="85" w:type="dxa"/>
+              <w:left w:w="85" w:type="dxa"/>
+              <w:bottom w:w="85" w:type="dxa"/>
+              <w:right w:w="85" w:type="dxa"/>
+            </w:tcMar>
+          </w:tcPr>
+          <w:p>
+            <w:pPr>
+              <w:spacing w:after="20" w:line="240" w:lineRule="auto"/>
+            </w:pPr>
+            <w:r>
+              <w:rPr>
+                <w:b w:val="0"/>
+                <w:sz w:val="20"/>
+              </w:rPr>
+              <w:t>5.4 s</w:t>
+            </w:r>
+          </w:p>
+        </w:tc>
+        <w:tc>
+          <w:tcPr>
+            <w:tcW w:type="dxa" w:w="1474"/>
+            <w:vAlign w:val="center"/>
+            <w:tcBorders>
+              <w:top w:val="single" w:sz="4" w:color="D9D9D9"/>
+              <w:left w:val="single" w:sz="4" w:color="D9D9D9"/>
+              <w:bottom w:val="single" w:sz="4" w:color="D9D9D9"/>
+              <w:right w:val="single" w:sz="4" w:color="D9D9D9"/>
+            </w:tcBorders>
+            <w:tcMar>
+              <w:top w:w="85" w:type="dxa"/>
+              <w:left w:w="85" w:type="dxa"/>
+              <w:bottom w:w="85" w:type="dxa"/>
+              <w:right w:w="85" w:type="dxa"/>
+            </w:tcMar>
+          </w:tcPr>
+          <w:p>
+            <w:pPr>
+              <w:spacing w:after="20" w:line="240" w:lineRule="auto"/>
+            </w:pPr>
+            <w:r>
+              <w:rPr>
+                <w:b w:val="0"/>
+                <w:sz w:val="20"/>
+              </w:rPr>
+              <w:t>DSP to host</w:t>
+            </w:r>
+          </w:p>
+        </w:tc>
+        <w:tc>
+          <w:tcPr>
+            <w:tcW w:type="dxa" w:w="6236"/>
+            <w:vAlign w:val="center"/>
+            <w:tcBorders>
+              <w:top w:val="single" w:sz="4" w:color="D9D9D9"/>
+              <w:left w:val="single" w:sz="4" w:color="D9D9D9"/>
+              <w:bottom w:val="single" w:sz="4" w:color="D9D9D9"/>
+              <w:right w:val="single" w:sz="4" w:color="D9D9D9"/>
+            </w:tcBorders>
+            <w:tcMar>
+              <w:top w:w="85" w:type="dxa"/>
+              <w:left w:w="85" w:type="dxa"/>
+              <w:bottom w:w="85" w:type="dxa"/>
+              <w:right w:w="85" w:type="dxa"/>
+            </w:tcMar>
+          </w:tcPr>
+          <w:p>
+            <w:pPr>
+              <w:spacing w:after="20" w:line="240" w:lineRule="auto"/>
+            </w:pPr>
+            <w:r>
+              <w:rPr>
+                <w:b w:val="0"/>
+                <w:sz w:val="20"/>
+              </w:rPr>
+              <w:t>Retune message carrying index 4</w:t>
+            </w:r>
+          </w:p>
+        </w:tc>
+      </w:tr>
+      <w:tr>
+        <w:trPr>
+          <w:cantSplit/>
+        </w:trPr>
+        <w:tc>
+          <w:tcPr>
+            <w:tcW w:type="dxa" w:w="1701"/>
+            <w:vAlign w:val="center"/>
+            <w:tcBorders>
+              <w:top w:val="single" w:sz="4" w:color="D9D9D9"/>
+              <w:left w:val="single" w:sz="4" w:color="D9D9D9"/>
+              <w:bottom w:val="single" w:sz="4" w:color="D9D9D9"/>
+              <w:right w:val="single" w:sz="4" w:color="D9D9D9"/>
+            </w:tcBorders>
+            <w:tcMar>
+              <w:top w:w="85" w:type="dxa"/>
+              <w:left w:w="85" w:type="dxa"/>
+              <w:bottom w:w="85" w:type="dxa"/>
+              <w:right w:w="85" w:type="dxa"/>
+            </w:tcMar>
+          </w:tcPr>
+          <w:p>
+            <w:pPr>
+              <w:spacing w:after="20" w:line="240" w:lineRule="auto"/>
+            </w:pPr>
+            <w:r>
+              <w:rPr>
+                <w:b w:val="0"/>
+                <w:sz w:val="20"/>
+              </w:rPr>
+              <w:t>5.4 to 7.6 s</w:t>
+            </w:r>
+          </w:p>
+        </w:tc>
+        <w:tc>
+          <w:tcPr>
+            <w:tcW w:type="dxa" w:w="1474"/>
+            <w:vAlign w:val="center"/>
+            <w:tcBorders>
+              <w:top w:val="single" w:sz="4" w:color="D9D9D9"/>
+              <w:left w:val="single" w:sz="4" w:color="D9D9D9"/>
+              <w:bottom w:val="single" w:sz="4" w:color="D9D9D9"/>
+              <w:right w:val="single" w:sz="4" w:color="D9D9D9"/>
+            </w:tcBorders>
+            <w:tcMar>
+              <w:top w:w="85" w:type="dxa"/>
+              <w:left w:w="85" w:type="dxa"/>
+              <w:bottom w:w="85" w:type="dxa"/>
+              <w:right w:w="85" w:type="dxa"/>
+            </w:tcMar>
+          </w:tcPr>
+          <w:p>
+            <w:pPr>
+              <w:spacing w:after="20" w:line="240" w:lineRule="auto"/>
+            </w:pPr>
+            <w:r>
+              <w:rPr>
+                <w:b w:val="0"/>
+                <w:sz w:val="20"/>
+              </w:rPr>
+              <w:t>I-modem</w:t>
+            </w:r>
+          </w:p>
+        </w:tc>
+        <w:tc>
+          <w:tcPr>
+            <w:tcW w:type="dxa" w:w="6236"/>
+            <w:vAlign w:val="center"/>
+            <w:tcBorders>
+              <w:top w:val="single" w:sz="4" w:color="D9D9D9"/>
+              <w:left w:val="single" w:sz="4" w:color="D9D9D9"/>
+              <w:bottom w:val="single" w:sz="4" w:color="D9D9D9"/>
+              <w:right w:val="single" w:sz="4" w:color="D9D9D9"/>
+            </w:tcBorders>
+            <w:tcMar>
+              <w:top w:w="85" w:type="dxa"/>
+              <w:left w:w="85" w:type="dxa"/>
+              <w:bottom w:w="85" w:type="dxa"/>
+              <w:right w:w="85" w:type="dxa"/>
+            </w:tcMar>
+          </w:tcPr>
+          <w:p>
+            <w:pPr>
+              <w:spacing w:after="20" w:line="240" w:lineRule="auto"/>
+            </w:pPr>
+            <w:r>
+              <w:rPr>
+                <w:b w:val="0"/>
+                <w:sz w:val="20"/>
+              </w:rPr>
+              <w:t>Digital zero</w:t>
+            </w:r>
+          </w:p>
+        </w:tc>
+      </w:tr>
+      <w:tr>
+        <w:trPr>
+          <w:cantSplit/>
+        </w:trPr>
+        <w:tc>
+          <w:tcPr>
+            <w:tcW w:type="dxa" w:w="1701"/>
+            <w:vAlign w:val="center"/>
+            <w:tcBorders>
+              <w:top w:val="single" w:sz="4" w:color="D9D9D9"/>
+              <w:left w:val="single" w:sz="4" w:color="D9D9D9"/>
+              <w:bottom w:val="single" w:sz="4" w:color="D9D9D9"/>
+              <w:right w:val="single" w:sz="4" w:color="D9D9D9"/>
+            </w:tcBorders>
+            <w:tcMar>
+              <w:top w:w="85" w:type="dxa"/>
+              <w:left w:w="85" w:type="dxa"/>
+              <w:bottom w:w="85" w:type="dxa"/>
+              <w:right w:w="85" w:type="dxa"/>
+            </w:tcMar>
+          </w:tcPr>
+          <w:p>
+            <w:pPr>
+              <w:spacing w:after="20" w:line="240" w:lineRule="auto"/>
+            </w:pPr>
+            <w:r>
+              <w:rPr>
+                <w:b w:val="0"/>
+                <w:sz w:val="20"/>
+              </w:rPr>
+              <w:t>5.4 to 7.65 s</w:t>
+            </w:r>
+          </w:p>
+        </w:tc>
+        <w:tc>
+          <w:tcPr>
+            <w:tcW w:type="dxa" w:w="1474"/>
+            <w:vAlign w:val="center"/>
+            <w:tcBorders>
+              <w:top w:val="single" w:sz="4" w:color="D9D9D9"/>
+              <w:left w:val="single" w:sz="4" w:color="D9D9D9"/>
+              <w:bottom w:val="single" w:sz="4" w:color="D9D9D9"/>
+              <w:right w:val="single" w:sz="4" w:color="D9D9D9"/>
+            </w:tcBorders>
+            <w:tcMar>
+              <w:top w:w="85" w:type="dxa"/>
+              <w:left w:w="85" w:type="dxa"/>
+              <w:bottom w:w="85" w:type="dxa"/>
+              <w:right w:w="85" w:type="dxa"/>
+            </w:tcMar>
+          </w:tcPr>
+          <w:p>
+            <w:pPr>
+              <w:spacing w:after="20" w:line="240" w:lineRule="auto"/>
+            </w:pPr>
+            <w:r>
+              <w:rPr>
+                <w:b w:val="0"/>
+                <w:sz w:val="20"/>
+              </w:rPr>
+              <w:t>Courier</w:t>
+            </w:r>
+          </w:p>
+        </w:tc>
+        <w:tc>
+          <w:tcPr>
+            <w:tcW w:type="dxa" w:w="6236"/>
+            <w:vAlign w:val="center"/>
+            <w:tcBorders>
+              <w:top w:val="single" w:sz="4" w:color="D9D9D9"/>
+              <w:left w:val="single" w:sz="4" w:color="D9D9D9"/>
+              <w:bottom w:val="single" w:sz="4" w:color="D9D9D9"/>
+              <w:right w:val="single" w:sz="4" w:color="D9D9D9"/>
+            </w:tcBorders>
+            <w:tcMar>
+              <w:top w:w="85" w:type="dxa"/>
+              <w:left w:w="85" w:type="dxa"/>
+              <w:bottom w:w="85" w:type="dxa"/>
+              <w:right w:w="85" w:type="dxa"/>
+            </w:tcMar>
+          </w:tcPr>
+          <w:p>
+            <w:pPr>
+              <w:spacing w:after="20" w:line="240" w:lineRule="auto"/>
+            </w:pPr>
+            <w:r>
+              <w:rPr>
+                <w:b w:val="0"/>
+                <w:sz w:val="20"/>
+              </w:rPr>
+              <w:t>Wideband signal</w:t>
             </w:r>
           </w:p>
         </w:tc>
@@ -18099,7 +19270,7 @@
         <w:rPr>
           <w:sz w:val="20"/>
         </w:rPr>
-        <w:t>Draft 0.24 decodes the bearer sequence before the INFO0 gate. Draft 0.23 tests multi-phase errors. Draft 0.22 sweeps all six phases of the impairment test. Draft 0.21 reproduces the 56000 decision with a controlled low-bit impairment of the startup source. Draft 0.20 decodes the data-mode hook families and the rate decision after the capability exchange. Draft 0.19 decodes the in-band capability frame. Draft 0.18 decodes the receiver mismatch handling. Draft 0.17 decodes the startup source receiver that ends the wait. Draft 0.16 decodes the originating-end idle stub and the wait that ends it. Draft 0.15 traces the symmetric startup branch. Draft 0.14 specifies the server peer-role test on the exchanged INFO0 words. Draft 0.13 traces the server after marker acceptance. Draft 0.12 identifies the server receiver for the seven-bit marker and verifies its field parse. Draft 0.11 resolves the 3453C capability route: the transmitted INFO0 word is the plain tag 51 word and the tag 70 word is never read. Draft 0.10 adds pre-V.90 and later client rate selection, position grouping, variable-length body construction and original serialization. It distinguishes the host diagnostic report from peer records and records the XC timing correction and successful symmetric regression. Draft 0.9 executes the four-word PCM record receiver through CRC acceptance, rate-mask selection, bank construction, mapped output and later payload-source activation. The client measurement-to-record producer and complete call-state selection remain open. Draft 0.8 verified 57333 profiles and corrected builder product scaling to SPM 1. Draft 0.7 confirmed active GPC scrambling and pre-data resets in the symmetric 64000 pair. Analogue client decoding, alternate companding output and complete peer negotiation remain open.</w:t>
+        <w:t>Draft 0.25 maps the asymmetric call bearer sequence and decodes the marker frame from the line. Draft 0.24 decodes the bearer sequence before the INFO0 gate. Draft 0.23 tests multi-phase errors. Draft 0.22 sweeps all six phases of the impairment test. Draft 0.21 reproduces the 56000 decision with a controlled low-bit impairment of the startup source. Draft 0.20 decodes the data-mode hook families and the rate decision after the capability exchange. Draft 0.19 decodes the in-band capability frame. Draft 0.18 decodes the receiver mismatch handling. Draft 0.17 decodes the startup source receiver that ends the wait. Draft 0.16 decodes the originating-end idle stub and the wait that ends it. Draft 0.15 traces the symmetric startup branch. Draft 0.14 specifies the server peer-role test on the exchanged INFO0 words. Draft 0.13 traces the server after marker acceptance. Draft 0.12 identifies the server receiver for the seven-bit marker and verifies its field parse. Draft 0.11 resolves the 3453C capability route: the transmitted INFO0 word is the plain tag 51 word and the tag 70 word is never read. Draft 0.10 adds pre-V.90 and later client rate selection, position grouping, variable-length body construction and original serialization. It distinguishes the host diagnostic report from peer records and records the XC timing correction and successful symmetric regression. Draft 0.9 executes the four-word PCM record receiver through CRC acceptance, rate-mask selection, bank construction, mapped output and later payload-source activation. The client measurement-to-record producer and complete call-state selection remain open. Draft 0.8 verified 57333 profiles and corrected builder product scaling to SPM 1. Draft 0.7 confirmed active GPC scrambling and pre-data resets in the symmetric 64000 pair. Analogue client decoding, alternate companding output and complete peer negotiation remain open.</w:t>
       </w:r>
     </w:p>
     <w:p>
@@ -18238,7 +19409,7 @@
       <w:rPr>
         <w:sz w:val="18"/>
       </w:rPr>
-      <w:t>COURIER EMU     x2 firmware reconstruction     Draft 0.24</w:t>
+      <w:t>COURIER EMU     x2 firmware reconstruction     Draft 0.25</w:t>
     </w:r>
   </w:p>
 </w:hdr>

</xml_diff>

<commit_message>
Decode the Courier's post-marker signal: V.34 Phase 3 at 3200 baud, 1920 Hz
S 128, S-bar 16, PP 288 (6 x 48), TRN of scrambled ones (1+x^-5+x^-23) for
about 6400 symbols; the server's own signal starts when TRN ends. Spec 0.26.

Co-Authored-By: Claude Sonnet 5.5 <noreply@anthropic.com>
</commit_message>
<xml_diff>
--- a/artifacts/x2-spec-20261004/x2-technical-specification.docx
+++ b/artifacts/x2-spec-20261004/x2-technical-specification.docx
@@ -20,7 +20,7 @@
     </w:p>
     <w:p>
       <w:r>
-        <w:t>Draft 0.25   •   Independent firmware reconstruction   •   4 October 2026</w:t>
+        <w:t>Draft 0.26   •   Independent firmware reconstruction   •   4 October 2026</w:t>
       </w:r>
     </w:p>
     <w:p>
@@ -3404,6 +3404,615 @@
                 <w:sz w:val="20"/>
               </w:rPr>
               <w:t>Wideband signal</w:t>
+            </w:r>
+          </w:p>
+        </w:tc>
+      </w:tr>
+    </w:tbl>
+    <w:p/>
+    <w:p>
+      <w:pPr>
+        <w:pStyle w:val="Heading2"/>
+      </w:pPr>
+      <w:r>
+        <w:t>3 4 Client signal after the marker</w:t>
+      </w:r>
+    </w:p>
+    <w:p>
+      <w:r>
+        <w:t>After the marker the analogue Courier sends an ordinary V.34 Phase 3 start-up signal at the rate and carrier it announced: 3200 symbols per second on a 1920 Hz carrier. The sequence is a 128-symbol alternation of two points, a 16-symbol alternation of the opposite pair, a 288-symbol periodic sequence made of six repetitions of a 48-symbol period, and about 6400 symbols (2.0 s) of a four-point constellation. Descrambling the last part with the polynomial 1 plus x to the minus 5 plus x to the minus 23 gives constant ones, so it is scrambled ones. About 440 further symbols follow with non-constant content, then the signal stops. The server begins its own wideband signal at the moment the client scrambled-ones segment ends. The content of the final 440 symbols and of the server signal were not decoded.</w:t>
+      </w:r>
+    </w:p>
+    <w:p>
+      <w:pPr>
+        <w:pStyle w:val="Caption"/>
+      </w:pPr>
+      <w:r>
+        <w:t>Table 3C — Courier signal after the marker</w:t>
+      </w:r>
+    </w:p>
+    <w:tbl>
+      <w:tblPr>
+        <w:tblW w:type="auto" w:w="0"/>
+        <w:jc w:val="center"/>
+        <w:tblLayout w:type="fixed"/>
+        <w:tblLook w:firstColumn="1" w:firstRow="1" w:lastColumn="0" w:lastRow="0" w:noHBand="0" w:noVBand="1" w:val="04A0"/>
+      </w:tblPr>
+      <w:tblGrid>
+        <w:gridCol w:w="1701"/>
+        <w:gridCol w:w="2268"/>
+        <w:gridCol w:w="5443"/>
+      </w:tblGrid>
+      <w:tr>
+        <w:trPr>
+          <w:tblHeader/>
+          <w:cantSplit/>
+        </w:trPr>
+        <w:tc>
+          <w:tcPr>
+            <w:tcW w:type="dxa" w:w="1701"/>
+            <w:vAlign w:val="center"/>
+            <w:tcBorders>
+              <w:top w:val="single" w:sz="4" w:color="D9D9D9"/>
+              <w:left w:val="single" w:sz="4" w:color="D9D9D9"/>
+              <w:bottom w:val="single" w:sz="4" w:color="D9D9D9"/>
+              <w:right w:val="single" w:sz="4" w:color="D9D9D9"/>
+            </w:tcBorders>
+            <w:shd w:fill="E7E7E7"/>
+            <w:tcMar>
+              <w:top w:w="85" w:type="dxa"/>
+              <w:left w:w="85" w:type="dxa"/>
+              <w:bottom w:w="85" w:type="dxa"/>
+              <w:right w:w="85" w:type="dxa"/>
+            </w:tcMar>
+          </w:tcPr>
+          <w:p>
+            <w:pPr>
+              <w:spacing w:after="20" w:line="240" w:lineRule="auto"/>
+            </w:pPr>
+            <w:r>
+              <w:rPr>
+                <w:b/>
+                <w:sz w:val="20"/>
+              </w:rPr>
+              <w:t>Segment</w:t>
+            </w:r>
+          </w:p>
+        </w:tc>
+        <w:tc>
+          <w:tcPr>
+            <w:tcW w:type="dxa" w:w="2268"/>
+            <w:vAlign w:val="center"/>
+            <w:tcBorders>
+              <w:top w:val="single" w:sz="4" w:color="D9D9D9"/>
+              <w:left w:val="single" w:sz="4" w:color="D9D9D9"/>
+              <w:bottom w:val="single" w:sz="4" w:color="D9D9D9"/>
+              <w:right w:val="single" w:sz="4" w:color="D9D9D9"/>
+            </w:tcBorders>
+            <w:shd w:fill="E7E7E7"/>
+            <w:tcMar>
+              <w:top w:w="85" w:type="dxa"/>
+              <w:left w:w="85" w:type="dxa"/>
+              <w:bottom w:w="85" w:type="dxa"/>
+              <w:right w:w="85" w:type="dxa"/>
+            </w:tcMar>
+          </w:tcPr>
+          <w:p>
+            <w:pPr>
+              <w:spacing w:after="20" w:line="240" w:lineRule="auto"/>
+            </w:pPr>
+            <w:r>
+              <w:rPr>
+                <w:b/>
+                <w:sz w:val="20"/>
+              </w:rPr>
+              <w:t>Length in symbols</w:t>
+            </w:r>
+          </w:p>
+        </w:tc>
+        <w:tc>
+          <w:tcPr>
+            <w:tcW w:type="dxa" w:w="5443"/>
+            <w:vAlign w:val="center"/>
+            <w:tcBorders>
+              <w:top w:val="single" w:sz="4" w:color="D9D9D9"/>
+              <w:left w:val="single" w:sz="4" w:color="D9D9D9"/>
+              <w:bottom w:val="single" w:sz="4" w:color="D9D9D9"/>
+              <w:right w:val="single" w:sz="4" w:color="D9D9D9"/>
+            </w:tcBorders>
+            <w:shd w:fill="E7E7E7"/>
+            <w:tcMar>
+              <w:top w:w="85" w:type="dxa"/>
+              <w:left w:w="85" w:type="dxa"/>
+              <w:bottom w:w="85" w:type="dxa"/>
+              <w:right w:w="85" w:type="dxa"/>
+            </w:tcMar>
+          </w:tcPr>
+          <w:p>
+            <w:pPr>
+              <w:spacing w:after="20" w:line="240" w:lineRule="auto"/>
+            </w:pPr>
+            <w:r>
+              <w:rPr>
+                <w:b/>
+                <w:sz w:val="20"/>
+              </w:rPr>
+              <w:t>Content</w:t>
+            </w:r>
+          </w:p>
+        </w:tc>
+      </w:tr>
+      <w:tr>
+        <w:trPr>
+          <w:cantSplit/>
+        </w:trPr>
+        <w:tc>
+          <w:tcPr>
+            <w:tcW w:type="dxa" w:w="1701"/>
+            <w:vAlign w:val="center"/>
+            <w:tcBorders>
+              <w:top w:val="single" w:sz="4" w:color="D9D9D9"/>
+              <w:left w:val="single" w:sz="4" w:color="D9D9D9"/>
+              <w:bottom w:val="single" w:sz="4" w:color="D9D9D9"/>
+              <w:right w:val="single" w:sz="4" w:color="D9D9D9"/>
+            </w:tcBorders>
+            <w:tcMar>
+              <w:top w:w="85" w:type="dxa"/>
+              <w:left w:w="85" w:type="dxa"/>
+              <w:bottom w:w="85" w:type="dxa"/>
+              <w:right w:w="85" w:type="dxa"/>
+            </w:tcMar>
+          </w:tcPr>
+          <w:p>
+            <w:pPr>
+              <w:spacing w:after="20" w:line="240" w:lineRule="auto"/>
+            </w:pPr>
+            <w:r>
+              <w:rPr>
+                <w:b w:val="0"/>
+                <w:sz w:val="20"/>
+              </w:rPr>
+              <w:t>S</w:t>
+            </w:r>
+          </w:p>
+        </w:tc>
+        <w:tc>
+          <w:tcPr>
+            <w:tcW w:type="dxa" w:w="2268"/>
+            <w:vAlign w:val="center"/>
+            <w:tcBorders>
+              <w:top w:val="single" w:sz="4" w:color="D9D9D9"/>
+              <w:left w:val="single" w:sz="4" w:color="D9D9D9"/>
+              <w:bottom w:val="single" w:sz="4" w:color="D9D9D9"/>
+              <w:right w:val="single" w:sz="4" w:color="D9D9D9"/>
+            </w:tcBorders>
+            <w:tcMar>
+              <w:top w:w="85" w:type="dxa"/>
+              <w:left w:w="85" w:type="dxa"/>
+              <w:bottom w:w="85" w:type="dxa"/>
+              <w:right w:w="85" w:type="dxa"/>
+            </w:tcMar>
+          </w:tcPr>
+          <w:p>
+            <w:pPr>
+              <w:spacing w:after="20" w:line="240" w:lineRule="auto"/>
+            </w:pPr>
+            <w:r>
+              <w:rPr>
+                <w:b w:val="0"/>
+                <w:sz w:val="20"/>
+              </w:rPr>
+              <w:t>128</w:t>
+            </w:r>
+          </w:p>
+        </w:tc>
+        <w:tc>
+          <w:tcPr>
+            <w:tcW w:type="dxa" w:w="5443"/>
+            <w:vAlign w:val="center"/>
+            <w:tcBorders>
+              <w:top w:val="single" w:sz="4" w:color="D9D9D9"/>
+              <w:left w:val="single" w:sz="4" w:color="D9D9D9"/>
+              <w:bottom w:val="single" w:sz="4" w:color="D9D9D9"/>
+              <w:right w:val="single" w:sz="4" w:color="D9D9D9"/>
+            </w:tcBorders>
+            <w:tcMar>
+              <w:top w:w="85" w:type="dxa"/>
+              <w:left w:w="85" w:type="dxa"/>
+              <w:bottom w:w="85" w:type="dxa"/>
+              <w:right w:w="85" w:type="dxa"/>
+            </w:tcMar>
+          </w:tcPr>
+          <w:p>
+            <w:pPr>
+              <w:spacing w:after="20" w:line="240" w:lineRule="auto"/>
+            </w:pPr>
+            <w:r>
+              <w:rPr>
+                <w:b w:val="0"/>
+                <w:sz w:val="20"/>
+              </w:rPr>
+              <w:t>Two alternating points</w:t>
+            </w:r>
+          </w:p>
+        </w:tc>
+      </w:tr>
+      <w:tr>
+        <w:trPr>
+          <w:cantSplit/>
+        </w:trPr>
+        <w:tc>
+          <w:tcPr>
+            <w:tcW w:type="dxa" w:w="1701"/>
+            <w:vAlign w:val="center"/>
+            <w:tcBorders>
+              <w:top w:val="single" w:sz="4" w:color="D9D9D9"/>
+              <w:left w:val="single" w:sz="4" w:color="D9D9D9"/>
+              <w:bottom w:val="single" w:sz="4" w:color="D9D9D9"/>
+              <w:right w:val="single" w:sz="4" w:color="D9D9D9"/>
+            </w:tcBorders>
+            <w:tcMar>
+              <w:top w:w="85" w:type="dxa"/>
+              <w:left w:w="85" w:type="dxa"/>
+              <w:bottom w:w="85" w:type="dxa"/>
+              <w:right w:w="85" w:type="dxa"/>
+            </w:tcMar>
+          </w:tcPr>
+          <w:p>
+            <w:pPr>
+              <w:spacing w:after="20" w:line="240" w:lineRule="auto"/>
+            </w:pPr>
+            <w:r>
+              <w:rPr>
+                <w:b w:val="0"/>
+                <w:sz w:val="20"/>
+              </w:rPr>
+              <w:t>S-bar</w:t>
+            </w:r>
+          </w:p>
+        </w:tc>
+        <w:tc>
+          <w:tcPr>
+            <w:tcW w:type="dxa" w:w="2268"/>
+            <w:vAlign w:val="center"/>
+            <w:tcBorders>
+              <w:top w:val="single" w:sz="4" w:color="D9D9D9"/>
+              <w:left w:val="single" w:sz="4" w:color="D9D9D9"/>
+              <w:bottom w:val="single" w:sz="4" w:color="D9D9D9"/>
+              <w:right w:val="single" w:sz="4" w:color="D9D9D9"/>
+            </w:tcBorders>
+            <w:tcMar>
+              <w:top w:w="85" w:type="dxa"/>
+              <w:left w:w="85" w:type="dxa"/>
+              <w:bottom w:w="85" w:type="dxa"/>
+              <w:right w:w="85" w:type="dxa"/>
+            </w:tcMar>
+          </w:tcPr>
+          <w:p>
+            <w:pPr>
+              <w:spacing w:after="20" w:line="240" w:lineRule="auto"/>
+            </w:pPr>
+            <w:r>
+              <w:rPr>
+                <w:b w:val="0"/>
+                <w:sz w:val="20"/>
+              </w:rPr>
+              <w:t>16</w:t>
+            </w:r>
+          </w:p>
+        </w:tc>
+        <w:tc>
+          <w:tcPr>
+            <w:tcW w:type="dxa" w:w="5443"/>
+            <w:vAlign w:val="center"/>
+            <w:tcBorders>
+              <w:top w:val="single" w:sz="4" w:color="D9D9D9"/>
+              <w:left w:val="single" w:sz="4" w:color="D9D9D9"/>
+              <w:bottom w:val="single" w:sz="4" w:color="D9D9D9"/>
+              <w:right w:val="single" w:sz="4" w:color="D9D9D9"/>
+            </w:tcBorders>
+            <w:tcMar>
+              <w:top w:w="85" w:type="dxa"/>
+              <w:left w:w="85" w:type="dxa"/>
+              <w:bottom w:w="85" w:type="dxa"/>
+              <w:right w:w="85" w:type="dxa"/>
+            </w:tcMar>
+          </w:tcPr>
+          <w:p>
+            <w:pPr>
+              <w:spacing w:after="20" w:line="240" w:lineRule="auto"/>
+            </w:pPr>
+            <w:r>
+              <w:rPr>
+                <w:b w:val="0"/>
+                <w:sz w:val="20"/>
+              </w:rPr>
+              <w:t>The opposite pair of points</w:t>
+            </w:r>
+          </w:p>
+        </w:tc>
+      </w:tr>
+      <w:tr>
+        <w:trPr>
+          <w:cantSplit/>
+        </w:trPr>
+        <w:tc>
+          <w:tcPr>
+            <w:tcW w:type="dxa" w:w="1701"/>
+            <w:vAlign w:val="center"/>
+            <w:tcBorders>
+              <w:top w:val="single" w:sz="4" w:color="D9D9D9"/>
+              <w:left w:val="single" w:sz="4" w:color="D9D9D9"/>
+              <w:bottom w:val="single" w:sz="4" w:color="D9D9D9"/>
+              <w:right w:val="single" w:sz="4" w:color="D9D9D9"/>
+            </w:tcBorders>
+            <w:tcMar>
+              <w:top w:w="85" w:type="dxa"/>
+              <w:left w:w="85" w:type="dxa"/>
+              <w:bottom w:w="85" w:type="dxa"/>
+              <w:right w:w="85" w:type="dxa"/>
+            </w:tcMar>
+          </w:tcPr>
+          <w:p>
+            <w:pPr>
+              <w:spacing w:after="20" w:line="240" w:lineRule="auto"/>
+            </w:pPr>
+            <w:r>
+              <w:rPr>
+                <w:b w:val="0"/>
+                <w:sz w:val="20"/>
+              </w:rPr>
+              <w:t>PP</w:t>
+            </w:r>
+          </w:p>
+        </w:tc>
+        <w:tc>
+          <w:tcPr>
+            <w:tcW w:type="dxa" w:w="2268"/>
+            <w:vAlign w:val="center"/>
+            <w:tcBorders>
+              <w:top w:val="single" w:sz="4" w:color="D9D9D9"/>
+              <w:left w:val="single" w:sz="4" w:color="D9D9D9"/>
+              <w:bottom w:val="single" w:sz="4" w:color="D9D9D9"/>
+              <w:right w:val="single" w:sz="4" w:color="D9D9D9"/>
+            </w:tcBorders>
+            <w:tcMar>
+              <w:top w:w="85" w:type="dxa"/>
+              <w:left w:w="85" w:type="dxa"/>
+              <w:bottom w:w="85" w:type="dxa"/>
+              <w:right w:w="85" w:type="dxa"/>
+            </w:tcMar>
+          </w:tcPr>
+          <w:p>
+            <w:pPr>
+              <w:spacing w:after="20" w:line="240" w:lineRule="auto"/>
+            </w:pPr>
+            <w:r>
+              <w:rPr>
+                <w:b w:val="0"/>
+                <w:sz w:val="20"/>
+              </w:rPr>
+              <w:t>288</w:t>
+            </w:r>
+          </w:p>
+        </w:tc>
+        <w:tc>
+          <w:tcPr>
+            <w:tcW w:type="dxa" w:w="5443"/>
+            <w:vAlign w:val="center"/>
+            <w:tcBorders>
+              <w:top w:val="single" w:sz="4" w:color="D9D9D9"/>
+              <w:left w:val="single" w:sz="4" w:color="D9D9D9"/>
+              <w:bottom w:val="single" w:sz="4" w:color="D9D9D9"/>
+              <w:right w:val="single" w:sz="4" w:color="D9D9D9"/>
+            </w:tcBorders>
+            <w:tcMar>
+              <w:top w:w="85" w:type="dxa"/>
+              <w:left w:w="85" w:type="dxa"/>
+              <w:bottom w:w="85" w:type="dxa"/>
+              <w:right w:w="85" w:type="dxa"/>
+            </w:tcMar>
+          </w:tcPr>
+          <w:p>
+            <w:pPr>
+              <w:spacing w:after="20" w:line="240" w:lineRule="auto"/>
+            </w:pPr>
+            <w:r>
+              <w:rPr>
+                <w:b w:val="0"/>
+                <w:sz w:val="20"/>
+              </w:rPr>
+              <w:t>Six repetitions of a 48-symbol period</w:t>
+            </w:r>
+          </w:p>
+        </w:tc>
+      </w:tr>
+      <w:tr>
+        <w:trPr>
+          <w:cantSplit/>
+        </w:trPr>
+        <w:tc>
+          <w:tcPr>
+            <w:tcW w:type="dxa" w:w="1701"/>
+            <w:vAlign w:val="center"/>
+            <w:tcBorders>
+              <w:top w:val="single" w:sz="4" w:color="D9D9D9"/>
+              <w:left w:val="single" w:sz="4" w:color="D9D9D9"/>
+              <w:bottom w:val="single" w:sz="4" w:color="D9D9D9"/>
+              <w:right w:val="single" w:sz="4" w:color="D9D9D9"/>
+            </w:tcBorders>
+            <w:tcMar>
+              <w:top w:w="85" w:type="dxa"/>
+              <w:left w:w="85" w:type="dxa"/>
+              <w:bottom w:w="85" w:type="dxa"/>
+              <w:right w:w="85" w:type="dxa"/>
+            </w:tcMar>
+          </w:tcPr>
+          <w:p>
+            <w:pPr>
+              <w:spacing w:after="20" w:line="240" w:lineRule="auto"/>
+            </w:pPr>
+            <w:r>
+              <w:rPr>
+                <w:b w:val="0"/>
+                <w:sz w:val="20"/>
+              </w:rPr>
+              <w:t>TRN</w:t>
+            </w:r>
+          </w:p>
+        </w:tc>
+        <w:tc>
+          <w:tcPr>
+            <w:tcW w:type="dxa" w:w="2268"/>
+            <w:vAlign w:val="center"/>
+            <w:tcBorders>
+              <w:top w:val="single" w:sz="4" w:color="D9D9D9"/>
+              <w:left w:val="single" w:sz="4" w:color="D9D9D9"/>
+              <w:bottom w:val="single" w:sz="4" w:color="D9D9D9"/>
+              <w:right w:val="single" w:sz="4" w:color="D9D9D9"/>
+            </w:tcBorders>
+            <w:tcMar>
+              <w:top w:w="85" w:type="dxa"/>
+              <w:left w:w="85" w:type="dxa"/>
+              <w:bottom w:w="85" w:type="dxa"/>
+              <w:right w:w="85" w:type="dxa"/>
+            </w:tcMar>
+          </w:tcPr>
+          <w:p>
+            <w:pPr>
+              <w:spacing w:after="20" w:line="240" w:lineRule="auto"/>
+            </w:pPr>
+            <w:r>
+              <w:rPr>
+                <w:b w:val="0"/>
+                <w:sz w:val="20"/>
+              </w:rPr>
+              <w:t>about 6400</w:t>
+            </w:r>
+          </w:p>
+        </w:tc>
+        <w:tc>
+          <w:tcPr>
+            <w:tcW w:type="dxa" w:w="5443"/>
+            <w:vAlign w:val="center"/>
+            <w:tcBorders>
+              <w:top w:val="single" w:sz="4" w:color="D9D9D9"/>
+              <w:left w:val="single" w:sz="4" w:color="D9D9D9"/>
+              <w:bottom w:val="single" w:sz="4" w:color="D9D9D9"/>
+              <w:right w:val="single" w:sz="4" w:color="D9D9D9"/>
+            </w:tcBorders>
+            <w:tcMar>
+              <w:top w:w="85" w:type="dxa"/>
+              <w:left w:w="85" w:type="dxa"/>
+              <w:bottom w:w="85" w:type="dxa"/>
+              <w:right w:w="85" w:type="dxa"/>
+            </w:tcMar>
+          </w:tcPr>
+          <w:p>
+            <w:pPr>
+              <w:spacing w:after="20" w:line="240" w:lineRule="auto"/>
+            </w:pPr>
+            <w:r>
+              <w:rPr>
+                <w:b w:val="0"/>
+                <w:sz w:val="20"/>
+              </w:rPr>
+              <w:t>Scrambled ones, four-point constellation</w:t>
+            </w:r>
+          </w:p>
+        </w:tc>
+      </w:tr>
+      <w:tr>
+        <w:trPr>
+          <w:cantSplit/>
+        </w:trPr>
+        <w:tc>
+          <w:tcPr>
+            <w:tcW w:type="dxa" w:w="1701"/>
+            <w:vAlign w:val="center"/>
+            <w:tcBorders>
+              <w:top w:val="single" w:sz="4" w:color="D9D9D9"/>
+              <w:left w:val="single" w:sz="4" w:color="D9D9D9"/>
+              <w:bottom w:val="single" w:sz="4" w:color="D9D9D9"/>
+              <w:right w:val="single" w:sz="4" w:color="D9D9D9"/>
+            </w:tcBorders>
+            <w:tcMar>
+              <w:top w:w="85" w:type="dxa"/>
+              <w:left w:w="85" w:type="dxa"/>
+              <w:bottom w:w="85" w:type="dxa"/>
+              <w:right w:w="85" w:type="dxa"/>
+            </w:tcMar>
+          </w:tcPr>
+          <w:p>
+            <w:pPr>
+              <w:spacing w:after="20" w:line="240" w:lineRule="auto"/>
+            </w:pPr>
+            <w:r>
+              <w:rPr>
+                <w:b w:val="0"/>
+                <w:sz w:val="20"/>
+              </w:rPr>
+              <w:t>Tail</w:t>
+            </w:r>
+          </w:p>
+        </w:tc>
+        <w:tc>
+          <w:tcPr>
+            <w:tcW w:type="dxa" w:w="2268"/>
+            <w:vAlign w:val="center"/>
+            <w:tcBorders>
+              <w:top w:val="single" w:sz="4" w:color="D9D9D9"/>
+              <w:left w:val="single" w:sz="4" w:color="D9D9D9"/>
+              <w:bottom w:val="single" w:sz="4" w:color="D9D9D9"/>
+              <w:right w:val="single" w:sz="4" w:color="D9D9D9"/>
+            </w:tcBorders>
+            <w:tcMar>
+              <w:top w:w="85" w:type="dxa"/>
+              <w:left w:w="85" w:type="dxa"/>
+              <w:bottom w:w="85" w:type="dxa"/>
+              <w:right w:w="85" w:type="dxa"/>
+            </w:tcMar>
+          </w:tcPr>
+          <w:p>
+            <w:pPr>
+              <w:spacing w:after="20" w:line="240" w:lineRule="auto"/>
+            </w:pPr>
+            <w:r>
+              <w:rPr>
+                <w:b w:val="0"/>
+                <w:sz w:val="20"/>
+              </w:rPr>
+              <w:t>about 440</w:t>
+            </w:r>
+          </w:p>
+        </w:tc>
+        <w:tc>
+          <w:tcPr>
+            <w:tcW w:type="dxa" w:w="5443"/>
+            <w:vAlign w:val="center"/>
+            <w:tcBorders>
+              <w:top w:val="single" w:sz="4" w:color="D9D9D9"/>
+              <w:left w:val="single" w:sz="4" w:color="D9D9D9"/>
+              <w:bottom w:val="single" w:sz="4" w:color="D9D9D9"/>
+              <w:right w:val="single" w:sz="4" w:color="D9D9D9"/>
+            </w:tcBorders>
+            <w:tcMar>
+              <w:top w:w="85" w:type="dxa"/>
+              <w:left w:w="85" w:type="dxa"/>
+              <w:bottom w:w="85" w:type="dxa"/>
+              <w:right w:w="85" w:type="dxa"/>
+            </w:tcMar>
+          </w:tcPr>
+          <w:p>
+            <w:pPr>
+              <w:spacing w:after="20" w:line="240" w:lineRule="auto"/>
+            </w:pPr>
+            <w:r>
+              <w:rPr>
+                <w:b w:val="0"/>
+                <w:sz w:val="20"/>
+              </w:rPr>
+              <w:t>Four-point symbols with non-constant bits, not decoded</w:t>
             </w:r>
           </w:p>
         </w:tc>
@@ -19233,7 +19842,7 @@
         <w:rPr>
           <w:sz w:val="20"/>
         </w:rPr>
-        <w:t>The pre-gate bearer sequence is analysed by tools/analyze_bearer_handshake.py with artifacts/x2-pre-gate-20261004/analysis.json. The impairment test is tools/x2_source_impairment.py with artifacts/x2-source-impairment-20261004/verification.json. The marker receiver is documented at the end of docs/x2-v90-protocol-selection.md; tools/verify_x2_marker_receiver.py runs the original QF060003 parse from 97B5 and writes artifacts/x2-marker-receiver-20261004/verification.json. The arming site is 9791; the IM020104 counterpart is 948A.</w:t>
+        <w:t>The Courier post-marker signal is analysed by tools/analyze_v34_training.py with artifacts/x2-courier-phase3-20261004/analysis.json. The pre-gate bearer sequence is analysed by tools/analyze_bearer_handshake.py with artifacts/x2-pre-gate-20261004/analysis.json. The impairment test is tools/x2_source_impairment.py with artifacts/x2-source-impairment-20261004/verification.json. The marker receiver is documented at the end of docs/x2-v90-protocol-selection.md; tools/verify_x2_marker_receiver.py runs the original QF060003 parse from 97B5 and writes artifacts/x2-marker-receiver-20261004/verification.json. The arming site is 9791; the IM020104 counterpart is 948A.</w:t>
       </w:r>
     </w:p>
     <w:p>
@@ -19270,7 +19879,7 @@
         <w:rPr>
           <w:sz w:val="20"/>
         </w:rPr>
-        <w:t>Draft 0.25 maps the asymmetric call bearer sequence and decodes the marker frame from the line. Draft 0.24 decodes the bearer sequence before the INFO0 gate. Draft 0.23 tests multi-phase errors. Draft 0.22 sweeps all six phases of the impairment test. Draft 0.21 reproduces the 56000 decision with a controlled low-bit impairment of the startup source. Draft 0.20 decodes the data-mode hook families and the rate decision after the capability exchange. Draft 0.19 decodes the in-band capability frame. Draft 0.18 decodes the receiver mismatch handling. Draft 0.17 decodes the startup source receiver that ends the wait. Draft 0.16 decodes the originating-end idle stub and the wait that ends it. Draft 0.15 traces the symmetric startup branch. Draft 0.14 specifies the server peer-role test on the exchanged INFO0 words. Draft 0.13 traces the server after marker acceptance. Draft 0.12 identifies the server receiver for the seven-bit marker and verifies its field parse. Draft 0.11 resolves the 3453C capability route: the transmitted INFO0 word is the plain tag 51 word and the tag 70 word is never read. Draft 0.10 adds pre-V.90 and later client rate selection, position grouping, variable-length body construction and original serialization. It distinguishes the host diagnostic report from peer records and records the XC timing correction and successful symmetric regression. Draft 0.9 executes the four-word PCM record receiver through CRC acceptance, rate-mask selection, bank construction, mapped output and later payload-source activation. The client measurement-to-record producer and complete call-state selection remain open. Draft 0.8 verified 57333 profiles and corrected builder product scaling to SPM 1. Draft 0.7 confirmed active GPC scrambling and pre-data resets in the symmetric 64000 pair. Analogue client decoding, alternate companding output and complete peer negotiation remain open.</w:t>
+        <w:t>Draft 0.26 decodes the Courier start-up signal after the marker as V.34 Phase 3 at the announced rate. Draft 0.25 maps the asymmetric call bearer sequence and decodes the marker frame from the line. Draft 0.24 decodes the bearer sequence before the INFO0 gate. Draft 0.23 tests multi-phase errors. Draft 0.22 sweeps all six phases of the impairment test. Draft 0.21 reproduces the 56000 decision with a controlled low-bit impairment of the startup source. Draft 0.20 decodes the data-mode hook families and the rate decision after the capability exchange. Draft 0.19 decodes the in-band capability frame. Draft 0.18 decodes the receiver mismatch handling. Draft 0.17 decodes the startup source receiver that ends the wait. Draft 0.16 decodes the originating-end idle stub and the wait that ends it. Draft 0.15 traces the symmetric startup branch. Draft 0.14 specifies the server peer-role test on the exchanged INFO0 words. Draft 0.13 traces the server after marker acceptance. Draft 0.12 identifies the server receiver for the seven-bit marker and verifies its field parse. Draft 0.11 resolves the 3453C capability route: the transmitted INFO0 word is the plain tag 51 word and the tag 70 word is never read. Draft 0.10 adds pre-V.90 and later client rate selection, position grouping, variable-length body construction and original serialization. It distinguishes the host diagnostic report from peer records and records the XC timing correction and successful symmetric regression. Draft 0.9 executes the four-word PCM record receiver through CRC acceptance, rate-mask selection, bank construction, mapped output and later payload-source activation. The client measurement-to-record producer and complete call-state selection remain open. Draft 0.8 verified 57333 profiles and corrected builder product scaling to SPM 1. Draft 0.7 confirmed active GPC scrambling and pre-data resets in the symmetric 64000 pair. Analogue client decoding, alternate companding output and complete peer negotiation remain open.</w:t>
       </w:r>
     </w:p>
     <w:p>
@@ -19409,7 +20018,7 @@
       <w:rPr>
         <w:sz w:val="18"/>
       </w:rPr>
-      <w:t>COURIER EMU     x2 firmware reconstruction     Draft 0.25</w:t>
+      <w:t>COURIER EMU     x2 firmware reconstruction     Draft 0.26</w:t>
     </w:r>
   </w:p>
 </w:hdr>

</xml_diff>

<commit_message>
Segment the server's downstream training signal and decode its scrambled-ones stretches
Four-level period-22 pattern, 2.65 s of +-3772 scrambled ones (1+x^-18+x^-23)
ending in a repeated 12-bit word, 0.75 s at +-1820, a six-level period-36
pattern, then many-level data. Spec 0.27.

Co-Authored-By: Claude Sonnet 5.5 <noreply@anthropic.com>
</commit_message>
<xml_diff>
--- a/artifacts/x2-spec-20261004/x2-technical-specification.docx
+++ b/artifacts/x2-spec-20261004/x2-technical-specification.docx
@@ -20,7 +20,7 @@
     </w:p>
     <w:p>
       <w:r>
-        <w:t>Draft 0.26   •   Independent firmware reconstruction   •   4 October 2026</w:t>
+        <w:t>Draft 0.27   •   Independent firmware reconstruction   •   4 October 2026</w:t>
       </w:r>
     </w:p>
     <w:p>
@@ -4013,6 +4013,710 @@
                 <w:sz w:val="20"/>
               </w:rPr>
               <w:t>Four-point symbols with non-constant bits, not decoded</w:t>
+            </w:r>
+          </w:p>
+        </w:tc>
+      </w:tr>
+    </w:tbl>
+    <w:p/>
+    <w:p>
+      <w:pPr>
+        <w:pStyle w:val="Heading2"/>
+      </w:pPr>
+      <w:r>
+        <w:t>3 5 Server signal after the marker</w:t>
+      </w:r>
+    </w:p>
+    <w:p>
+      <w:r>
+        <w:t>After the marker the server sends a short exactly periodic four-level pattern, then 2.65 s of scrambled ones as two PCMU levels, one bit per octet, using the generator polynomial 1 plus x to the minus 18 plus x to the minus 23. The scrambled ones end 0.15 s before the stretch ends, and the descrambled bits become a repeating twelve-bit word. A second 0.75 s of scrambled ones follows at lower amplitude, then a 0.14 s six-level periodic pattern whose period is six octets repeated in a rotation of 36, then many-level data using 17 magnitudes at each of the six symbol positions. The client restarts its own signal during the repeating word and before the amplitude step. The content of the periodic patterns and of the many-level data was not decoded.</w:t>
+      </w:r>
+    </w:p>
+    <w:p>
+      <w:pPr>
+        <w:pStyle w:val="Caption"/>
+      </w:pPr>
+      <w:r>
+        <w:t>Table 3D — Server signal after the marker</w:t>
+      </w:r>
+    </w:p>
+    <w:tbl>
+      <w:tblPr>
+        <w:tblW w:type="auto" w:w="0"/>
+        <w:jc w:val="center"/>
+        <w:tblLayout w:type="fixed"/>
+        <w:tblLook w:firstColumn="1" w:firstRow="1" w:lastColumn="0" w:lastRow="0" w:noHBand="0" w:noVBand="1" w:val="04A0"/>
+      </w:tblPr>
+      <w:tblGrid>
+        <w:gridCol w:w="1701"/>
+        <w:gridCol w:w="2494"/>
+        <w:gridCol w:w="5216"/>
+      </w:tblGrid>
+      <w:tr>
+        <w:trPr>
+          <w:tblHeader/>
+          <w:cantSplit/>
+        </w:trPr>
+        <w:tc>
+          <w:tcPr>
+            <w:tcW w:type="dxa" w:w="1701"/>
+            <w:vAlign w:val="center"/>
+            <w:tcBorders>
+              <w:top w:val="single" w:sz="4" w:color="D9D9D9"/>
+              <w:left w:val="single" w:sz="4" w:color="D9D9D9"/>
+              <w:bottom w:val="single" w:sz="4" w:color="D9D9D9"/>
+              <w:right w:val="single" w:sz="4" w:color="D9D9D9"/>
+            </w:tcBorders>
+            <w:shd w:fill="E7E7E7"/>
+            <w:tcMar>
+              <w:top w:w="85" w:type="dxa"/>
+              <w:left w:w="85" w:type="dxa"/>
+              <w:bottom w:w="85" w:type="dxa"/>
+              <w:right w:w="85" w:type="dxa"/>
+            </w:tcMar>
+          </w:tcPr>
+          <w:p>
+            <w:pPr>
+              <w:spacing w:after="20" w:line="240" w:lineRule="auto"/>
+            </w:pPr>
+            <w:r>
+              <w:rPr>
+                <w:b/>
+                <w:sz w:val="20"/>
+              </w:rPr>
+              <w:t>Stretch</w:t>
+            </w:r>
+          </w:p>
+        </w:tc>
+        <w:tc>
+          <w:tcPr>
+            <w:tcW w:type="dxa" w:w="2494"/>
+            <w:vAlign w:val="center"/>
+            <w:tcBorders>
+              <w:top w:val="single" w:sz="4" w:color="D9D9D9"/>
+              <w:left w:val="single" w:sz="4" w:color="D9D9D9"/>
+              <w:bottom w:val="single" w:sz="4" w:color="D9D9D9"/>
+              <w:right w:val="single" w:sz="4" w:color="D9D9D9"/>
+            </w:tcBorders>
+            <w:shd w:fill="E7E7E7"/>
+            <w:tcMar>
+              <w:top w:w="85" w:type="dxa"/>
+              <w:left w:w="85" w:type="dxa"/>
+              <w:bottom w:w="85" w:type="dxa"/>
+              <w:right w:w="85" w:type="dxa"/>
+            </w:tcMar>
+          </w:tcPr>
+          <w:p>
+            <w:pPr>
+              <w:spacing w:after="20" w:line="240" w:lineRule="auto"/>
+            </w:pPr>
+            <w:r>
+              <w:rPr>
+                <w:b/>
+                <w:sz w:val="20"/>
+              </w:rPr>
+              <w:t>Bearer time (s)</w:t>
+            </w:r>
+          </w:p>
+        </w:tc>
+        <w:tc>
+          <w:tcPr>
+            <w:tcW w:type="dxa" w:w="5216"/>
+            <w:vAlign w:val="center"/>
+            <w:tcBorders>
+              <w:top w:val="single" w:sz="4" w:color="D9D9D9"/>
+              <w:left w:val="single" w:sz="4" w:color="D9D9D9"/>
+              <w:bottom w:val="single" w:sz="4" w:color="D9D9D9"/>
+              <w:right w:val="single" w:sz="4" w:color="D9D9D9"/>
+            </w:tcBorders>
+            <w:shd w:fill="E7E7E7"/>
+            <w:tcMar>
+              <w:top w:w="85" w:type="dxa"/>
+              <w:left w:w="85" w:type="dxa"/>
+              <w:bottom w:w="85" w:type="dxa"/>
+              <w:right w:w="85" w:type="dxa"/>
+            </w:tcMar>
+          </w:tcPr>
+          <w:p>
+            <w:pPr>
+              <w:spacing w:after="20" w:line="240" w:lineRule="auto"/>
+            </w:pPr>
+            <w:r>
+              <w:rPr>
+                <w:b/>
+                <w:sz w:val="20"/>
+              </w:rPr>
+              <w:t>Content</w:t>
+            </w:r>
+          </w:p>
+        </w:tc>
+      </w:tr>
+      <w:tr>
+        <w:trPr>
+          <w:cantSplit/>
+        </w:trPr>
+        <w:tc>
+          <w:tcPr>
+            <w:tcW w:type="dxa" w:w="1701"/>
+            <w:vAlign w:val="center"/>
+            <w:tcBorders>
+              <w:top w:val="single" w:sz="4" w:color="D9D9D9"/>
+              <w:left w:val="single" w:sz="4" w:color="D9D9D9"/>
+              <w:bottom w:val="single" w:sz="4" w:color="D9D9D9"/>
+              <w:right w:val="single" w:sz="4" w:color="D9D9D9"/>
+            </w:tcBorders>
+            <w:tcMar>
+              <w:top w:w="85" w:type="dxa"/>
+              <w:left w:w="85" w:type="dxa"/>
+              <w:bottom w:w="85" w:type="dxa"/>
+              <w:right w:w="85" w:type="dxa"/>
+            </w:tcMar>
+          </w:tcPr>
+          <w:p>
+            <w:pPr>
+              <w:spacing w:after="20" w:line="240" w:lineRule="auto"/>
+            </w:pPr>
+            <w:r>
+              <w:rPr>
+                <w:b w:val="0"/>
+                <w:sz w:val="20"/>
+              </w:rPr>
+              <w:t>A</w:t>
+            </w:r>
+          </w:p>
+        </w:tc>
+        <w:tc>
+          <w:tcPr>
+            <w:tcW w:type="dxa" w:w="2494"/>
+            <w:vAlign w:val="center"/>
+            <w:tcBorders>
+              <w:top w:val="single" w:sz="4" w:color="D9D9D9"/>
+              <w:left w:val="single" w:sz="4" w:color="D9D9D9"/>
+              <w:bottom w:val="single" w:sz="4" w:color="D9D9D9"/>
+              <w:right w:val="single" w:sz="4" w:color="D9D9D9"/>
+            </w:tcBorders>
+            <w:tcMar>
+              <w:top w:w="85" w:type="dxa"/>
+              <w:left w:w="85" w:type="dxa"/>
+              <w:bottom w:w="85" w:type="dxa"/>
+              <w:right w:w="85" w:type="dxa"/>
+            </w:tcMar>
+          </w:tcPr>
+          <w:p>
+            <w:pPr>
+              <w:spacing w:after="20" w:line="240" w:lineRule="auto"/>
+            </w:pPr>
+            <w:r>
+              <w:rPr>
+                <w:b w:val="0"/>
+                <w:sz w:val="20"/>
+              </w:rPr>
+              <w:t>7.58 to 7.62</w:t>
+            </w:r>
+          </w:p>
+        </w:tc>
+        <w:tc>
+          <w:tcPr>
+            <w:tcW w:type="dxa" w:w="5216"/>
+            <w:vAlign w:val="center"/>
+            <w:tcBorders>
+              <w:top w:val="single" w:sz="4" w:color="D9D9D9"/>
+              <w:left w:val="single" w:sz="4" w:color="D9D9D9"/>
+              <w:bottom w:val="single" w:sz="4" w:color="D9D9D9"/>
+              <w:right w:val="single" w:sz="4" w:color="D9D9D9"/>
+            </w:tcBorders>
+            <w:tcMar>
+              <w:top w:w="85" w:type="dxa"/>
+              <w:left w:w="85" w:type="dxa"/>
+              <w:bottom w:w="85" w:type="dxa"/>
+              <w:right w:w="85" w:type="dxa"/>
+            </w:tcMar>
+          </w:tcPr>
+          <w:p>
+            <w:pPr>
+              <w:spacing w:after="20" w:line="240" w:lineRule="auto"/>
+            </w:pPr>
+            <w:r>
+              <w:rPr>
+                <w:b w:val="0"/>
+                <w:sz w:val="20"/>
+              </w:rPr>
+              <w:t>Four levels, period 22 octets</w:t>
+            </w:r>
+          </w:p>
+        </w:tc>
+      </w:tr>
+      <w:tr>
+        <w:trPr>
+          <w:cantSplit/>
+        </w:trPr>
+        <w:tc>
+          <w:tcPr>
+            <w:tcW w:type="dxa" w:w="1701"/>
+            <w:vAlign w:val="center"/>
+            <w:tcBorders>
+              <w:top w:val="single" w:sz="4" w:color="D9D9D9"/>
+              <w:left w:val="single" w:sz="4" w:color="D9D9D9"/>
+              <w:bottom w:val="single" w:sz="4" w:color="D9D9D9"/>
+              <w:right w:val="single" w:sz="4" w:color="D9D9D9"/>
+            </w:tcBorders>
+            <w:tcMar>
+              <w:top w:w="85" w:type="dxa"/>
+              <w:left w:w="85" w:type="dxa"/>
+              <w:bottom w:w="85" w:type="dxa"/>
+              <w:right w:w="85" w:type="dxa"/>
+            </w:tcMar>
+          </w:tcPr>
+          <w:p>
+            <w:pPr>
+              <w:spacing w:after="20" w:line="240" w:lineRule="auto"/>
+            </w:pPr>
+            <w:r>
+              <w:rPr>
+                <w:b w:val="0"/>
+                <w:sz w:val="20"/>
+              </w:rPr>
+              <w:t>B</w:t>
+            </w:r>
+          </w:p>
+        </w:tc>
+        <w:tc>
+          <w:tcPr>
+            <w:tcW w:type="dxa" w:w="2494"/>
+            <w:vAlign w:val="center"/>
+            <w:tcBorders>
+              <w:top w:val="single" w:sz="4" w:color="D9D9D9"/>
+              <w:left w:val="single" w:sz="4" w:color="D9D9D9"/>
+              <w:bottom w:val="single" w:sz="4" w:color="D9D9D9"/>
+              <w:right w:val="single" w:sz="4" w:color="D9D9D9"/>
+            </w:tcBorders>
+            <w:tcMar>
+              <w:top w:w="85" w:type="dxa"/>
+              <w:left w:w="85" w:type="dxa"/>
+              <w:bottom w:w="85" w:type="dxa"/>
+              <w:right w:w="85" w:type="dxa"/>
+            </w:tcMar>
+          </w:tcPr>
+          <w:p>
+            <w:pPr>
+              <w:spacing w:after="20" w:line="240" w:lineRule="auto"/>
+            </w:pPr>
+            <w:r>
+              <w:rPr>
+                <w:b w:val="0"/>
+                <w:sz w:val="20"/>
+              </w:rPr>
+              <w:t>7.62 to 10.12</w:t>
+            </w:r>
+          </w:p>
+        </w:tc>
+        <w:tc>
+          <w:tcPr>
+            <w:tcW w:type="dxa" w:w="5216"/>
+            <w:vAlign w:val="center"/>
+            <w:tcBorders>
+              <w:top w:val="single" w:sz="4" w:color="D9D9D9"/>
+              <w:left w:val="single" w:sz="4" w:color="D9D9D9"/>
+              <w:bottom w:val="single" w:sz="4" w:color="D9D9D9"/>
+              <w:right w:val="single" w:sz="4" w:color="D9D9D9"/>
+            </w:tcBorders>
+            <w:tcMar>
+              <w:top w:w="85" w:type="dxa"/>
+              <w:left w:w="85" w:type="dxa"/>
+              <w:bottom w:w="85" w:type="dxa"/>
+              <w:right w:w="85" w:type="dxa"/>
+            </w:tcMar>
+          </w:tcPr>
+          <w:p>
+            <w:pPr>
+              <w:spacing w:after="20" w:line="240" w:lineRule="auto"/>
+            </w:pPr>
+            <w:r>
+              <w:rPr>
+                <w:b w:val="0"/>
+                <w:sz w:val="20"/>
+              </w:rPr>
+              <w:t>Scrambled ones, two levels</w:t>
+            </w:r>
+          </w:p>
+        </w:tc>
+      </w:tr>
+      <w:tr>
+        <w:trPr>
+          <w:cantSplit/>
+        </w:trPr>
+        <w:tc>
+          <w:tcPr>
+            <w:tcW w:type="dxa" w:w="1701"/>
+            <w:vAlign w:val="center"/>
+            <w:tcBorders>
+              <w:top w:val="single" w:sz="4" w:color="D9D9D9"/>
+              <w:left w:val="single" w:sz="4" w:color="D9D9D9"/>
+              <w:bottom w:val="single" w:sz="4" w:color="D9D9D9"/>
+              <w:right w:val="single" w:sz="4" w:color="D9D9D9"/>
+            </w:tcBorders>
+            <w:tcMar>
+              <w:top w:w="85" w:type="dxa"/>
+              <w:left w:w="85" w:type="dxa"/>
+              <w:bottom w:w="85" w:type="dxa"/>
+              <w:right w:w="85" w:type="dxa"/>
+            </w:tcMar>
+          </w:tcPr>
+          <w:p>
+            <w:pPr>
+              <w:spacing w:after="20" w:line="240" w:lineRule="auto"/>
+            </w:pPr>
+            <w:r>
+              <w:rPr>
+                <w:b w:val="0"/>
+                <w:sz w:val="20"/>
+              </w:rPr>
+              <w:t>B tail</w:t>
+            </w:r>
+          </w:p>
+        </w:tc>
+        <w:tc>
+          <w:tcPr>
+            <w:tcW w:type="dxa" w:w="2494"/>
+            <w:vAlign w:val="center"/>
+            <w:tcBorders>
+              <w:top w:val="single" w:sz="4" w:color="D9D9D9"/>
+              <w:left w:val="single" w:sz="4" w:color="D9D9D9"/>
+              <w:bottom w:val="single" w:sz="4" w:color="D9D9D9"/>
+              <w:right w:val="single" w:sz="4" w:color="D9D9D9"/>
+            </w:tcBorders>
+            <w:tcMar>
+              <w:top w:w="85" w:type="dxa"/>
+              <w:left w:w="85" w:type="dxa"/>
+              <w:bottom w:w="85" w:type="dxa"/>
+              <w:right w:w="85" w:type="dxa"/>
+            </w:tcMar>
+          </w:tcPr>
+          <w:p>
+            <w:pPr>
+              <w:spacing w:after="20" w:line="240" w:lineRule="auto"/>
+            </w:pPr>
+            <w:r>
+              <w:rPr>
+                <w:b w:val="0"/>
+                <w:sz w:val="20"/>
+              </w:rPr>
+              <w:t>10.12 to 10.27</w:t>
+            </w:r>
+          </w:p>
+        </w:tc>
+        <w:tc>
+          <w:tcPr>
+            <w:tcW w:type="dxa" w:w="5216"/>
+            <w:vAlign w:val="center"/>
+            <w:tcBorders>
+              <w:top w:val="single" w:sz="4" w:color="D9D9D9"/>
+              <w:left w:val="single" w:sz="4" w:color="D9D9D9"/>
+              <w:bottom w:val="single" w:sz="4" w:color="D9D9D9"/>
+              <w:right w:val="single" w:sz="4" w:color="D9D9D9"/>
+            </w:tcBorders>
+            <w:tcMar>
+              <w:top w:w="85" w:type="dxa"/>
+              <w:left w:w="85" w:type="dxa"/>
+              <w:bottom w:w="85" w:type="dxa"/>
+              <w:right w:w="85" w:type="dxa"/>
+            </w:tcMar>
+          </w:tcPr>
+          <w:p>
+            <w:pPr>
+              <w:spacing w:after="20" w:line="240" w:lineRule="auto"/>
+            </w:pPr>
+            <w:r>
+              <w:rPr>
+                <w:b w:val="0"/>
+                <w:sz w:val="20"/>
+              </w:rPr>
+              <w:t>Repeating twelve-bit word, same levels</w:t>
+            </w:r>
+          </w:p>
+        </w:tc>
+      </w:tr>
+      <w:tr>
+        <w:trPr>
+          <w:cantSplit/>
+        </w:trPr>
+        <w:tc>
+          <w:tcPr>
+            <w:tcW w:type="dxa" w:w="1701"/>
+            <w:vAlign w:val="center"/>
+            <w:tcBorders>
+              <w:top w:val="single" w:sz="4" w:color="D9D9D9"/>
+              <w:left w:val="single" w:sz="4" w:color="D9D9D9"/>
+              <w:bottom w:val="single" w:sz="4" w:color="D9D9D9"/>
+              <w:right w:val="single" w:sz="4" w:color="D9D9D9"/>
+            </w:tcBorders>
+            <w:tcMar>
+              <w:top w:w="85" w:type="dxa"/>
+              <w:left w:w="85" w:type="dxa"/>
+              <w:bottom w:w="85" w:type="dxa"/>
+              <w:right w:w="85" w:type="dxa"/>
+            </w:tcMar>
+          </w:tcPr>
+          <w:p>
+            <w:pPr>
+              <w:spacing w:after="20" w:line="240" w:lineRule="auto"/>
+            </w:pPr>
+            <w:r>
+              <w:rPr>
+                <w:b w:val="0"/>
+                <w:sz w:val="20"/>
+              </w:rPr>
+              <w:t>C</w:t>
+            </w:r>
+          </w:p>
+        </w:tc>
+        <w:tc>
+          <w:tcPr>
+            <w:tcW w:type="dxa" w:w="2494"/>
+            <w:vAlign w:val="center"/>
+            <w:tcBorders>
+              <w:top w:val="single" w:sz="4" w:color="D9D9D9"/>
+              <w:left w:val="single" w:sz="4" w:color="D9D9D9"/>
+              <w:bottom w:val="single" w:sz="4" w:color="D9D9D9"/>
+              <w:right w:val="single" w:sz="4" w:color="D9D9D9"/>
+            </w:tcBorders>
+            <w:tcMar>
+              <w:top w:w="85" w:type="dxa"/>
+              <w:left w:w="85" w:type="dxa"/>
+              <w:bottom w:w="85" w:type="dxa"/>
+              <w:right w:w="85" w:type="dxa"/>
+            </w:tcMar>
+          </w:tcPr>
+          <w:p>
+            <w:pPr>
+              <w:spacing w:after="20" w:line="240" w:lineRule="auto"/>
+            </w:pPr>
+            <w:r>
+              <w:rPr>
+                <w:b w:val="0"/>
+                <w:sz w:val="20"/>
+              </w:rPr>
+              <w:t>10.27 to 11.02</w:t>
+            </w:r>
+          </w:p>
+        </w:tc>
+        <w:tc>
+          <w:tcPr>
+            <w:tcW w:type="dxa" w:w="5216"/>
+            <w:vAlign w:val="center"/>
+            <w:tcBorders>
+              <w:top w:val="single" w:sz="4" w:color="D9D9D9"/>
+              <w:left w:val="single" w:sz="4" w:color="D9D9D9"/>
+              <w:bottom w:val="single" w:sz="4" w:color="D9D9D9"/>
+              <w:right w:val="single" w:sz="4" w:color="D9D9D9"/>
+            </w:tcBorders>
+            <w:tcMar>
+              <w:top w:w="85" w:type="dxa"/>
+              <w:left w:w="85" w:type="dxa"/>
+              <w:bottom w:w="85" w:type="dxa"/>
+              <w:right w:w="85" w:type="dxa"/>
+            </w:tcMar>
+          </w:tcPr>
+          <w:p>
+            <w:pPr>
+              <w:spacing w:after="20" w:line="240" w:lineRule="auto"/>
+            </w:pPr>
+            <w:r>
+              <w:rPr>
+                <w:b w:val="0"/>
+                <w:sz w:val="20"/>
+              </w:rPr>
+              <w:t>Scrambled ones, lower amplitude</w:t>
+            </w:r>
+          </w:p>
+        </w:tc>
+      </w:tr>
+      <w:tr>
+        <w:trPr>
+          <w:cantSplit/>
+        </w:trPr>
+        <w:tc>
+          <w:tcPr>
+            <w:tcW w:type="dxa" w:w="1701"/>
+            <w:vAlign w:val="center"/>
+            <w:tcBorders>
+              <w:top w:val="single" w:sz="4" w:color="D9D9D9"/>
+              <w:left w:val="single" w:sz="4" w:color="D9D9D9"/>
+              <w:bottom w:val="single" w:sz="4" w:color="D9D9D9"/>
+              <w:right w:val="single" w:sz="4" w:color="D9D9D9"/>
+            </w:tcBorders>
+            <w:tcMar>
+              <w:top w:w="85" w:type="dxa"/>
+              <w:left w:w="85" w:type="dxa"/>
+              <w:bottom w:w="85" w:type="dxa"/>
+              <w:right w:w="85" w:type="dxa"/>
+            </w:tcMar>
+          </w:tcPr>
+          <w:p>
+            <w:pPr>
+              <w:spacing w:after="20" w:line="240" w:lineRule="auto"/>
+            </w:pPr>
+            <w:r>
+              <w:rPr>
+                <w:b w:val="0"/>
+                <w:sz w:val="20"/>
+              </w:rPr>
+              <w:t>D</w:t>
+            </w:r>
+          </w:p>
+        </w:tc>
+        <w:tc>
+          <w:tcPr>
+            <w:tcW w:type="dxa" w:w="2494"/>
+            <w:vAlign w:val="center"/>
+            <w:tcBorders>
+              <w:top w:val="single" w:sz="4" w:color="D9D9D9"/>
+              <w:left w:val="single" w:sz="4" w:color="D9D9D9"/>
+              <w:bottom w:val="single" w:sz="4" w:color="D9D9D9"/>
+              <w:right w:val="single" w:sz="4" w:color="D9D9D9"/>
+            </w:tcBorders>
+            <w:tcMar>
+              <w:top w:w="85" w:type="dxa"/>
+              <w:left w:w="85" w:type="dxa"/>
+              <w:bottom w:w="85" w:type="dxa"/>
+              <w:right w:w="85" w:type="dxa"/>
+            </w:tcMar>
+          </w:tcPr>
+          <w:p>
+            <w:pPr>
+              <w:spacing w:after="20" w:line="240" w:lineRule="auto"/>
+            </w:pPr>
+            <w:r>
+              <w:rPr>
+                <w:b w:val="0"/>
+                <w:sz w:val="20"/>
+              </w:rPr>
+              <w:t>11.02 to 11.16</w:t>
+            </w:r>
+          </w:p>
+        </w:tc>
+        <w:tc>
+          <w:tcPr>
+            <w:tcW w:type="dxa" w:w="5216"/>
+            <w:vAlign w:val="center"/>
+            <w:tcBorders>
+              <w:top w:val="single" w:sz="4" w:color="D9D9D9"/>
+              <w:left w:val="single" w:sz="4" w:color="D9D9D9"/>
+              <w:bottom w:val="single" w:sz="4" w:color="D9D9D9"/>
+              <w:right w:val="single" w:sz="4" w:color="D9D9D9"/>
+            </w:tcBorders>
+            <w:tcMar>
+              <w:top w:w="85" w:type="dxa"/>
+              <w:left w:w="85" w:type="dxa"/>
+              <w:bottom w:w="85" w:type="dxa"/>
+              <w:right w:w="85" w:type="dxa"/>
+            </w:tcMar>
+          </w:tcPr>
+          <w:p>
+            <w:pPr>
+              <w:spacing w:after="20" w:line="240" w:lineRule="auto"/>
+            </w:pPr>
+            <w:r>
+              <w:rPr>
+                <w:b w:val="0"/>
+                <w:sz w:val="20"/>
+              </w:rPr>
+              <w:t>Six levels, period 36 octets</w:t>
+            </w:r>
+          </w:p>
+        </w:tc>
+      </w:tr>
+      <w:tr>
+        <w:trPr>
+          <w:cantSplit/>
+        </w:trPr>
+        <w:tc>
+          <w:tcPr>
+            <w:tcW w:type="dxa" w:w="1701"/>
+            <w:vAlign w:val="center"/>
+            <w:tcBorders>
+              <w:top w:val="single" w:sz="4" w:color="D9D9D9"/>
+              <w:left w:val="single" w:sz="4" w:color="D9D9D9"/>
+              <w:bottom w:val="single" w:sz="4" w:color="D9D9D9"/>
+              <w:right w:val="single" w:sz="4" w:color="D9D9D9"/>
+            </w:tcBorders>
+            <w:tcMar>
+              <w:top w:w="85" w:type="dxa"/>
+              <w:left w:w="85" w:type="dxa"/>
+              <w:bottom w:w="85" w:type="dxa"/>
+              <w:right w:w="85" w:type="dxa"/>
+            </w:tcMar>
+          </w:tcPr>
+          <w:p>
+            <w:pPr>
+              <w:spacing w:after="20" w:line="240" w:lineRule="auto"/>
+            </w:pPr>
+            <w:r>
+              <w:rPr>
+                <w:b w:val="0"/>
+                <w:sz w:val="20"/>
+              </w:rPr>
+              <w:t>E</w:t>
+            </w:r>
+          </w:p>
+        </w:tc>
+        <w:tc>
+          <w:tcPr>
+            <w:tcW w:type="dxa" w:w="2494"/>
+            <w:vAlign w:val="center"/>
+            <w:tcBorders>
+              <w:top w:val="single" w:sz="4" w:color="D9D9D9"/>
+              <w:left w:val="single" w:sz="4" w:color="D9D9D9"/>
+              <w:bottom w:val="single" w:sz="4" w:color="D9D9D9"/>
+              <w:right w:val="single" w:sz="4" w:color="D9D9D9"/>
+            </w:tcBorders>
+            <w:tcMar>
+              <w:top w:w="85" w:type="dxa"/>
+              <w:left w:w="85" w:type="dxa"/>
+              <w:bottom w:w="85" w:type="dxa"/>
+              <w:right w:w="85" w:type="dxa"/>
+            </w:tcMar>
+          </w:tcPr>
+          <w:p>
+            <w:pPr>
+              <w:spacing w:after="20" w:line="240" w:lineRule="auto"/>
+            </w:pPr>
+            <w:r>
+              <w:rPr>
+                <w:b w:val="0"/>
+                <w:sz w:val="20"/>
+              </w:rPr>
+              <w:t>11.16 on</w:t>
+            </w:r>
+          </w:p>
+        </w:tc>
+        <w:tc>
+          <w:tcPr>
+            <w:tcW w:type="dxa" w:w="5216"/>
+            <w:vAlign w:val="center"/>
+            <w:tcBorders>
+              <w:top w:val="single" w:sz="4" w:color="D9D9D9"/>
+              <w:left w:val="single" w:sz="4" w:color="D9D9D9"/>
+              <w:bottom w:val="single" w:sz="4" w:color="D9D9D9"/>
+              <w:right w:val="single" w:sz="4" w:color="D9D9D9"/>
+            </w:tcBorders>
+            <w:tcMar>
+              <w:top w:w="85" w:type="dxa"/>
+              <w:left w:w="85" w:type="dxa"/>
+              <w:bottom w:w="85" w:type="dxa"/>
+              <w:right w:w="85" w:type="dxa"/>
+            </w:tcMar>
+          </w:tcPr>
+          <w:p>
+            <w:pPr>
+              <w:spacing w:after="20" w:line="240" w:lineRule="auto"/>
+            </w:pPr>
+            <w:r>
+              <w:rPr>
+                <w:b w:val="0"/>
+                <w:sz w:val="20"/>
+              </w:rPr>
+              <w:t>Many-level data, 17 magnitudes</w:t>
             </w:r>
           </w:p>
         </w:tc>
@@ -19842,7 +20546,7 @@
         <w:rPr>
           <w:sz w:val="20"/>
         </w:rPr>
-        <w:t>The Courier post-marker signal is analysed by tools/analyze_v34_training.py with artifacts/x2-courier-phase3-20261004/analysis.json. The pre-gate bearer sequence is analysed by tools/analyze_bearer_handshake.py with artifacts/x2-pre-gate-20261004/analysis.json. The impairment test is tools/x2_source_impairment.py with artifacts/x2-source-impairment-20261004/verification.json. The marker receiver is documented at the end of docs/x2-v90-protocol-selection.md; tools/verify_x2_marker_receiver.py runs the original QF060003 parse from 97B5 and writes artifacts/x2-marker-receiver-20261004/verification.json. The arming site is 9791; the IM020104 counterpart is 948A.</w:t>
+        <w:t>The server post-marker signal is analysed by tools/analyze_server_training.py with artifacts/x2-server-training-20261004/analysis.json. The Courier post-marker signal is analysed by tools/analyze_v34_training.py with artifacts/x2-courier-phase3-20261004/analysis.json. The pre-gate bearer sequence is analysed by tools/analyze_bearer_handshake.py with artifacts/x2-pre-gate-20261004/analysis.json. The impairment test is tools/x2_source_impairment.py with artifacts/x2-source-impairment-20261004/verification.json. The marker receiver is documented at the end of docs/x2-v90-protocol-selection.md; tools/verify_x2_marker_receiver.py runs the original QF060003 parse from 97B5 and writes artifacts/x2-marker-receiver-20261004/verification.json. The arming site is 9791; the IM020104 counterpart is 948A.</w:t>
       </w:r>
     </w:p>
     <w:p>
@@ -19879,7 +20583,7 @@
         <w:rPr>
           <w:sz w:val="20"/>
         </w:rPr>
-        <w:t>Draft 0.26 decodes the Courier start-up signal after the marker as V.34 Phase 3 at the announced rate. Draft 0.25 maps the asymmetric call bearer sequence and decodes the marker frame from the line. Draft 0.24 decodes the bearer sequence before the INFO0 gate. Draft 0.23 tests multi-phase errors. Draft 0.22 sweeps all six phases of the impairment test. Draft 0.21 reproduces the 56000 decision with a controlled low-bit impairment of the startup source. Draft 0.20 decodes the data-mode hook families and the rate decision after the capability exchange. Draft 0.19 decodes the in-band capability frame. Draft 0.18 decodes the receiver mismatch handling. Draft 0.17 decodes the startup source receiver that ends the wait. Draft 0.16 decodes the originating-end idle stub and the wait that ends it. Draft 0.15 traces the symmetric startup branch. Draft 0.14 specifies the server peer-role test on the exchanged INFO0 words. Draft 0.13 traces the server after marker acceptance. Draft 0.12 identifies the server receiver for the seven-bit marker and verifies its field parse. Draft 0.11 resolves the 3453C capability route: the transmitted INFO0 word is the plain tag 51 word and the tag 70 word is never read. Draft 0.10 adds pre-V.90 and later client rate selection, position grouping, variable-length body construction and original serialization. It distinguishes the host diagnostic report from peer records and records the XC timing correction and successful symmetric regression. Draft 0.9 executes the four-word PCM record receiver through CRC acceptance, rate-mask selection, bank construction, mapped output and later payload-source activation. The client measurement-to-record producer and complete call-state selection remain open. Draft 0.8 verified 57333 profiles and corrected builder product scaling to SPM 1. Draft 0.7 confirmed active GPC scrambling and pre-data resets in the symmetric 64000 pair. Analogue client decoding, alternate companding output and complete peer negotiation remain open.</w:t>
+        <w:t>Draft 0.27 segments the server downstream training signal and decodes its scrambled-ones stretches. Draft 0.26 decodes the Courier start-up signal after the marker as V.34 Phase 3 at the announced rate. Draft 0.25 maps the asymmetric call bearer sequence and decodes the marker frame from the line. Draft 0.24 decodes the bearer sequence before the INFO0 gate. Draft 0.23 tests multi-phase errors. Draft 0.22 sweeps all six phases of the impairment test. Draft 0.21 reproduces the 56000 decision with a controlled low-bit impairment of the startup source. Draft 0.20 decodes the data-mode hook families and the rate decision after the capability exchange. Draft 0.19 decodes the in-band capability frame. Draft 0.18 decodes the receiver mismatch handling. Draft 0.17 decodes the startup source receiver that ends the wait. Draft 0.16 decodes the originating-end idle stub and the wait that ends it. Draft 0.15 traces the symmetric startup branch. Draft 0.14 specifies the server peer-role test on the exchanged INFO0 words. Draft 0.13 traces the server after marker acceptance. Draft 0.12 identifies the server receiver for the seven-bit marker and verifies its field parse. Draft 0.11 resolves the 3453C capability route: the transmitted INFO0 word is the plain tag 51 word and the tag 70 word is never read. Draft 0.10 adds pre-V.90 and later client rate selection, position grouping, variable-length body construction and original serialization. It distinguishes the host diagnostic report from peer records and records the XC timing correction and successful symmetric regression. Draft 0.9 executes the four-word PCM record receiver through CRC acceptance, rate-mask selection, bank construction, mapped output and later payload-source activation. The client measurement-to-record producer and complete call-state selection remain open. Draft 0.8 verified 57333 profiles and corrected builder product scaling to SPM 1. Draft 0.7 confirmed active GPC scrambling and pre-data resets in the symmetric 64000 pair. Analogue client decoding, alternate companding output and complete peer negotiation remain open.</w:t>
       </w:r>
     </w:p>
     <w:p>
@@ -20018,7 +20722,7 @@
       <w:rPr>
         <w:sz w:val="18"/>
       </w:rPr>
-      <w:t>COURIER EMU     x2 firmware reconstruction     Draft 0.26</w:t>
+      <w:t>COURIER EMU     x2 firmware reconstruction     Draft 0.27</w:t>
     </w:r>
   </w:p>
 </w:hdr>

</xml_diff>

<commit_message>
Read the server's training script from the firmware
Table-driven state machine at c915: durations equal the measured stretch
lengths (363, 20004, 6000, 1152). The 12-bit word is a script constant (09b0)
rotated six bits per frame; D sweeps six codewords through six positions; E
starts constellation training at size 19. Spec 0.28.

Co-Authored-By: Claude Sonnet 5.5 <noreply@anthropic.com>
</commit_message>
<xml_diff>
--- a/artifacts/x2-spec-20261004/x2-technical-specification.docx
+++ b/artifacts/x2-spec-20261004/x2-technical-specification.docx
@@ -20,7 +20,7 @@
     </w:p>
     <w:p>
       <w:r>
-        <w:t>Draft 0.27   •   Independent firmware reconstruction   •   4 October 2026</w:t>
+        <w:t>Draft 0.28   •   Independent firmware reconstruction   •   4 October 2026</w:t>
       </w:r>
     </w:p>
     <w:p>
@@ -4029,7 +4029,7 @@
     </w:p>
     <w:p>
       <w:r>
-        <w:t>After the marker the server sends a short exactly periodic four-level pattern, then 2.65 s of scrambled ones as two PCMU levels, one bit per octet, using the generator polynomial 1 plus x to the minus 18 plus x to the minus 23. The scrambled ones end 0.15 s before the stretch ends, and the descrambled bits become a repeating twelve-bit word. A second 0.75 s of scrambled ones follows at lower amplitude, then a 0.14 s six-level periodic pattern whose period is six octets repeated in a rotation of 36, then many-level data using 17 magnitudes at each of the six symbol positions. The client restarts its own signal during the repeating word and before the amplitude step. The content of the periodic patterns and of the many-level data was not decoded.</w:t>
+        <w:t>After the marker the server sends a short exactly periodic four-level pattern, then 2.65 s of scrambled ones as two PCMU levels, one bit per octet, using the generator polynomial 1 plus x to the minus 18 plus x to the minus 23. The scrambled ones end 0.15 s before the stretch ends, and the descrambled bits become a repeating twelve-bit word. A second 0.75 s of scrambled ones follows at lower amplitude, then a 0.14 s six-level periodic pattern whose period is six octets repeated in a rotation of 36, then many-level data using 17 magnitudes at each of the six symbol positions. The client restarts its own signal during the repeating word and before the amplitude step. The server output is a script of state, parameter and symbol-count entries: its durations are exactly the stretch lengths, 363, 20004, 6000 and 1152 symbols. The repeating word is a constant twelve-bit register of the script rotated by six bits every six-symbol frame, so six bits go out per frame. The six-level stretch sweeps six codewords through all six symbol positions, a rotation that gives its period of 36 octets. The last stretch begins constellation training with the size parameter 19, the first entry of the table of clause 10. The rule that generates the first periodic pattern, the meaning of the twelve-bit word and the content of the many-level data were not decoded.</w:t>
       </w:r>
     </w:p>
     <w:p>
@@ -20546,7 +20546,7 @@
         <w:rPr>
           <w:sz w:val="20"/>
         </w:rPr>
-        <w:t>The server post-marker signal is analysed by tools/analyze_server_training.py with artifacts/x2-server-training-20261004/analysis.json. The Courier post-marker signal is analysed by tools/analyze_v34_training.py with artifacts/x2-courier-phase3-20261004/analysis.json. The pre-gate bearer sequence is analysed by tools/analyze_bearer_handshake.py with artifacts/x2-pre-gate-20261004/analysis.json. The impairment test is tools/x2_source_impairment.py with artifacts/x2-source-impairment-20261004/verification.json. The marker receiver is documented at the end of docs/x2-v90-protocol-selection.md; tools/verify_x2_marker_receiver.py runs the original QF060003 parse from 97B5 and writes artifacts/x2-marker-receiver-20261004/verification.json. The arming site is 9791; the IM020104 counterpart is 948A.</w:t>
+        <w:t>The server training script is decoded by tools/decode_server_script.py with artifacts/x2-server-script-20261004/script.json. The server post-marker signal is analysed by tools/analyze_server_training.py with artifacts/x2-server-training-20261004/analysis.json. The Courier post-marker signal is analysed by tools/analyze_v34_training.py with artifacts/x2-courier-phase3-20261004/analysis.json. The pre-gate bearer sequence is analysed by tools/analyze_bearer_handshake.py with artifacts/x2-pre-gate-20261004/analysis.json. The impairment test is tools/x2_source_impairment.py with artifacts/x2-source-impairment-20261004/verification.json. The marker receiver is documented at the end of docs/x2-v90-protocol-selection.md; tools/verify_x2_marker_receiver.py runs the original QF060003 parse from 97B5 and writes artifacts/x2-marker-receiver-20261004/verification.json. The arming site is 9791; the IM020104 counterpart is 948A.</w:t>
       </w:r>
     </w:p>
     <w:p>
@@ -20583,7 +20583,7 @@
         <w:rPr>
           <w:sz w:val="20"/>
         </w:rPr>
-        <w:t>Draft 0.27 segments the server downstream training signal and decodes its scrambled-ones stretches. Draft 0.26 decodes the Courier start-up signal after the marker as V.34 Phase 3 at the announced rate. Draft 0.25 maps the asymmetric call bearer sequence and decodes the marker frame from the line. Draft 0.24 decodes the bearer sequence before the INFO0 gate. Draft 0.23 tests multi-phase errors. Draft 0.22 sweeps all six phases of the impairment test. Draft 0.21 reproduces the 56000 decision with a controlled low-bit impairment of the startup source. Draft 0.20 decodes the data-mode hook families and the rate decision after the capability exchange. Draft 0.19 decodes the in-band capability frame. Draft 0.18 decodes the receiver mismatch handling. Draft 0.17 decodes the startup source receiver that ends the wait. Draft 0.16 decodes the originating-end idle stub and the wait that ends it. Draft 0.15 traces the symmetric startup branch. Draft 0.14 specifies the server peer-role test on the exchanged INFO0 words. Draft 0.13 traces the server after marker acceptance. Draft 0.12 identifies the server receiver for the seven-bit marker and verifies its field parse. Draft 0.11 resolves the 3453C capability route: the transmitted INFO0 word is the plain tag 51 word and the tag 70 word is never read. Draft 0.10 adds pre-V.90 and later client rate selection, position grouping, variable-length body construction and original serialization. It distinguishes the host diagnostic report from peer records and records the XC timing correction and successful symmetric regression. Draft 0.9 executes the four-word PCM record receiver through CRC acceptance, rate-mask selection, bank construction, mapped output and later payload-source activation. The client measurement-to-record producer and complete call-state selection remain open. Draft 0.8 verified 57333 profiles and corrected builder product scaling to SPM 1. Draft 0.7 confirmed active GPC scrambling and pre-data resets in the symmetric 64000 pair. Analogue client decoding, alternate companding output and complete peer negotiation remain open.</w:t>
+        <w:t>Draft 0.28 reads the server training script from the firmware. Draft 0.27 segments the server downstream training signal and decodes its scrambled-ones stretches. Draft 0.26 decodes the Courier start-up signal after the marker as V.34 Phase 3 at the announced rate. Draft 0.25 maps the asymmetric call bearer sequence and decodes the marker frame from the line. Draft 0.24 decodes the bearer sequence before the INFO0 gate. Draft 0.23 tests multi-phase errors. Draft 0.22 sweeps all six phases of the impairment test. Draft 0.21 reproduces the 56000 decision with a controlled low-bit impairment of the startup source. Draft 0.20 decodes the data-mode hook families and the rate decision after the capability exchange. Draft 0.19 decodes the in-band capability frame. Draft 0.18 decodes the receiver mismatch handling. Draft 0.17 decodes the startup source receiver that ends the wait. Draft 0.16 decodes the originating-end idle stub and the wait that ends it. Draft 0.15 traces the symmetric startup branch. Draft 0.14 specifies the server peer-role test on the exchanged INFO0 words. Draft 0.13 traces the server after marker acceptance. Draft 0.12 identifies the server receiver for the seven-bit marker and verifies its field parse. Draft 0.11 resolves the 3453C capability route: the transmitted INFO0 word is the plain tag 51 word and the tag 70 word is never read. Draft 0.10 adds pre-V.90 and later client rate selection, position grouping, variable-length body construction and original serialization. It distinguishes the host diagnostic report from peer records and records the XC timing correction and successful symmetric regression. Draft 0.9 executes the four-word PCM record receiver through CRC acceptance, rate-mask selection, bank construction, mapped output and later payload-source activation. The client measurement-to-record producer and complete call-state selection remain open. Draft 0.8 verified 57333 profiles and corrected builder product scaling to SPM 1. Draft 0.7 confirmed active GPC scrambling and pre-data resets in the symmetric 64000 pair. Analogue client decoding, alternate companding output and complete peer negotiation remain open.</w:t>
       </w:r>
     </w:p>
     <w:p>
@@ -20722,7 +20722,7 @@
       <w:rPr>
         <w:sz w:val="18"/>
       </w:rPr>
-      <w:t>COURIER EMU     x2 firmware reconstruction     Draft 0.27</w:t>
+      <w:t>COURIER EMU     x2 firmware reconstruction     Draft 0.28</w:t>
     </w:r>
   </w:p>
 </w:hdr>

</xml_diff>

<commit_message>
Decode d229 and the level table behind the server's last training stretch
E sends only the nine mu-law magnitudes of the table d229 copies (chosen by
ffd9 bit 2), both signs, uniformly; corrects the earlier 34-octet claim, which
included the data phase. Spec 0.29.

Co-Authored-By: Claude Sonnet 5.5 <noreply@anthropic.com>
</commit_message>
<xml_diff>
--- a/artifacts/x2-spec-20261004/x2-technical-specification.docx
+++ b/artifacts/x2-spec-20261004/x2-technical-specification.docx
@@ -20,7 +20,7 @@
     </w:p>
     <w:p>
       <w:r>
-        <w:t>Draft 0.28   •   Independent firmware reconstruction   •   4 October 2026</w:t>
+        <w:t>Draft 0.29   •   Independent firmware reconstruction   •   4 October 2026</w:t>
       </w:r>
     </w:p>
     <w:p>
@@ -4029,7 +4029,7 @@
     </w:p>
     <w:p>
       <w:r>
-        <w:t>After the marker the server sends a short exactly periodic four-level pattern, then 2.65 s of scrambled ones as two PCMU levels, one bit per octet, using the generator polynomial 1 plus x to the minus 18 plus x to the minus 23. The scrambled ones end 0.15 s before the stretch ends, and the descrambled bits become a repeating twelve-bit word. A second 0.75 s of scrambled ones follows at lower amplitude, then a 0.14 s six-level periodic pattern whose period is six octets repeated in a rotation of 36, then many-level data using 17 magnitudes at each of the six symbol positions. The client restarts its own signal during the repeating word and before the amplitude step. The server output is a script of state, parameter and symbol-count entries: its durations are exactly the stretch lengths, 363, 20004, 6000 and 1152 symbols. The repeating word is a constant twelve-bit register of the script rotated by six bits every six-symbol frame, so six bits go out per frame. The six-level stretch sweeps six codewords through all six symbol positions, a rotation that gives its period of 36 octets. The last stretch begins constellation training with the size parameter 19, the first entry of the table of clause 10. The rule that generates the first periodic pattern, the meaning of the twelve-bit word and the content of the many-level data were not decoded.</w:t>
+        <w:t>After the marker the server sends a short exactly periodic four-level pattern, then 2.65 s of scrambled ones as two PCMU levels, one bit per octet, using the generator polynomial 1 plus x to the minus 18 plus x to the minus 23. The scrambled ones end 0.15 s before the stretch ends, and the descrambled bits become a repeating twelve-bit word. A second 0.75 s of scrambled ones follows at lower amplitude, then a 0.14 s six-level periodic pattern whose period is six octets repeated in a rotation of 36, then 1.25 s of training over eighteen levels, nine magnitudes with both signs, chosen from one of two tables by a flag set during the exchange. The client restarts its own signal during the repeating word and before the amplitude step. The server output is a script of state, parameter and symbol-count entries: its durations are exactly the stretch lengths, 363, 20004, 6000 and 1152 symbols. The repeating word is a constant twelve-bit register of the script rotated by six bits every six-symbol frame, so six bits go out per frame. The six-level stretch sweeps six codewords through all six symbol positions, a rotation that gives its period of 36 octets. The last stretch begins constellation training with the size parameter 19, the first entry of the table of clause 10, and sends only the nine magnitudes of the selected table, about equally often. The rule that generates the first periodic pattern, the meaning of the twelve-bit word and what maps the training bits to levels were not decoded.</w:t>
       </w:r>
     </w:p>
     <w:p>
@@ -4686,7 +4686,7 @@
                 <w:b w:val="0"/>
                 <w:sz w:val="20"/>
               </w:rPr>
-              <w:t>11.16 on</w:t>
+              <w:t>11.16 to 12.4</w:t>
             </w:r>
           </w:p>
         </w:tc>
@@ -4716,7 +4716,7 @@
                 <w:b w:val="0"/>
                 <w:sz w:val="20"/>
               </w:rPr>
-              <w:t>Many-level data, 17 magnitudes</w:t>
+              <w:t>Eighteen levels, nine magnitudes with both signs</w:t>
             </w:r>
           </w:p>
         </w:tc>
@@ -20583,7 +20583,7 @@
         <w:rPr>
           <w:sz w:val="20"/>
         </w:rPr>
-        <w:t>Draft 0.28 reads the server training script from the firmware. Draft 0.27 segments the server downstream training signal and decodes its scrambled-ones stretches. Draft 0.26 decodes the Courier start-up signal after the marker as V.34 Phase 3 at the announced rate. Draft 0.25 maps the asymmetric call bearer sequence and decodes the marker frame from the line. Draft 0.24 decodes the bearer sequence before the INFO0 gate. Draft 0.23 tests multi-phase errors. Draft 0.22 sweeps all six phases of the impairment test. Draft 0.21 reproduces the 56000 decision with a controlled low-bit impairment of the startup source. Draft 0.20 decodes the data-mode hook families and the rate decision after the capability exchange. Draft 0.19 decodes the in-band capability frame. Draft 0.18 decodes the receiver mismatch handling. Draft 0.17 decodes the startup source receiver that ends the wait. Draft 0.16 decodes the originating-end idle stub and the wait that ends it. Draft 0.15 traces the symmetric startup branch. Draft 0.14 specifies the server peer-role test on the exchanged INFO0 words. Draft 0.13 traces the server after marker acceptance. Draft 0.12 identifies the server receiver for the seven-bit marker and verifies its field parse. Draft 0.11 resolves the 3453C capability route: the transmitted INFO0 word is the plain tag 51 word and the tag 70 word is never read. Draft 0.10 adds pre-V.90 and later client rate selection, position grouping, variable-length body construction and original serialization. It distinguishes the host diagnostic report from peer records and records the XC timing correction and successful symmetric regression. Draft 0.9 executes the four-word PCM record receiver through CRC acceptance, rate-mask selection, bank construction, mapped output and later payload-source activation. The client measurement-to-record producer and complete call-state selection remain open. Draft 0.8 verified 57333 profiles and corrected builder product scaling to SPM 1. Draft 0.7 confirmed active GPC scrambling and pre-data resets in the symmetric 64000 pair. Analogue client decoding, alternate companding output and complete peer negotiation remain open.</w:t>
+        <w:t>Draft 0.29 reads the level table behind the last training stretch and corrects its alphabet. Draft 0.28 reads the server training script from the firmware. Draft 0.27 segments the server downstream training signal and decodes its scrambled-ones stretches. Draft 0.26 decodes the Courier start-up signal after the marker as V.34 Phase 3 at the announced rate. Draft 0.25 maps the asymmetric call bearer sequence and decodes the marker frame from the line. Draft 0.24 decodes the bearer sequence before the INFO0 gate. Draft 0.23 tests multi-phase errors. Draft 0.22 sweeps all six phases of the impairment test. Draft 0.21 reproduces the 56000 decision with a controlled low-bit impairment of the startup source. Draft 0.20 decodes the data-mode hook families and the rate decision after the capability exchange. Draft 0.19 decodes the in-band capability frame. Draft 0.18 decodes the receiver mismatch handling. Draft 0.17 decodes the startup source receiver that ends the wait. Draft 0.16 decodes the originating-end idle stub and the wait that ends it. Draft 0.15 traces the symmetric startup branch. Draft 0.14 specifies the server peer-role test on the exchanged INFO0 words. Draft 0.13 traces the server after marker acceptance. Draft 0.12 identifies the server receiver for the seven-bit marker and verifies its field parse. Draft 0.11 resolves the 3453C capability route: the transmitted INFO0 word is the plain tag 51 word and the tag 70 word is never read. Draft 0.10 adds pre-V.90 and later client rate selection, position grouping, variable-length body construction and original serialization. It distinguishes the host diagnostic report from peer records and records the XC timing correction and successful symmetric regression. Draft 0.9 executes the four-word PCM record receiver through CRC acceptance, rate-mask selection, bank construction, mapped output and later payload-source activation. The client measurement-to-record producer and complete call-state selection remain open. Draft 0.8 verified 57333 profiles and corrected builder product scaling to SPM 1. Draft 0.7 confirmed active GPC scrambling and pre-data resets in the symmetric 64000 pair. Analogue client decoding, alternate companding output and complete peer negotiation remain open.</w:t>
       </w:r>
     </w:p>
     <w:p>
@@ -20722,7 +20722,7 @@
       <w:rPr>
         <w:sz w:val="18"/>
       </w:rPr>
-      <w:t>COURIER EMU     x2 firmware reconstruction     Draft 0.28</w:t>
+      <w:t>COURIER EMU     x2 firmware reconstruction     Draft 0.29</w:t>
     </w:r>
   </w:p>
 </w:hdr>

</xml_diff>

<commit_message>
Decode pattern A's generation rule: Barker-11 signs, two amplitudes
Two 11-bit registers (05b8 signs, 0712 levels, complemented on odd cycles),
32 cycles plus one with every sign inverted; reproduces all 363 captured
octets. Spec 0.30.

Co-Authored-By: Claude Sonnet 5.5 <noreply@anthropic.com>
</commit_message>
<xml_diff>
--- a/artifacts/x2-spec-20261004/x2-technical-specification.docx
+++ b/artifacts/x2-spec-20261004/x2-technical-specification.docx
@@ -20,7 +20,7 @@
     </w:p>
     <w:p>
       <w:r>
-        <w:t>Draft 0.29   •   Independent firmware reconstruction   •   4 October 2026</w:t>
+        <w:t>Draft 0.30   •   Independent firmware reconstruction   •   4 October 2026</w:t>
       </w:r>
     </w:p>
     <w:p>
@@ -4029,7 +4029,7 @@
     </w:p>
     <w:p>
       <w:r>
-        <w:t>After the marker the server sends a short exactly periodic four-level pattern, then 2.65 s of scrambled ones as two PCMU levels, one bit per octet, using the generator polynomial 1 plus x to the minus 18 plus x to the minus 23. The scrambled ones end 0.15 s before the stretch ends, and the descrambled bits become a repeating twelve-bit word. A second 0.75 s of scrambled ones follows at lower amplitude, then a 0.14 s six-level periodic pattern whose period is six octets repeated in a rotation of 36, then 1.25 s of training over eighteen levels, nine magnitudes with both signs, chosen from one of two tables by a flag set during the exchange. The client restarts its own signal during the repeating word and before the amplitude step. The server output is a script of state, parameter and symbol-count entries: its durations are exactly the stretch lengths, 363, 20004, 6000 and 1152 symbols. The repeating word is a constant twelve-bit register of the script rotated by six bits every six-symbol frame, so six bits go out per frame. The six-level stretch sweeps six codewords through all six symbol positions, a rotation that gives its period of 36 octets. The last stretch begins constellation training with the size parameter 19, the first entry of the table of clause 10, and sends only the nine magnitudes of the selected table, about equally often. The rule that generates the first periodic pattern, the meaning of the twelve-bit word and what maps the training bits to levels were not decoded.</w:t>
+        <w:t>After the marker the server sends a short exactly periodic four-level pattern, then 2.65 s of scrambled ones as two PCMU levels, one bit per octet, using the generator polynomial 1 plus x to the minus 18 plus x to the minus 23. The scrambled ones end 0.15 s before the stretch ends, and the descrambled bits become a repeating twelve-bit word. A second 0.75 s of scrambled ones follows at lower amplitude, then a 0.14 s six-level periodic pattern whose period is six octets repeated in a rotation of 36, then 1.25 s of training over eighteen levels, nine magnitudes with both signs, chosen from one of two tables by a flag set during the exchange. The client restarts its own signal during the repeating word and before the amplitude step. The server output is a script of state, parameter and symbol-count entries: its durations are exactly the stretch lengths, 363, 20004, 6000 and 1152 symbols. The repeating word is a constant twelve-bit register of the script rotated by six bits every six-symbol frame, so six bits go out per frame. The six-level stretch sweeps six codewords through all six symbol positions, a rotation that gives its period of 36 octets. The last stretch begins constellation training with the size parameter 19, the first entry of the table of clause 10, and sends only the nine magnitudes of the selected table, about equally often. The first pattern is generated from two eleven-bit registers: one gives the signs, and they are the Barker-11 code; the other chooses between two amplitudes and is complemented on alternate eleven-symbol cycles. Thirty-two cycles are followed by one with every sign inverted, 363 symbols in all, and the rule reproduces every octet of the recorded pattern. It is most likely a synchronization preamble, which the firmware does not state. The meaning of the twelve-bit word and what maps the training bits to levels were not decoded.</w:t>
       </w:r>
     </w:p>
     <w:p>
@@ -4241,7 +4241,7 @@
                 <w:b w:val="0"/>
                 <w:sz w:val="20"/>
               </w:rPr>
-              <w:t>Four levels, period 22 octets</w:t>
+              <w:t>Barker-11 signs, two amplitudes, period 22</w:t>
             </w:r>
           </w:p>
         </w:tc>
@@ -20583,7 +20583,7 @@
         <w:rPr>
           <w:sz w:val="20"/>
         </w:rPr>
-        <w:t>Draft 0.29 reads the level table behind the last training stretch and corrects its alphabet. Draft 0.28 reads the server training script from the firmware. Draft 0.27 segments the server downstream training signal and decodes its scrambled-ones stretches. Draft 0.26 decodes the Courier start-up signal after the marker as V.34 Phase 3 at the announced rate. Draft 0.25 maps the asymmetric call bearer sequence and decodes the marker frame from the line. Draft 0.24 decodes the bearer sequence before the INFO0 gate. Draft 0.23 tests multi-phase errors. Draft 0.22 sweeps all six phases of the impairment test. Draft 0.21 reproduces the 56000 decision with a controlled low-bit impairment of the startup source. Draft 0.20 decodes the data-mode hook families and the rate decision after the capability exchange. Draft 0.19 decodes the in-band capability frame. Draft 0.18 decodes the receiver mismatch handling. Draft 0.17 decodes the startup source receiver that ends the wait. Draft 0.16 decodes the originating-end idle stub and the wait that ends it. Draft 0.15 traces the symmetric startup branch. Draft 0.14 specifies the server peer-role test on the exchanged INFO0 words. Draft 0.13 traces the server after marker acceptance. Draft 0.12 identifies the server receiver for the seven-bit marker and verifies its field parse. Draft 0.11 resolves the 3453C capability route: the transmitted INFO0 word is the plain tag 51 word and the tag 70 word is never read. Draft 0.10 adds pre-V.90 and later client rate selection, position grouping, variable-length body construction and original serialization. It distinguishes the host diagnostic report from peer records and records the XC timing correction and successful symmetric regression. Draft 0.9 executes the four-word PCM record receiver through CRC acceptance, rate-mask selection, bank construction, mapped output and later payload-source activation. The client measurement-to-record producer and complete call-state selection remain open. Draft 0.8 verified 57333 profiles and corrected builder product scaling to SPM 1. Draft 0.7 confirmed active GPC scrambling and pre-data resets in the symmetric 64000 pair. Analogue client decoding, alternate companding output and complete peer negotiation remain open.</w:t>
+        <w:t>Draft 0.30 decodes the generation rule of the first server training pattern. Draft 0.29 reads the level table behind the last training stretch and corrects its alphabet. Draft 0.28 reads the server training script from the firmware. Draft 0.27 segments the server downstream training signal and decodes its scrambled-ones stretches. Draft 0.26 decodes the Courier start-up signal after the marker as V.34 Phase 3 at the announced rate. Draft 0.25 maps the asymmetric call bearer sequence and decodes the marker frame from the line. Draft 0.24 decodes the bearer sequence before the INFO0 gate. Draft 0.23 tests multi-phase errors. Draft 0.22 sweeps all six phases of the impairment test. Draft 0.21 reproduces the 56000 decision with a controlled low-bit impairment of the startup source. Draft 0.20 decodes the data-mode hook families and the rate decision after the capability exchange. Draft 0.19 decodes the in-band capability frame. Draft 0.18 decodes the receiver mismatch handling. Draft 0.17 decodes the startup source receiver that ends the wait. Draft 0.16 decodes the originating-end idle stub and the wait that ends it. Draft 0.15 traces the symmetric startup branch. Draft 0.14 specifies the server peer-role test on the exchanged INFO0 words. Draft 0.13 traces the server after marker acceptance. Draft 0.12 identifies the server receiver for the seven-bit marker and verifies its field parse. Draft 0.11 resolves the 3453C capability route: the transmitted INFO0 word is the plain tag 51 word and the tag 70 word is never read. Draft 0.10 adds pre-V.90 and later client rate selection, position grouping, variable-length body construction and original serialization. It distinguishes the host diagnostic report from peer records and records the XC timing correction and successful symmetric regression. Draft 0.9 executes the four-word PCM record receiver through CRC acceptance, rate-mask selection, bank construction, mapped output and later payload-source activation. The client measurement-to-record producer and complete call-state selection remain open. Draft 0.8 verified 57333 profiles and corrected builder product scaling to SPM 1. Draft 0.7 confirmed active GPC scrambling and pre-data resets in the symmetric 64000 pair. Analogue client decoding, alternate companding output and complete peer negotiation remain open.</w:t>
       </w:r>
     </w:p>
     <w:p>
@@ -20722,7 +20722,7 @@
       <w:rPr>
         <w:sz w:val="18"/>
       </w:rPr>
-      <w:t>COURIER EMU     x2 firmware reconstruction     Draft 0.29</w:t>
+      <w:t>COURIER EMU     x2 firmware reconstruction     Draft 0.30</w:t>
     </w:r>
   </w:p>
 </w:hdr>

</xml_diff>

<commit_message>
Decode the server's last training stretch with the payload mapper
E is the clause 10/11 mapper (nine-entry banks, B=19, MD=5, differential signs)
fed with scrambled ones, 32 kbit/s, constant ones over 1667 frames. The
repeated word is a script constant held until the receiver reaches state 6;
the 099f entry is not taken in this call. Spec 0.31.

Co-Authored-By: Claude Sonnet 5.5 <noreply@anthropic.com>
</commit_message>
<xml_diff>
--- a/artifacts/x2-spec-20261004/x2-technical-specification.docx
+++ b/artifacts/x2-spec-20261004/x2-technical-specification.docx
@@ -20,7 +20,7 @@
     </w:p>
     <w:p>
       <w:r>
-        <w:t>Draft 0.30   •   Independent firmware reconstruction   •   4 October 2026</w:t>
+        <w:t>Draft 0.31   •   Independent firmware reconstruction   •   4 October 2026</w:t>
       </w:r>
     </w:p>
     <w:p>
@@ -4029,7 +4029,7 @@
     </w:p>
     <w:p>
       <w:r>
-        <w:t>After the marker the server sends a short exactly periodic four-level pattern, then 2.65 s of scrambled ones as two PCMU levels, one bit per octet, using the generator polynomial 1 plus x to the minus 18 plus x to the minus 23. The scrambled ones end 0.15 s before the stretch ends, and the descrambled bits become a repeating twelve-bit word. A second 0.75 s of scrambled ones follows at lower amplitude, then a 0.14 s six-level periodic pattern whose period is six octets repeated in a rotation of 36, then 1.25 s of training over eighteen levels, nine magnitudes with both signs, chosen from one of two tables by a flag set during the exchange. The client restarts its own signal during the repeating word and before the amplitude step. The server output is a script of state, parameter and symbol-count entries: its durations are exactly the stretch lengths, 363, 20004, 6000 and 1152 symbols. The repeating word is a constant twelve-bit register of the script rotated by six bits every six-symbol frame, so six bits go out per frame. The six-level stretch sweeps six codewords through all six symbol positions, a rotation that gives its period of 36 octets. The last stretch begins constellation training with the size parameter 19, the first entry of the table of clause 10, and sends only the nine magnitudes of the selected table, about equally often. The first pattern is generated from two eleven-bit registers: one gives the signs, and they are the Barker-11 code; the other chooses between two amplitudes and is complemented on alternate eleven-symbol cycles. Thirty-two cycles are followed by one with every sign inverted, 363 symbols in all, and the rule reproduces every octet of the recorded pattern. It is most likely a synchronization preamble, which the firmware does not state. The meaning of the twelve-bit word and what maps the training bits to levels were not decoded.</w:t>
+        <w:t>After the marker the server sends a short exactly periodic four-level pattern, then 2.65 s of scrambled ones as two PCMU levels, one bit per octet, using the generator polynomial 1 plus x to the minus 18 plus x to the minus 23. The scrambled ones end 0.15 s before the stretch ends, and the descrambled bits become a repeating twelve-bit word. A second 0.75 s of scrambled ones follows at lower amplitude, then a 0.14 s six-level periodic pattern whose period is six octets repeated in a rotation of 36, then 1.25 s of training over eighteen levels, nine magnitudes with both signs, chosen from one of two tables by a flag set during the exchange. The client restarts its own signal during the repeating word and before the amplitude step. The server output is a script of state, parameter and symbol-count entries: its durations are exactly the stretch lengths, 363, 20004, 6000 and 1152 symbols. The repeating word is a constant twelve-bit register of the script rotated by six bits every six-symbol frame, so six bits go out per frame. The six-level stretch sweeps six codewords through all six symbol positions, a rotation that gives its period of 36 octets. The last stretch begins constellation training with the size parameter 19, the first entry of the table of clause 10, and sends only the nine magnitudes of the selected table, about equally often. The first pattern is generated from two eleven-bit registers: one gives the signs, and they are the Barker-11 code; the other chooses between two amplitudes and is complemented on alternate eleven-symbol cycles. Thirty-two cycles are followed by one with every sign inverted, 363 symbols in all, and the rule reproduces every octet of the recorded pattern. It is most likely a synchronization preamble, which the firmware does not state. The last stretch is the data-frame mapper of clauses 10 and 11 fed with scrambled ones: six banks of nine entries, nineteen amplitude bits and five independent sign bits, 24 bits per six-symbol frame or 32000 bit/s. Reassembling the frames and descrambling gives constant ones for every one of 1667 frames, and no other independent-sign count does. The twelve-bit word is a constant of the script, two six-bit source words alternating from frame to frame, and the script holds at it, with a halt word, until the server receiver reaches a state; the client starts its second signal about 60 ms after the word begins. The second entry of the word belongs to a case that this call does not take.</w:t>
       </w:r>
     </w:p>
     <w:p>
@@ -4716,7 +4716,7 @@
                 <w:b w:val="0"/>
                 <w:sz w:val="20"/>
               </w:rPr>
-              <w:t>Eighteen levels, nine magnitudes with both signs</w:t>
+              <w:t>Mapper frames of 24 bits, scrambled ones, 32000 bit/s</w:t>
             </w:r>
           </w:p>
         </w:tc>
@@ -20546,7 +20546,7 @@
         <w:rPr>
           <w:sz w:val="20"/>
         </w:rPr>
-        <w:t>The server training script is decoded by tools/decode_server_script.py with artifacts/x2-server-script-20261004/script.json. The server post-marker signal is analysed by tools/analyze_server_training.py with artifacts/x2-server-training-20261004/analysis.json. The Courier post-marker signal is analysed by tools/analyze_v34_training.py with artifacts/x2-courier-phase3-20261004/analysis.json. The pre-gate bearer sequence is analysed by tools/analyze_bearer_handshake.py with artifacts/x2-pre-gate-20261004/analysis.json. The impairment test is tools/x2_source_impairment.py with artifacts/x2-source-impairment-20261004/verification.json. The marker receiver is documented at the end of docs/x2-v90-protocol-selection.md; tools/verify_x2_marker_receiver.py runs the original QF060003 parse from 97B5 and writes artifacts/x2-marker-receiver-20261004/verification.json. The arming site is 9791; the IM020104 counterpart is 948A.</w:t>
+        <w:t>The last server training stretch is decoded by tools/decode_server_training_e.py with artifacts/x2-server-training-e-20261004/analysis.json. The server training script is decoded by tools/decode_server_script.py with artifacts/x2-server-script-20261004/script.json. The server post-marker signal is analysed by tools/analyze_server_training.py with artifacts/x2-server-training-20261004/analysis.json. The Courier post-marker signal is analysed by tools/analyze_v34_training.py with artifacts/x2-courier-phase3-20261004/analysis.json. The pre-gate bearer sequence is analysed by tools/analyze_bearer_handshake.py with artifacts/x2-pre-gate-20261004/analysis.json. The impairment test is tools/x2_source_impairment.py with artifacts/x2-source-impairment-20261004/verification.json. The marker receiver is documented at the end of docs/x2-v90-protocol-selection.md; tools/verify_x2_marker_receiver.py runs the original QF060003 parse from 97B5 and writes artifacts/x2-marker-receiver-20261004/verification.json. The arming site is 9791; the IM020104 counterpart is 948A.</w:t>
       </w:r>
     </w:p>
     <w:p>
@@ -20583,7 +20583,7 @@
         <w:rPr>
           <w:sz w:val="20"/>
         </w:rPr>
-        <w:t>Draft 0.30 decodes the generation rule of the first server training pattern. Draft 0.29 reads the level table behind the last training stretch and corrects its alphabet. Draft 0.28 reads the server training script from the firmware. Draft 0.27 segments the server downstream training signal and decodes its scrambled-ones stretches. Draft 0.26 decodes the Courier start-up signal after the marker as V.34 Phase 3 at the announced rate. Draft 0.25 maps the asymmetric call bearer sequence and decodes the marker frame from the line. Draft 0.24 decodes the bearer sequence before the INFO0 gate. Draft 0.23 tests multi-phase errors. Draft 0.22 sweeps all six phases of the impairment test. Draft 0.21 reproduces the 56000 decision with a controlled low-bit impairment of the startup source. Draft 0.20 decodes the data-mode hook families and the rate decision after the capability exchange. Draft 0.19 decodes the in-band capability frame. Draft 0.18 decodes the receiver mismatch handling. Draft 0.17 decodes the startup source receiver that ends the wait. Draft 0.16 decodes the originating-end idle stub and the wait that ends it. Draft 0.15 traces the symmetric startup branch. Draft 0.14 specifies the server peer-role test on the exchanged INFO0 words. Draft 0.13 traces the server after marker acceptance. Draft 0.12 identifies the server receiver for the seven-bit marker and verifies its field parse. Draft 0.11 resolves the 3453C capability route: the transmitted INFO0 word is the plain tag 51 word and the tag 70 word is never read. Draft 0.10 adds pre-V.90 and later client rate selection, position grouping, variable-length body construction and original serialization. It distinguishes the host diagnostic report from peer records and records the XC timing correction and successful symmetric regression. Draft 0.9 executes the four-word PCM record receiver through CRC acceptance, rate-mask selection, bank construction, mapped output and later payload-source activation. The client measurement-to-record producer and complete call-state selection remain open. Draft 0.8 verified 57333 profiles and corrected builder product scaling to SPM 1. Draft 0.7 confirmed active GPC scrambling and pre-data resets in the symmetric 64000 pair. Analogue client decoding, alternate companding output and complete peer negotiation remain open.</w:t>
+        <w:t>Draft 0.31 decodes the last server training stretch with the payload mapper and explains the repeated word and the script restart. Draft 0.30 decodes the generation rule of the first server training pattern. Draft 0.29 reads the level table behind the last training stretch and corrects its alphabet. Draft 0.28 reads the server training script from the firmware. Draft 0.27 segments the server downstream training signal and decodes its scrambled-ones stretches. Draft 0.26 decodes the Courier start-up signal after the marker as V.34 Phase 3 at the announced rate. Draft 0.25 maps the asymmetric call bearer sequence and decodes the marker frame from the line. Draft 0.24 decodes the bearer sequence before the INFO0 gate. Draft 0.23 tests multi-phase errors. Draft 0.22 sweeps all six phases of the impairment test. Draft 0.21 reproduces the 56000 decision with a controlled low-bit impairment of the startup source. Draft 0.20 decodes the data-mode hook families and the rate decision after the capability exchange. Draft 0.19 decodes the in-band capability frame. Draft 0.18 decodes the receiver mismatch handling. Draft 0.17 decodes the startup source receiver that ends the wait. Draft 0.16 decodes the originating-end idle stub and the wait that ends it. Draft 0.15 traces the symmetric startup branch. Draft 0.14 specifies the server peer-role test on the exchanged INFO0 words. Draft 0.13 traces the server after marker acceptance. Draft 0.12 identifies the server receiver for the seven-bit marker and verifies its field parse. Draft 0.11 resolves the 3453C capability route: the transmitted INFO0 word is the plain tag 51 word and the tag 70 word is never read. Draft 0.10 adds pre-V.90 and later client rate selection, position grouping, variable-length body construction and original serialization. It distinguishes the host diagnostic report from peer records and records the XC timing correction and successful symmetric regression. Draft 0.9 executes the four-word PCM record receiver through CRC acceptance, rate-mask selection, bank construction, mapped output and later payload-source activation. The client measurement-to-record producer and complete call-state selection remain open. Draft 0.8 verified 57333 profiles and corrected builder product scaling to SPM 1. Draft 0.7 confirmed active GPC scrambling and pre-data resets in the symmetric 64000 pair. Analogue client decoding, alternate companding output and complete peer negotiation remain open.</w:t>
       </w:r>
     </w:p>
     <w:p>
@@ -20722,7 +20722,7 @@
       <w:rPr>
         <w:sz w:val="18"/>
       </w:rPr>
-      <w:t>COURIER EMU     x2 firmware reconstruction     Draft 0.30</w:t>
+      <w:t>COURIER EMU     x2 firmware reconstruction     Draft 0.31</w:t>
     </w:r>
   </w:p>
 </w:hdr>

</xml_diff>

<commit_message>
Document Courier MP fields and explain asymmetric rate reporting
</commit_message>
<xml_diff>
--- a/artifacts/x2-spec-20261004/x2-technical-specification.docx
+++ b/artifacts/x2-spec-20261004/x2-technical-specification.docx
@@ -20,7 +20,7 @@
     </w:p>
     <w:p>
       <w:r>
-        <w:t>Draft 0.31   •   Independent firmware reconstruction   •   4 October 2026</w:t>
+        <w:t>Draft 0.33   •   Independent firmware reconstruction   •   5 October 2026</w:t>
       </w:r>
     </w:p>
     <w:p>
@@ -33,7 +33,7 @@
     </w:p>
     <w:p>
       <w:r>
-        <w:t>This document explains x2 negotiation and data mapping for asymmetric and symmetric operation. It covers the Courier 3453C analogue client, original I-modem server and later Quad mapper evidence. Clauses 12 to 14 describe symmetric operation and the successful digital pair. Clauses 15 to 17 cover the rate ladder, lower-rate mapping and scrambling. Clause 18 verifies the PCM record consumer, rate selector and later source handoff. Clauses 19 and 20 reconstruct client rate selection, position grouping and variable-length record serialization in pre-V.90 and later firmware.</w:t>
+        <w:t>This document reconstructs x2 negotiation and data mapping from Courier client, I-modem server and Quad firmware. Clauses 12 to 17 cover symmetric operation, rates and scrambling. Clauses 18 to 20 reconstruct server record consumption and client record construction. Clauses 21 and 22 trace the Courier MP, threshold selection and DSP-to-supervisor path producing the asymmetric 53333/33333 results.</w:t>
       </w:r>
     </w:p>
     <w:p>
@@ -6231,7 +6231,7 @@
     <w:p/>
     <w:p>
       <w:r>
-        <w:t>The first two values announce the same asymmetric pair with its directions exchanged. The latter two name equal ordinary V.34 indices and differ only in carrier choice; they are not proof of a PCM connection in both directions. These values come from the inspected Courier announcement builders; they have not been established as a complete set of every possible x2 peer message.</w:t>
+        <w:t>The first two values exchange the directions of the same asymmetric pair. The latter two name ordinary V.34 index four and do not establish symmetric PCM operation. These inspected Courier values are not an exhaustive set of peer messages.</w:t>
       </w:r>
     </w:p>
     <w:p>
@@ -18512,6 +18512,1043 @@
         <w:spacing w:before="0"/>
       </w:pPr>
       <w:r>
+        <w:t>21 Courier MP fields and the asymmetric rate result</w:t>
+      </w:r>
+    </w:p>
+    <w:p>
+      <w:pPr>
+        <w:pStyle w:val="Heading2"/>
+      </w:pPr>
+      <w:r>
+        <w:t>21 1 The four word MP</w:t>
+      </w:r>
+    </w:p>
+    <w:p>
+      <w:r>
+        <w:t>The captured Courier 403 call sends a four-word MP body 0344 03FE 0000 0500, in hexadecimal. The frame comprises seventeen ones, a zero, four sixteen-bit words each followed by zero, sixteen CRC bits and two trailing zeros: 104 bits. The words and CRC are sent least significant bit first. Reflected polynomial 8408, initial value FFFF, data bits only and no final XOR give CRC 14AD, which matches the line decoding. Earlier interpretation as a three-word standard MP with a failing CRC is superseded.</w:t>
+      </w:r>
+    </w:p>
+    <w:p>
+      <w:r>
+        <w:t>The native packer combines N1 in bits 2 through 5 of the first word and N2 in bits 6 through 9. N1 is the smaller of the requested input and the highest allowed mask position. The call first computes and retains local rate index twelve, then forces the packing input to one. The allowed mask ceiling is fifteen, so N1 becomes one. N2 is thirteen, the highest set bit of the original 1FFE symbol-rate mask. A subsequent write reduces that mask to 03FE without rebuilding N2; this explains the apparent mismatch between N2 and the transmitted mask. The acknowledgement later changes the first word to 8344.</w:t>
+      </w:r>
+    </w:p>
+    <w:p>
+      <w:r>
+        <w:t>The fourth word takes its high byte from the additive parameter at 0364 and preserves its previous low byte. The live trace shows an earlier clear followed by 0500 in both packer calls: high byte five, low byte zero. The general meaning of the low byte in other modes remains open. Execution of the original field packer verifies 1536 controlled cases, including empty and sparse masks and low-byte preservation.</w:t>
+      </w:r>
+    </w:p>
+    <w:p>
+      <w:pPr>
+        <w:pStyle w:val="Heading2"/>
+      </w:pPr>
+      <w:r>
+        <w:t>21 2 The additive count and its rate interpretation</w:t>
+      </w:r>
+    </w:p>
+    <w:p>
+      <w:r>
+        <w:t>In the separate variable-length client path, the selected mask index N is converted to an intermediate count N minus the additive parameter plus twenty. A header consumer makes the same conversion, and the original bit consumer adds that parameter back. With parameter five, the intermediate count is N plus fifteen and the consumed total is N plus twenty. A return-only per-bit callback verifies the original consumer in 216 contexts; intermediate count thirty-five and parameter five produce forty bit callbacks. In the six-sample allocation model, index twenty therefore gives forty bits per six samples, or nominal 53333 bit/s. Assigning the additive five bits specifically to independent signs still requires the downstream receiver connection.</w:t>
+      </w:r>
+    </w:p>
+    <w:p>
+      <w:pPr>
+        <w:pStyle w:val="Heading2"/>
+      </w:pPr>
+      <w:r>
+        <w:t>21 3 The receive flag and the reported result</w:t>
+      </w:r>
+    </w:p>
+    <w:p>
+      <w:r>
+        <w:t>The live Courier flag trace identifies the bit-nine setter at F8CB. Its receive check requires no timer failure, the framing state to be zero, matching recovered words and the value 09B0. It sets bit nine and then bit eleven before the MP is built. Thus the server repeated-word recognition explains the four-bit-per-symbol branch used on the second pass through the Courier training initializer.</w:t>
+      </w:r>
+    </w:p>
+    <w:p>
+      <w:r>
+        <w:t>The known variable-length client selector, header writer and serializer preparation never execute in the retained DSP core of the capped calls. Their execution counters are zero, a separately enabled selector instruction trace is empty, and the watched MP buffer has no later record construction after acknowledgement. The Courier retains local rate index twelve, reports that index to the host and prints CONNECT 53333; the I-modem prints CONNECT 33333. These observations do not establish a later variable-length exchange as the cause of 53333. Clause 22 now establishes the Courier result formatter chain and the live I-modem MP-to-rate selector. Complete receiver state and measured usable payload throughput remain open. The Quad consumer of clause 18 is a separate component test.</w:t>
+      </w:r>
+    </w:p>
+    <w:p>
+      <w:pPr>
+        <w:pStyle w:val="Heading1"/>
+        <w:pageBreakBefore/>
+        <w:spacing w:before="0"/>
+      </w:pPr>
+      <w:r>
+        <w:t>22 DSP and supervisor reported-rate chain</w:t>
+      </w:r>
+    </w:p>
+    <w:p>
+      <w:pPr>
+        <w:pStyle w:val="Heading2"/>
+      </w:pPr>
+      <w:r>
+        <w:t>22 1 Why the Courier retains index twelve</w:t>
+      </w:r>
+    </w:p>
+    <w:p>
+      <w:r>
+        <w:t>The first threshold call receives hexadecimal 4220. The caller loads 4020 and adds 0200. The optional FFF4 bit-twelve correction is inactive; the signed FFFB adjustment is FF00, or minus 256. With mode bit seven clear, the routine subtracts another 0200, producing 3F20. These are fixed-point firmware values; physical measurement units are not assigned here.</w:t>
+      </w:r>
+    </w:p>
+    <w:p>
+      <w:r>
+        <w:t>The descending fifteen-entry search tests 4680, 4100, 40C0 and then 3EC0. The last is the first threshold no greater than 3F20, giving one-based index twelve. Threshold twelve is 3EC0 and threshold thirteen is 40C0. The original routine passes forty-six threshold cases, including equality, both adjacent values and duplicate thresholds. Later training invocations can return other indices but do not replace the first saved local result in these calls.</w:t>
+      </w:r>
+    </w:p>
+    <w:p>
+      <w:pPr>
+        <w:pStyle w:val="Heading2"/>
+      </w:pPr>
+      <w:r>
+        <w:t>22 2 The rate report and CONNECT selection</w:t>
+      </w:r>
+    </w:p>
+    <w:p>
+      <w:pPr>
+        <w:pStyle w:val="Caption"/>
+      </w:pPr>
+      <w:r>
+        <w:t>Table 22 — Courier rate-result handoff</w:t>
+      </w:r>
+    </w:p>
+    <w:tbl>
+      <w:tblPr>
+        <w:tblW w:type="auto" w:w="0"/>
+        <w:jc w:val="center"/>
+        <w:tblLayout w:type="fixed"/>
+        <w:tblLook w:firstColumn="1" w:firstRow="1" w:lastColumn="0" w:lastRow="0" w:noHBand="0" w:noVBand="1" w:val="04A0"/>
+      </w:tblPr>
+      <w:tblGrid>
+        <w:gridCol w:w="2041"/>
+        <w:gridCol w:w="7370"/>
+      </w:tblGrid>
+      <w:tr>
+        <w:trPr>
+          <w:tblHeader/>
+          <w:cantSplit/>
+        </w:trPr>
+        <w:tc>
+          <w:tcPr>
+            <w:tcW w:type="dxa" w:w="2041"/>
+            <w:vAlign w:val="center"/>
+            <w:tcBorders>
+              <w:top w:val="single" w:sz="4" w:color="D9D9D9"/>
+              <w:left w:val="single" w:sz="4" w:color="D9D9D9"/>
+              <w:bottom w:val="single" w:sz="4" w:color="D9D9D9"/>
+              <w:right w:val="single" w:sz="4" w:color="D9D9D9"/>
+            </w:tcBorders>
+            <w:shd w:fill="E7E7E7"/>
+            <w:tcMar>
+              <w:top w:w="85" w:type="dxa"/>
+              <w:left w:w="85" w:type="dxa"/>
+              <w:bottom w:w="85" w:type="dxa"/>
+              <w:right w:w="85" w:type="dxa"/>
+            </w:tcMar>
+          </w:tcPr>
+          <w:p>
+            <w:pPr>
+              <w:spacing w:after="20" w:line="240" w:lineRule="auto"/>
+            </w:pPr>
+            <w:r>
+              <w:rPr>
+                <w:b/>
+                <w:sz w:val="20"/>
+              </w:rPr>
+              <w:t>Stage</w:t>
+            </w:r>
+          </w:p>
+        </w:tc>
+        <w:tc>
+          <w:tcPr>
+            <w:tcW w:type="dxa" w:w="7370"/>
+            <w:vAlign w:val="center"/>
+            <w:tcBorders>
+              <w:top w:val="single" w:sz="4" w:color="D9D9D9"/>
+              <w:left w:val="single" w:sz="4" w:color="D9D9D9"/>
+              <w:bottom w:val="single" w:sz="4" w:color="D9D9D9"/>
+              <w:right w:val="single" w:sz="4" w:color="D9D9D9"/>
+            </w:tcBorders>
+            <w:shd w:fill="E7E7E7"/>
+            <w:tcMar>
+              <w:top w:w="85" w:type="dxa"/>
+              <w:left w:w="85" w:type="dxa"/>
+              <w:bottom w:w="85" w:type="dxa"/>
+              <w:right w:w="85" w:type="dxa"/>
+            </w:tcMar>
+          </w:tcPr>
+          <w:p>
+            <w:pPr>
+              <w:spacing w:after="20" w:line="240" w:lineRule="auto"/>
+            </w:pPr>
+            <w:r>
+              <w:rPr>
+                <w:b/>
+                <w:sz w:val="20"/>
+              </w:rPr>
+              <w:t>Firmware effect in the observed call</w:t>
+            </w:r>
+          </w:p>
+        </w:tc>
+      </w:tr>
+      <w:tr>
+        <w:trPr>
+          <w:cantSplit/>
+        </w:trPr>
+        <w:tc>
+          <w:tcPr>
+            <w:tcW w:type="dxa" w:w="2041"/>
+            <w:vAlign w:val="center"/>
+            <w:tcBorders>
+              <w:top w:val="single" w:sz="4" w:color="D9D9D9"/>
+              <w:left w:val="single" w:sz="4" w:color="D9D9D9"/>
+              <w:bottom w:val="single" w:sz="4" w:color="D9D9D9"/>
+              <w:right w:val="single" w:sz="4" w:color="D9D9D9"/>
+            </w:tcBorders>
+            <w:tcMar>
+              <w:top w:w="85" w:type="dxa"/>
+              <w:left w:w="85" w:type="dxa"/>
+              <w:bottom w:w="85" w:type="dxa"/>
+              <w:right w:w="85" w:type="dxa"/>
+            </w:tcMar>
+          </w:tcPr>
+          <w:p>
+            <w:pPr>
+              <w:spacing w:after="20" w:line="240" w:lineRule="auto"/>
+            </w:pPr>
+            <w:r>
+              <w:rPr>
+                <w:b w:val="0"/>
+                <w:sz w:val="20"/>
+              </w:rPr>
+              <w:t>Local retention</w:t>
+            </w:r>
+          </w:p>
+        </w:tc>
+        <w:tc>
+          <w:tcPr>
+            <w:tcW w:type="dxa" w:w="7370"/>
+            <w:vAlign w:val="center"/>
+            <w:tcBorders>
+              <w:top w:val="single" w:sz="4" w:color="D9D9D9"/>
+              <w:left w:val="single" w:sz="4" w:color="D9D9D9"/>
+              <w:bottom w:val="single" w:sz="4" w:color="D9D9D9"/>
+              <w:right w:val="single" w:sz="4" w:color="D9D9D9"/>
+            </w:tcBorders>
+            <w:tcMar>
+              <w:top w:w="85" w:type="dxa"/>
+              <w:left w:w="85" w:type="dxa"/>
+              <w:bottom w:w="85" w:type="dxa"/>
+              <w:right w:w="85" w:type="dxa"/>
+            </w:tcMar>
+          </w:tcPr>
+          <w:p>
+            <w:pPr>
+              <w:spacing w:after="20" w:line="240" w:lineRule="auto"/>
+            </w:pPr>
+            <w:r>
+              <w:rPr>
+                <w:b w:val="0"/>
+                <w:sz w:val="20"/>
+              </w:rPr>
+              <w:t>F874 stores index twelve at DSP cell 031C.</w:t>
+            </w:r>
+          </w:p>
+        </w:tc>
+      </w:tr>
+      <w:tr>
+        <w:trPr>
+          <w:cantSplit/>
+        </w:trPr>
+        <w:tc>
+          <w:tcPr>
+            <w:tcW w:type="dxa" w:w="2041"/>
+            <w:vAlign w:val="center"/>
+            <w:tcBorders>
+              <w:top w:val="single" w:sz="4" w:color="D9D9D9"/>
+              <w:left w:val="single" w:sz="4" w:color="D9D9D9"/>
+              <w:bottom w:val="single" w:sz="4" w:color="D9D9D9"/>
+              <w:right w:val="single" w:sz="4" w:color="D9D9D9"/>
+            </w:tcBorders>
+            <w:tcMar>
+              <w:top w:w="85" w:type="dxa"/>
+              <w:left w:w="85" w:type="dxa"/>
+              <w:bottom w:w="85" w:type="dxa"/>
+              <w:right w:w="85" w:type="dxa"/>
+            </w:tcMar>
+          </w:tcPr>
+          <w:p>
+            <w:pPr>
+              <w:spacing w:after="20" w:line="240" w:lineRule="auto"/>
+            </w:pPr>
+            <w:r>
+              <w:rPr>
+                <w:b w:val="0"/>
+                <w:sz w:val="20"/>
+              </w:rPr>
+              <w:t>Peer-facing MP</w:t>
+            </w:r>
+          </w:p>
+        </w:tc>
+        <w:tc>
+          <w:tcPr>
+            <w:tcW w:type="dxa" w:w="7370"/>
+            <w:vAlign w:val="center"/>
+            <w:tcBorders>
+              <w:top w:val="single" w:sz="4" w:color="D9D9D9"/>
+              <w:left w:val="single" w:sz="4" w:color="D9D9D9"/>
+              <w:bottom w:val="single" w:sz="4" w:color="D9D9D9"/>
+              <w:right w:val="single" w:sz="4" w:color="D9D9D9"/>
+            </w:tcBorders>
+            <w:tcMar>
+              <w:top w:w="85" w:type="dxa"/>
+              <w:left w:w="85" w:type="dxa"/>
+              <w:bottom w:w="85" w:type="dxa"/>
+              <w:right w:w="85" w:type="dxa"/>
+            </w:tcMar>
+          </w:tcPr>
+          <w:p>
+            <w:pPr>
+              <w:spacing w:after="20" w:line="240" w:lineRule="auto"/>
+            </w:pPr>
+            <w:r>
+              <w:rPr>
+                <w:b w:val="0"/>
+                <w:sz w:val="20"/>
+              </w:rPr>
+              <w:t>F875 delay slots force the MP packing input to one; the saved index remains twelve.</w:t>
+            </w:r>
+          </w:p>
+        </w:tc>
+      </w:tr>
+      <w:tr>
+        <w:trPr>
+          <w:cantSplit/>
+        </w:trPr>
+        <w:tc>
+          <w:tcPr>
+            <w:tcW w:type="dxa" w:w="2041"/>
+            <w:vAlign w:val="center"/>
+            <w:tcBorders>
+              <w:top w:val="single" w:sz="4" w:color="D9D9D9"/>
+              <w:left w:val="single" w:sz="4" w:color="D9D9D9"/>
+              <w:bottom w:val="single" w:sz="4" w:color="D9D9D9"/>
+              <w:right w:val="single" w:sz="4" w:color="D9D9D9"/>
+            </w:tcBorders>
+            <w:tcMar>
+              <w:top w:w="85" w:type="dxa"/>
+              <w:left w:w="85" w:type="dxa"/>
+              <w:bottom w:w="85" w:type="dxa"/>
+              <w:right w:w="85" w:type="dxa"/>
+            </w:tcMar>
+          </w:tcPr>
+          <w:p>
+            <w:pPr>
+              <w:spacing w:after="20" w:line="240" w:lineRule="auto"/>
+            </w:pPr>
+            <w:r>
+              <w:rPr>
+                <w:b w:val="0"/>
+                <w:sz w:val="20"/>
+              </w:rPr>
+              <w:t>Report tag</w:t>
+            </w:r>
+          </w:p>
+        </w:tc>
+        <w:tc>
+          <w:tcPr>
+            <w:tcW w:type="dxa" w:w="7370"/>
+            <w:vAlign w:val="center"/>
+            <w:tcBorders>
+              <w:top w:val="single" w:sz="4" w:color="D9D9D9"/>
+              <w:left w:val="single" w:sz="4" w:color="D9D9D9"/>
+              <w:bottom w:val="single" w:sz="4" w:color="D9D9D9"/>
+              <w:right w:val="single" w:sz="4" w:color="D9D9D9"/>
+            </w:tcBorders>
+            <w:tcMar>
+              <w:top w:w="85" w:type="dxa"/>
+              <w:left w:w="85" w:type="dxa"/>
+              <w:bottom w:w="85" w:type="dxa"/>
+              <w:right w:w="85" w:type="dxa"/>
+            </w:tcMar>
+          </w:tcPr>
+          <w:p>
+            <w:pPr>
+              <w:spacing w:after="20" w:line="240" w:lineRule="auto"/>
+            </w:pPr>
+            <w:r>
+              <w:rPr>
+                <w:b w:val="0"/>
+                <w:sz w:val="20"/>
+              </w:rPr>
+              <w:t>E20A queues tag 806A through the original mailbox sender.</w:t>
+            </w:r>
+          </w:p>
+        </w:tc>
+      </w:tr>
+      <w:tr>
+        <w:trPr>
+          <w:cantSplit/>
+        </w:trPr>
+        <w:tc>
+          <w:tcPr>
+            <w:tcW w:type="dxa" w:w="2041"/>
+            <w:vAlign w:val="center"/>
+            <w:tcBorders>
+              <w:top w:val="single" w:sz="4" w:color="D9D9D9"/>
+              <w:left w:val="single" w:sz="4" w:color="D9D9D9"/>
+              <w:bottom w:val="single" w:sz="4" w:color="D9D9D9"/>
+              <w:right w:val="single" w:sz="4" w:color="D9D9D9"/>
+            </w:tcBorders>
+            <w:tcMar>
+              <w:top w:w="85" w:type="dxa"/>
+              <w:left w:w="85" w:type="dxa"/>
+              <w:bottom w:w="85" w:type="dxa"/>
+              <w:right w:w="85" w:type="dxa"/>
+            </w:tcMar>
+          </w:tcPr>
+          <w:p>
+            <w:pPr>
+              <w:spacing w:after="20" w:line="240" w:lineRule="auto"/>
+            </w:pPr>
+            <w:r>
+              <w:rPr>
+                <w:b w:val="0"/>
+                <w:sz w:val="20"/>
+              </w:rPr>
+              <w:t>Report argument</w:t>
+            </w:r>
+          </w:p>
+        </w:tc>
+        <w:tc>
+          <w:tcPr>
+            <w:tcW w:type="dxa" w:w="7370"/>
+            <w:vAlign w:val="center"/>
+            <w:tcBorders>
+              <w:top w:val="single" w:sz="4" w:color="D9D9D9"/>
+              <w:left w:val="single" w:sz="4" w:color="D9D9D9"/>
+              <w:bottom w:val="single" w:sz="4" w:color="D9D9D9"/>
+              <w:right w:val="single" w:sz="4" w:color="D9D9D9"/>
+            </w:tcBorders>
+            <w:tcMar>
+              <w:top w:w="85" w:type="dxa"/>
+              <w:left w:w="85" w:type="dxa"/>
+              <w:bottom w:w="85" w:type="dxa"/>
+              <w:right w:w="85" w:type="dxa"/>
+            </w:tcMar>
+          </w:tcPr>
+          <w:p>
+            <w:pPr>
+              <w:spacing w:after="20" w:line="240" w:lineRule="auto"/>
+            </w:pPr>
+            <w:r>
+              <w:rPr>
+                <w:b w:val="0"/>
+                <w:sz w:val="20"/>
+              </w:rPr>
+              <w:t>E19C resolves the other direction to ten. E1A3 through E1AC form 0A0C using the saved local index as the low byte.</w:t>
+            </w:r>
+          </w:p>
+        </w:tc>
+      </w:tr>
+      <w:tr>
+        <w:trPr>
+          <w:cantSplit/>
+        </w:trPr>
+        <w:tc>
+          <w:tcPr>
+            <w:tcW w:type="dxa" w:w="2041"/>
+            <w:vAlign w:val="center"/>
+            <w:tcBorders>
+              <w:top w:val="single" w:sz="4" w:color="D9D9D9"/>
+              <w:left w:val="single" w:sz="4" w:color="D9D9D9"/>
+              <w:bottom w:val="single" w:sz="4" w:color="D9D9D9"/>
+              <w:right w:val="single" w:sz="4" w:color="D9D9D9"/>
+            </w:tcBorders>
+            <w:tcMar>
+              <w:top w:w="85" w:type="dxa"/>
+              <w:left w:w="85" w:type="dxa"/>
+              <w:bottom w:w="85" w:type="dxa"/>
+              <w:right w:w="85" w:type="dxa"/>
+            </w:tcMar>
+          </w:tcPr>
+          <w:p>
+            <w:pPr>
+              <w:spacing w:after="20" w:line="240" w:lineRule="auto"/>
+            </w:pPr>
+            <w:r>
+              <w:rPr>
+                <w:b w:val="0"/>
+                <w:sz w:val="20"/>
+              </w:rPr>
+              <w:t>Supervisor receipt</w:t>
+            </w:r>
+          </w:p>
+        </w:tc>
+        <w:tc>
+          <w:tcPr>
+            <w:tcW w:type="dxa" w:w="7370"/>
+            <w:vAlign w:val="center"/>
+            <w:tcBorders>
+              <w:top w:val="single" w:sz="4" w:color="D9D9D9"/>
+              <w:left w:val="single" w:sz="4" w:color="D9D9D9"/>
+              <w:bottom w:val="single" w:sz="4" w:color="D9D9D9"/>
+              <w:right w:val="single" w:sz="4" w:color="D9D9D9"/>
+            </w:tcBorders>
+            <w:tcMar>
+              <w:top w:w="85" w:type="dxa"/>
+              <w:left w:w="85" w:type="dxa"/>
+              <w:bottom w:w="85" w:type="dxa"/>
+              <w:right w:w="85" w:type="dxa"/>
+            </w:tcMar>
+          </w:tcPr>
+          <w:p>
+            <w:pPr>
+              <w:spacing w:after="20" w:line="240" w:lineRule="auto"/>
+            </w:pPr>
+            <w:r>
+              <w:rPr>
+                <w:b w:val="0"/>
+                <w:sz w:val="20"/>
+              </w:rPr>
+              <w:t>Tag-6A handler 93CD9 calls 94399. It masks the low byte with 001F and stores twelve at 0A19, 0A27 and 0A17.</w:t>
+            </w:r>
+          </w:p>
+        </w:tc>
+      </w:tr>
+      <w:tr>
+        <w:trPr>
+          <w:cantSplit/>
+        </w:trPr>
+        <w:tc>
+          <w:tcPr>
+            <w:tcW w:type="dxa" w:w="2041"/>
+            <w:vAlign w:val="center"/>
+            <w:tcBorders>
+              <w:top w:val="single" w:sz="4" w:color="D9D9D9"/>
+              <w:left w:val="single" w:sz="4" w:color="D9D9D9"/>
+              <w:bottom w:val="single" w:sz="4" w:color="D9D9D9"/>
+              <w:right w:val="single" w:sz="4" w:color="D9D9D9"/>
+            </w:tcBorders>
+            <w:tcMar>
+              <w:top w:w="85" w:type="dxa"/>
+              <w:left w:w="85" w:type="dxa"/>
+              <w:bottom w:w="85" w:type="dxa"/>
+              <w:right w:w="85" w:type="dxa"/>
+            </w:tcMar>
+          </w:tcPr>
+          <w:p>
+            <w:pPr>
+              <w:spacing w:after="20" w:line="240" w:lineRule="auto"/>
+            </w:pPr>
+            <w:r>
+              <w:rPr>
+                <w:b w:val="0"/>
+                <w:sz w:val="20"/>
+              </w:rPr>
+              <w:t>Result selection</w:t>
+            </w:r>
+          </w:p>
+        </w:tc>
+        <w:tc>
+          <w:tcPr>
+            <w:tcW w:type="dxa" w:w="7370"/>
+            <w:vAlign w:val="center"/>
+            <w:tcBorders>
+              <w:top w:val="single" w:sz="4" w:color="D9D9D9"/>
+              <w:left w:val="single" w:sz="4" w:color="D9D9D9"/>
+              <w:bottom w:val="single" w:sz="4" w:color="D9D9D9"/>
+              <w:right w:val="single" w:sz="4" w:color="D9D9D9"/>
+            </w:tcBorders>
+            <w:tcMar>
+              <w:top w:w="85" w:type="dxa"/>
+              <w:left w:w="85" w:type="dxa"/>
+              <w:bottom w:w="85" w:type="dxa"/>
+              <w:right w:w="85" w:type="dxa"/>
+            </w:tcMar>
+          </w:tcPr>
+          <w:p>
+            <w:pPr>
+              <w:spacing w:after="20" w:line="240" w:lineRule="auto"/>
+            </w:pPr>
+            <w:r>
+              <w:rPr>
+                <w:b w:val="0"/>
+                <w:sz w:val="20"/>
+              </w:rPr>
+              <w:t>82FB9 takes the x2 branch. With 0A27=12 and the result/ARQ flags, it selects enum E3.</w:t>
+            </w:r>
+          </w:p>
+        </w:tc>
+      </w:tr>
+      <w:tr>
+        <w:trPr>
+          <w:cantSplit/>
+        </w:trPr>
+        <w:tc>
+          <w:tcPr>
+            <w:tcW w:type="dxa" w:w="2041"/>
+            <w:vAlign w:val="center"/>
+            <w:tcBorders>
+              <w:top w:val="single" w:sz="4" w:color="D9D9D9"/>
+              <w:left w:val="single" w:sz="4" w:color="D9D9D9"/>
+              <w:bottom w:val="single" w:sz="4" w:color="D9D9D9"/>
+              <w:right w:val="single" w:sz="4" w:color="D9D9D9"/>
+            </w:tcBorders>
+            <w:tcMar>
+              <w:top w:w="85" w:type="dxa"/>
+              <w:left w:w="85" w:type="dxa"/>
+              <w:bottom w:w="85" w:type="dxa"/>
+              <w:right w:w="85" w:type="dxa"/>
+            </w:tcMar>
+          </w:tcPr>
+          <w:p>
+            <w:pPr>
+              <w:spacing w:after="20" w:line="240" w:lineRule="auto"/>
+            </w:pPr>
+            <w:r>
+              <w:rPr>
+                <w:b w:val="0"/>
+                <w:sz w:val="20"/>
+              </w:rPr>
+              <w:t>Text output</w:t>
+            </w:r>
+          </w:p>
+        </w:tc>
+        <w:tc>
+          <w:tcPr>
+            <w:tcW w:type="dxa" w:w="7370"/>
+            <w:vAlign w:val="center"/>
+            <w:tcBorders>
+              <w:top w:val="single" w:sz="4" w:color="D9D9D9"/>
+              <w:left w:val="single" w:sz="4" w:color="D9D9D9"/>
+              <w:bottom w:val="single" w:sz="4" w:color="D9D9D9"/>
+              <w:right w:val="single" w:sz="4" w:color="D9D9D9"/>
+            </w:tcBorders>
+            <w:tcMar>
+              <w:top w:w="85" w:type="dxa"/>
+              <w:left w:w="85" w:type="dxa"/>
+              <w:bottom w:w="85" w:type="dxa"/>
+              <w:right w:w="85" w:type="dxa"/>
+            </w:tcMar>
+          </w:tcPr>
+          <w:p>
+            <w:pPr>
+              <w:spacing w:after="20" w:line="240" w:lineRule="auto"/>
+            </w:pPr>
+            <w:r>
+              <w:rPr>
+                <w:b w:val="0"/>
+                <w:sz w:val="20"/>
+              </w:rPr>
+              <w:t>The original pointer lookup selects physical 8AC78, containing 53333/ARQ/x2. C800:0044 emits the CONNECT prefix.</w:t>
+            </w:r>
+          </w:p>
+        </w:tc>
+      </w:tr>
+    </w:tbl>
+    <w:p/>
+    <w:p>
+      <w:r>
+        <w:t>The new live supervisor write trace confirms the receipt and retained value. A later disconnect reset changes 0A27 to one, so a final RAM peek alone does not identify the index used to print CONNECT. The original DSP report builder passes forty-five contexts; the original supervisor handler, selector and pointer lookup pass 150 contexts across all fifteen indices, verbosity and ARQ flags.</w:t>
+      </w:r>
+    </w:p>
+    <w:p>
+      <w:pPr>
+        <w:pStyle w:val="Heading2"/>
+        <w:pageBreakBefore/>
+      </w:pPr>
+      <w:r>
+        <w:t>22 3 The same MP on the I-modem</w:t>
+      </w:r>
+    </w:p>
+    <w:p>
+      <w:r>
+        <w:t>In the Ie030002 call, the received working MP begins 0344 03FE. The live CFF4 selector calls ABBC for direction one. Its x2 branch reads N1 from the received first word and intersects that ceiling with the local allowed mask F6D9=7FFF. N1=1 returns one. CFF8 subtracts one, CFF9 stores zero at 03A2, and CFFC selects the first amplitude-allocation entry of table D24A: nineteen. The trace then reads W4=0500 and extracts its high byte five.</w:t>
+      </w:r>
+    </w:p>
+    <w:p>
+      <w:r>
+        <w:t>This selector and table belong to Ie030002 image six, loaded at A000. They are not the overlapping image-eleven/image-ten profile. Original execution verifies all fifteen N1 ceilings with the full local mask. The live I-modem terminal reports CONNECT 33333/ARQ/x2/LAPM/V42BIS while the Courier reports CONNECT 53333 with the same suffix.</w:t>
+      </w:r>
+    </w:p>
+    <w:p>
+      <w:pPr>
+        <w:pStyle w:val="Caption"/>
+      </w:pPr>
+      <w:r>
+        <w:t>Table 23 — One-based x2 displayed-rate indices</w:t>
+      </w:r>
+    </w:p>
+    <w:tbl>
+      <w:tblPr>
+        <w:tblW w:type="auto" w:w="0"/>
+        <w:jc w:val="center"/>
+        <w:tblLayout w:type="fixed"/>
+        <w:tblLook w:firstColumn="1" w:firstRow="1" w:lastColumn="0" w:lastRow="0" w:noHBand="0" w:noVBand="1" w:val="04A0"/>
+      </w:tblPr>
+      <w:tblGrid>
+        <w:gridCol w:w="2041"/>
+        <w:gridCol w:w="7370"/>
+      </w:tblGrid>
+      <w:tr>
+        <w:trPr>
+          <w:tblHeader/>
+          <w:cantSplit/>
+        </w:trPr>
+        <w:tc>
+          <w:tcPr>
+            <w:tcW w:type="dxa" w:w="2041"/>
+            <w:vAlign w:val="center"/>
+            <w:tcBorders>
+              <w:top w:val="single" w:sz="4" w:color="D9D9D9"/>
+              <w:left w:val="single" w:sz="4" w:color="D9D9D9"/>
+              <w:bottom w:val="single" w:sz="4" w:color="D9D9D9"/>
+              <w:right w:val="single" w:sz="4" w:color="D9D9D9"/>
+            </w:tcBorders>
+            <w:shd w:fill="E7E7E7"/>
+            <w:tcMar>
+              <w:top w:w="85" w:type="dxa"/>
+              <w:left w:w="85" w:type="dxa"/>
+              <w:bottom w:w="85" w:type="dxa"/>
+              <w:right w:w="85" w:type="dxa"/>
+            </w:tcMar>
+          </w:tcPr>
+          <w:p>
+            <w:pPr>
+              <w:spacing w:after="20" w:line="240" w:lineRule="auto"/>
+            </w:pPr>
+            <w:r>
+              <w:rPr>
+                <w:b/>
+                <w:sz w:val="20"/>
+              </w:rPr>
+              <w:t>Index</w:t>
+            </w:r>
+          </w:p>
+        </w:tc>
+        <w:tc>
+          <w:tcPr>
+            <w:tcW w:type="dxa" w:w="7370"/>
+            <w:vAlign w:val="center"/>
+            <w:tcBorders>
+              <w:top w:val="single" w:sz="4" w:color="D9D9D9"/>
+              <w:left w:val="single" w:sz="4" w:color="D9D9D9"/>
+              <w:bottom w:val="single" w:sz="4" w:color="D9D9D9"/>
+              <w:right w:val="single" w:sz="4" w:color="D9D9D9"/>
+            </w:tcBorders>
+            <w:shd w:fill="E7E7E7"/>
+            <w:tcMar>
+              <w:top w:w="85" w:type="dxa"/>
+              <w:left w:w="85" w:type="dxa"/>
+              <w:bottom w:w="85" w:type="dxa"/>
+              <w:right w:w="85" w:type="dxa"/>
+            </w:tcMar>
+          </w:tcPr>
+          <w:p>
+            <w:pPr>
+              <w:spacing w:after="20" w:line="240" w:lineRule="auto"/>
+            </w:pPr>
+            <w:r>
+              <w:rPr>
+                <w:b/>
+                <w:sz w:val="20"/>
+              </w:rPr>
+              <w:t>Nominal result bit/s</w:t>
+            </w:r>
+          </w:p>
+        </w:tc>
+      </w:tr>
+      <w:tr>
+        <w:trPr>
+          <w:cantSplit/>
+        </w:trPr>
+        <w:tc>
+          <w:tcPr>
+            <w:tcW w:type="dxa" w:w="2041"/>
+            <w:vAlign w:val="center"/>
+            <w:tcBorders>
+              <w:top w:val="single" w:sz="4" w:color="D9D9D9"/>
+              <w:left w:val="single" w:sz="4" w:color="D9D9D9"/>
+              <w:bottom w:val="single" w:sz="4" w:color="D9D9D9"/>
+              <w:right w:val="single" w:sz="4" w:color="D9D9D9"/>
+            </w:tcBorders>
+            <w:tcMar>
+              <w:top w:w="85" w:type="dxa"/>
+              <w:left w:w="85" w:type="dxa"/>
+              <w:bottom w:w="85" w:type="dxa"/>
+              <w:right w:w="85" w:type="dxa"/>
+            </w:tcMar>
+          </w:tcPr>
+          <w:p>
+            <w:pPr>
+              <w:spacing w:after="20" w:line="240" w:lineRule="auto"/>
+            </w:pPr>
+            <w:r>
+              <w:rPr>
+                <w:b w:val="0"/>
+                <w:sz w:val="20"/>
+              </w:rPr>
+              <w:t>1</w:t>
+            </w:r>
+          </w:p>
+        </w:tc>
+        <w:tc>
+          <w:tcPr>
+            <w:tcW w:type="dxa" w:w="7370"/>
+            <w:vAlign w:val="center"/>
+            <w:tcBorders>
+              <w:top w:val="single" w:sz="4" w:color="D9D9D9"/>
+              <w:left w:val="single" w:sz="4" w:color="D9D9D9"/>
+              <w:bottom w:val="single" w:sz="4" w:color="D9D9D9"/>
+              <w:right w:val="single" w:sz="4" w:color="D9D9D9"/>
+            </w:tcBorders>
+            <w:tcMar>
+              <w:top w:w="85" w:type="dxa"/>
+              <w:left w:w="85" w:type="dxa"/>
+              <w:bottom w:w="85" w:type="dxa"/>
+              <w:right w:w="85" w:type="dxa"/>
+            </w:tcMar>
+          </w:tcPr>
+          <w:p>
+            <w:pPr>
+              <w:spacing w:after="20" w:line="240" w:lineRule="auto"/>
+            </w:pPr>
+            <w:r>
+              <w:rPr>
+                <w:b w:val="0"/>
+                <w:sz w:val="20"/>
+              </w:rPr>
+              <w:t>33333</w:t>
+            </w:r>
+          </w:p>
+        </w:tc>
+      </w:tr>
+      <w:tr>
+        <w:trPr>
+          <w:cantSplit/>
+        </w:trPr>
+        <w:tc>
+          <w:tcPr>
+            <w:tcW w:type="dxa" w:w="2041"/>
+            <w:vAlign w:val="center"/>
+            <w:tcBorders>
+              <w:top w:val="single" w:sz="4" w:color="D9D9D9"/>
+              <w:left w:val="single" w:sz="4" w:color="D9D9D9"/>
+              <w:bottom w:val="single" w:sz="4" w:color="D9D9D9"/>
+              <w:right w:val="single" w:sz="4" w:color="D9D9D9"/>
+            </w:tcBorders>
+            <w:tcMar>
+              <w:top w:w="85" w:type="dxa"/>
+              <w:left w:w="85" w:type="dxa"/>
+              <w:bottom w:w="85" w:type="dxa"/>
+              <w:right w:w="85" w:type="dxa"/>
+            </w:tcMar>
+          </w:tcPr>
+          <w:p>
+            <w:pPr>
+              <w:spacing w:after="20" w:line="240" w:lineRule="auto"/>
+            </w:pPr>
+            <w:r>
+              <w:rPr>
+                <w:b w:val="0"/>
+                <w:sz w:val="20"/>
+              </w:rPr>
+              <w:t>2</w:t>
+            </w:r>
+          </w:p>
+        </w:tc>
+        <w:tc>
+          <w:tcPr>
+            <w:tcW w:type="dxa" w:w="7370"/>
+            <w:vAlign w:val="center"/>
+            <w:tcBorders>
+              <w:top w:val="single" w:sz="4" w:color="D9D9D9"/>
+              <w:left w:val="single" w:sz="4" w:color="D9D9D9"/>
+              <w:bottom w:val="single" w:sz="4" w:color="D9D9D9"/>
+              <w:right w:val="single" w:sz="4" w:color="D9D9D9"/>
+            </w:tcBorders>
+            <w:tcMar>
+              <w:top w:w="85" w:type="dxa"/>
+              <w:left w:w="85" w:type="dxa"/>
+              <w:bottom w:w="85" w:type="dxa"/>
+              <w:right w:w="85" w:type="dxa"/>
+            </w:tcMar>
+          </w:tcPr>
+          <w:p>
+            <w:pPr>
+              <w:spacing w:after="20" w:line="240" w:lineRule="auto"/>
+            </w:pPr>
+            <w:r>
+              <w:rPr>
+                <w:b w:val="0"/>
+                <w:sz w:val="20"/>
+              </w:rPr>
+              <w:t>37333</w:t>
+            </w:r>
+          </w:p>
+        </w:tc>
+      </w:tr>
+      <w:tr>
+        <w:trPr>
+          <w:cantSplit/>
+        </w:trPr>
+        <w:tc>
+          <w:tcPr>
+            <w:tcW w:type="dxa" w:w="2041"/>
+            <w:vAlign w:val="center"/>
+            <w:tcBorders>
+              <w:top w:val="single" w:sz="4" w:color="D9D9D9"/>
+              <w:left w:val="single" w:sz="4" w:color="D9D9D9"/>
+              <w:bottom w:val="single" w:sz="4" w:color="D9D9D9"/>
+              <w:right w:val="single" w:sz="4" w:color="D9D9D9"/>
+            </w:tcBorders>
+            <w:tcMar>
+              <w:top w:w="85" w:type="dxa"/>
+              <w:left w:w="85" w:type="dxa"/>
+              <w:bottom w:w="85" w:type="dxa"/>
+              <w:right w:w="85" w:type="dxa"/>
+            </w:tcMar>
+          </w:tcPr>
+          <w:p>
+            <w:pPr>
+              <w:spacing w:after="20" w:line="240" w:lineRule="auto"/>
+            </w:pPr>
+            <w:r>
+              <w:rPr>
+                <w:b w:val="0"/>
+                <w:sz w:val="20"/>
+              </w:rPr>
+              <w:t>3 through 15</w:t>
+            </w:r>
+          </w:p>
+        </w:tc>
+        <w:tc>
+          <w:tcPr>
+            <w:tcW w:type="dxa" w:w="7370"/>
+            <w:vAlign w:val="center"/>
+            <w:tcBorders>
+              <w:top w:val="single" w:sz="4" w:color="D9D9D9"/>
+              <w:left w:val="single" w:sz="4" w:color="D9D9D9"/>
+              <w:bottom w:val="single" w:sz="4" w:color="D9D9D9"/>
+              <w:right w:val="single" w:sz="4" w:color="D9D9D9"/>
+            </w:tcBorders>
+            <w:tcMar>
+              <w:top w:w="85" w:type="dxa"/>
+              <w:left w:w="85" w:type="dxa"/>
+              <w:bottom w:w="85" w:type="dxa"/>
+              <w:right w:w="85" w:type="dxa"/>
+            </w:tcMar>
+          </w:tcPr>
+          <w:p>
+            <w:pPr>
+              <w:spacing w:after="20" w:line="240" w:lineRule="auto"/>
+            </w:pPr>
+            <w:r>
+              <w:rPr>
+                <w:b w:val="0"/>
+                <w:sz w:val="20"/>
+              </w:rPr>
+              <w:t>Integer part of (index plus 28) times 8000 divided by six</w:t>
+            </w:r>
+          </w:p>
+        </w:tc>
+      </w:tr>
+      <w:tr>
+        <w:trPr>
+          <w:cantSplit/>
+        </w:trPr>
+        <w:tc>
+          <w:tcPr>
+            <w:tcW w:type="dxa" w:w="2041"/>
+            <w:vAlign w:val="center"/>
+            <w:tcBorders>
+              <w:top w:val="single" w:sz="4" w:color="D9D9D9"/>
+              <w:left w:val="single" w:sz="4" w:color="D9D9D9"/>
+              <w:bottom w:val="single" w:sz="4" w:color="D9D9D9"/>
+              <w:right w:val="single" w:sz="4" w:color="D9D9D9"/>
+            </w:tcBorders>
+            <w:tcMar>
+              <w:top w:w="85" w:type="dxa"/>
+              <w:left w:w="85" w:type="dxa"/>
+              <w:bottom w:w="85" w:type="dxa"/>
+              <w:right w:w="85" w:type="dxa"/>
+            </w:tcMar>
+          </w:tcPr>
+          <w:p>
+            <w:pPr>
+              <w:spacing w:after="20" w:line="240" w:lineRule="auto"/>
+            </w:pPr>
+            <w:r>
+              <w:rPr>
+                <w:b w:val="0"/>
+                <w:sz w:val="20"/>
+              </w:rPr>
+              <w:t>12</w:t>
+            </w:r>
+          </w:p>
+        </w:tc>
+        <w:tc>
+          <w:tcPr>
+            <w:tcW w:type="dxa" w:w="7370"/>
+            <w:vAlign w:val="center"/>
+            <w:tcBorders>
+              <w:top w:val="single" w:sz="4" w:color="D9D9D9"/>
+              <w:left w:val="single" w:sz="4" w:color="D9D9D9"/>
+              <w:bottom w:val="single" w:sz="4" w:color="D9D9D9"/>
+              <w:right w:val="single" w:sz="4" w:color="D9D9D9"/>
+            </w:tcBorders>
+            <w:tcMar>
+              <w:top w:w="85" w:type="dxa"/>
+              <w:left w:w="85" w:type="dxa"/>
+              <w:bottom w:w="85" w:type="dxa"/>
+              <w:right w:w="85" w:type="dxa"/>
+            </w:tcMar>
+          </w:tcPr>
+          <w:p>
+            <w:pPr>
+              <w:spacing w:after="20" w:line="240" w:lineRule="auto"/>
+            </w:pPr>
+            <w:r>
+              <w:rPr>
+                <w:b w:val="0"/>
+                <w:sz w:val="20"/>
+              </w:rPr>
+              <w:t>53333</w:t>
+            </w:r>
+          </w:p>
+        </w:tc>
+      </w:tr>
+    </w:tbl>
+    <w:p/>
+    <w:p>
+      <w:r>
+        <w:t>The I-modem bit consumer advances its source cursor by the amplitude allocation B plus the W4 high-byte count MD. The original consumer passes 210 contexts covering all fifteen amplitude entries, MD zero through six and cursor wrap. In the live selected context B=19 and MD=5 consume twenty-four source bits per invocation. The sign recurrence consumes the MD bits; the remaining signs are shaping choices. This is a local source-count result, distinct from the nominal 33333 label. Callback cadence and the complete data path are still required to establish usable throughput.</w:t>
+      </w:r>
+    </w:p>
+    <w:p>
+      <w:r>
+        <w:t>The two lowest indices are special entries. In particular, index one must not be interpreted with the linear formula for indices three through fifteen. The I-modem allocation table likewise begins nineteen, twenty-two and twenty-five, followed by twenty-six through thirty-seven.</w:t>
+      </w:r>
+    </w:p>
+    <w:p>
+      <w:r>
+        <w:t>These observations account for the asymmetric reported result: the Courier retains and displays local index twelve; the MP supplies N1=1 to the I-modem transmit selector. The known variable-length client exchange is not required to explain either CONNECT result in these calls. Full record-receiver state, the general low-byte meaning of W4, analogue payload decoding and measured usable throughput remain open.</w:t>
+      </w:r>
+    </w:p>
+    <w:p>
+      <w:r>
+        <w:t>The control path is established by live scheduling and component execution. It shall not be treated as a measurement of terminal throughput, nor as proof that the short MP alone completes every peer receiver state. The separate variable-length header index and this short-MP rate index use different conversions.</w:t>
+      </w:r>
+    </w:p>
+    <w:p>
+      <w:pPr>
+        <w:pStyle w:val="Heading1"/>
+        <w:pageBreakBefore/>
+        <w:spacing w:before="0"/>
+      </w:pPr>
+      <w:r>
         <w:t>Annex A Firmware evidence and reproduction</w:t>
       </w:r>
     </w:p>
@@ -19730,6 +20767,196 @@
                 <w:sz w:val="20"/>
               </w:rPr>
               <w:t>Two original client versions; host report</w:t>
+            </w:r>
+          </w:p>
+        </w:tc>
+      </w:tr>
+      <w:tr>
+        <w:trPr>
+          <w:cantSplit/>
+        </w:trPr>
+        <w:tc>
+          <w:tcPr>
+            <w:tcW w:type="dxa" w:w="2778"/>
+            <w:vAlign w:val="center"/>
+            <w:tcBorders>
+              <w:top w:val="single" w:sz="4" w:color="D9D9D9"/>
+              <w:left w:val="single" w:sz="4" w:color="D9D9D9"/>
+              <w:bottom w:val="single" w:sz="4" w:color="D9D9D9"/>
+              <w:right w:val="single" w:sz="4" w:color="D9D9D9"/>
+            </w:tcBorders>
+            <w:tcMar>
+              <w:top w:w="85" w:type="dxa"/>
+              <w:left w:w="85" w:type="dxa"/>
+              <w:bottom w:w="85" w:type="dxa"/>
+              <w:right w:w="85" w:type="dxa"/>
+            </w:tcMar>
+          </w:tcPr>
+          <w:p>
+            <w:pPr>
+              <w:spacing w:after="20" w:line="240" w:lineRule="auto"/>
+            </w:pPr>
+            <w:r>
+              <w:rPr>
+                <w:b w:val="0"/>
+                <w:sz w:val="20"/>
+              </w:rPr>
+              <w:t>Courier MP fields</w:t>
+            </w:r>
+          </w:p>
+        </w:tc>
+        <w:tc>
+          <w:tcPr>
+            <w:tcW w:type="dxa" w:w="1304"/>
+            <w:vAlign w:val="center"/>
+            <w:tcBorders>
+              <w:top w:val="single" w:sz="4" w:color="D9D9D9"/>
+              <w:left w:val="single" w:sz="4" w:color="D9D9D9"/>
+              <w:bottom w:val="single" w:sz="4" w:color="D9D9D9"/>
+              <w:right w:val="single" w:sz="4" w:color="D9D9D9"/>
+            </w:tcBorders>
+            <w:tcMar>
+              <w:top w:w="85" w:type="dxa"/>
+              <w:left w:w="85" w:type="dxa"/>
+              <w:bottom w:w="85" w:type="dxa"/>
+              <w:right w:w="85" w:type="dxa"/>
+            </w:tcMar>
+          </w:tcPr>
+          <w:p>
+            <w:pPr>
+              <w:spacing w:after="20" w:line="240" w:lineRule="auto"/>
+            </w:pPr>
+            <w:r>
+              <w:rPr>
+                <w:b w:val="0"/>
+                <w:sz w:val="20"/>
+              </w:rPr>
+              <w:t>1,536</w:t>
+            </w:r>
+          </w:p>
+        </w:tc>
+        <w:tc>
+          <w:tcPr>
+            <w:tcW w:type="dxa" w:w="5329"/>
+            <w:vAlign w:val="center"/>
+            <w:tcBorders>
+              <w:top w:val="single" w:sz="4" w:color="D9D9D9"/>
+              <w:left w:val="single" w:sz="4" w:color="D9D9D9"/>
+              <w:bottom w:val="single" w:sz="4" w:color="D9D9D9"/>
+              <w:right w:val="single" w:sz="4" w:color="D9D9D9"/>
+            </w:tcBorders>
+            <w:tcMar>
+              <w:top w:w="85" w:type="dxa"/>
+              <w:left w:w="85" w:type="dxa"/>
+              <w:bottom w:w="85" w:type="dxa"/>
+              <w:right w:w="85" w:type="dxa"/>
+            </w:tcMar>
+          </w:tcPr>
+          <w:p>
+            <w:pPr>
+              <w:spacing w:after="20" w:line="240" w:lineRule="auto"/>
+            </w:pPr>
+            <w:r>
+              <w:rPr>
+                <w:b w:val="0"/>
+                <w:sz w:val="20"/>
+              </w:rPr>
+              <w:t>Original captured 403 field packer</w:t>
+            </w:r>
+          </w:p>
+        </w:tc>
+      </w:tr>
+      <w:tr>
+        <w:trPr>
+          <w:cantSplit/>
+        </w:trPr>
+        <w:tc>
+          <w:tcPr>
+            <w:tcW w:type="dxa" w:w="2778"/>
+            <w:vAlign w:val="center"/>
+            <w:tcBorders>
+              <w:top w:val="single" w:sz="4" w:color="D9D9D9"/>
+              <w:left w:val="single" w:sz="4" w:color="D9D9D9"/>
+              <w:bottom w:val="single" w:sz="4" w:color="D9D9D9"/>
+              <w:right w:val="single" w:sz="4" w:color="D9D9D9"/>
+            </w:tcBorders>
+            <w:tcMar>
+              <w:top w:w="85" w:type="dxa"/>
+              <w:left w:w="85" w:type="dxa"/>
+              <w:bottom w:w="85" w:type="dxa"/>
+              <w:right w:w="85" w:type="dxa"/>
+            </w:tcMar>
+          </w:tcPr>
+          <w:p>
+            <w:pPr>
+              <w:spacing w:after="20" w:line="240" w:lineRule="auto"/>
+            </w:pPr>
+            <w:r>
+              <w:rPr>
+                <w:b w:val="0"/>
+                <w:sz w:val="20"/>
+              </w:rPr>
+              <w:t>Courier bit consumer</w:t>
+            </w:r>
+          </w:p>
+        </w:tc>
+        <w:tc>
+          <w:tcPr>
+            <w:tcW w:type="dxa" w:w="1304"/>
+            <w:vAlign w:val="center"/>
+            <w:tcBorders>
+              <w:top w:val="single" w:sz="4" w:color="D9D9D9"/>
+              <w:left w:val="single" w:sz="4" w:color="D9D9D9"/>
+              <w:bottom w:val="single" w:sz="4" w:color="D9D9D9"/>
+              <w:right w:val="single" w:sz="4" w:color="D9D9D9"/>
+            </w:tcBorders>
+            <w:tcMar>
+              <w:top w:w="85" w:type="dxa"/>
+              <w:left w:w="85" w:type="dxa"/>
+              <w:bottom w:w="85" w:type="dxa"/>
+              <w:right w:w="85" w:type="dxa"/>
+            </w:tcMar>
+          </w:tcPr>
+          <w:p>
+            <w:pPr>
+              <w:spacing w:after="20" w:line="240" w:lineRule="auto"/>
+            </w:pPr>
+            <w:r>
+              <w:rPr>
+                <w:b w:val="0"/>
+                <w:sz w:val="20"/>
+              </w:rPr>
+              <w:t>216</w:t>
+            </w:r>
+          </w:p>
+        </w:tc>
+        <w:tc>
+          <w:tcPr>
+            <w:tcW w:type="dxa" w:w="5329"/>
+            <w:vAlign w:val="center"/>
+            <w:tcBorders>
+              <w:top w:val="single" w:sz="4" w:color="D9D9D9"/>
+              <w:left w:val="single" w:sz="4" w:color="D9D9D9"/>
+              <w:bottom w:val="single" w:sz="4" w:color="D9D9D9"/>
+              <w:right w:val="single" w:sz="4" w:color="D9D9D9"/>
+            </w:tcBorders>
+            <w:tcMar>
+              <w:top w:w="85" w:type="dxa"/>
+              <w:left w:w="85" w:type="dxa"/>
+              <w:bottom w:w="85" w:type="dxa"/>
+              <w:right w:w="85" w:type="dxa"/>
+            </w:tcMar>
+          </w:tcPr>
+          <w:p>
+            <w:pPr>
+              <w:spacing w:after="20" w:line="240" w:lineRule="auto"/>
+            </w:pPr>
+            <w:r>
+              <w:rPr>
+                <w:b w:val="0"/>
+                <w:sz w:val="20"/>
+              </w:rPr>
+              <w:t>Original bit callbacks and additive count</w:t>
             </w:r>
           </w:p>
         </w:tc>
@@ -20546,6 +21773,18 @@
         <w:rPr>
           <w:sz w:val="20"/>
         </w:rPr>
+        <w:t>Courier MP and rate-report evidence is docs/x2-courier-mp-fields.md and artifacts/x2-courier-mp-20261005. Run tools/verify_courier_mp_fields.py for the packer and bit consumer checks, and tools/verify_courier_rate_report.py for 46 threshold, 45 DSP report, 150 supervisor selection, 15 I-modem selector and 210 I-modem source-consumer cases. The continuation evidence is artifacts/x2-courier-rate-report-20261005. Live flag and buffer runs use tools/probe_imodem_analog_pair.py with a capped analogue CPU run, COURIER_DSP_WATCH_LAST and COURIER_DSP_TRACE_LIMIT. F875 forces the packing input, F8CB sets bit nine, and EA82 through EABC is the separately traced variable-length selector. The captured Courier ROM and Ie030002 call are distinct from the XMF and Quad component profiles.</w:t>
+      </w:r>
+    </w:p>
+    <w:p>
+      <w:pPr>
+        <w:keepLines/>
+        <w:spacing w:after="80"/>
+      </w:pPr>
+      <w:r>
+        <w:rPr>
+          <w:sz w:val="20"/>
+        </w:rPr>
         <w:t>The last server training stretch is decoded by tools/decode_server_training_e.py with artifacts/x2-server-training-e-20261004/analysis.json. The server training script is decoded by tools/decode_server_script.py with artifacts/x2-server-script-20261004/script.json. The server post-marker signal is analysed by tools/analyze_server_training.py with artifacts/x2-server-training-20261004/analysis.json. The Courier post-marker signal is analysed by tools/analyze_v34_training.py with artifacts/x2-courier-phase3-20261004/analysis.json. The pre-gate bearer sequence is analysed by tools/analyze_bearer_handshake.py with artifacts/x2-pre-gate-20261004/analysis.json. The impairment test is tools/x2_source_impairment.py with artifacts/x2-source-impairment-20261004/verification.json. The marker receiver is documented at the end of docs/x2-v90-protocol-selection.md; tools/verify_x2_marker_receiver.py runs the original QF060003 parse from 97B5 and writes artifacts/x2-marker-receiver-20261004/verification.json. The arming site is 9791; the IM020104 counterpart is 948A.</w:t>
       </w:r>
     </w:p>
@@ -20583,7 +21822,7 @@
         <w:rPr>
           <w:sz w:val="20"/>
         </w:rPr>
-        <w:t>Draft 0.31 decodes the last server training stretch with the payload mapper and explains the repeated word and the script restart. Draft 0.30 decodes the generation rule of the first server training pattern. Draft 0.29 reads the level table behind the last training stretch and corrects its alphabet. Draft 0.28 reads the server training script from the firmware. Draft 0.27 segments the server downstream training signal and decodes its scrambled-ones stretches. Draft 0.26 decodes the Courier start-up signal after the marker as V.34 Phase 3 at the announced rate. Draft 0.25 maps the asymmetric call bearer sequence and decodes the marker frame from the line. Draft 0.24 decodes the bearer sequence before the INFO0 gate. Draft 0.23 tests multi-phase errors. Draft 0.22 sweeps all six phases of the impairment test. Draft 0.21 reproduces the 56000 decision with a controlled low-bit impairment of the startup source. Draft 0.20 decodes the data-mode hook families and the rate decision after the capability exchange. Draft 0.19 decodes the in-band capability frame. Draft 0.18 decodes the receiver mismatch handling. Draft 0.17 decodes the startup source receiver that ends the wait. Draft 0.16 decodes the originating-end idle stub and the wait that ends it. Draft 0.15 traces the symmetric startup branch. Draft 0.14 specifies the server peer-role test on the exchanged INFO0 words. Draft 0.13 traces the server after marker acceptance. Draft 0.12 identifies the server receiver for the seven-bit marker and verifies its field parse. Draft 0.11 resolves the 3453C capability route: the transmitted INFO0 word is the plain tag 51 word and the tag 70 word is never read. Draft 0.10 adds pre-V.90 and later client rate selection, position grouping, variable-length body construction and original serialization. It distinguishes the host diagnostic report from peer records and records the XC timing correction and successful symmetric regression. Draft 0.9 executes the four-word PCM record receiver through CRC acceptance, rate-mask selection, bank construction, mapped output and later payload-source activation. The client measurement-to-record producer and complete call-state selection remain open. Draft 0.8 verified 57333 profiles and corrected builder product scaling to SPM 1. Draft 0.7 confirmed active GPC scrambling and pre-data resets in the symmetric 64000 pair. Analogue client decoding, alternate companding output and complete peer negotiation remain open.</w:t>
+        <w:t>Draft 0.33 traces the local threshold result through the DSP mailbox and supervisor CONNECT formatter, and verifies the live I-modem MP-to-rate selector. Draft 0.32 verifies the Courier four-word MP and its CRC, traces the forced N1, additive bit count and bit-nine setter, and distinguishes the local 53333 report from the unexecuted later client exchange. Draft 0.31 decodes the last server training stretch with the payload mapper and explains the repeated word and the script restart. Draft 0.30 decodes the generation rule of the first server training pattern. Draft 0.29 reads the level table behind the last training stretch and corrects its alphabet. Draft 0.28 reads the server training script from the firmware. Draft 0.27 segments the server downstream training signal and decodes its scrambled-ones stretches. Draft 0.26 decodes the Courier start-up signal after the marker as V.34 Phase 3 at the announced rate. Draft 0.25 maps the asymmetric call bearer sequence and decodes the marker frame from the line. Draft 0.24 decodes the bearer sequence before the INFO0 gate. Draft 0.23 tests multi-phase errors. Draft 0.22 sweeps all six phases of the impairment test. Draft 0.21 reproduces the 56000 decision with a controlled low-bit impairment of the startup source. Draft 0.20 decodes the data-mode hook families and the rate decision after the capability exchange. Draft 0.19 decodes the in-band capability frame. Draft 0.18 decodes the receiver mismatch handling. Draft 0.17 decodes the startup source receiver that ends the wait. Draft 0.16 decodes the originating-end idle stub and the wait that ends it. Draft 0.15 traces the symmetric startup branch. Draft 0.14 specifies the server peer-role test on the exchanged INFO0 words. Draft 0.13 traces the server after marker acceptance. Draft 0.12 identifies the server receiver for the seven-bit marker and verifies its field parse. Draft 0.11 resolves the 3453C capability route: the transmitted INFO0 word is the plain tag 51 word and the tag 70 word is never read. Draft 0.10 adds pre-V.90 and later client rate selection, position grouping, variable-length body construction and original serialization. It distinguishes the host diagnostic report from peer records and records the XC timing correction and successful symmetric regression. Draft 0.9 executes the four-word PCM record receiver through CRC acceptance, rate-mask selection, bank construction, mapped output and later payload-source activation. The client measurement-to-record producer and complete call-state selection remain open. Draft 0.8 verified 57333 profiles and corrected builder product scaling to SPM 1. Draft 0.7 confirmed active GPC scrambling and pre-data resets in the symmetric 64000 pair. Analogue client decoding, alternate companding output and complete peer negotiation remain open.</w:t>
       </w:r>
     </w:p>
     <w:p>
@@ -20705,7 +21944,7 @@
       <w:rPr>
         <w:sz w:val="18"/>
       </w:rPr>
-      <w:t xml:space="preserve">x2 technical specification     •     4 October 2026     •     </w:t>
+      <w:t xml:space="preserve">x2 technical specification     •     5 October 2026     •     </w:t>
     </w:r>
     <w:fldSimple w:instr="PAGE"/>
   </w:p>
@@ -20722,7 +21961,7 @@
       <w:rPr>
         <w:sz w:val="18"/>
       </w:rPr>
-      <w:t>COURIER EMU     x2 firmware reconstruction     Draft 0.31</w:t>
+      <w:t>COURIER EMU     x2 firmware reconstruction     Draft 0.33</w:t>
     </w:r>
   </w:p>
 </w:hdr>

</xml_diff>